<commit_message>
Added main feature list and started listing issues with previous development of GPR.PY
</commit_message>
<xml_diff>
--- a/Project Plan/Project Plan.docx
+++ b/Project Plan/Project Plan.docx
@@ -208,35 +208,30 @@
           <w:rFonts w:ascii="Times New Roman" w:hAnsi="Times New Roman" w:cs="Times New Roman"/>
           <w:lang w:val="en-US"/>
         </w:rPr>
-        <w:t>build</w:t>
-      </w:r>
-      <w:r>
-        <w:rPr>
-          <w:rFonts w:ascii="Times New Roman" w:hAnsi="Times New Roman" w:cs="Times New Roman"/>
-          <w:lang w:val="en-US"/>
-        </w:rPr>
-        <w:t xml:space="preserve"> </w:t>
-      </w:r>
-      <w:r>
-        <w:rPr>
-          <w:rFonts w:ascii="Times New Roman" w:hAnsi="Times New Roman" w:cs="Times New Roman"/>
-          <w:lang w:val="en-US"/>
-        </w:rPr>
-        <w:t>upon the existing libraries</w:t>
-      </w:r>
-      <w:r>
-        <w:rPr>
-          <w:rFonts w:ascii="Times New Roman" w:hAnsi="Times New Roman" w:cs="Times New Roman"/>
-          <w:lang w:val="en-US"/>
-        </w:rPr>
-        <w:t xml:space="preserve"> and </w:t>
-      </w:r>
-      <w:r>
-        <w:rPr>
-          <w:rFonts w:ascii="Times New Roman" w:hAnsi="Times New Roman" w:cs="Times New Roman"/>
-          <w:lang w:val="en-US"/>
-        </w:rPr>
-        <w:t>make an easy to use software for non-technical users</w:t>
+        <w:t xml:space="preserve">build upon the existing libraries and </w:t>
+      </w:r>
+      <w:r>
+        <w:rPr>
+          <w:rFonts w:ascii="Times New Roman" w:hAnsi="Times New Roman" w:cs="Times New Roman"/>
+          <w:lang w:val="en-US"/>
+        </w:rPr>
+        <w:t xml:space="preserve">make an </w:t>
+      </w:r>
+      <w:proofErr w:type="gramStart"/>
+      <w:r>
+        <w:rPr>
+          <w:rFonts w:ascii="Times New Roman" w:hAnsi="Times New Roman" w:cs="Times New Roman"/>
+          <w:lang w:val="en-US"/>
+        </w:rPr>
+        <w:t>easy to use</w:t>
+      </w:r>
+      <w:proofErr w:type="gramEnd"/>
+      <w:r>
+        <w:rPr>
+          <w:rFonts w:ascii="Times New Roman" w:hAnsi="Times New Roman" w:cs="Times New Roman"/>
+          <w:lang w:val="en-US"/>
+        </w:rPr>
+        <w:t xml:space="preserve"> software for non-technical users</w:t>
       </w:r>
       <w:r>
         <w:rPr>
@@ -257,14 +252,501 @@
           <w:rFonts w:ascii="Times New Roman" w:hAnsi="Times New Roman" w:cs="Times New Roman"/>
           <w:lang w:val="en-US"/>
         </w:rPr>
-        <w:t xml:space="preserve">features such as 3-D cube visualization and LiDAR correction to reduce the need for licensed software </w:t>
-      </w:r>
-      <w:r>
-        <w:rPr>
-          <w:rFonts w:ascii="Times New Roman" w:hAnsi="Times New Roman" w:cs="Times New Roman"/>
-          <w:lang w:val="en-US"/>
-        </w:rPr>
-        <w:t xml:space="preserve">. </w:t>
+        <w:t>features such as 3-D cube visualization and LiDAR correction to reduce the need for licensed software</w:t>
+      </w:r>
+      <w:r>
+        <w:rPr>
+          <w:rFonts w:ascii="Times New Roman" w:hAnsi="Times New Roman" w:cs="Times New Roman"/>
+          <w:lang w:val="en-US"/>
+        </w:rPr>
+        <w:t>.</w:t>
+      </w:r>
+    </w:p>
+    <w:p>
+      <w:pPr>
+        <w:rPr>
+          <w:rFonts w:ascii="Times New Roman" w:hAnsi="Times New Roman" w:cs="Times New Roman"/>
+          <w:lang w:val="en-US"/>
+        </w:rPr>
+      </w:pPr>
+      <w:r>
+        <w:rPr>
+          <w:rFonts w:ascii="Times New Roman" w:hAnsi="Times New Roman" w:cs="Times New Roman"/>
+          <w:lang w:val="en-US"/>
+        </w:rPr>
+        <w:t>The final is product will have the following changes implemented:</w:t>
+      </w:r>
+    </w:p>
+    <w:p>
+      <w:pPr>
+        <w:pStyle w:val="ListParagraph"/>
+        <w:numPr>
+          <w:ilvl w:val="0"/>
+          <w:numId w:val="1"/>
+        </w:numPr>
+        <w:rPr>
+          <w:rFonts w:ascii="Times New Roman" w:hAnsi="Times New Roman" w:cs="Times New Roman"/>
+          <w:lang w:val="en-US"/>
+        </w:rPr>
+      </w:pPr>
+      <w:r>
+        <w:rPr>
+          <w:rFonts w:ascii="Times New Roman" w:hAnsi="Times New Roman" w:cs="Times New Roman"/>
+          <w:lang w:val="en-US"/>
+        </w:rPr>
+        <w:t>New UI</w:t>
+      </w:r>
+    </w:p>
+    <w:p>
+      <w:pPr>
+        <w:pStyle w:val="ListParagraph"/>
+        <w:numPr>
+          <w:ilvl w:val="0"/>
+          <w:numId w:val="1"/>
+        </w:numPr>
+        <w:rPr>
+          <w:rFonts w:ascii="Times New Roman" w:hAnsi="Times New Roman" w:cs="Times New Roman"/>
+          <w:lang w:val="en-US"/>
+        </w:rPr>
+      </w:pPr>
+      <w:r>
+        <w:rPr>
+          <w:rFonts w:ascii="Times New Roman" w:hAnsi="Times New Roman" w:cs="Times New Roman"/>
+          <w:lang w:val="en-US"/>
+        </w:rPr>
+        <w:t>Built in 3-D cube manipulation</w:t>
+      </w:r>
+    </w:p>
+    <w:p>
+      <w:pPr>
+        <w:pStyle w:val="ListParagraph"/>
+        <w:numPr>
+          <w:ilvl w:val="0"/>
+          <w:numId w:val="1"/>
+        </w:numPr>
+        <w:rPr>
+          <w:rFonts w:ascii="Times New Roman" w:hAnsi="Times New Roman" w:cs="Times New Roman"/>
+          <w:lang w:val="en-US"/>
+        </w:rPr>
+      </w:pPr>
+      <w:r>
+        <w:rPr>
+          <w:rFonts w:ascii="Times New Roman" w:hAnsi="Times New Roman" w:cs="Times New Roman"/>
+          <w:lang w:val="en-US"/>
+        </w:rPr>
+        <w:t>GPR data interpolation</w:t>
+      </w:r>
+    </w:p>
+    <w:p>
+      <w:pPr>
+        <w:pStyle w:val="ListParagraph"/>
+        <w:numPr>
+          <w:ilvl w:val="0"/>
+          <w:numId w:val="1"/>
+        </w:numPr>
+        <w:rPr>
+          <w:rFonts w:ascii="Times New Roman" w:hAnsi="Times New Roman" w:cs="Times New Roman"/>
+          <w:lang w:val="en-US"/>
+        </w:rPr>
+      </w:pPr>
+      <w:r>
+        <w:rPr>
+          <w:rFonts w:ascii="Times New Roman" w:hAnsi="Times New Roman" w:cs="Times New Roman"/>
+          <w:lang w:val="en-US"/>
+        </w:rPr>
+        <w:t xml:space="preserve">Batch processing for </w:t>
+      </w:r>
+      <w:proofErr w:type="spellStart"/>
+      <w:r>
+        <w:rPr>
+          <w:rFonts w:ascii="Times New Roman" w:hAnsi="Times New Roman" w:cs="Times New Roman"/>
+          <w:lang w:val="en-US"/>
+        </w:rPr>
+        <w:t>gpr</w:t>
+      </w:r>
+      <w:proofErr w:type="spellEnd"/>
+      <w:r>
+        <w:rPr>
+          <w:rFonts w:ascii="Times New Roman" w:hAnsi="Times New Roman" w:cs="Times New Roman"/>
+          <w:lang w:val="en-US"/>
+        </w:rPr>
+        <w:t xml:space="preserve"> files</w:t>
+      </w:r>
+    </w:p>
+    <w:p>
+      <w:pPr>
+        <w:pStyle w:val="ListParagraph"/>
+        <w:numPr>
+          <w:ilvl w:val="0"/>
+          <w:numId w:val="1"/>
+        </w:numPr>
+        <w:rPr>
+          <w:rFonts w:ascii="Times New Roman" w:hAnsi="Times New Roman" w:cs="Times New Roman"/>
+          <w:lang w:val="en-US"/>
+        </w:rPr>
+      </w:pPr>
+      <w:r>
+        <w:rPr>
+          <w:rFonts w:ascii="Times New Roman" w:hAnsi="Times New Roman" w:cs="Times New Roman"/>
+          <w:lang w:val="en-US"/>
+        </w:rPr>
+        <w:t>LIDAR correction for GPR data cube</w:t>
+      </w:r>
+    </w:p>
+    <w:p>
+      <w:pPr>
+        <w:rPr>
+          <w:rFonts w:ascii="Times New Roman" w:hAnsi="Times New Roman" w:cs="Times New Roman"/>
+          <w:lang w:val="en-US"/>
+        </w:rPr>
+      </w:pPr>
+    </w:p>
+    <w:p>
+      <w:pPr>
+        <w:rPr>
+          <w:rFonts w:ascii="Times New Roman" w:hAnsi="Times New Roman" w:cs="Times New Roman"/>
+          <w:lang w:val="en-US"/>
+        </w:rPr>
+      </w:pPr>
+    </w:p>
+    <w:p>
+      <w:pPr>
+        <w:rPr>
+          <w:rFonts w:ascii="Times New Roman" w:hAnsi="Times New Roman" w:cs="Times New Roman"/>
+          <w:lang w:val="en-US"/>
+        </w:rPr>
+      </w:pPr>
+    </w:p>
+    <w:p>
+      <w:pPr>
+        <w:rPr>
+          <w:rFonts w:ascii="Times New Roman" w:hAnsi="Times New Roman" w:cs="Times New Roman"/>
+          <w:lang w:val="en-US"/>
+        </w:rPr>
+      </w:pPr>
+    </w:p>
+    <w:p>
+      <w:pPr>
+        <w:rPr>
+          <w:rFonts w:ascii="Times New Roman" w:hAnsi="Times New Roman" w:cs="Times New Roman"/>
+          <w:lang w:val="en-US"/>
+        </w:rPr>
+      </w:pPr>
+    </w:p>
+    <w:p>
+      <w:pPr>
+        <w:rPr>
+          <w:rFonts w:ascii="Times New Roman" w:hAnsi="Times New Roman" w:cs="Times New Roman"/>
+          <w:lang w:val="en-US"/>
+        </w:rPr>
+      </w:pPr>
+    </w:p>
+    <w:p>
+      <w:pPr>
+        <w:rPr>
+          <w:rFonts w:ascii="Times New Roman" w:hAnsi="Times New Roman" w:cs="Times New Roman"/>
+          <w:lang w:val="en-US"/>
+        </w:rPr>
+      </w:pPr>
+    </w:p>
+    <w:p>
+      <w:pPr>
+        <w:rPr>
+          <w:rFonts w:ascii="Times New Roman" w:hAnsi="Times New Roman" w:cs="Times New Roman"/>
+          <w:lang w:val="en-US"/>
+        </w:rPr>
+      </w:pPr>
+    </w:p>
+    <w:p>
+      <w:pPr>
+        <w:rPr>
+          <w:rFonts w:ascii="Times New Roman" w:hAnsi="Times New Roman" w:cs="Times New Roman"/>
+          <w:lang w:val="en-US"/>
+        </w:rPr>
+      </w:pPr>
+    </w:p>
+    <w:p>
+      <w:pPr>
+        <w:rPr>
+          <w:rFonts w:ascii="Times New Roman" w:hAnsi="Times New Roman" w:cs="Times New Roman"/>
+          <w:lang w:val="en-US"/>
+        </w:rPr>
+      </w:pPr>
+    </w:p>
+    <w:p>
+      <w:pPr>
+        <w:rPr>
+          <w:rFonts w:ascii="Times New Roman" w:hAnsi="Times New Roman" w:cs="Times New Roman"/>
+          <w:lang w:val="en-US"/>
+        </w:rPr>
+      </w:pPr>
+      <w:r>
+        <w:rPr>
+          <w:rFonts w:ascii="Times New Roman" w:hAnsi="Times New Roman" w:cs="Times New Roman"/>
+          <w:lang w:val="en-US"/>
+        </w:rPr>
+        <w:lastRenderedPageBreak/>
+        <w:t>Previous Versions</w:t>
+      </w:r>
+    </w:p>
+    <w:p>
+      <w:pPr>
+        <w:rPr>
+          <w:rFonts w:ascii="Times New Roman" w:hAnsi="Times New Roman" w:cs="Times New Roman"/>
+          <w:lang w:val="en-US"/>
+        </w:rPr>
+      </w:pPr>
+    </w:p>
+    <w:p>
+      <w:pPr>
+        <w:rPr>
+          <w:rFonts w:ascii="Times New Roman" w:hAnsi="Times New Roman" w:cs="Times New Roman"/>
+          <w:lang w:val="en-US"/>
+        </w:rPr>
+      </w:pPr>
+      <w:r>
+        <w:rPr>
+          <w:rFonts w:ascii="Times New Roman" w:hAnsi="Times New Roman" w:cs="Times New Roman"/>
+          <w:lang w:val="en-US"/>
+        </w:rPr>
+        <w:t xml:space="preserve">The first iteration of GPR.PY was developed as a part of my capstone </w:t>
+      </w:r>
+      <w:proofErr w:type="gramStart"/>
+      <w:r>
+        <w:rPr>
+          <w:rFonts w:ascii="Times New Roman" w:hAnsi="Times New Roman" w:cs="Times New Roman"/>
+          <w:lang w:val="en-US"/>
+        </w:rPr>
+        <w:t>project, and</w:t>
+      </w:r>
+      <w:proofErr w:type="gramEnd"/>
+      <w:r>
+        <w:rPr>
+          <w:rFonts w:ascii="Times New Roman" w:hAnsi="Times New Roman" w:cs="Times New Roman"/>
+          <w:lang w:val="en-US"/>
+        </w:rPr>
+        <w:t xml:space="preserve"> aimed at </w:t>
+      </w:r>
+      <w:proofErr w:type="spellStart"/>
+      <w:r>
+        <w:rPr>
+          <w:rFonts w:ascii="Times New Roman" w:hAnsi="Times New Roman" w:cs="Times New Roman"/>
+          <w:lang w:val="en-US"/>
+        </w:rPr>
+        <w:t>acheieving</w:t>
+      </w:r>
+      <w:proofErr w:type="spellEnd"/>
+      <w:r>
+        <w:rPr>
+          <w:rFonts w:ascii="Times New Roman" w:hAnsi="Times New Roman" w:cs="Times New Roman"/>
+          <w:lang w:val="en-US"/>
+        </w:rPr>
+        <w:t xml:space="preserve"> the same goals that are listed above. However, due to several limitations in the libraries used and poor design choices the project failed to meet some targets. Although the final product was working, it was not ready for real-world deployment. The issues with the previous project are as follows:</w:t>
+      </w:r>
+    </w:p>
+    <w:p>
+      <w:pPr>
+        <w:rPr>
+          <w:rFonts w:ascii="Times New Roman" w:hAnsi="Times New Roman" w:cs="Times New Roman"/>
+          <w:lang w:val="en-US"/>
+        </w:rPr>
+      </w:pPr>
+    </w:p>
+    <w:p>
+      <w:pPr>
+        <w:pStyle w:val="ListParagraph"/>
+        <w:numPr>
+          <w:ilvl w:val="0"/>
+          <w:numId w:val="2"/>
+        </w:numPr>
+        <w:rPr>
+          <w:rFonts w:ascii="Times New Roman" w:hAnsi="Times New Roman" w:cs="Times New Roman"/>
+          <w:lang w:val="en-US"/>
+        </w:rPr>
+      </w:pPr>
+      <w:proofErr w:type="spellStart"/>
+      <w:r>
+        <w:rPr>
+          <w:rFonts w:ascii="Times New Roman" w:hAnsi="Times New Roman" w:cs="Times New Roman"/>
+          <w:lang w:val="en-US"/>
+        </w:rPr>
+        <w:t>Incompatibilty</w:t>
+      </w:r>
+      <w:proofErr w:type="spellEnd"/>
+      <w:r>
+        <w:rPr>
+          <w:rFonts w:ascii="Times New Roman" w:hAnsi="Times New Roman" w:cs="Times New Roman"/>
+          <w:lang w:val="en-US"/>
+        </w:rPr>
+        <w:t xml:space="preserve"> with MacOS</w:t>
+      </w:r>
+    </w:p>
+    <w:p>
+      <w:pPr>
+        <w:ind w:left="720"/>
+        <w:rPr>
+          <w:rFonts w:ascii="Times New Roman" w:hAnsi="Times New Roman" w:cs="Times New Roman"/>
+          <w:lang w:val="en-US"/>
+        </w:rPr>
+      </w:pPr>
+      <w:r>
+        <w:rPr>
+          <w:rFonts w:ascii="Times New Roman" w:hAnsi="Times New Roman" w:cs="Times New Roman"/>
+          <w:lang w:val="en-US"/>
+        </w:rPr>
+        <w:t xml:space="preserve">This was due to conflicts with </w:t>
+      </w:r>
+      <w:proofErr w:type="spellStart"/>
+      <w:r>
+        <w:rPr>
+          <w:rFonts w:ascii="Times New Roman" w:hAnsi="Times New Roman" w:cs="Times New Roman"/>
+          <w:i/>
+          <w:iCs/>
+          <w:lang w:val="en-US"/>
+        </w:rPr>
+        <w:t>mayavi</w:t>
+      </w:r>
+      <w:proofErr w:type="spellEnd"/>
+      <w:r>
+        <w:rPr>
+          <w:rFonts w:ascii="Times New Roman" w:hAnsi="Times New Roman" w:cs="Times New Roman"/>
+          <w:lang w:val="en-US"/>
+        </w:rPr>
+        <w:t xml:space="preserve"> libraries which resulted in the program crashing on </w:t>
+      </w:r>
+      <w:proofErr w:type="gramStart"/>
+      <w:r>
+        <w:rPr>
+          <w:rFonts w:ascii="Times New Roman" w:hAnsi="Times New Roman" w:cs="Times New Roman"/>
+          <w:lang w:val="en-US"/>
+        </w:rPr>
+        <w:t>launch .</w:t>
+      </w:r>
+      <w:proofErr w:type="gramEnd"/>
+      <w:r>
+        <w:rPr>
+          <w:rFonts w:ascii="Times New Roman" w:hAnsi="Times New Roman" w:cs="Times New Roman"/>
+          <w:lang w:val="en-US"/>
+        </w:rPr>
+        <w:t xml:space="preserve"> Despite reinstalling the correct version, the problem continued to persist. </w:t>
+      </w:r>
+      <w:r>
+        <w:rPr>
+          <w:rFonts w:ascii="Times New Roman" w:hAnsi="Times New Roman" w:cs="Times New Roman"/>
+          <w:lang w:val="en-US"/>
+        </w:rPr>
+        <w:t xml:space="preserve">The temporary fix was to </w:t>
+      </w:r>
+      <w:proofErr w:type="spellStart"/>
+      <w:proofErr w:type="gramStart"/>
+      <w:r>
+        <w:rPr>
+          <w:rFonts w:ascii="Times New Roman" w:hAnsi="Times New Roman" w:cs="Times New Roman"/>
+          <w:lang w:val="en-US"/>
+        </w:rPr>
+        <w:t>removed</w:t>
+      </w:r>
+      <w:proofErr w:type="spellEnd"/>
+      <w:proofErr w:type="gramEnd"/>
+      <w:r>
+        <w:rPr>
+          <w:rFonts w:ascii="Times New Roman" w:hAnsi="Times New Roman" w:cs="Times New Roman"/>
+          <w:lang w:val="en-US"/>
+        </w:rPr>
+        <w:t xml:space="preserve"> the import statement entirely. This however, removed the 3D cube visualization capabilities of the program on MacOS.</w:t>
+      </w:r>
+    </w:p>
+    <w:p>
+      <w:pPr>
+        <w:ind w:left="720"/>
+        <w:rPr>
+          <w:rFonts w:ascii="Times New Roman" w:hAnsi="Times New Roman" w:cs="Times New Roman"/>
+          <w:lang w:val="en-US"/>
+        </w:rPr>
+      </w:pPr>
+    </w:p>
+    <w:p>
+      <w:pPr>
+        <w:ind w:left="720"/>
+        <w:rPr>
+          <w:rFonts w:ascii="Times New Roman" w:hAnsi="Times New Roman" w:cs="Times New Roman"/>
+          <w:lang w:val="en-US"/>
+        </w:rPr>
+      </w:pPr>
+    </w:p>
+    <w:p>
+      <w:pPr>
+        <w:ind w:left="720"/>
+        <w:rPr>
+          <w:rFonts w:ascii="Times New Roman" w:hAnsi="Times New Roman" w:cs="Times New Roman"/>
+          <w:lang w:val="en-US"/>
+        </w:rPr>
+      </w:pPr>
+    </w:p>
+    <w:p>
+      <w:pPr>
+        <w:ind w:left="720"/>
+        <w:rPr>
+          <w:rFonts w:ascii="Times New Roman" w:hAnsi="Times New Roman" w:cs="Times New Roman"/>
+          <w:lang w:val="en-US"/>
+        </w:rPr>
+      </w:pPr>
+    </w:p>
+    <w:p>
+      <w:pPr>
+        <w:ind w:left="720"/>
+        <w:rPr>
+          <w:rFonts w:ascii="Times New Roman" w:hAnsi="Times New Roman" w:cs="Times New Roman"/>
+          <w:lang w:val="en-US"/>
+        </w:rPr>
+      </w:pPr>
+      <w:r>
+        <w:rPr>
+          <w:rFonts w:ascii="Times New Roman" w:hAnsi="Times New Roman" w:cs="Times New Roman"/>
+          <w:noProof/>
+          <w:lang w:val="en-US"/>
+        </w:rPr>
+        <w:drawing>
+          <wp:inline distT="0" distB="0" distL="0" distR="0" wp14:anchorId="36C72E2B" wp14:editId="0C418025">
+            <wp:extent cx="5731510" cy="3283585"/>
+            <wp:effectExtent l="0" t="0" r="0" b="5715"/>
+            <wp:docPr id="1025035813" name="Picture 1" descr="A screenshot of a computer program&#10;&#10;AI-generated content may be incorrect."/>
+            <wp:cNvGraphicFramePr>
+              <a:graphicFrameLocks xmlns:a="http://schemas.openxmlformats.org/drawingml/2006/main" noChangeAspect="1"/>
+            </wp:cNvGraphicFramePr>
+            <a:graphic xmlns:a="http://schemas.openxmlformats.org/drawingml/2006/main">
+              <a:graphicData uri="http://schemas.openxmlformats.org/drawingml/2006/picture">
+                <pic:pic xmlns:pic="http://schemas.openxmlformats.org/drawingml/2006/picture">
+                  <pic:nvPicPr>
+                    <pic:cNvPr id="1025035813" name="Picture 1" descr="A screenshot of a computer program&#10;&#10;AI-generated content may be incorrect."/>
+                    <pic:cNvPicPr/>
+                  </pic:nvPicPr>
+                  <pic:blipFill>
+                    <a:blip r:embed="rId5">
+                      <a:extLst>
+                        <a:ext uri="{28A0092B-C50C-407E-A947-70E740481C1C}">
+                          <a14:useLocalDpi xmlns:a14="http://schemas.microsoft.com/office/drawing/2010/main" val="0"/>
+                        </a:ext>
+                      </a:extLst>
+                    </a:blip>
+                    <a:stretch>
+                      <a:fillRect/>
+                    </a:stretch>
+                  </pic:blipFill>
+                  <pic:spPr>
+                    <a:xfrm>
+                      <a:off x="0" y="0"/>
+                      <a:ext cx="5731510" cy="3283585"/>
+                    </a:xfrm>
+                    <a:prstGeom prst="rect">
+                      <a:avLst/>
+                    </a:prstGeom>
+                  </pic:spPr>
+                </pic:pic>
+              </a:graphicData>
+            </a:graphic>
+          </wp:inline>
+        </w:drawing>
       </w:r>
     </w:p>
     <w:sectPr>
@@ -275,6 +757,195 @@
     </w:sectPr>
   </w:body>
 </w:document>
+</file>
+
+<file path=word/numbering.xml><?xml version="1.0" encoding="utf-8"?>
+<w:numbering xmlns:wpc="http://schemas.microsoft.com/office/word/2010/wordprocessingCanvas" xmlns:cx="http://schemas.microsoft.com/office/drawing/2014/chartex" xmlns:cx1="http://schemas.microsoft.com/office/drawing/2015/9/8/chartex" xmlns:cx2="http://schemas.microsoft.com/office/drawing/2015/10/21/chartex" xmlns:cx3="http://schemas.microsoft.com/office/drawing/2016/5/9/chartex" xmlns:cx4="http://schemas.microsoft.com/office/drawing/2016/5/10/chartex" xmlns:cx5="http://schemas.microsoft.com/office/drawing/2016/5/11/chartex" xmlns:cx6="http://schemas.microsoft.com/office/drawing/2016/5/12/chartex" xmlns:cx7="http://schemas.microsoft.com/office/drawing/2016/5/13/chartex" xmlns:cx8="http://schemas.microsoft.com/office/drawing/2016/5/14/chartex" xmlns:mc="http://schemas.openxmlformats.org/markup-compatibility/2006" xmlns:aink="http://schemas.microsoft.com/office/drawing/2016/ink" xmlns:am3d="http://schemas.microsoft.com/office/drawing/2017/model3d" xmlns:o="urn:schemas-microsoft-com:office:office" xmlns:oel="http://schemas.microsoft.com/office/2019/extlst" xmlns:r="http://schemas.openxmlformats.org/officeDocument/2006/relationships" xmlns:m="http://schemas.openxmlformats.org/officeDocument/2006/math" xmlns:v="urn:schemas-microsoft-com:vml" xmlns:wp14="http://schemas.microsoft.com/office/word/2010/wordprocessingDrawing" xmlns:wp="http://schemas.openxmlformats.org/drawingml/2006/wordprocessingDrawing" xmlns:w10="urn:schemas-microsoft-com:office:word" xmlns:w="http://schemas.openxmlformats.org/wordprocessingml/2006/main" xmlns:w14="http://schemas.microsoft.com/office/word/2010/wordml" xmlns:w15="http://schemas.microsoft.com/office/word/2012/wordml" xmlns:w16cex="http://schemas.microsoft.com/office/word/2018/wordml/cex" xmlns:w16cid="http://schemas.microsoft.com/office/word/2016/wordml/cid" xmlns:w16="http://schemas.microsoft.com/office/word/2018/wordml" xmlns:w16du="http://schemas.microsoft.com/office/word/2023/wordml/word16du" xmlns:w16sdtdh="http://schemas.microsoft.com/office/word/2020/wordml/sdtdatahash" xmlns:w16sdtfl="http://schemas.microsoft.com/office/word/2024/wordml/sdtformatlock" xmlns:w16se="http://schemas.microsoft.com/office/word/2015/wordml/symex" xmlns:wpg="http://schemas.microsoft.com/office/word/2010/wordprocessingGroup" xmlns:wpi="http://schemas.microsoft.com/office/word/2010/wordprocessingInk" xmlns:wne="http://schemas.microsoft.com/office/word/2006/wordml" xmlns:wps="http://schemas.microsoft.com/office/word/2010/wordprocessingShape" mc:Ignorable="w14 w15 w16se w16cid w16 w16cex w16sdtdh w16sdtfl w16du wp14">
+  <w:abstractNum w:abstractNumId="0" w15:restartNumberingAfterBreak="0">
+    <w:nsid w:val="740E0BE0"/>
+    <w:multiLevelType w:val="hybridMultilevel"/>
+    <w:tmpl w:val="F104DA8A"/>
+    <w:lvl w:ilvl="0" w:tplc="08090011">
+      <w:start w:val="1"/>
+      <w:numFmt w:val="decimal"/>
+      <w:lvlText w:val="%1)"/>
+      <w:lvlJc w:val="left"/>
+      <w:pPr>
+        <w:ind w:left="720" w:hanging="360"/>
+      </w:pPr>
+      <w:rPr>
+        <w:rFonts w:hint="default"/>
+      </w:rPr>
+    </w:lvl>
+    <w:lvl w:ilvl="1" w:tplc="08090019" w:tentative="1">
+      <w:start w:val="1"/>
+      <w:numFmt w:val="lowerLetter"/>
+      <w:lvlText w:val="%2."/>
+      <w:lvlJc w:val="left"/>
+      <w:pPr>
+        <w:ind w:left="1440" w:hanging="360"/>
+      </w:pPr>
+    </w:lvl>
+    <w:lvl w:ilvl="2" w:tplc="0809001B" w:tentative="1">
+      <w:start w:val="1"/>
+      <w:numFmt w:val="lowerRoman"/>
+      <w:lvlText w:val="%3."/>
+      <w:lvlJc w:val="right"/>
+      <w:pPr>
+        <w:ind w:left="2160" w:hanging="180"/>
+      </w:pPr>
+    </w:lvl>
+    <w:lvl w:ilvl="3" w:tplc="0809000F" w:tentative="1">
+      <w:start w:val="1"/>
+      <w:numFmt w:val="decimal"/>
+      <w:lvlText w:val="%4."/>
+      <w:lvlJc w:val="left"/>
+      <w:pPr>
+        <w:ind w:left="2880" w:hanging="360"/>
+      </w:pPr>
+    </w:lvl>
+    <w:lvl w:ilvl="4" w:tplc="08090019" w:tentative="1">
+      <w:start w:val="1"/>
+      <w:numFmt w:val="lowerLetter"/>
+      <w:lvlText w:val="%5."/>
+      <w:lvlJc w:val="left"/>
+      <w:pPr>
+        <w:ind w:left="3600" w:hanging="360"/>
+      </w:pPr>
+    </w:lvl>
+    <w:lvl w:ilvl="5" w:tplc="0809001B" w:tentative="1">
+      <w:start w:val="1"/>
+      <w:numFmt w:val="lowerRoman"/>
+      <w:lvlText w:val="%6."/>
+      <w:lvlJc w:val="right"/>
+      <w:pPr>
+        <w:ind w:left="4320" w:hanging="180"/>
+      </w:pPr>
+    </w:lvl>
+    <w:lvl w:ilvl="6" w:tplc="0809000F" w:tentative="1">
+      <w:start w:val="1"/>
+      <w:numFmt w:val="decimal"/>
+      <w:lvlText w:val="%7."/>
+      <w:lvlJc w:val="left"/>
+      <w:pPr>
+        <w:ind w:left="5040" w:hanging="360"/>
+      </w:pPr>
+    </w:lvl>
+    <w:lvl w:ilvl="7" w:tplc="08090019" w:tentative="1">
+      <w:start w:val="1"/>
+      <w:numFmt w:val="lowerLetter"/>
+      <w:lvlText w:val="%8."/>
+      <w:lvlJc w:val="left"/>
+      <w:pPr>
+        <w:ind w:left="5760" w:hanging="360"/>
+      </w:pPr>
+    </w:lvl>
+    <w:lvl w:ilvl="8" w:tplc="0809001B" w:tentative="1">
+      <w:start w:val="1"/>
+      <w:numFmt w:val="lowerRoman"/>
+      <w:lvlText w:val="%9."/>
+      <w:lvlJc w:val="right"/>
+      <w:pPr>
+        <w:ind w:left="6480" w:hanging="180"/>
+      </w:pPr>
+    </w:lvl>
+  </w:abstractNum>
+  <w:abstractNum w:abstractNumId="1" w15:restartNumberingAfterBreak="0">
+    <w:nsid w:val="76992B80"/>
+    <w:multiLevelType w:val="hybridMultilevel"/>
+    <w:tmpl w:val="705C05EC"/>
+    <w:lvl w:ilvl="0" w:tplc="08090011">
+      <w:start w:val="1"/>
+      <w:numFmt w:val="decimal"/>
+      <w:lvlText w:val="%1)"/>
+      <w:lvlJc w:val="left"/>
+      <w:pPr>
+        <w:ind w:left="720" w:hanging="360"/>
+      </w:pPr>
+      <w:rPr>
+        <w:rFonts w:hint="default"/>
+      </w:rPr>
+    </w:lvl>
+    <w:lvl w:ilvl="1" w:tplc="08090019" w:tentative="1">
+      <w:start w:val="1"/>
+      <w:numFmt w:val="lowerLetter"/>
+      <w:lvlText w:val="%2."/>
+      <w:lvlJc w:val="left"/>
+      <w:pPr>
+        <w:ind w:left="1440" w:hanging="360"/>
+      </w:pPr>
+    </w:lvl>
+    <w:lvl w:ilvl="2" w:tplc="0809001B" w:tentative="1">
+      <w:start w:val="1"/>
+      <w:numFmt w:val="lowerRoman"/>
+      <w:lvlText w:val="%3."/>
+      <w:lvlJc w:val="right"/>
+      <w:pPr>
+        <w:ind w:left="2160" w:hanging="180"/>
+      </w:pPr>
+    </w:lvl>
+    <w:lvl w:ilvl="3" w:tplc="0809000F" w:tentative="1">
+      <w:start w:val="1"/>
+      <w:numFmt w:val="decimal"/>
+      <w:lvlText w:val="%4."/>
+      <w:lvlJc w:val="left"/>
+      <w:pPr>
+        <w:ind w:left="2880" w:hanging="360"/>
+      </w:pPr>
+    </w:lvl>
+    <w:lvl w:ilvl="4" w:tplc="08090019" w:tentative="1">
+      <w:start w:val="1"/>
+      <w:numFmt w:val="lowerLetter"/>
+      <w:lvlText w:val="%5."/>
+      <w:lvlJc w:val="left"/>
+      <w:pPr>
+        <w:ind w:left="3600" w:hanging="360"/>
+      </w:pPr>
+    </w:lvl>
+    <w:lvl w:ilvl="5" w:tplc="0809001B" w:tentative="1">
+      <w:start w:val="1"/>
+      <w:numFmt w:val="lowerRoman"/>
+      <w:lvlText w:val="%6."/>
+      <w:lvlJc w:val="right"/>
+      <w:pPr>
+        <w:ind w:left="4320" w:hanging="180"/>
+      </w:pPr>
+    </w:lvl>
+    <w:lvl w:ilvl="6" w:tplc="0809000F" w:tentative="1">
+      <w:start w:val="1"/>
+      <w:numFmt w:val="decimal"/>
+      <w:lvlText w:val="%7."/>
+      <w:lvlJc w:val="left"/>
+      <w:pPr>
+        <w:ind w:left="5040" w:hanging="360"/>
+      </w:pPr>
+    </w:lvl>
+    <w:lvl w:ilvl="7" w:tplc="08090019" w:tentative="1">
+      <w:start w:val="1"/>
+      <w:numFmt w:val="lowerLetter"/>
+      <w:lvlText w:val="%8."/>
+      <w:lvlJc w:val="left"/>
+      <w:pPr>
+        <w:ind w:left="5760" w:hanging="360"/>
+      </w:pPr>
+    </w:lvl>
+    <w:lvl w:ilvl="8" w:tplc="0809001B" w:tentative="1">
+      <w:start w:val="1"/>
+      <w:numFmt w:val="lowerRoman"/>
+      <w:lvlText w:val="%9."/>
+      <w:lvlJc w:val="right"/>
+      <w:pPr>
+        <w:ind w:left="6480" w:hanging="180"/>
+      </w:pPr>
+    </w:lvl>
+  </w:abstractNum>
+  <w:num w:numId="1" w16cid:durableId="1975673213">
+    <w:abstractNumId w:val="1"/>
+  </w:num>
+  <w:num w:numId="2" w16cid:durableId="1319265623">
+    <w:abstractNumId w:val="0"/>
+  </w:num>
+</w:numbering>
 </file>
 
 <file path=word/styles.xml><?xml version="1.0" encoding="utf-8"?>

</xml_diff>

<commit_message>
Added more issue to the list. Includes Memory leaks, Interpolation step and Batch processing with screenshots for reference
</commit_message>
<xml_diff>
--- a/Project Plan/Project Plan.docx
+++ b/Project Plan/Project Plan.docx
@@ -477,12 +477,20 @@
       <w:pPr>
         <w:rPr>
           <w:rFonts w:ascii="Times New Roman" w:hAnsi="Times New Roman" w:cs="Times New Roman"/>
-          <w:lang w:val="en-US"/>
-        </w:rPr>
-      </w:pPr>
-      <w:r>
-        <w:rPr>
-          <w:rFonts w:ascii="Times New Roman" w:hAnsi="Times New Roman" w:cs="Times New Roman"/>
+          <w:b/>
+          <w:bCs/>
+          <w:sz w:val="32"/>
+          <w:szCs w:val="32"/>
+          <w:lang w:val="en-US"/>
+        </w:rPr>
+      </w:pPr>
+      <w:r>
+        <w:rPr>
+          <w:rFonts w:ascii="Times New Roman" w:hAnsi="Times New Roman" w:cs="Times New Roman"/>
+          <w:b/>
+          <w:bCs/>
+          <w:sz w:val="32"/>
+          <w:szCs w:val="32"/>
           <w:lang w:val="en-US"/>
         </w:rPr>
         <w:lastRenderedPageBreak/>
@@ -561,6 +569,8 @@
         </w:numPr>
         <w:rPr>
           <w:rFonts w:ascii="Times New Roman" w:hAnsi="Times New Roman" w:cs="Times New Roman"/>
+          <w:b/>
+          <w:bCs/>
           <w:lang w:val="en-US"/>
         </w:rPr>
       </w:pPr>
@@ -568,6 +578,8 @@
       <w:r>
         <w:rPr>
           <w:rFonts w:ascii="Times New Roman" w:hAnsi="Times New Roman" w:cs="Times New Roman"/>
+          <w:b/>
+          <w:bCs/>
           <w:lang w:val="en-US"/>
         </w:rPr>
         <w:t>Incompatibilty</w:t>
@@ -576,6 +588,8 @@
       <w:r>
         <w:rPr>
           <w:rFonts w:ascii="Times New Roman" w:hAnsi="Times New Roman" w:cs="Times New Roman"/>
+          <w:b/>
+          <w:bCs/>
           <w:lang w:val="en-US"/>
         </w:rPr>
         <w:t xml:space="preserve"> with MacOS</w:t>
@@ -664,42 +678,6 @@
           <w:lang w:val="en-US"/>
         </w:rPr>
       </w:pPr>
-    </w:p>
-    <w:p>
-      <w:pPr>
-        <w:ind w:left="720"/>
-        <w:rPr>
-          <w:rFonts w:ascii="Times New Roman" w:hAnsi="Times New Roman" w:cs="Times New Roman"/>
-          <w:lang w:val="en-US"/>
-        </w:rPr>
-      </w:pPr>
-    </w:p>
-    <w:p>
-      <w:pPr>
-        <w:ind w:left="720"/>
-        <w:rPr>
-          <w:rFonts w:ascii="Times New Roman" w:hAnsi="Times New Roman" w:cs="Times New Roman"/>
-          <w:lang w:val="en-US"/>
-        </w:rPr>
-      </w:pPr>
-    </w:p>
-    <w:p>
-      <w:pPr>
-        <w:ind w:left="720"/>
-        <w:rPr>
-          <w:rFonts w:ascii="Times New Roman" w:hAnsi="Times New Roman" w:cs="Times New Roman"/>
-          <w:lang w:val="en-US"/>
-        </w:rPr>
-      </w:pPr>
-    </w:p>
-    <w:p>
-      <w:pPr>
-        <w:ind w:left="720"/>
-        <w:rPr>
-          <w:rFonts w:ascii="Times New Roman" w:hAnsi="Times New Roman" w:cs="Times New Roman"/>
-          <w:lang w:val="en-US"/>
-        </w:rPr>
-      </w:pPr>
       <w:r>
         <w:rPr>
           <w:rFonts w:ascii="Times New Roman" w:hAnsi="Times New Roman" w:cs="Times New Roman"/>
@@ -707,7 +685,7 @@
           <w:lang w:val="en-US"/>
         </w:rPr>
         <w:drawing>
-          <wp:inline distT="0" distB="0" distL="0" distR="0" wp14:anchorId="36C72E2B" wp14:editId="0C418025">
+          <wp:inline distT="0" distB="0" distL="0" distR="0" wp14:anchorId="6D780E43" wp14:editId="0E95FFC1">
             <wp:extent cx="5731510" cy="3283585"/>
             <wp:effectExtent l="0" t="0" r="0" b="5715"/>
             <wp:docPr id="1025035813" name="Picture 1" descr="A screenshot of a computer program&#10;&#10;AI-generated content may be incorrect."/>
@@ -749,6 +727,338 @@
         </w:drawing>
       </w:r>
     </w:p>
+    <w:p>
+      <w:pPr>
+        <w:pStyle w:val="ListParagraph"/>
+        <w:numPr>
+          <w:ilvl w:val="0"/>
+          <w:numId w:val="2"/>
+        </w:numPr>
+        <w:rPr>
+          <w:rFonts w:ascii="Times New Roman" w:hAnsi="Times New Roman" w:cs="Times New Roman"/>
+          <w:b/>
+          <w:bCs/>
+          <w:lang w:val="en-US"/>
+        </w:rPr>
+      </w:pPr>
+      <w:r>
+        <w:rPr>
+          <w:rFonts w:ascii="Times New Roman" w:hAnsi="Times New Roman" w:cs="Times New Roman"/>
+          <w:b/>
+          <w:bCs/>
+          <w:lang w:val="en-US"/>
+        </w:rPr>
+        <w:t xml:space="preserve">Batch Processing - </w:t>
+      </w:r>
+      <w:r>
+        <w:rPr>
+          <w:rFonts w:ascii="Times New Roman" w:hAnsi="Times New Roman" w:cs="Times New Roman"/>
+          <w:b/>
+          <w:bCs/>
+          <w:lang w:val="en-US"/>
+        </w:rPr>
+        <w:t>Memory Leaks</w:t>
+      </w:r>
+    </w:p>
+    <w:p>
+      <w:pPr>
+        <w:ind w:left="720"/>
+        <w:rPr>
+          <w:rFonts w:ascii="Times New Roman" w:hAnsi="Times New Roman" w:cs="Times New Roman"/>
+          <w:lang w:val="en-US"/>
+        </w:rPr>
+      </w:pPr>
+      <w:r>
+        <w:rPr>
+          <w:rFonts w:ascii="Times New Roman" w:hAnsi="Times New Roman" w:cs="Times New Roman"/>
+          <w:lang w:val="en-US"/>
+        </w:rPr>
+        <w:t>The program also implemented a batch processing feature that enabled users to enter a set of parameters in a series of text fields, and those changes would be applied to the folder containing the GPR data. To speed up the process, threads were utilized and resulted in 60% faster processing times. However, it would result in memory leaks and</w:t>
+      </w:r>
+      <w:r>
+        <w:rPr>
+          <w:rFonts w:ascii="Times New Roman" w:hAnsi="Times New Roman" w:cs="Times New Roman"/>
+          <w:lang w:val="en-US"/>
+        </w:rPr>
+        <w:t xml:space="preserve"> requires a “force quit” to end the program after one run.</w:t>
+      </w:r>
+    </w:p>
+    <w:p>
+      <w:pPr>
+        <w:ind w:left="720"/>
+        <w:rPr>
+          <w:rFonts w:ascii="Times New Roman" w:hAnsi="Times New Roman" w:cs="Times New Roman"/>
+          <w:lang w:val="en-US"/>
+        </w:rPr>
+      </w:pPr>
+    </w:p>
+    <w:p>
+      <w:pPr>
+        <w:ind w:left="360"/>
+        <w:rPr>
+          <w:rFonts w:ascii="Times New Roman" w:hAnsi="Times New Roman" w:cs="Times New Roman"/>
+          <w:lang w:val="en-US"/>
+        </w:rPr>
+      </w:pPr>
+      <w:r>
+        <w:rPr>
+          <w:rFonts w:ascii="Times New Roman" w:hAnsi="Times New Roman" w:cs="Times New Roman"/>
+          <w:noProof/>
+          <w:lang w:val="en-US"/>
+        </w:rPr>
+        <w:lastRenderedPageBreak/>
+        <w:drawing>
+          <wp:inline distT="0" distB="0" distL="0" distR="0" wp14:anchorId="65FE17F1" wp14:editId="39107F4E">
+            <wp:extent cx="5731510" cy="3676015"/>
+            <wp:effectExtent l="0" t="0" r="0" b="0"/>
+            <wp:docPr id="1531882688" name="Picture 2"/>
+            <wp:cNvGraphicFramePr>
+              <a:graphicFrameLocks xmlns:a="http://schemas.openxmlformats.org/drawingml/2006/main" noChangeAspect="1"/>
+            </wp:cNvGraphicFramePr>
+            <a:graphic xmlns:a="http://schemas.openxmlformats.org/drawingml/2006/main">
+              <a:graphicData uri="http://schemas.openxmlformats.org/drawingml/2006/picture">
+                <pic:pic xmlns:pic="http://schemas.openxmlformats.org/drawingml/2006/picture">
+                  <pic:nvPicPr>
+                    <pic:cNvPr id="1531882688" name="Picture 1531882688"/>
+                    <pic:cNvPicPr/>
+                  </pic:nvPicPr>
+                  <pic:blipFill>
+                    <a:blip r:embed="rId6" cstate="print">
+                      <a:extLst>
+                        <a:ext uri="{28A0092B-C50C-407E-A947-70E740481C1C}">
+                          <a14:useLocalDpi xmlns:a14="http://schemas.microsoft.com/office/drawing/2010/main" val="0"/>
+                        </a:ext>
+                      </a:extLst>
+                    </a:blip>
+                    <a:stretch>
+                      <a:fillRect/>
+                    </a:stretch>
+                  </pic:blipFill>
+                  <pic:spPr>
+                    <a:xfrm>
+                      <a:off x="0" y="0"/>
+                      <a:ext cx="5731510" cy="3676015"/>
+                    </a:xfrm>
+                    <a:prstGeom prst="rect">
+                      <a:avLst/>
+                    </a:prstGeom>
+                  </pic:spPr>
+                </pic:pic>
+              </a:graphicData>
+            </a:graphic>
+          </wp:inline>
+        </w:drawing>
+      </w:r>
+    </w:p>
+    <w:p>
+      <w:pPr>
+        <w:pStyle w:val="ListParagraph"/>
+        <w:numPr>
+          <w:ilvl w:val="0"/>
+          <w:numId w:val="2"/>
+        </w:numPr>
+        <w:rPr>
+          <w:rFonts w:ascii="Times New Roman" w:hAnsi="Times New Roman" w:cs="Times New Roman"/>
+          <w:b/>
+          <w:bCs/>
+          <w:lang w:val="en-US"/>
+        </w:rPr>
+      </w:pPr>
+      <w:r>
+        <w:rPr>
+          <w:rFonts w:ascii="Times New Roman" w:hAnsi="Times New Roman" w:cs="Times New Roman"/>
+          <w:b/>
+          <w:bCs/>
+          <w:lang w:val="en-US"/>
+        </w:rPr>
+        <w:t>Interpolation</w:t>
+      </w:r>
+    </w:p>
+    <w:p>
+      <w:pPr>
+        <w:ind w:left="720"/>
+        <w:rPr>
+          <w:rFonts w:ascii="Times New Roman" w:hAnsi="Times New Roman" w:cs="Times New Roman"/>
+          <w:lang w:val="en-US"/>
+        </w:rPr>
+      </w:pPr>
+      <w:r>
+        <w:rPr>
+          <w:rFonts w:ascii="Times New Roman" w:hAnsi="Times New Roman" w:cs="Times New Roman"/>
+          <w:lang w:val="en-US"/>
+        </w:rPr>
+        <w:t xml:space="preserve">This step utilized the makeDataCube.py file, and </w:t>
+      </w:r>
+      <w:r>
+        <w:rPr>
+          <w:rFonts w:ascii="Times New Roman" w:hAnsi="Times New Roman" w:cs="Times New Roman"/>
+          <w:lang w:val="en-US"/>
+        </w:rPr>
+        <w:t>because of</w:t>
+      </w:r>
+      <w:r>
+        <w:rPr>
+          <w:rFonts w:ascii="Times New Roman" w:hAnsi="Times New Roman" w:cs="Times New Roman"/>
+          <w:lang w:val="en-US"/>
+        </w:rPr>
+        <w:t xml:space="preserve"> the memory leaks created an incorrect matrix. Resulting in the cubing step, which already would take 2-4 hours to finish</w:t>
+      </w:r>
+      <w:r>
+        <w:rPr>
+          <w:rFonts w:ascii="Times New Roman" w:hAnsi="Times New Roman" w:cs="Times New Roman"/>
+          <w:lang w:val="en-US"/>
+        </w:rPr>
+        <w:t xml:space="preserve">, getting stuck in an infinite loop. </w:t>
+      </w:r>
+    </w:p>
+    <w:p>
+      <w:pPr>
+        <w:rPr>
+          <w:rFonts w:ascii="Times New Roman" w:hAnsi="Times New Roman" w:cs="Times New Roman"/>
+          <w:lang w:val="en-US"/>
+        </w:rPr>
+      </w:pPr>
+    </w:p>
+    <w:p>
+      <w:pPr>
+        <w:pStyle w:val="ListParagraph"/>
+        <w:numPr>
+          <w:ilvl w:val="0"/>
+          <w:numId w:val="2"/>
+        </w:numPr>
+        <w:rPr>
+          <w:rFonts w:ascii="Times New Roman" w:hAnsi="Times New Roman" w:cs="Times New Roman"/>
+          <w:lang w:val="en-US"/>
+        </w:rPr>
+      </w:pPr>
+      <w:r>
+        <w:rPr>
+          <w:rFonts w:ascii="Times New Roman" w:hAnsi="Times New Roman" w:cs="Times New Roman"/>
+          <w:lang w:val="en-US"/>
+        </w:rPr>
+        <w:t>Cube slicing</w:t>
+      </w:r>
+    </w:p>
+    <w:p>
+      <w:pPr>
+        <w:ind w:left="720"/>
+        <w:rPr>
+          <w:rFonts w:ascii="Times New Roman" w:hAnsi="Times New Roman" w:cs="Times New Roman"/>
+          <w:lang w:val="en-US"/>
+        </w:rPr>
+      </w:pPr>
+      <w:r>
+        <w:rPr>
+          <w:rFonts w:ascii="Times New Roman" w:hAnsi="Times New Roman" w:cs="Times New Roman"/>
+          <w:lang w:val="en-US"/>
+        </w:rPr>
+        <w:t xml:space="preserve">One of the features requested was to be able to slice a 3D cube at set intervals and obtain the coordinates at each slice. This however would go on longer than intended resulting in memory overloads and crashing </w:t>
+      </w:r>
+      <w:proofErr w:type="spellStart"/>
+      <w:r>
+        <w:rPr>
+          <w:rFonts w:ascii="Times New Roman" w:hAnsi="Times New Roman" w:cs="Times New Roman"/>
+          <w:lang w:val="en-US"/>
+        </w:rPr>
+        <w:t>mayavi</w:t>
+      </w:r>
+      <w:proofErr w:type="spellEnd"/>
+      <w:r>
+        <w:rPr>
+          <w:rFonts w:ascii="Times New Roman" w:hAnsi="Times New Roman" w:cs="Times New Roman"/>
+          <w:lang w:val="en-US"/>
+        </w:rPr>
+        <w:t>. A workaround for this was to manually stop the slicing after 50.</w:t>
+      </w:r>
+    </w:p>
+    <w:p>
+      <w:pPr>
+        <w:rPr>
+          <w:rFonts w:ascii="Times New Roman" w:hAnsi="Times New Roman" w:cs="Times New Roman"/>
+          <w:lang w:val="en-US"/>
+        </w:rPr>
+      </w:pPr>
+    </w:p>
+    <w:p>
+      <w:pPr>
+        <w:pStyle w:val="ListParagraph"/>
+        <w:numPr>
+          <w:ilvl w:val="0"/>
+          <w:numId w:val="2"/>
+        </w:numPr>
+        <w:rPr>
+          <w:rFonts w:ascii="Times New Roman" w:hAnsi="Times New Roman" w:cs="Times New Roman"/>
+          <w:lang w:val="en-US"/>
+        </w:rPr>
+      </w:pPr>
+      <w:r>
+        <w:rPr>
+          <w:rFonts w:ascii="Times New Roman" w:hAnsi="Times New Roman" w:cs="Times New Roman"/>
+          <w:lang w:val="en-US"/>
+        </w:rPr>
+        <w:t>Design</w:t>
+      </w:r>
+    </w:p>
+    <w:p>
+      <w:pPr>
+        <w:rPr>
+          <w:rFonts w:ascii="Times New Roman" w:hAnsi="Times New Roman" w:cs="Times New Roman"/>
+          <w:lang w:val="en-US"/>
+        </w:rPr>
+      </w:pPr>
+      <w:r>
+        <w:rPr>
+          <w:rFonts w:ascii="Times New Roman" w:hAnsi="Times New Roman" w:cs="Times New Roman"/>
+          <w:lang w:val="en-US"/>
+        </w:rPr>
+        <w:t xml:space="preserve"> </w:t>
+      </w:r>
+    </w:p>
+    <w:p>
+      <w:pPr>
+        <w:ind w:left="720"/>
+        <w:rPr>
+          <w:rFonts w:ascii="Times New Roman" w:hAnsi="Times New Roman" w:cs="Times New Roman"/>
+          <w:lang w:val="en-US"/>
+        </w:rPr>
+      </w:pPr>
+    </w:p>
+    <w:p>
+      <w:pPr>
+        <w:ind w:left="720"/>
+        <w:rPr>
+          <w:rFonts w:ascii="Times New Roman" w:hAnsi="Times New Roman" w:cs="Times New Roman"/>
+          <w:lang w:val="en-US"/>
+        </w:rPr>
+      </w:pPr>
+    </w:p>
+    <w:p>
+      <w:pPr>
+        <w:ind w:left="720"/>
+        <w:rPr>
+          <w:rFonts w:ascii="Times New Roman" w:hAnsi="Times New Roman" w:cs="Times New Roman"/>
+          <w:lang w:val="en-US"/>
+        </w:rPr>
+      </w:pPr>
+    </w:p>
+    <w:p>
+      <w:pPr>
+        <w:ind w:left="720"/>
+        <w:rPr>
+          <w:rFonts w:ascii="Times New Roman" w:hAnsi="Times New Roman" w:cs="Times New Roman"/>
+          <w:lang w:val="en-US"/>
+        </w:rPr>
+      </w:pPr>
+    </w:p>
+    <w:p>
+      <w:pPr>
+        <w:ind w:left="720"/>
+        <w:rPr>
+          <w:rFonts w:ascii="Times New Roman" w:hAnsi="Times New Roman" w:cs="Times New Roman"/>
+          <w:lang w:val="en-US"/>
+        </w:rPr>
+      </w:pPr>
+    </w:p>
     <w:sectPr>
       <w:pgSz w:w="11906" w:h="16838"/>
       <w:pgMar w:top="1440" w:right="1440" w:bottom="1440" w:left="1440" w:header="708" w:footer="708" w:gutter="0"/>
@@ -777,7 +1087,7 @@
         <w:rFonts w:hint="default"/>
       </w:rPr>
     </w:lvl>
-    <w:lvl w:ilvl="1" w:tplc="08090019" w:tentative="1">
+    <w:lvl w:ilvl="1" w:tplc="08090019">
       <w:start w:val="1"/>
       <w:numFmt w:val="lowerLetter"/>
       <w:lvlText w:val="%2."/>

</xml_diff>

<commit_message>
Added more screenshots and details for the Issues list for the Capstone section. Started on listing Issues with the library gpr.py.
</commit_message>
<xml_diff>
--- a/Project Plan/Project Plan.docx
+++ b/Project Plan/Project Plan.docx
@@ -64,15 +64,13 @@
         </w:rPr>
         <w:t xml:space="preserve">This project is aimed at improving an existing python library called GPR.PY by updating the User </w:t>
       </w:r>
-      <w:proofErr w:type="gramStart"/>
-      <w:r>
-        <w:rPr>
-          <w:rFonts w:ascii="Times New Roman" w:hAnsi="Times New Roman" w:cs="Times New Roman"/>
-          <w:lang w:val="en-US"/>
-        </w:rPr>
-        <w:t>Interface(</w:t>
-      </w:r>
-      <w:proofErr w:type="gramEnd"/>
+      <w:r>
+        <w:rPr>
+          <w:rFonts w:ascii="Times New Roman" w:hAnsi="Times New Roman" w:cs="Times New Roman"/>
+          <w:lang w:val="en-US"/>
+        </w:rPr>
+        <w:t>Interface (</w:t>
+      </w:r>
       <w:r>
         <w:rPr>
           <w:rFonts w:ascii="Times New Roman" w:hAnsi="Times New Roman" w:cs="Times New Roman"/>
@@ -172,15 +170,13 @@
         </w:rPr>
         <w:t xml:space="preserve">. GPR’s do not account for the terrain of the land when recording measurements. Therefore, when graves or artifacts are </w:t>
       </w:r>
-      <w:proofErr w:type="gramStart"/>
-      <w:r>
-        <w:rPr>
-          <w:rFonts w:ascii="Times New Roman" w:hAnsi="Times New Roman" w:cs="Times New Roman"/>
-          <w:lang w:val="en-US"/>
-        </w:rPr>
-        <w:t>discovered</w:t>
-      </w:r>
-      <w:proofErr w:type="gramEnd"/>
+      <w:r>
+        <w:rPr>
+          <w:rFonts w:ascii="Times New Roman" w:hAnsi="Times New Roman" w:cs="Times New Roman"/>
+          <w:lang w:val="en-US"/>
+        </w:rPr>
+        <w:t>discovered,</w:t>
+      </w:r>
       <w:r>
         <w:rPr>
           <w:rFonts w:ascii="Times New Roman" w:hAnsi="Times New Roman" w:cs="Times New Roman"/>
@@ -217,15 +213,13 @@
         </w:rPr>
         <w:t xml:space="preserve">make an </w:t>
       </w:r>
-      <w:proofErr w:type="gramStart"/>
-      <w:r>
-        <w:rPr>
-          <w:rFonts w:ascii="Times New Roman" w:hAnsi="Times New Roman" w:cs="Times New Roman"/>
-          <w:lang w:val="en-US"/>
-        </w:rPr>
-        <w:t>easy to use</w:t>
-      </w:r>
-      <w:proofErr w:type="gramEnd"/>
+      <w:r>
+        <w:rPr>
+          <w:rFonts w:ascii="Times New Roman" w:hAnsi="Times New Roman" w:cs="Times New Roman"/>
+          <w:lang w:val="en-US"/>
+        </w:rPr>
+        <w:t>easy-to-use</w:t>
+      </w:r>
       <w:r>
         <w:rPr>
           <w:rFonts w:ascii="Times New Roman" w:hAnsi="Times New Roman" w:cs="Times New Roman"/>
@@ -261,6 +255,29 @@
         </w:rPr>
         <w:t>.</w:t>
       </w:r>
+    </w:p>
+    <w:p>
+      <w:pPr>
+        <w:rPr>
+          <w:rFonts w:ascii="Times New Roman" w:hAnsi="Times New Roman" w:cs="Times New Roman"/>
+          <w:lang w:val="en-US"/>
+        </w:rPr>
+      </w:pPr>
+      <w:r>
+        <w:rPr>
+          <w:rFonts w:ascii="Times New Roman" w:hAnsi="Times New Roman" w:cs="Times New Roman"/>
+          <w:lang w:val="en-US"/>
+        </w:rPr>
+        <w:t>During my final year of university, along with a team, I attempted to tackle these issues but was not entirely successful. There were some successes, yet the project was far from perfect and missed some big targets. This time the goal is to approach the problem in a more organized manner, by laying out a clear plan, implementing a proper architecture and using coding principles to ensure all targets are met and the final product is serviceable.</w:t>
+      </w:r>
+    </w:p>
+    <w:p>
+      <w:pPr>
+        <w:rPr>
+          <w:rFonts w:ascii="Times New Roman" w:hAnsi="Times New Roman" w:cs="Times New Roman"/>
+          <w:lang w:val="en-US"/>
+        </w:rPr>
+      </w:pPr>
     </w:p>
     <w:p>
       <w:pPr>
@@ -445,38 +462,6 @@
       <w:pPr>
         <w:rPr>
           <w:rFonts w:ascii="Times New Roman" w:hAnsi="Times New Roman" w:cs="Times New Roman"/>
-          <w:lang w:val="en-US"/>
-        </w:rPr>
-      </w:pPr>
-    </w:p>
-    <w:p>
-      <w:pPr>
-        <w:rPr>
-          <w:rFonts w:ascii="Times New Roman" w:hAnsi="Times New Roman" w:cs="Times New Roman"/>
-          <w:lang w:val="en-US"/>
-        </w:rPr>
-      </w:pPr>
-    </w:p>
-    <w:p>
-      <w:pPr>
-        <w:rPr>
-          <w:rFonts w:ascii="Times New Roman" w:hAnsi="Times New Roman" w:cs="Times New Roman"/>
-          <w:lang w:val="en-US"/>
-        </w:rPr>
-      </w:pPr>
-    </w:p>
-    <w:p>
-      <w:pPr>
-        <w:rPr>
-          <w:rFonts w:ascii="Times New Roman" w:hAnsi="Times New Roman" w:cs="Times New Roman"/>
-          <w:lang w:val="en-US"/>
-        </w:rPr>
-      </w:pPr>
-    </w:p>
-    <w:p>
-      <w:pPr>
-        <w:rPr>
-          <w:rFonts w:ascii="Times New Roman" w:hAnsi="Times New Roman" w:cs="Times New Roman"/>
           <w:b/>
           <w:bCs/>
           <w:sz w:val="32"/>
@@ -494,19 +479,46 @@
           <w:lang w:val="en-US"/>
         </w:rPr>
         <w:lastRenderedPageBreak/>
-        <w:t>Previous Versions</w:t>
-      </w:r>
-    </w:p>
-    <w:p>
-      <w:pPr>
-        <w:rPr>
-          <w:rFonts w:ascii="Times New Roman" w:hAnsi="Times New Roman" w:cs="Times New Roman"/>
-          <w:lang w:val="en-US"/>
-        </w:rPr>
-      </w:pPr>
-    </w:p>
-    <w:p>
-      <w:pPr>
+        <w:t>Issues</w:t>
+      </w:r>
+    </w:p>
+    <w:p>
+      <w:pPr>
+        <w:rPr>
+          <w:rFonts w:ascii="Times New Roman" w:hAnsi="Times New Roman" w:cs="Times New Roman"/>
+          <w:b/>
+          <w:bCs/>
+          <w:sz w:val="28"/>
+          <w:szCs w:val="28"/>
+          <w:lang w:val="en-US"/>
+        </w:rPr>
+      </w:pPr>
+      <w:r>
+        <w:rPr>
+          <w:rFonts w:ascii="Times New Roman" w:hAnsi="Times New Roman" w:cs="Times New Roman"/>
+          <w:b/>
+          <w:bCs/>
+          <w:sz w:val="28"/>
+          <w:szCs w:val="28"/>
+          <w:lang w:val="en-US"/>
+        </w:rPr>
+        <w:t xml:space="preserve">A. </w:t>
+      </w:r>
+      <w:r>
+        <w:rPr>
+          <w:rFonts w:ascii="Times New Roman" w:hAnsi="Times New Roman" w:cs="Times New Roman"/>
+          <w:b/>
+          <w:bCs/>
+          <w:sz w:val="28"/>
+          <w:szCs w:val="28"/>
+          <w:lang w:val="en-US"/>
+        </w:rPr>
+        <w:t>Capstone Project</w:t>
+      </w:r>
+    </w:p>
+    <w:p>
+      <w:pPr>
+        <w:ind w:left="360"/>
         <w:rPr>
           <w:rFonts w:ascii="Times New Roman" w:hAnsi="Times New Roman" w:cs="Times New Roman"/>
           <w:lang w:val="en-US"/>
@@ -928,12 +940,16 @@
         </w:numPr>
         <w:rPr>
           <w:rFonts w:ascii="Times New Roman" w:hAnsi="Times New Roman" w:cs="Times New Roman"/>
-          <w:lang w:val="en-US"/>
-        </w:rPr>
-      </w:pPr>
-      <w:r>
-        <w:rPr>
-          <w:rFonts w:ascii="Times New Roman" w:hAnsi="Times New Roman" w:cs="Times New Roman"/>
+          <w:b/>
+          <w:bCs/>
+          <w:lang w:val="en-US"/>
+        </w:rPr>
+      </w:pPr>
+      <w:r>
+        <w:rPr>
+          <w:rFonts w:ascii="Times New Roman" w:hAnsi="Times New Roman" w:cs="Times New Roman"/>
+          <w:b/>
+          <w:bCs/>
           <w:lang w:val="en-US"/>
         </w:rPr>
         <w:t>Cube slicing</w:t>
@@ -988,12 +1004,16 @@
         </w:numPr>
         <w:rPr>
           <w:rFonts w:ascii="Times New Roman" w:hAnsi="Times New Roman" w:cs="Times New Roman"/>
-          <w:lang w:val="en-US"/>
-        </w:rPr>
-      </w:pPr>
-      <w:r>
-        <w:rPr>
-          <w:rFonts w:ascii="Times New Roman" w:hAnsi="Times New Roman" w:cs="Times New Roman"/>
+          <w:b/>
+          <w:bCs/>
+          <w:lang w:val="en-US"/>
+        </w:rPr>
+      </w:pPr>
+      <w:r>
+        <w:rPr>
+          <w:rFonts w:ascii="Times New Roman" w:hAnsi="Times New Roman" w:cs="Times New Roman"/>
+          <w:b/>
+          <w:bCs/>
           <w:lang w:val="en-US"/>
         </w:rPr>
         <w:t>Design</w:t>
@@ -1001,11 +1021,53 @@
     </w:p>
     <w:p>
       <w:pPr>
-        <w:rPr>
-          <w:rFonts w:ascii="Times New Roman" w:hAnsi="Times New Roman" w:cs="Times New Roman"/>
-          <w:lang w:val="en-US"/>
-        </w:rPr>
-      </w:pPr>
+        <w:ind w:left="720"/>
+        <w:rPr>
+          <w:rFonts w:ascii="Times New Roman" w:hAnsi="Times New Roman" w:cs="Times New Roman"/>
+          <w:lang w:val="en-US"/>
+        </w:rPr>
+      </w:pPr>
+      <w:r>
+        <w:rPr>
+          <w:rFonts w:ascii="Times New Roman" w:hAnsi="Times New Roman" w:cs="Times New Roman"/>
+          <w:lang w:val="en-US"/>
+        </w:rPr>
+        <w:t xml:space="preserve">Poor design decisions are the cause of some of the previous issues mentioned in Cube slicing, Batch processing and MacOS </w:t>
+      </w:r>
+      <w:r>
+        <w:rPr>
+          <w:rFonts w:ascii="Times New Roman" w:hAnsi="Times New Roman" w:cs="Times New Roman"/>
+          <w:lang w:val="en-US"/>
+        </w:rPr>
+        <w:t>incompatibility</w:t>
+      </w:r>
+      <w:r>
+        <w:rPr>
+          <w:rFonts w:ascii="Times New Roman" w:hAnsi="Times New Roman" w:cs="Times New Roman"/>
+          <w:lang w:val="en-US"/>
+        </w:rPr>
+        <w:t xml:space="preserve">. </w:t>
+      </w:r>
+    </w:p>
+    <w:p>
+      <w:pPr>
+        <w:pStyle w:val="ListParagraph"/>
+        <w:numPr>
+          <w:ilvl w:val="1"/>
+          <w:numId w:val="2"/>
+        </w:numPr>
+        <w:rPr>
+          <w:rFonts w:ascii="Times New Roman" w:hAnsi="Times New Roman" w:cs="Times New Roman"/>
+          <w:lang w:val="en-US"/>
+        </w:rPr>
+      </w:pPr>
+      <w:r>
+        <w:rPr>
+          <w:rFonts w:ascii="Times New Roman" w:hAnsi="Times New Roman" w:cs="Times New Roman"/>
+          <w:lang w:val="en-US"/>
+        </w:rPr>
+        <w:t>Placing all functions and classes in one file</w:t>
+      </w:r>
       <w:r>
         <w:rPr>
           <w:rFonts w:ascii="Times New Roman" w:hAnsi="Times New Roman" w:cs="Times New Roman"/>
@@ -1013,15 +1075,142 @@
         </w:rPr>
         <w:t xml:space="preserve"> </w:t>
       </w:r>
+      <w:r>
+        <w:rPr>
+          <w:rFonts w:ascii="Times New Roman" w:hAnsi="Times New Roman" w:cs="Times New Roman"/>
+          <w:lang w:val="en-US"/>
+        </w:rPr>
+        <w:t>did not permit for changes to be made to variables, buttons or the functions without unintended errors.</w:t>
+      </w:r>
+    </w:p>
+    <w:p>
+      <w:pPr>
+        <w:pStyle w:val="ListParagraph"/>
+        <w:numPr>
+          <w:ilvl w:val="1"/>
+          <w:numId w:val="2"/>
+        </w:numPr>
+        <w:rPr>
+          <w:rFonts w:ascii="Times New Roman" w:hAnsi="Times New Roman" w:cs="Times New Roman"/>
+          <w:lang w:val="en-US"/>
+        </w:rPr>
+      </w:pPr>
+      <w:r>
+        <w:rPr>
+          <w:rFonts w:ascii="Times New Roman" w:hAnsi="Times New Roman" w:cs="Times New Roman"/>
+          <w:lang w:val="en-US"/>
+        </w:rPr>
+        <w:t xml:space="preserve">Using </w:t>
+      </w:r>
+      <w:proofErr w:type="spellStart"/>
+      <w:r>
+        <w:rPr>
+          <w:rFonts w:ascii="Times New Roman" w:hAnsi="Times New Roman" w:cs="Times New Roman"/>
+          <w:i/>
+          <w:iCs/>
+          <w:lang w:val="en-US"/>
+        </w:rPr>
+        <w:t>tkinter</w:t>
+      </w:r>
+      <w:proofErr w:type="spellEnd"/>
+      <w:r>
+        <w:rPr>
+          <w:rFonts w:ascii="Times New Roman" w:hAnsi="Times New Roman" w:cs="Times New Roman"/>
+          <w:lang w:val="en-US"/>
+        </w:rPr>
+        <w:t xml:space="preserve"> for the UI constrained development since it is </w:t>
+      </w:r>
+      <w:proofErr w:type="spellStart"/>
+      <w:r>
+        <w:rPr>
+          <w:rFonts w:ascii="Times New Roman" w:hAnsi="Times New Roman" w:cs="Times New Roman"/>
+          <w:lang w:val="en-US"/>
+        </w:rPr>
+        <w:t>uncompatible</w:t>
+      </w:r>
+      <w:proofErr w:type="spellEnd"/>
+      <w:r>
+        <w:rPr>
+          <w:rFonts w:ascii="Times New Roman" w:hAnsi="Times New Roman" w:cs="Times New Roman"/>
+          <w:lang w:val="en-US"/>
+        </w:rPr>
+        <w:t xml:space="preserve"> with certain libraries, especially when it came to the 3D visualization. This also made running </w:t>
+      </w:r>
+      <w:proofErr w:type="spellStart"/>
+      <w:r>
+        <w:rPr>
+          <w:rFonts w:ascii="Times New Roman" w:hAnsi="Times New Roman" w:cs="Times New Roman"/>
+          <w:i/>
+          <w:iCs/>
+          <w:lang w:val="en-US"/>
+        </w:rPr>
+        <w:t>mayavi</w:t>
+      </w:r>
+      <w:proofErr w:type="spellEnd"/>
+      <w:r>
+        <w:rPr>
+          <w:rFonts w:ascii="Times New Roman" w:hAnsi="Times New Roman" w:cs="Times New Roman"/>
+          <w:lang w:val="en-US"/>
+        </w:rPr>
+        <w:t xml:space="preserve"> considerably slow.</w:t>
+      </w:r>
+    </w:p>
+    <w:p>
+      <w:pPr>
+        <w:pStyle w:val="ListParagraph"/>
+        <w:numPr>
+          <w:ilvl w:val="1"/>
+          <w:numId w:val="2"/>
+        </w:numPr>
+        <w:rPr>
+          <w:rFonts w:ascii="Times New Roman" w:hAnsi="Times New Roman" w:cs="Times New Roman"/>
+          <w:lang w:val="en-US"/>
+        </w:rPr>
+      </w:pPr>
+      <w:r>
+        <w:rPr>
+          <w:rFonts w:ascii="Times New Roman" w:hAnsi="Times New Roman" w:cs="Times New Roman"/>
+          <w:lang w:val="en-US"/>
+        </w:rPr>
+        <w:lastRenderedPageBreak/>
+        <w:t xml:space="preserve">Using </w:t>
+      </w:r>
+      <w:proofErr w:type="spellStart"/>
+      <w:r>
+        <w:rPr>
+          <w:rFonts w:ascii="Times New Roman" w:hAnsi="Times New Roman" w:cs="Times New Roman"/>
+          <w:lang w:val="en-US"/>
+        </w:rPr>
+        <w:t>tkinter</w:t>
+      </w:r>
+      <w:proofErr w:type="spellEnd"/>
+      <w:r>
+        <w:rPr>
+          <w:rFonts w:ascii="Times New Roman" w:hAnsi="Times New Roman" w:cs="Times New Roman"/>
+          <w:lang w:val="en-US"/>
+        </w:rPr>
+        <w:t xml:space="preserve"> also resulted in different appearances for Mac and Windows. Required concessions to be made to the design of UI such as, making Collapsible panes instead of Tabs for the different button groups</w:t>
+      </w:r>
     </w:p>
     <w:p>
       <w:pPr>
         <w:ind w:left="720"/>
         <w:rPr>
           <w:rFonts w:ascii="Times New Roman" w:hAnsi="Times New Roman" w:cs="Times New Roman"/>
-          <w:lang w:val="en-US"/>
-        </w:rPr>
-      </w:pPr>
+          <w:b/>
+          <w:bCs/>
+          <w:lang w:val="en-US"/>
+        </w:rPr>
+      </w:pPr>
+      <w:r>
+        <w:rPr>
+          <w:rFonts w:ascii="Times New Roman" w:hAnsi="Times New Roman" w:cs="Times New Roman"/>
+          <w:b/>
+          <w:bCs/>
+          <w:lang w:val="en-US"/>
+        </w:rPr>
+        <w:t>Mac Version:</w:t>
+      </w:r>
     </w:p>
     <w:p>
       <w:pPr>
@@ -1031,15 +1220,74 @@
           <w:lang w:val="en-US"/>
         </w:rPr>
       </w:pPr>
+      <w:r>
+        <w:rPr>
+          <w:rFonts w:ascii="Times New Roman" w:hAnsi="Times New Roman" w:cs="Times New Roman"/>
+          <w:noProof/>
+          <w:lang w:val="en-US"/>
+        </w:rPr>
+        <w:drawing>
+          <wp:inline distT="0" distB="0" distL="0" distR="0" wp14:anchorId="7C9862AA" wp14:editId="684E1C3B">
+            <wp:extent cx="5731510" cy="3227070"/>
+            <wp:effectExtent l="0" t="0" r="0" b="0"/>
+            <wp:docPr id="2074968455" name="Picture 3" descr="A screenshot of a computer&#10;&#10;AI-generated content may be incorrect."/>
+            <wp:cNvGraphicFramePr>
+              <a:graphicFrameLocks xmlns:a="http://schemas.openxmlformats.org/drawingml/2006/main" noChangeAspect="1"/>
+            </wp:cNvGraphicFramePr>
+            <a:graphic xmlns:a="http://schemas.openxmlformats.org/drawingml/2006/main">
+              <a:graphicData uri="http://schemas.openxmlformats.org/drawingml/2006/picture">
+                <pic:pic xmlns:pic="http://schemas.openxmlformats.org/drawingml/2006/picture">
+                  <pic:nvPicPr>
+                    <pic:cNvPr id="2074968455" name="Picture 3" descr="A screenshot of a computer&#10;&#10;AI-generated content may be incorrect."/>
+                    <pic:cNvPicPr/>
+                  </pic:nvPicPr>
+                  <pic:blipFill>
+                    <a:blip r:embed="rId7" cstate="print">
+                      <a:extLst>
+                        <a:ext uri="{28A0092B-C50C-407E-A947-70E740481C1C}">
+                          <a14:useLocalDpi xmlns:a14="http://schemas.microsoft.com/office/drawing/2010/main" val="0"/>
+                        </a:ext>
+                      </a:extLst>
+                    </a:blip>
+                    <a:stretch>
+                      <a:fillRect/>
+                    </a:stretch>
+                  </pic:blipFill>
+                  <pic:spPr>
+                    <a:xfrm>
+                      <a:off x="0" y="0"/>
+                      <a:ext cx="5731510" cy="3227070"/>
+                    </a:xfrm>
+                    <a:prstGeom prst="rect">
+                      <a:avLst/>
+                    </a:prstGeom>
+                  </pic:spPr>
+                </pic:pic>
+              </a:graphicData>
+            </a:graphic>
+          </wp:inline>
+        </w:drawing>
+      </w:r>
     </w:p>
     <w:p>
       <w:pPr>
         <w:ind w:left="720"/>
         <w:rPr>
           <w:rFonts w:ascii="Times New Roman" w:hAnsi="Times New Roman" w:cs="Times New Roman"/>
-          <w:lang w:val="en-US"/>
-        </w:rPr>
-      </w:pPr>
+          <w:b/>
+          <w:bCs/>
+          <w:lang w:val="en-US"/>
+        </w:rPr>
+      </w:pPr>
+      <w:r>
+        <w:rPr>
+          <w:rFonts w:ascii="Times New Roman" w:hAnsi="Times New Roman" w:cs="Times New Roman"/>
+          <w:b/>
+          <w:bCs/>
+          <w:lang w:val="en-US"/>
+        </w:rPr>
+        <w:t>Windows Version:</w:t>
+      </w:r>
     </w:p>
     <w:p>
       <w:pPr>
@@ -1049,6 +1297,54 @@
           <w:lang w:val="en-US"/>
         </w:rPr>
       </w:pPr>
+      <w:r>
+        <w:rPr>
+          <w:rFonts w:ascii="Times New Roman" w:hAnsi="Times New Roman" w:cs="Times New Roman"/>
+          <w:noProof/>
+          <w:lang w:val="en-US"/>
+        </w:rPr>
+        <w:drawing>
+          <wp:inline distT="0" distB="0" distL="0" distR="0" wp14:anchorId="78EB1A45" wp14:editId="5914C509">
+            <wp:extent cx="5731510" cy="2863215"/>
+            <wp:effectExtent l="0" t="0" r="0" b="0"/>
+            <wp:docPr id="703638256" name="Picture 4" descr="A screenshot of a computer&#10;&#10;AI-generated content may be incorrect."/>
+            <wp:cNvGraphicFramePr>
+              <a:graphicFrameLocks xmlns:a="http://schemas.openxmlformats.org/drawingml/2006/main" noChangeAspect="1"/>
+            </wp:cNvGraphicFramePr>
+            <a:graphic xmlns:a="http://schemas.openxmlformats.org/drawingml/2006/main">
+              <a:graphicData uri="http://schemas.openxmlformats.org/drawingml/2006/picture">
+                <pic:pic xmlns:pic="http://schemas.openxmlformats.org/drawingml/2006/picture">
+                  <pic:nvPicPr>
+                    <pic:cNvPr id="703638256" name="Picture 4" descr="A screenshot of a computer&#10;&#10;AI-generated content may be incorrect."/>
+                    <pic:cNvPicPr/>
+                  </pic:nvPicPr>
+                  <pic:blipFill>
+                    <a:blip r:embed="rId8">
+                      <a:extLst>
+                        <a:ext uri="{28A0092B-C50C-407E-A947-70E740481C1C}">
+                          <a14:useLocalDpi xmlns:a14="http://schemas.microsoft.com/office/drawing/2010/main" val="0"/>
+                        </a:ext>
+                      </a:extLst>
+                    </a:blip>
+                    <a:stretch>
+                      <a:fillRect/>
+                    </a:stretch>
+                  </pic:blipFill>
+                  <pic:spPr>
+                    <a:xfrm>
+                      <a:off x="0" y="0"/>
+                      <a:ext cx="5731510" cy="2863215"/>
+                    </a:xfrm>
+                    <a:prstGeom prst="rect">
+                      <a:avLst/>
+                    </a:prstGeom>
+                  </pic:spPr>
+                </pic:pic>
+              </a:graphicData>
+            </a:graphic>
+          </wp:inline>
+        </w:drawing>
+      </w:r>
     </w:p>
     <w:p>
       <w:pPr>
@@ -1058,6 +1354,382 @@
           <w:lang w:val="en-US"/>
         </w:rPr>
       </w:pPr>
+    </w:p>
+    <w:p>
+      <w:pPr>
+        <w:ind w:left="720"/>
+        <w:rPr>
+          <w:rFonts w:ascii="Times New Roman" w:hAnsi="Times New Roman" w:cs="Times New Roman"/>
+          <w:lang w:val="en-US"/>
+        </w:rPr>
+      </w:pPr>
+    </w:p>
+    <w:p>
+      <w:pPr>
+        <w:ind w:left="720"/>
+        <w:rPr>
+          <w:rFonts w:ascii="Times New Roman" w:hAnsi="Times New Roman" w:cs="Times New Roman"/>
+          <w:lang w:val="en-US"/>
+        </w:rPr>
+      </w:pPr>
+    </w:p>
+    <w:p>
+      <w:pPr>
+        <w:rPr>
+          <w:rFonts w:ascii="Times New Roman" w:hAnsi="Times New Roman" w:cs="Times New Roman"/>
+          <w:lang w:val="en-US"/>
+        </w:rPr>
+      </w:pPr>
+    </w:p>
+    <w:p>
+      <w:pPr>
+        <w:rPr>
+          <w:rFonts w:ascii="Times New Roman" w:hAnsi="Times New Roman" w:cs="Times New Roman"/>
+          <w:b/>
+          <w:bCs/>
+          <w:sz w:val="28"/>
+          <w:szCs w:val="28"/>
+          <w:lang w:val="en-US"/>
+        </w:rPr>
+      </w:pPr>
+      <w:r>
+        <w:rPr>
+          <w:rFonts w:ascii="Times New Roman" w:hAnsi="Times New Roman" w:cs="Times New Roman"/>
+          <w:b/>
+          <w:bCs/>
+          <w:sz w:val="28"/>
+          <w:szCs w:val="28"/>
+          <w:lang w:val="en-US"/>
+        </w:rPr>
+        <w:lastRenderedPageBreak/>
+        <w:t>B. gpr.py</w:t>
+      </w:r>
+    </w:p>
+    <w:p>
+      <w:pPr>
+        <w:pStyle w:val="ListParagraph"/>
+        <w:numPr>
+          <w:ilvl w:val="0"/>
+          <w:numId w:val="5"/>
+        </w:numPr>
+        <w:rPr>
+          <w:rFonts w:ascii="Times New Roman" w:hAnsi="Times New Roman" w:cs="Times New Roman"/>
+          <w:b/>
+          <w:bCs/>
+          <w:lang w:val="en-US"/>
+        </w:rPr>
+      </w:pPr>
+      <w:r>
+        <w:rPr>
+          <w:rFonts w:ascii="Times New Roman" w:hAnsi="Times New Roman" w:cs="Times New Roman"/>
+          <w:b/>
+          <w:bCs/>
+          <w:lang w:val="en-US"/>
+        </w:rPr>
+        <w:t>UI</w:t>
+      </w:r>
+    </w:p>
+    <w:p>
+      <w:pPr>
+        <w:pStyle w:val="ListParagraph"/>
+        <w:rPr>
+          <w:rFonts w:ascii="Times New Roman" w:hAnsi="Times New Roman" w:cs="Times New Roman"/>
+          <w:lang w:val="en-US"/>
+        </w:rPr>
+      </w:pPr>
+      <w:r>
+        <w:rPr>
+          <w:rFonts w:ascii="Times New Roman" w:hAnsi="Times New Roman" w:cs="Times New Roman"/>
+          <w:lang w:val="en-US"/>
+        </w:rPr>
+        <w:t xml:space="preserve">The current UI is outdated and disorganized. </w:t>
+      </w:r>
+      <w:r>
+        <w:rPr>
+          <w:rFonts w:ascii="Times New Roman" w:hAnsi="Times New Roman" w:cs="Times New Roman"/>
+          <w:lang w:val="en-US"/>
+        </w:rPr>
+        <w:t>Acts as a high barrier to entry for non-technical users, or users with little to none programming experience.</w:t>
+      </w:r>
+    </w:p>
+    <w:p>
+      <w:pPr>
+        <w:pStyle w:val="ListParagraph"/>
+        <w:rPr>
+          <w:rFonts w:ascii="Times New Roman" w:hAnsi="Times New Roman" w:cs="Times New Roman"/>
+          <w:lang w:val="en-US"/>
+        </w:rPr>
+      </w:pPr>
+      <w:r>
+        <w:rPr>
+          <w:rFonts w:ascii="Times New Roman" w:hAnsi="Times New Roman" w:cs="Times New Roman"/>
+          <w:lang w:val="en-US"/>
+        </w:rPr>
+        <w:t xml:space="preserve">Since button layout is seemingly random, </w:t>
+      </w:r>
+      <w:proofErr w:type="gramStart"/>
+      <w:r>
+        <w:rPr>
+          <w:rFonts w:ascii="Times New Roman" w:hAnsi="Times New Roman" w:cs="Times New Roman"/>
+          <w:lang w:val="en-US"/>
+        </w:rPr>
+        <w:t>first time</w:t>
+      </w:r>
+      <w:proofErr w:type="gramEnd"/>
+      <w:r>
+        <w:rPr>
+          <w:rFonts w:ascii="Times New Roman" w:hAnsi="Times New Roman" w:cs="Times New Roman"/>
+          <w:lang w:val="en-US"/>
+        </w:rPr>
+        <w:t xml:space="preserve"> users take time to figure out workflow and understand button functionality</w:t>
+      </w:r>
+    </w:p>
+    <w:p>
+      <w:pPr>
+        <w:pStyle w:val="ListParagraph"/>
+        <w:rPr>
+          <w:rFonts w:ascii="Times New Roman" w:hAnsi="Times New Roman" w:cs="Times New Roman"/>
+          <w:lang w:val="en-US"/>
+        </w:rPr>
+      </w:pPr>
+      <w:r>
+        <w:rPr>
+          <w:rFonts w:ascii="Times New Roman" w:hAnsi="Times New Roman" w:cs="Times New Roman"/>
+          <w:noProof/>
+          <w:lang w:val="en-US"/>
+        </w:rPr>
+        <w:drawing>
+          <wp:inline distT="0" distB="0" distL="0" distR="0" wp14:anchorId="58519AE8" wp14:editId="59020039">
+            <wp:extent cx="5731510" cy="2910205"/>
+            <wp:effectExtent l="0" t="0" r="0" b="0"/>
+            <wp:docPr id="1869858423" name="Picture 5" descr="A screenshot of a computer&#10;&#10;AI-generated content may be incorrect."/>
+            <wp:cNvGraphicFramePr>
+              <a:graphicFrameLocks xmlns:a="http://schemas.openxmlformats.org/drawingml/2006/main" noChangeAspect="1"/>
+            </wp:cNvGraphicFramePr>
+            <a:graphic xmlns:a="http://schemas.openxmlformats.org/drawingml/2006/main">
+              <a:graphicData uri="http://schemas.openxmlformats.org/drawingml/2006/picture">
+                <pic:pic xmlns:pic="http://schemas.openxmlformats.org/drawingml/2006/picture">
+                  <pic:nvPicPr>
+                    <pic:cNvPr id="1869858423" name="Picture 5" descr="A screenshot of a computer&#10;&#10;AI-generated content may be incorrect."/>
+                    <pic:cNvPicPr/>
+                  </pic:nvPicPr>
+                  <pic:blipFill>
+                    <a:blip r:embed="rId9">
+                      <a:extLst>
+                        <a:ext uri="{28A0092B-C50C-407E-A947-70E740481C1C}">
+                          <a14:useLocalDpi xmlns:a14="http://schemas.microsoft.com/office/drawing/2010/main" val="0"/>
+                        </a:ext>
+                      </a:extLst>
+                    </a:blip>
+                    <a:stretch>
+                      <a:fillRect/>
+                    </a:stretch>
+                  </pic:blipFill>
+                  <pic:spPr>
+                    <a:xfrm>
+                      <a:off x="0" y="0"/>
+                      <a:ext cx="5731510" cy="2910205"/>
+                    </a:xfrm>
+                    <a:prstGeom prst="rect">
+                      <a:avLst/>
+                    </a:prstGeom>
+                  </pic:spPr>
+                </pic:pic>
+              </a:graphicData>
+            </a:graphic>
+          </wp:inline>
+        </w:drawing>
+      </w:r>
+    </w:p>
+    <w:p>
+      <w:pPr>
+        <w:ind w:left="360"/>
+        <w:rPr>
+          <w:rFonts w:ascii="Times New Roman" w:hAnsi="Times New Roman" w:cs="Times New Roman"/>
+          <w:b/>
+          <w:bCs/>
+          <w:lang w:val="en-US"/>
+        </w:rPr>
+      </w:pPr>
+    </w:p>
+    <w:p>
+      <w:pPr>
+        <w:ind w:left="360"/>
+        <w:rPr>
+          <w:rFonts w:ascii="Times New Roman" w:hAnsi="Times New Roman" w:cs="Times New Roman"/>
+          <w:b/>
+          <w:bCs/>
+          <w:lang w:val="en-US"/>
+        </w:rPr>
+      </w:pPr>
+      <w:r>
+        <w:rPr>
+          <w:rFonts w:ascii="Times New Roman" w:hAnsi="Times New Roman" w:cs="Times New Roman"/>
+          <w:b/>
+          <w:bCs/>
+          <w:lang w:val="en-US"/>
+        </w:rPr>
+        <w:t>Interpolation</w:t>
+      </w:r>
+    </w:p>
+    <w:p>
+      <w:pPr>
+        <w:pStyle w:val="ListParagraph"/>
+        <w:rPr>
+          <w:rFonts w:ascii="Times New Roman" w:hAnsi="Times New Roman" w:cs="Times New Roman"/>
+          <w:lang w:val="en-US"/>
+        </w:rPr>
+      </w:pPr>
+      <w:r>
+        <w:rPr>
+          <w:rFonts w:ascii="Times New Roman" w:hAnsi="Times New Roman" w:cs="Times New Roman"/>
+          <w:lang w:val="en-US"/>
+        </w:rPr>
+        <w:t xml:space="preserve">This is the function of combining a series of </w:t>
+      </w:r>
+      <w:proofErr w:type="spellStart"/>
+      <w:r>
+        <w:rPr>
+          <w:rFonts w:ascii="Times New Roman" w:hAnsi="Times New Roman" w:cs="Times New Roman"/>
+          <w:lang w:val="en-US"/>
+        </w:rPr>
+        <w:t>gpr</w:t>
+      </w:r>
+      <w:proofErr w:type="spellEnd"/>
+      <w:r>
+        <w:rPr>
+          <w:rFonts w:ascii="Times New Roman" w:hAnsi="Times New Roman" w:cs="Times New Roman"/>
+          <w:lang w:val="en-US"/>
+        </w:rPr>
+        <w:t xml:space="preserve"> files and creating a 3D cube of the </w:t>
+      </w:r>
+      <w:proofErr w:type="gramStart"/>
+      <w:r>
+        <w:rPr>
+          <w:rFonts w:ascii="Times New Roman" w:hAnsi="Times New Roman" w:cs="Times New Roman"/>
+          <w:lang w:val="en-US"/>
+        </w:rPr>
+        <w:t>area</w:t>
+      </w:r>
+      <w:r>
+        <w:rPr>
+          <w:rFonts w:ascii="Times New Roman" w:hAnsi="Times New Roman" w:cs="Times New Roman"/>
+          <w:lang w:val="en-US"/>
+        </w:rPr>
+        <w:t>, and</w:t>
+      </w:r>
+      <w:proofErr w:type="gramEnd"/>
+      <w:r>
+        <w:rPr>
+          <w:rFonts w:ascii="Times New Roman" w:hAnsi="Times New Roman" w:cs="Times New Roman"/>
+          <w:lang w:val="en-US"/>
+        </w:rPr>
+        <w:t xml:space="preserve"> is stored in the makeDataCube.py file</w:t>
+      </w:r>
+      <w:r>
+        <w:rPr>
+          <w:rFonts w:ascii="Times New Roman" w:hAnsi="Times New Roman" w:cs="Times New Roman"/>
+          <w:lang w:val="en-US"/>
+        </w:rPr>
+        <w:t xml:space="preserve">. </w:t>
+      </w:r>
+      <w:proofErr w:type="gramStart"/>
+      <w:r>
+        <w:rPr>
+          <w:rFonts w:ascii="Times New Roman" w:hAnsi="Times New Roman" w:cs="Times New Roman"/>
+          <w:lang w:val="en-US"/>
+        </w:rPr>
+        <w:t>However</w:t>
+      </w:r>
+      <w:proofErr w:type="gramEnd"/>
+      <w:r>
+        <w:rPr>
+          <w:rFonts w:ascii="Times New Roman" w:hAnsi="Times New Roman" w:cs="Times New Roman"/>
+          <w:lang w:val="en-US"/>
+        </w:rPr>
+        <w:t xml:space="preserve"> this functionality is not integrated </w:t>
+      </w:r>
+      <w:r>
+        <w:rPr>
+          <w:rFonts w:ascii="Times New Roman" w:hAnsi="Times New Roman" w:cs="Times New Roman"/>
+          <w:lang w:val="en-US"/>
+        </w:rPr>
+        <w:t xml:space="preserve">into the </w:t>
+      </w:r>
+      <w:proofErr w:type="spellStart"/>
+      <w:r>
+        <w:rPr>
+          <w:rFonts w:ascii="Times New Roman" w:hAnsi="Times New Roman" w:cs="Times New Roman"/>
+          <w:lang w:val="en-US"/>
+        </w:rPr>
+        <w:t>GPRpy</w:t>
+      </w:r>
+      <w:proofErr w:type="spellEnd"/>
+      <w:r>
+        <w:rPr>
+          <w:rFonts w:ascii="Times New Roman" w:hAnsi="Times New Roman" w:cs="Times New Roman"/>
+          <w:lang w:val="en-US"/>
+        </w:rPr>
+        <w:t xml:space="preserve"> program and requires additional scripting. On its own the program takes hours to complete, does not have a progress bar and has no way of stopping the process midway.</w:t>
+      </w:r>
+    </w:p>
+    <w:p>
+      <w:pPr>
+        <w:pStyle w:val="ListParagraph"/>
+        <w:rPr>
+          <w:rFonts w:ascii="Times New Roman" w:hAnsi="Times New Roman" w:cs="Times New Roman"/>
+          <w:lang w:val="en-US"/>
+        </w:rPr>
+      </w:pPr>
+    </w:p>
+    <w:p>
+      <w:pPr>
+        <w:pStyle w:val="ListParagraph"/>
+        <w:numPr>
+          <w:ilvl w:val="0"/>
+          <w:numId w:val="5"/>
+        </w:numPr>
+        <w:rPr>
+          <w:rFonts w:ascii="Times New Roman" w:hAnsi="Times New Roman" w:cs="Times New Roman"/>
+          <w:b/>
+          <w:bCs/>
+          <w:lang w:val="en-US"/>
+        </w:rPr>
+      </w:pPr>
+      <w:r>
+        <w:rPr>
+          <w:rFonts w:ascii="Times New Roman" w:hAnsi="Times New Roman" w:cs="Times New Roman"/>
+          <w:b/>
+          <w:bCs/>
+          <w:lang w:val="en-US"/>
+        </w:rPr>
+        <w:t>LiDAR correctio</w:t>
+      </w:r>
+      <w:r>
+        <w:rPr>
+          <w:rFonts w:ascii="Times New Roman" w:hAnsi="Times New Roman" w:cs="Times New Roman"/>
+          <w:b/>
+          <w:bCs/>
+          <w:lang w:val="en-US"/>
+        </w:rPr>
+        <w:t>n</w:t>
+      </w:r>
+    </w:p>
+    <w:p>
+      <w:pPr>
+        <w:ind w:left="720"/>
+        <w:rPr>
+          <w:rFonts w:ascii="Times New Roman" w:hAnsi="Times New Roman" w:cs="Times New Roman"/>
+          <w:lang w:val="en-US"/>
+        </w:rPr>
+      </w:pPr>
+      <w:r>
+        <w:rPr>
+          <w:rFonts w:ascii="Times New Roman" w:hAnsi="Times New Roman" w:cs="Times New Roman"/>
+          <w:lang w:val="en-US"/>
+        </w:rPr>
+        <w:t xml:space="preserve">One of the main issues faced by </w:t>
+      </w:r>
     </w:p>
     <w:sectPr>
       <w:pgSz w:w="11906" w:h="16838"/>
@@ -1072,6 +1744,273 @@
 <file path=word/numbering.xml><?xml version="1.0" encoding="utf-8"?>
 <w:numbering xmlns:wpc="http://schemas.microsoft.com/office/word/2010/wordprocessingCanvas" xmlns:cx="http://schemas.microsoft.com/office/drawing/2014/chartex" xmlns:cx1="http://schemas.microsoft.com/office/drawing/2015/9/8/chartex" xmlns:cx2="http://schemas.microsoft.com/office/drawing/2015/10/21/chartex" xmlns:cx3="http://schemas.microsoft.com/office/drawing/2016/5/9/chartex" xmlns:cx4="http://schemas.microsoft.com/office/drawing/2016/5/10/chartex" xmlns:cx5="http://schemas.microsoft.com/office/drawing/2016/5/11/chartex" xmlns:cx6="http://schemas.microsoft.com/office/drawing/2016/5/12/chartex" xmlns:cx7="http://schemas.microsoft.com/office/drawing/2016/5/13/chartex" xmlns:cx8="http://schemas.microsoft.com/office/drawing/2016/5/14/chartex" xmlns:mc="http://schemas.openxmlformats.org/markup-compatibility/2006" xmlns:aink="http://schemas.microsoft.com/office/drawing/2016/ink" xmlns:am3d="http://schemas.microsoft.com/office/drawing/2017/model3d" xmlns:o="urn:schemas-microsoft-com:office:office" xmlns:oel="http://schemas.microsoft.com/office/2019/extlst" xmlns:r="http://schemas.openxmlformats.org/officeDocument/2006/relationships" xmlns:m="http://schemas.openxmlformats.org/officeDocument/2006/math" xmlns:v="urn:schemas-microsoft-com:vml" xmlns:wp14="http://schemas.microsoft.com/office/word/2010/wordprocessingDrawing" xmlns:wp="http://schemas.openxmlformats.org/drawingml/2006/wordprocessingDrawing" xmlns:w10="urn:schemas-microsoft-com:office:word" xmlns:w="http://schemas.openxmlformats.org/wordprocessingml/2006/main" xmlns:w14="http://schemas.microsoft.com/office/word/2010/wordml" xmlns:w15="http://schemas.microsoft.com/office/word/2012/wordml" xmlns:w16cex="http://schemas.microsoft.com/office/word/2018/wordml/cex" xmlns:w16cid="http://schemas.microsoft.com/office/word/2016/wordml/cid" xmlns:w16="http://schemas.microsoft.com/office/word/2018/wordml" xmlns:w16du="http://schemas.microsoft.com/office/word/2023/wordml/word16du" xmlns:w16sdtdh="http://schemas.microsoft.com/office/word/2020/wordml/sdtdatahash" xmlns:w16sdtfl="http://schemas.microsoft.com/office/word/2024/wordml/sdtformatlock" xmlns:w16se="http://schemas.microsoft.com/office/word/2015/wordml/symex" xmlns:wpg="http://schemas.microsoft.com/office/word/2010/wordprocessingGroup" xmlns:wpi="http://schemas.microsoft.com/office/word/2010/wordprocessingInk" xmlns:wne="http://schemas.microsoft.com/office/word/2006/wordml" xmlns:wps="http://schemas.microsoft.com/office/word/2010/wordprocessingShape" mc:Ignorable="w14 w15 w16se w16cid w16 w16cex w16sdtdh w16sdtfl w16du wp14">
   <w:abstractNum w:abstractNumId="0" w15:restartNumberingAfterBreak="0">
+    <w:nsid w:val="08A021B0"/>
+    <w:multiLevelType w:val="hybridMultilevel"/>
+    <w:tmpl w:val="164221EE"/>
+    <w:lvl w:ilvl="0" w:tplc="08090011">
+      <w:start w:val="1"/>
+      <w:numFmt w:val="decimal"/>
+      <w:lvlText w:val="%1)"/>
+      <w:lvlJc w:val="left"/>
+      <w:pPr>
+        <w:ind w:left="720" w:hanging="360"/>
+      </w:pPr>
+      <w:rPr>
+        <w:rFonts w:hint="default"/>
+      </w:rPr>
+    </w:lvl>
+    <w:lvl w:ilvl="1" w:tplc="08090019" w:tentative="1">
+      <w:start w:val="1"/>
+      <w:numFmt w:val="lowerLetter"/>
+      <w:lvlText w:val="%2."/>
+      <w:lvlJc w:val="left"/>
+      <w:pPr>
+        <w:ind w:left="1440" w:hanging="360"/>
+      </w:pPr>
+    </w:lvl>
+    <w:lvl w:ilvl="2" w:tplc="0809001B" w:tentative="1">
+      <w:start w:val="1"/>
+      <w:numFmt w:val="lowerRoman"/>
+      <w:lvlText w:val="%3."/>
+      <w:lvlJc w:val="right"/>
+      <w:pPr>
+        <w:ind w:left="2160" w:hanging="180"/>
+      </w:pPr>
+    </w:lvl>
+    <w:lvl w:ilvl="3" w:tplc="0809000F" w:tentative="1">
+      <w:start w:val="1"/>
+      <w:numFmt w:val="decimal"/>
+      <w:lvlText w:val="%4."/>
+      <w:lvlJc w:val="left"/>
+      <w:pPr>
+        <w:ind w:left="2880" w:hanging="360"/>
+      </w:pPr>
+    </w:lvl>
+    <w:lvl w:ilvl="4" w:tplc="08090019" w:tentative="1">
+      <w:start w:val="1"/>
+      <w:numFmt w:val="lowerLetter"/>
+      <w:lvlText w:val="%5."/>
+      <w:lvlJc w:val="left"/>
+      <w:pPr>
+        <w:ind w:left="3600" w:hanging="360"/>
+      </w:pPr>
+    </w:lvl>
+    <w:lvl w:ilvl="5" w:tplc="0809001B" w:tentative="1">
+      <w:start w:val="1"/>
+      <w:numFmt w:val="lowerRoman"/>
+      <w:lvlText w:val="%6."/>
+      <w:lvlJc w:val="right"/>
+      <w:pPr>
+        <w:ind w:left="4320" w:hanging="180"/>
+      </w:pPr>
+    </w:lvl>
+    <w:lvl w:ilvl="6" w:tplc="0809000F" w:tentative="1">
+      <w:start w:val="1"/>
+      <w:numFmt w:val="decimal"/>
+      <w:lvlText w:val="%7."/>
+      <w:lvlJc w:val="left"/>
+      <w:pPr>
+        <w:ind w:left="5040" w:hanging="360"/>
+      </w:pPr>
+    </w:lvl>
+    <w:lvl w:ilvl="7" w:tplc="08090019" w:tentative="1">
+      <w:start w:val="1"/>
+      <w:numFmt w:val="lowerLetter"/>
+      <w:lvlText w:val="%8."/>
+      <w:lvlJc w:val="left"/>
+      <w:pPr>
+        <w:ind w:left="5760" w:hanging="360"/>
+      </w:pPr>
+    </w:lvl>
+    <w:lvl w:ilvl="8" w:tplc="0809001B" w:tentative="1">
+      <w:start w:val="1"/>
+      <w:numFmt w:val="lowerRoman"/>
+      <w:lvlText w:val="%9."/>
+      <w:lvlJc w:val="right"/>
+      <w:pPr>
+        <w:ind w:left="6480" w:hanging="180"/>
+      </w:pPr>
+    </w:lvl>
+  </w:abstractNum>
+  <w:abstractNum w:abstractNumId="1" w15:restartNumberingAfterBreak="0">
+    <w:nsid w:val="270A7175"/>
+    <w:multiLevelType w:val="hybridMultilevel"/>
+    <w:tmpl w:val="88E2C358"/>
+    <w:lvl w:ilvl="0" w:tplc="08090015">
+      <w:start w:val="1"/>
+      <w:numFmt w:val="upperLetter"/>
+      <w:lvlText w:val="%1."/>
+      <w:lvlJc w:val="left"/>
+      <w:pPr>
+        <w:ind w:left="720" w:hanging="360"/>
+      </w:pPr>
+      <w:rPr>
+        <w:rFonts w:hint="default"/>
+      </w:rPr>
+    </w:lvl>
+    <w:lvl w:ilvl="1" w:tplc="08090019" w:tentative="1">
+      <w:start w:val="1"/>
+      <w:numFmt w:val="lowerLetter"/>
+      <w:lvlText w:val="%2."/>
+      <w:lvlJc w:val="left"/>
+      <w:pPr>
+        <w:ind w:left="1440" w:hanging="360"/>
+      </w:pPr>
+    </w:lvl>
+    <w:lvl w:ilvl="2" w:tplc="0809001B" w:tentative="1">
+      <w:start w:val="1"/>
+      <w:numFmt w:val="lowerRoman"/>
+      <w:lvlText w:val="%3."/>
+      <w:lvlJc w:val="right"/>
+      <w:pPr>
+        <w:ind w:left="2160" w:hanging="180"/>
+      </w:pPr>
+    </w:lvl>
+    <w:lvl w:ilvl="3" w:tplc="0809000F" w:tentative="1">
+      <w:start w:val="1"/>
+      <w:numFmt w:val="decimal"/>
+      <w:lvlText w:val="%4."/>
+      <w:lvlJc w:val="left"/>
+      <w:pPr>
+        <w:ind w:left="2880" w:hanging="360"/>
+      </w:pPr>
+    </w:lvl>
+    <w:lvl w:ilvl="4" w:tplc="08090019" w:tentative="1">
+      <w:start w:val="1"/>
+      <w:numFmt w:val="lowerLetter"/>
+      <w:lvlText w:val="%5."/>
+      <w:lvlJc w:val="left"/>
+      <w:pPr>
+        <w:ind w:left="3600" w:hanging="360"/>
+      </w:pPr>
+    </w:lvl>
+    <w:lvl w:ilvl="5" w:tplc="0809001B" w:tentative="1">
+      <w:start w:val="1"/>
+      <w:numFmt w:val="lowerRoman"/>
+      <w:lvlText w:val="%6."/>
+      <w:lvlJc w:val="right"/>
+      <w:pPr>
+        <w:ind w:left="4320" w:hanging="180"/>
+      </w:pPr>
+    </w:lvl>
+    <w:lvl w:ilvl="6" w:tplc="0809000F" w:tentative="1">
+      <w:start w:val="1"/>
+      <w:numFmt w:val="decimal"/>
+      <w:lvlText w:val="%7."/>
+      <w:lvlJc w:val="left"/>
+      <w:pPr>
+        <w:ind w:left="5040" w:hanging="360"/>
+      </w:pPr>
+    </w:lvl>
+    <w:lvl w:ilvl="7" w:tplc="08090019" w:tentative="1">
+      <w:start w:val="1"/>
+      <w:numFmt w:val="lowerLetter"/>
+      <w:lvlText w:val="%8."/>
+      <w:lvlJc w:val="left"/>
+      <w:pPr>
+        <w:ind w:left="5760" w:hanging="360"/>
+      </w:pPr>
+    </w:lvl>
+    <w:lvl w:ilvl="8" w:tplc="0809001B" w:tentative="1">
+      <w:start w:val="1"/>
+      <w:numFmt w:val="lowerRoman"/>
+      <w:lvlText w:val="%9."/>
+      <w:lvlJc w:val="right"/>
+      <w:pPr>
+        <w:ind w:left="6480" w:hanging="180"/>
+      </w:pPr>
+    </w:lvl>
+  </w:abstractNum>
+  <w:abstractNum w:abstractNumId="2" w15:restartNumberingAfterBreak="0">
+    <w:nsid w:val="38AC53B2"/>
+    <w:multiLevelType w:val="hybridMultilevel"/>
+    <w:tmpl w:val="23245FD8"/>
+    <w:lvl w:ilvl="0" w:tplc="08090011">
+      <w:start w:val="1"/>
+      <w:numFmt w:val="decimal"/>
+      <w:lvlText w:val="%1)"/>
+      <w:lvlJc w:val="left"/>
+      <w:pPr>
+        <w:ind w:left="720" w:hanging="360"/>
+      </w:pPr>
+      <w:rPr>
+        <w:rFonts w:hint="default"/>
+      </w:rPr>
+    </w:lvl>
+    <w:lvl w:ilvl="1" w:tplc="08090019" w:tentative="1">
+      <w:start w:val="1"/>
+      <w:numFmt w:val="lowerLetter"/>
+      <w:lvlText w:val="%2."/>
+      <w:lvlJc w:val="left"/>
+      <w:pPr>
+        <w:ind w:left="1440" w:hanging="360"/>
+      </w:pPr>
+    </w:lvl>
+    <w:lvl w:ilvl="2" w:tplc="0809001B" w:tentative="1">
+      <w:start w:val="1"/>
+      <w:numFmt w:val="lowerRoman"/>
+      <w:lvlText w:val="%3."/>
+      <w:lvlJc w:val="right"/>
+      <w:pPr>
+        <w:ind w:left="2160" w:hanging="180"/>
+      </w:pPr>
+    </w:lvl>
+    <w:lvl w:ilvl="3" w:tplc="0809000F" w:tentative="1">
+      <w:start w:val="1"/>
+      <w:numFmt w:val="decimal"/>
+      <w:lvlText w:val="%4."/>
+      <w:lvlJc w:val="left"/>
+      <w:pPr>
+        <w:ind w:left="2880" w:hanging="360"/>
+      </w:pPr>
+    </w:lvl>
+    <w:lvl w:ilvl="4" w:tplc="08090019" w:tentative="1">
+      <w:start w:val="1"/>
+      <w:numFmt w:val="lowerLetter"/>
+      <w:lvlText w:val="%5."/>
+      <w:lvlJc w:val="left"/>
+      <w:pPr>
+        <w:ind w:left="3600" w:hanging="360"/>
+      </w:pPr>
+    </w:lvl>
+    <w:lvl w:ilvl="5" w:tplc="0809001B" w:tentative="1">
+      <w:start w:val="1"/>
+      <w:numFmt w:val="lowerRoman"/>
+      <w:lvlText w:val="%6."/>
+      <w:lvlJc w:val="right"/>
+      <w:pPr>
+        <w:ind w:left="4320" w:hanging="180"/>
+      </w:pPr>
+    </w:lvl>
+    <w:lvl w:ilvl="6" w:tplc="0809000F" w:tentative="1">
+      <w:start w:val="1"/>
+      <w:numFmt w:val="decimal"/>
+      <w:lvlText w:val="%7."/>
+      <w:lvlJc w:val="left"/>
+      <w:pPr>
+        <w:ind w:left="5040" w:hanging="360"/>
+      </w:pPr>
+    </w:lvl>
+    <w:lvl w:ilvl="7" w:tplc="08090019" w:tentative="1">
+      <w:start w:val="1"/>
+      <w:numFmt w:val="lowerLetter"/>
+      <w:lvlText w:val="%8."/>
+      <w:lvlJc w:val="left"/>
+      <w:pPr>
+        <w:ind w:left="5760" w:hanging="360"/>
+      </w:pPr>
+    </w:lvl>
+    <w:lvl w:ilvl="8" w:tplc="0809001B" w:tentative="1">
+      <w:start w:val="1"/>
+      <w:numFmt w:val="lowerRoman"/>
+      <w:lvlText w:val="%9."/>
+      <w:lvlJc w:val="right"/>
+      <w:pPr>
+        <w:ind w:left="6480" w:hanging="180"/>
+      </w:pPr>
+    </w:lvl>
+  </w:abstractNum>
+  <w:abstractNum w:abstractNumId="3" w15:restartNumberingAfterBreak="0">
     <w:nsid w:val="740E0BE0"/>
     <w:multiLevelType w:val="hybridMultilevel"/>
     <w:tmpl w:val="F104DA8A"/>
@@ -1160,7 +2099,7 @@
       </w:pPr>
     </w:lvl>
   </w:abstractNum>
-  <w:abstractNum w:abstractNumId="1" w15:restartNumberingAfterBreak="0">
+  <w:abstractNum w:abstractNumId="4" w15:restartNumberingAfterBreak="0">
     <w:nsid w:val="76992B80"/>
     <w:multiLevelType w:val="hybridMultilevel"/>
     <w:tmpl w:val="705C05EC"/>
@@ -1250,9 +2189,18 @@
     </w:lvl>
   </w:abstractNum>
   <w:num w:numId="1" w16cid:durableId="1975673213">
+    <w:abstractNumId w:val="4"/>
+  </w:num>
+  <w:num w:numId="2" w16cid:durableId="1319265623">
+    <w:abstractNumId w:val="3"/>
+  </w:num>
+  <w:num w:numId="3" w16cid:durableId="1926573245">
+    <w:abstractNumId w:val="2"/>
+  </w:num>
+  <w:num w:numId="4" w16cid:durableId="912082426">
     <w:abstractNumId w:val="1"/>
   </w:num>
-  <w:num w:numId="2" w16cid:durableId="1319265623">
+  <w:num w:numId="5" w16cid:durableId="1133017783">
     <w:abstractNumId w:val="0"/>
   </w:num>
 </w:numbering>

</xml_diff>

<commit_message>
Finished issues sections and started Goals section
</commit_message>
<xml_diff>
--- a/Project Plan/Project Plan.docx
+++ b/Project Plan/Project Plan.docx
@@ -254,6 +254,28 @@
           <w:lang w:val="en-US"/>
         </w:rPr>
         <w:t>.</w:t>
+      </w:r>
+      <w:r>
+        <w:rPr>
+          <w:rFonts w:ascii="Times New Roman" w:hAnsi="Times New Roman" w:cs="Times New Roman"/>
+          <w:lang w:val="en-US"/>
+        </w:rPr>
+        <w:t xml:space="preserve"> </w:t>
+      </w:r>
+    </w:p>
+    <w:p>
+      <w:pPr>
+        <w:rPr>
+          <w:rFonts w:ascii="Times New Roman" w:hAnsi="Times New Roman" w:cs="Times New Roman"/>
+          <w:lang w:val="en-US"/>
+        </w:rPr>
+      </w:pPr>
+      <w:r>
+        <w:rPr>
+          <w:rFonts w:ascii="Times New Roman" w:hAnsi="Times New Roman" w:cs="Times New Roman"/>
+          <w:lang w:val="en-US"/>
+        </w:rPr>
+        <w:t xml:space="preserve">The problem was first put forth by William Wadsworth, from the University of Alberta </w:t>
       </w:r>
     </w:p>
     <w:p>
@@ -478,7 +500,6 @@
           <w:szCs w:val="32"/>
           <w:lang w:val="en-US"/>
         </w:rPr>
-        <w:lastRenderedPageBreak/>
         <w:t>Issues</w:t>
       </w:r>
     </w:p>
@@ -785,7 +806,21 @@
           <w:rFonts w:ascii="Times New Roman" w:hAnsi="Times New Roman" w:cs="Times New Roman"/>
           <w:lang w:val="en-US"/>
         </w:rPr>
-        <w:t>The program also implemented a batch processing feature that enabled users to enter a set of parameters in a series of text fields, and those changes would be applied to the folder containing the GPR data. To speed up the process, threads were utilized and resulted in 60% faster processing times. However, it would result in memory leaks and</w:t>
+        <w:t xml:space="preserve">The program also implemented a batch processing feature that enabled users to enter a set of parameters in a series of text fields, and those changes would be applied to the folder containing the GPR data. </w:t>
+      </w:r>
+      <w:r>
+        <w:rPr>
+          <w:rFonts w:ascii="Times New Roman" w:hAnsi="Times New Roman" w:cs="Times New Roman"/>
+          <w:lang w:val="en-US"/>
+        </w:rPr>
+        <w:t xml:space="preserve">The original script was developed by William Wadsworth and Dr Something from the University of Laval. </w:t>
+      </w:r>
+      <w:r>
+        <w:rPr>
+          <w:rFonts w:ascii="Times New Roman" w:hAnsi="Times New Roman" w:cs="Times New Roman"/>
+          <w:lang w:val="en-US"/>
+        </w:rPr>
+        <w:t>To speed up the process, threads were utilized and resulted in 60% faster processing times. However, it would result in memory leaks and</w:t>
       </w:r>
       <w:r>
         <w:rPr>
@@ -818,7 +853,6 @@
           <w:noProof/>
           <w:lang w:val="en-US"/>
         </w:rPr>
-        <w:lastRenderedPageBreak/>
         <w:drawing>
           <wp:inline distT="0" distB="0" distL="0" distR="0" wp14:anchorId="65FE17F1" wp14:editId="39107F4E">
             <wp:extent cx="5731510" cy="3676015"/>
@@ -1554,136 +1588,6 @@
     </w:p>
     <w:p>
       <w:pPr>
-        <w:ind w:left="360"/>
-        <w:rPr>
-          <w:rFonts w:ascii="Times New Roman" w:hAnsi="Times New Roman" w:cs="Times New Roman"/>
-          <w:b/>
-          <w:bCs/>
-          <w:lang w:val="en-US"/>
-        </w:rPr>
-      </w:pPr>
-      <w:r>
-        <w:rPr>
-          <w:rFonts w:ascii="Times New Roman" w:hAnsi="Times New Roman" w:cs="Times New Roman"/>
-          <w:b/>
-          <w:bCs/>
-          <w:lang w:val="en-US"/>
-        </w:rPr>
-        <w:t>Interpolation</w:t>
-      </w:r>
-    </w:p>
-    <w:p>
-      <w:pPr>
-        <w:pStyle w:val="ListParagraph"/>
-        <w:rPr>
-          <w:rFonts w:ascii="Times New Roman" w:hAnsi="Times New Roman" w:cs="Times New Roman"/>
-          <w:lang w:val="en-US"/>
-        </w:rPr>
-      </w:pPr>
-      <w:r>
-        <w:rPr>
-          <w:rFonts w:ascii="Times New Roman" w:hAnsi="Times New Roman" w:cs="Times New Roman"/>
-          <w:lang w:val="en-US"/>
-        </w:rPr>
-        <w:t xml:space="preserve">This is the function of combining a series of </w:t>
-      </w:r>
-      <w:proofErr w:type="spellStart"/>
-      <w:r>
-        <w:rPr>
-          <w:rFonts w:ascii="Times New Roman" w:hAnsi="Times New Roman" w:cs="Times New Roman"/>
-          <w:lang w:val="en-US"/>
-        </w:rPr>
-        <w:t>gpr</w:t>
-      </w:r>
-      <w:proofErr w:type="spellEnd"/>
-      <w:r>
-        <w:rPr>
-          <w:rFonts w:ascii="Times New Roman" w:hAnsi="Times New Roman" w:cs="Times New Roman"/>
-          <w:lang w:val="en-US"/>
-        </w:rPr>
-        <w:t xml:space="preserve"> files and creating a 3D cube of the </w:t>
-      </w:r>
-      <w:proofErr w:type="gramStart"/>
-      <w:r>
-        <w:rPr>
-          <w:rFonts w:ascii="Times New Roman" w:hAnsi="Times New Roman" w:cs="Times New Roman"/>
-          <w:lang w:val="en-US"/>
-        </w:rPr>
-        <w:t>area</w:t>
-      </w:r>
-      <w:r>
-        <w:rPr>
-          <w:rFonts w:ascii="Times New Roman" w:hAnsi="Times New Roman" w:cs="Times New Roman"/>
-          <w:lang w:val="en-US"/>
-        </w:rPr>
-        <w:t>, and</w:t>
-      </w:r>
-      <w:proofErr w:type="gramEnd"/>
-      <w:r>
-        <w:rPr>
-          <w:rFonts w:ascii="Times New Roman" w:hAnsi="Times New Roman" w:cs="Times New Roman"/>
-          <w:lang w:val="en-US"/>
-        </w:rPr>
-        <w:t xml:space="preserve"> is stored in the makeDataCube.py file</w:t>
-      </w:r>
-      <w:r>
-        <w:rPr>
-          <w:rFonts w:ascii="Times New Roman" w:hAnsi="Times New Roman" w:cs="Times New Roman"/>
-          <w:lang w:val="en-US"/>
-        </w:rPr>
-        <w:t xml:space="preserve">. </w:t>
-      </w:r>
-      <w:proofErr w:type="gramStart"/>
-      <w:r>
-        <w:rPr>
-          <w:rFonts w:ascii="Times New Roman" w:hAnsi="Times New Roman" w:cs="Times New Roman"/>
-          <w:lang w:val="en-US"/>
-        </w:rPr>
-        <w:t>However</w:t>
-      </w:r>
-      <w:proofErr w:type="gramEnd"/>
-      <w:r>
-        <w:rPr>
-          <w:rFonts w:ascii="Times New Roman" w:hAnsi="Times New Roman" w:cs="Times New Roman"/>
-          <w:lang w:val="en-US"/>
-        </w:rPr>
-        <w:t xml:space="preserve"> this functionality is not integrated </w:t>
-      </w:r>
-      <w:r>
-        <w:rPr>
-          <w:rFonts w:ascii="Times New Roman" w:hAnsi="Times New Roman" w:cs="Times New Roman"/>
-          <w:lang w:val="en-US"/>
-        </w:rPr>
-        <w:t xml:space="preserve">into the </w:t>
-      </w:r>
-      <w:proofErr w:type="spellStart"/>
-      <w:r>
-        <w:rPr>
-          <w:rFonts w:ascii="Times New Roman" w:hAnsi="Times New Roman" w:cs="Times New Roman"/>
-          <w:lang w:val="en-US"/>
-        </w:rPr>
-        <w:t>GPRpy</w:t>
-      </w:r>
-      <w:proofErr w:type="spellEnd"/>
-      <w:r>
-        <w:rPr>
-          <w:rFonts w:ascii="Times New Roman" w:hAnsi="Times New Roman" w:cs="Times New Roman"/>
-          <w:lang w:val="en-US"/>
-        </w:rPr>
-        <w:t xml:space="preserve"> program and requires additional scripting. On its own the program takes hours to complete, does not have a progress bar and has no way of stopping the process midway.</w:t>
-      </w:r>
-    </w:p>
-    <w:p>
-      <w:pPr>
-        <w:pStyle w:val="ListParagraph"/>
-        <w:rPr>
-          <w:rFonts w:ascii="Times New Roman" w:hAnsi="Times New Roman" w:cs="Times New Roman"/>
-          <w:lang w:val="en-US"/>
-        </w:rPr>
-      </w:pPr>
-    </w:p>
-    <w:p>
-      <w:pPr>
         <w:pStyle w:val="ListParagraph"/>
         <w:numPr>
           <w:ilvl w:val="0"/>
@@ -1703,6 +1607,140 @@
           <w:bCs/>
           <w:lang w:val="en-US"/>
         </w:rPr>
+        <w:t>Interpolation</w:t>
+      </w:r>
+    </w:p>
+    <w:p>
+      <w:pPr>
+        <w:pStyle w:val="ListParagraph"/>
+        <w:rPr>
+          <w:rFonts w:ascii="Times New Roman" w:hAnsi="Times New Roman" w:cs="Times New Roman"/>
+          <w:lang w:val="en-US"/>
+        </w:rPr>
+      </w:pPr>
+      <w:r>
+        <w:rPr>
+          <w:rFonts w:ascii="Times New Roman" w:hAnsi="Times New Roman" w:cs="Times New Roman"/>
+          <w:lang w:val="en-US"/>
+        </w:rPr>
+        <w:t xml:space="preserve">This is the function of combining a series of </w:t>
+      </w:r>
+      <w:proofErr w:type="spellStart"/>
+      <w:r>
+        <w:rPr>
+          <w:rFonts w:ascii="Times New Roman" w:hAnsi="Times New Roman" w:cs="Times New Roman"/>
+          <w:lang w:val="en-US"/>
+        </w:rPr>
+        <w:t>gpr</w:t>
+      </w:r>
+      <w:proofErr w:type="spellEnd"/>
+      <w:r>
+        <w:rPr>
+          <w:rFonts w:ascii="Times New Roman" w:hAnsi="Times New Roman" w:cs="Times New Roman"/>
+          <w:lang w:val="en-US"/>
+        </w:rPr>
+        <w:t xml:space="preserve"> files and creating a 3D cube of the </w:t>
+      </w:r>
+      <w:proofErr w:type="gramStart"/>
+      <w:r>
+        <w:rPr>
+          <w:rFonts w:ascii="Times New Roman" w:hAnsi="Times New Roman" w:cs="Times New Roman"/>
+          <w:lang w:val="en-US"/>
+        </w:rPr>
+        <w:t>area</w:t>
+      </w:r>
+      <w:r>
+        <w:rPr>
+          <w:rFonts w:ascii="Times New Roman" w:hAnsi="Times New Roman" w:cs="Times New Roman"/>
+          <w:lang w:val="en-US"/>
+        </w:rPr>
+        <w:t>, and</w:t>
+      </w:r>
+      <w:proofErr w:type="gramEnd"/>
+      <w:r>
+        <w:rPr>
+          <w:rFonts w:ascii="Times New Roman" w:hAnsi="Times New Roman" w:cs="Times New Roman"/>
+          <w:lang w:val="en-US"/>
+        </w:rPr>
+        <w:t xml:space="preserve"> is stored in the makeDataCube.py file</w:t>
+      </w:r>
+      <w:r>
+        <w:rPr>
+          <w:rFonts w:ascii="Times New Roman" w:hAnsi="Times New Roman" w:cs="Times New Roman"/>
+          <w:lang w:val="en-US"/>
+        </w:rPr>
+        <w:t xml:space="preserve">. </w:t>
+      </w:r>
+      <w:proofErr w:type="gramStart"/>
+      <w:r>
+        <w:rPr>
+          <w:rFonts w:ascii="Times New Roman" w:hAnsi="Times New Roman" w:cs="Times New Roman"/>
+          <w:lang w:val="en-US"/>
+        </w:rPr>
+        <w:t>However</w:t>
+      </w:r>
+      <w:proofErr w:type="gramEnd"/>
+      <w:r>
+        <w:rPr>
+          <w:rFonts w:ascii="Times New Roman" w:hAnsi="Times New Roman" w:cs="Times New Roman"/>
+          <w:lang w:val="en-US"/>
+        </w:rPr>
+        <w:t xml:space="preserve"> this functionality is not integrated </w:t>
+      </w:r>
+      <w:r>
+        <w:rPr>
+          <w:rFonts w:ascii="Times New Roman" w:hAnsi="Times New Roman" w:cs="Times New Roman"/>
+          <w:lang w:val="en-US"/>
+        </w:rPr>
+        <w:t xml:space="preserve">into the </w:t>
+      </w:r>
+      <w:proofErr w:type="spellStart"/>
+      <w:r>
+        <w:rPr>
+          <w:rFonts w:ascii="Times New Roman" w:hAnsi="Times New Roman" w:cs="Times New Roman"/>
+          <w:lang w:val="en-US"/>
+        </w:rPr>
+        <w:t>GPRpy</w:t>
+      </w:r>
+      <w:proofErr w:type="spellEnd"/>
+      <w:r>
+        <w:rPr>
+          <w:rFonts w:ascii="Times New Roman" w:hAnsi="Times New Roman" w:cs="Times New Roman"/>
+          <w:lang w:val="en-US"/>
+        </w:rPr>
+        <w:t xml:space="preserve"> program and requires additional scripting. On its own the program takes hours to complete, does not have a progress bar and has no way of stopping the process midway.</w:t>
+      </w:r>
+    </w:p>
+    <w:p>
+      <w:pPr>
+        <w:pStyle w:val="ListParagraph"/>
+        <w:rPr>
+          <w:rFonts w:ascii="Times New Roman" w:hAnsi="Times New Roman" w:cs="Times New Roman"/>
+          <w:lang w:val="en-US"/>
+        </w:rPr>
+      </w:pPr>
+    </w:p>
+    <w:p>
+      <w:pPr>
+        <w:pStyle w:val="ListParagraph"/>
+        <w:numPr>
+          <w:ilvl w:val="0"/>
+          <w:numId w:val="5"/>
+        </w:numPr>
+        <w:rPr>
+          <w:rFonts w:ascii="Times New Roman" w:hAnsi="Times New Roman" w:cs="Times New Roman"/>
+          <w:b/>
+          <w:bCs/>
+          <w:lang w:val="en-US"/>
+        </w:rPr>
+      </w:pPr>
+      <w:r>
+        <w:rPr>
+          <w:rFonts w:ascii="Times New Roman" w:hAnsi="Times New Roman" w:cs="Times New Roman"/>
+          <w:b/>
+          <w:bCs/>
+          <w:lang w:val="en-US"/>
+        </w:rPr>
         <w:t>LiDAR correctio</w:t>
       </w:r>
       <w:r>
@@ -1728,8 +1766,160 @@
           <w:rFonts w:ascii="Times New Roman" w:hAnsi="Times New Roman" w:cs="Times New Roman"/>
           <w:lang w:val="en-US"/>
         </w:rPr>
-        <w:t xml:space="preserve">One of the main issues faced by </w:t>
-      </w:r>
+        <w:t xml:space="preserve">Since GPR data does not account </w:t>
+      </w:r>
+      <w:r>
+        <w:rPr>
+          <w:rFonts w:ascii="Times New Roman" w:hAnsi="Times New Roman" w:cs="Times New Roman"/>
+          <w:lang w:val="en-US"/>
+        </w:rPr>
+        <w:t xml:space="preserve">for </w:t>
+      </w:r>
+      <w:r>
+        <w:rPr>
+          <w:rFonts w:ascii="Times New Roman" w:hAnsi="Times New Roman" w:cs="Times New Roman"/>
+          <w:lang w:val="en-US"/>
+        </w:rPr>
+        <w:t>elevation of terrain</w:t>
+      </w:r>
+      <w:r>
+        <w:rPr>
+          <w:rFonts w:ascii="Times New Roman" w:hAnsi="Times New Roman" w:cs="Times New Roman"/>
+          <w:lang w:val="en-US"/>
+        </w:rPr>
+        <w:t xml:space="preserve">, finding accurate positions of </w:t>
+      </w:r>
+      <w:r>
+        <w:rPr>
+          <w:rFonts w:ascii="Times New Roman" w:hAnsi="Times New Roman" w:cs="Times New Roman"/>
+          <w:lang w:val="en-US"/>
+        </w:rPr>
+        <w:t>unmarked</w:t>
+      </w:r>
+      <w:r>
+        <w:rPr>
+          <w:rFonts w:ascii="Times New Roman" w:hAnsi="Times New Roman" w:cs="Times New Roman"/>
+          <w:lang w:val="en-US"/>
+        </w:rPr>
+        <w:t xml:space="preserve"> graves becomes difficult. This results in extra being spent to locate them via excavations, which is not feasible for small scale non-profit organizations</w:t>
+      </w:r>
+      <w:r>
+        <w:rPr>
+          <w:rFonts w:ascii="Times New Roman" w:hAnsi="Times New Roman" w:cs="Times New Roman"/>
+          <w:lang w:val="en-US"/>
+        </w:rPr>
+        <w:t xml:space="preserve"> that are known to do work related to this area. By incorporating LiDAR images of the landform and adjusting the </w:t>
+      </w:r>
+      <w:proofErr w:type="spellStart"/>
+      <w:r>
+        <w:rPr>
+          <w:rFonts w:ascii="Times New Roman" w:hAnsi="Times New Roman" w:cs="Times New Roman"/>
+          <w:lang w:val="en-US"/>
+        </w:rPr>
+        <w:t>gpr</w:t>
+      </w:r>
+      <w:proofErr w:type="spellEnd"/>
+      <w:r>
+        <w:rPr>
+          <w:rFonts w:ascii="Times New Roman" w:hAnsi="Times New Roman" w:cs="Times New Roman"/>
+          <w:lang w:val="en-US"/>
+        </w:rPr>
+        <w:t xml:space="preserve"> data for elevation, the positions of these graves are more precise. There are paid software alternatives, but licenses for them cost large sums of money and is not within the purchasing power of organizations with poor funding. William proposed this project with the goal of creating an </w:t>
+      </w:r>
+      <w:proofErr w:type="gramStart"/>
+      <w:r>
+        <w:rPr>
+          <w:rFonts w:ascii="Times New Roman" w:hAnsi="Times New Roman" w:cs="Times New Roman"/>
+          <w:lang w:val="en-US"/>
+        </w:rPr>
+        <w:t>open source</w:t>
+      </w:r>
+      <w:proofErr w:type="gramEnd"/>
+      <w:r>
+        <w:rPr>
+          <w:rFonts w:ascii="Times New Roman" w:hAnsi="Times New Roman" w:cs="Times New Roman"/>
+          <w:lang w:val="en-US"/>
+        </w:rPr>
+        <w:t xml:space="preserve"> version that can be distributed for free amongst such organizations like the IPIA</w:t>
+      </w:r>
+      <w:r>
+        <w:rPr>
+          <w:rFonts w:ascii="Times New Roman" w:hAnsi="Times New Roman" w:cs="Times New Roman"/>
+          <w:lang w:val="en-US"/>
+        </w:rPr>
+        <w:t xml:space="preserve"> and help in the discovery of unmarked graves</w:t>
+      </w:r>
+    </w:p>
+    <w:p>
+      <w:pPr>
+        <w:ind w:left="720"/>
+        <w:rPr>
+          <w:rFonts w:ascii="Times New Roman" w:hAnsi="Times New Roman" w:cs="Times New Roman"/>
+          <w:lang w:val="en-US"/>
+        </w:rPr>
+      </w:pPr>
+    </w:p>
+    <w:p>
+      <w:pPr>
+        <w:ind w:left="720"/>
+        <w:rPr>
+          <w:rFonts w:ascii="Times New Roman" w:hAnsi="Times New Roman" w:cs="Times New Roman"/>
+          <w:b/>
+          <w:bCs/>
+          <w:sz w:val="32"/>
+          <w:szCs w:val="32"/>
+          <w:lang w:val="en-US"/>
+        </w:rPr>
+      </w:pPr>
+      <w:r>
+        <w:rPr>
+          <w:rFonts w:ascii="Times New Roman" w:hAnsi="Times New Roman" w:cs="Times New Roman"/>
+          <w:b/>
+          <w:bCs/>
+          <w:sz w:val="32"/>
+          <w:szCs w:val="32"/>
+          <w:lang w:val="en-US"/>
+        </w:rPr>
+        <w:lastRenderedPageBreak/>
+        <w:t>Goals</w:t>
+      </w:r>
+      <w:r>
+        <w:rPr>
+          <w:rFonts w:ascii="Times New Roman" w:hAnsi="Times New Roman" w:cs="Times New Roman"/>
+          <w:b/>
+          <w:bCs/>
+          <w:sz w:val="32"/>
+          <w:szCs w:val="32"/>
+          <w:lang w:val="en-US"/>
+        </w:rPr>
+        <w:t xml:space="preserve"> </w:t>
+      </w:r>
+    </w:p>
+    <w:p>
+      <w:pPr>
+        <w:ind w:left="720"/>
+        <w:rPr>
+          <w:rFonts w:ascii="Times New Roman" w:hAnsi="Times New Roman" w:cs="Times New Roman"/>
+          <w:b/>
+          <w:bCs/>
+          <w:sz w:val="32"/>
+          <w:szCs w:val="32"/>
+          <w:lang w:val="en-US"/>
+        </w:rPr>
+      </w:pPr>
+    </w:p>
+    <w:p>
+      <w:pPr>
+        <w:ind w:left="720"/>
+        <w:rPr>
+          <w:rFonts w:ascii="Times New Roman" w:hAnsi="Times New Roman" w:cs="Times New Roman"/>
+          <w:b/>
+          <w:bCs/>
+          <w:sz w:val="32"/>
+          <w:szCs w:val="32"/>
+          <w:lang w:val="en-US"/>
+        </w:rPr>
+      </w:pPr>
     </w:p>
     <w:sectPr>
       <w:pgSz w:w="11906" w:h="16838"/>

</xml_diff>

<commit_message>
Completed Goals section, and added UI wireframes to doc
</commit_message>
<xml_diff>
--- a/Project Plan/Project Plan.docx
+++ b/Project Plan/Project Plan.docx
@@ -14,6 +14,17 @@
           <w:lang w:val="en-US"/>
         </w:rPr>
       </w:pPr>
+      <w:r>
+        <w:rPr>
+          <w:rFonts w:ascii="Times New Roman" w:hAnsi="Times New Roman" w:cs="Times New Roman"/>
+          <w:b/>
+          <w:bCs/>
+          <w:sz w:val="32"/>
+          <w:szCs w:val="32"/>
+          <w:lang w:val="en-US"/>
+        </w:rPr>
+        <w:t xml:space="preserve"> </w:t>
+      </w:r>
       <w:r>
         <w:rPr>
           <w:rFonts w:ascii="Times New Roman" w:hAnsi="Times New Roman" w:cs="Times New Roman"/>
@@ -854,7 +865,7 @@
           <w:lang w:val="en-US"/>
         </w:rPr>
         <w:drawing>
-          <wp:inline distT="0" distB="0" distL="0" distR="0" wp14:anchorId="65FE17F1" wp14:editId="39107F4E">
+          <wp:inline distT="0" distB="0" distL="0" distR="0" wp14:anchorId="65FE17F1" wp14:editId="22386370">
             <wp:extent cx="5731510" cy="3676015"/>
             <wp:effectExtent l="0" t="0" r="0" b="0"/>
             <wp:docPr id="1531882688" name="Picture 2"/>
@@ -1861,7 +1872,6 @@
     </w:p>
     <w:p>
       <w:pPr>
-        <w:ind w:left="720"/>
         <w:rPr>
           <w:rFonts w:ascii="Times New Roman" w:hAnsi="Times New Roman" w:cs="Times New Roman"/>
           <w:b/>
@@ -1897,29 +1907,1079 @@
     </w:p>
     <w:p>
       <w:pPr>
-        <w:ind w:left="720"/>
-        <w:rPr>
-          <w:rFonts w:ascii="Times New Roman" w:hAnsi="Times New Roman" w:cs="Times New Roman"/>
-          <w:b/>
-          <w:bCs/>
-          <w:sz w:val="32"/>
-          <w:szCs w:val="32"/>
-          <w:lang w:val="en-US"/>
-        </w:rPr>
-      </w:pPr>
-    </w:p>
-    <w:p>
-      <w:pPr>
-        <w:ind w:left="720"/>
-        <w:rPr>
-          <w:rFonts w:ascii="Times New Roman" w:hAnsi="Times New Roman" w:cs="Times New Roman"/>
-          <w:b/>
-          <w:bCs/>
-          <w:sz w:val="32"/>
-          <w:szCs w:val="32"/>
-          <w:lang w:val="en-US"/>
-        </w:rPr>
-      </w:pPr>
+        <w:pStyle w:val="ListParagraph"/>
+        <w:numPr>
+          <w:ilvl w:val="0"/>
+          <w:numId w:val="6"/>
+        </w:numPr>
+        <w:rPr>
+          <w:rFonts w:ascii="Times New Roman" w:hAnsi="Times New Roman" w:cs="Times New Roman"/>
+          <w:sz w:val="32"/>
+          <w:szCs w:val="32"/>
+          <w:lang w:val="en-US"/>
+        </w:rPr>
+      </w:pPr>
+      <w:r>
+        <w:rPr>
+          <w:rFonts w:ascii="Times New Roman" w:hAnsi="Times New Roman" w:cs="Times New Roman"/>
+          <w:sz w:val="32"/>
+          <w:szCs w:val="32"/>
+          <w:lang w:val="en-US"/>
+        </w:rPr>
+        <w:t>Improve UI</w:t>
+      </w:r>
+    </w:p>
+    <w:p>
+      <w:pPr>
+        <w:pStyle w:val="ListParagraph"/>
+        <w:ind w:left="1080"/>
+        <w:rPr>
+          <w:rFonts w:ascii="Times New Roman" w:hAnsi="Times New Roman" w:cs="Times New Roman"/>
+          <w:sz w:val="32"/>
+          <w:szCs w:val="32"/>
+          <w:lang w:val="en-US"/>
+        </w:rPr>
+      </w:pPr>
+      <w:r>
+        <w:rPr>
+          <w:rFonts w:ascii="Times New Roman" w:hAnsi="Times New Roman" w:cs="Times New Roman"/>
+          <w:sz w:val="32"/>
+          <w:szCs w:val="32"/>
+          <w:lang w:val="en-US"/>
+        </w:rPr>
+        <w:t xml:space="preserve">Utilize modern UI libraries to give a modern and familiar look and feel to the program. Organize functions and elements to reduce clutter </w:t>
+      </w:r>
+      <w:r>
+        <w:rPr>
+          <w:rFonts w:ascii="Times New Roman" w:hAnsi="Times New Roman" w:cs="Times New Roman"/>
+          <w:sz w:val="32"/>
+          <w:szCs w:val="32"/>
+          <w:lang w:val="en-US"/>
+        </w:rPr>
+        <w:t>and increase the space available to display GPR data. It also</w:t>
+      </w:r>
+      <w:r>
+        <w:rPr>
+          <w:rFonts w:ascii="Times New Roman" w:hAnsi="Times New Roman" w:cs="Times New Roman"/>
+          <w:sz w:val="32"/>
+          <w:szCs w:val="32"/>
+          <w:lang w:val="en-US"/>
+        </w:rPr>
+        <w:t xml:space="preserve"> allow</w:t>
+      </w:r>
+      <w:r>
+        <w:rPr>
+          <w:rFonts w:ascii="Times New Roman" w:hAnsi="Times New Roman" w:cs="Times New Roman"/>
+          <w:sz w:val="32"/>
+          <w:szCs w:val="32"/>
+          <w:lang w:val="en-US"/>
+        </w:rPr>
+        <w:t>s</w:t>
+      </w:r>
+      <w:r>
+        <w:rPr>
+          <w:rFonts w:ascii="Times New Roman" w:hAnsi="Times New Roman" w:cs="Times New Roman"/>
+          <w:sz w:val="32"/>
+          <w:szCs w:val="32"/>
+          <w:lang w:val="en-US"/>
+        </w:rPr>
+        <w:t xml:space="preserve"> user to create their own workflow. We will achieve this by grouping buttons by function type and placing them into separate tab groups. This permits users to pick and choose what changes aspect of the GPR data they will want to work with first. </w:t>
+      </w:r>
+    </w:p>
+    <w:p>
+      <w:pPr>
+        <w:rPr>
+          <w:rFonts w:ascii="Times New Roman" w:hAnsi="Times New Roman" w:cs="Times New Roman"/>
+          <w:sz w:val="32"/>
+          <w:szCs w:val="32"/>
+          <w:lang w:val="en-US"/>
+        </w:rPr>
+      </w:pPr>
+    </w:p>
+    <w:p>
+      <w:pPr>
+        <w:pStyle w:val="ListParagraph"/>
+        <w:numPr>
+          <w:ilvl w:val="0"/>
+          <w:numId w:val="6"/>
+        </w:numPr>
+        <w:rPr>
+          <w:rFonts w:ascii="Times New Roman" w:hAnsi="Times New Roman" w:cs="Times New Roman"/>
+          <w:sz w:val="32"/>
+          <w:szCs w:val="32"/>
+          <w:lang w:val="en-US"/>
+        </w:rPr>
+      </w:pPr>
+      <w:r>
+        <w:rPr>
+          <w:rFonts w:ascii="Times New Roman" w:hAnsi="Times New Roman" w:cs="Times New Roman"/>
+          <w:sz w:val="32"/>
+          <w:szCs w:val="32"/>
+          <w:lang w:val="en-US"/>
+        </w:rPr>
+        <w:t>Faster Performance</w:t>
+      </w:r>
+    </w:p>
+    <w:p>
+      <w:pPr>
+        <w:pStyle w:val="ListParagraph"/>
+        <w:ind w:left="1080"/>
+        <w:rPr>
+          <w:rFonts w:ascii="Times New Roman" w:hAnsi="Times New Roman" w:cs="Times New Roman"/>
+          <w:sz w:val="32"/>
+          <w:szCs w:val="32"/>
+          <w:lang w:val="en-US"/>
+        </w:rPr>
+      </w:pPr>
+      <w:r>
+        <w:rPr>
+          <w:rFonts w:ascii="Times New Roman" w:hAnsi="Times New Roman" w:cs="Times New Roman"/>
+          <w:sz w:val="32"/>
+          <w:szCs w:val="32"/>
+          <w:lang w:val="en-US"/>
+        </w:rPr>
+        <w:t xml:space="preserve">The current processing times for the </w:t>
+      </w:r>
+      <w:proofErr w:type="spellStart"/>
+      <w:r>
+        <w:rPr>
+          <w:rFonts w:ascii="Times New Roman" w:hAnsi="Times New Roman" w:cs="Times New Roman"/>
+          <w:i/>
+          <w:iCs/>
+          <w:sz w:val="32"/>
+          <w:szCs w:val="32"/>
+          <w:lang w:val="en-US"/>
+        </w:rPr>
+        <w:t>makeDataCube</w:t>
+      </w:r>
+      <w:proofErr w:type="spellEnd"/>
+      <w:r>
+        <w:rPr>
+          <w:rFonts w:ascii="Times New Roman" w:hAnsi="Times New Roman" w:cs="Times New Roman"/>
+          <w:sz w:val="32"/>
+          <w:szCs w:val="32"/>
+          <w:lang w:val="en-US"/>
+        </w:rPr>
+        <w:t xml:space="preserve">, and batch processing functions takes hours or several minutes, respectively. This makes implementing changes in data parameters difficult, since errors are not apparent until the function is done. We hope to accomplish this by reworking the functions themselves either by using alternative methods to create the data cube or to implement threads. This will hopefully speed up the </w:t>
+      </w:r>
+      <w:proofErr w:type="gramStart"/>
+      <w:r>
+        <w:rPr>
+          <w:rFonts w:ascii="Times New Roman" w:hAnsi="Times New Roman" w:cs="Times New Roman"/>
+          <w:sz w:val="32"/>
+          <w:szCs w:val="32"/>
+          <w:lang w:val="en-US"/>
+        </w:rPr>
+        <w:t>workflow  and</w:t>
+      </w:r>
+      <w:proofErr w:type="gramEnd"/>
+      <w:r>
+        <w:rPr>
+          <w:rFonts w:ascii="Times New Roman" w:hAnsi="Times New Roman" w:cs="Times New Roman"/>
+          <w:sz w:val="32"/>
+          <w:szCs w:val="32"/>
+          <w:lang w:val="en-US"/>
+        </w:rPr>
+        <w:t xml:space="preserve"> permit faster iterations.</w:t>
+      </w:r>
+    </w:p>
+    <w:p>
+      <w:pPr>
+        <w:rPr>
+          <w:rFonts w:ascii="Times New Roman" w:hAnsi="Times New Roman" w:cs="Times New Roman"/>
+          <w:sz w:val="32"/>
+          <w:szCs w:val="32"/>
+          <w:lang w:val="en-US"/>
+        </w:rPr>
+      </w:pPr>
+    </w:p>
+    <w:p>
+      <w:pPr>
+        <w:pStyle w:val="ListParagraph"/>
+        <w:numPr>
+          <w:ilvl w:val="0"/>
+          <w:numId w:val="6"/>
+        </w:numPr>
+        <w:rPr>
+          <w:rFonts w:ascii="Times New Roman" w:hAnsi="Times New Roman" w:cs="Times New Roman"/>
+          <w:sz w:val="32"/>
+          <w:szCs w:val="32"/>
+          <w:lang w:val="en-US"/>
+        </w:rPr>
+      </w:pPr>
+      <w:r>
+        <w:rPr>
+          <w:rFonts w:ascii="Times New Roman" w:hAnsi="Times New Roman" w:cs="Times New Roman"/>
+          <w:sz w:val="32"/>
+          <w:szCs w:val="32"/>
+          <w:lang w:val="en-US"/>
+        </w:rPr>
+        <w:t>3D manipulation</w:t>
+      </w:r>
+    </w:p>
+    <w:p>
+      <w:pPr>
+        <w:pStyle w:val="ListParagraph"/>
+        <w:ind w:left="1080"/>
+        <w:rPr>
+          <w:rFonts w:ascii="Times New Roman" w:hAnsi="Times New Roman" w:cs="Times New Roman"/>
+          <w:sz w:val="32"/>
+          <w:szCs w:val="32"/>
+          <w:lang w:val="en-US"/>
+        </w:rPr>
+      </w:pPr>
+      <w:r>
+        <w:rPr>
+          <w:rFonts w:ascii="Times New Roman" w:hAnsi="Times New Roman" w:cs="Times New Roman"/>
+          <w:sz w:val="32"/>
+          <w:szCs w:val="32"/>
+          <w:lang w:val="en-US"/>
+        </w:rPr>
+        <w:t xml:space="preserve">One of the main uses of the GPR data is to combine the collected data into a cube, via an interpolation function. This cube is then sliced, viewed in </w:t>
+      </w:r>
+      <w:r>
+        <w:rPr>
+          <w:rFonts w:ascii="Times New Roman" w:hAnsi="Times New Roman" w:cs="Times New Roman"/>
+          <w:sz w:val="32"/>
+          <w:szCs w:val="32"/>
+          <w:lang w:val="en-US"/>
+        </w:rPr>
+        <w:t xml:space="preserve">different modes to identify disturbances in the soil. However, this is only possible by using different software causing a </w:t>
+      </w:r>
+      <w:proofErr w:type="spellStart"/>
+      <w:r>
+        <w:rPr>
+          <w:rFonts w:ascii="Times New Roman" w:hAnsi="Times New Roman" w:cs="Times New Roman"/>
+          <w:sz w:val="32"/>
+          <w:szCs w:val="32"/>
+          <w:lang w:val="en-US"/>
+        </w:rPr>
+        <w:t>slow down</w:t>
+      </w:r>
+      <w:proofErr w:type="spellEnd"/>
+      <w:r>
+        <w:rPr>
+          <w:rFonts w:ascii="Times New Roman" w:hAnsi="Times New Roman" w:cs="Times New Roman"/>
+          <w:sz w:val="32"/>
+          <w:szCs w:val="32"/>
+          <w:lang w:val="en-US"/>
+        </w:rPr>
+        <w:t xml:space="preserve"> in the data extraction process due to the steep learning curve. By incorporating a </w:t>
+      </w:r>
+      <w:proofErr w:type="gramStart"/>
+      <w:r>
+        <w:rPr>
+          <w:rFonts w:ascii="Times New Roman" w:hAnsi="Times New Roman" w:cs="Times New Roman"/>
+          <w:sz w:val="32"/>
+          <w:szCs w:val="32"/>
+          <w:lang w:val="en-US"/>
+        </w:rPr>
+        <w:t>stripped down</w:t>
+      </w:r>
+      <w:proofErr w:type="gramEnd"/>
+      <w:r>
+        <w:rPr>
+          <w:rFonts w:ascii="Times New Roman" w:hAnsi="Times New Roman" w:cs="Times New Roman"/>
+          <w:sz w:val="32"/>
+          <w:szCs w:val="32"/>
+          <w:lang w:val="en-US"/>
+        </w:rPr>
+        <w:t xml:space="preserve"> version of a 3D visualization software, that includes only the functions necessary for this </w:t>
+      </w:r>
+      <w:r>
+        <w:rPr>
+          <w:rFonts w:ascii="Times New Roman" w:hAnsi="Times New Roman" w:cs="Times New Roman"/>
+          <w:sz w:val="32"/>
+          <w:szCs w:val="32"/>
+          <w:lang w:val="en-US"/>
+        </w:rPr>
+        <w:lastRenderedPageBreak/>
+        <w:t xml:space="preserve">workflow, we can make the entire process much smoother for non-technical users. </w:t>
+      </w:r>
+    </w:p>
+    <w:p>
+      <w:pPr>
+        <w:rPr>
+          <w:rFonts w:ascii="Times New Roman" w:hAnsi="Times New Roman" w:cs="Times New Roman"/>
+          <w:sz w:val="32"/>
+          <w:szCs w:val="32"/>
+          <w:lang w:val="en-US"/>
+        </w:rPr>
+      </w:pPr>
+    </w:p>
+    <w:p>
+      <w:pPr>
+        <w:pStyle w:val="ListParagraph"/>
+        <w:numPr>
+          <w:ilvl w:val="0"/>
+          <w:numId w:val="6"/>
+        </w:numPr>
+        <w:rPr>
+          <w:rFonts w:ascii="Times New Roman" w:hAnsi="Times New Roman" w:cs="Times New Roman"/>
+          <w:sz w:val="32"/>
+          <w:szCs w:val="32"/>
+          <w:lang w:val="en-US"/>
+        </w:rPr>
+      </w:pPr>
+      <w:r>
+        <w:rPr>
+          <w:rFonts w:ascii="Times New Roman" w:hAnsi="Times New Roman" w:cs="Times New Roman"/>
+          <w:sz w:val="32"/>
+          <w:szCs w:val="32"/>
+          <w:lang w:val="en-US"/>
+        </w:rPr>
+        <w:t>Elevation correction</w:t>
+      </w:r>
+    </w:p>
+    <w:p>
+      <w:pPr>
+        <w:pStyle w:val="ListParagraph"/>
+        <w:ind w:left="1080"/>
+        <w:rPr>
+          <w:rFonts w:ascii="Times New Roman" w:hAnsi="Times New Roman" w:cs="Times New Roman"/>
+          <w:sz w:val="32"/>
+          <w:szCs w:val="32"/>
+          <w:lang w:val="en-US"/>
+        </w:rPr>
+      </w:pPr>
+      <w:r>
+        <w:rPr>
+          <w:rFonts w:ascii="Times New Roman" w:hAnsi="Times New Roman" w:cs="Times New Roman"/>
+          <w:sz w:val="32"/>
+          <w:szCs w:val="32"/>
+          <w:lang w:val="en-US"/>
+        </w:rPr>
+        <w:t xml:space="preserve">One of the main challenges with GPR data is that elevation of the terrain is not measured. This makes accurately locating structures underground difficult. Elevation correction solutions do </w:t>
+      </w:r>
+      <w:proofErr w:type="gramStart"/>
+      <w:r>
+        <w:rPr>
+          <w:rFonts w:ascii="Times New Roman" w:hAnsi="Times New Roman" w:cs="Times New Roman"/>
+          <w:sz w:val="32"/>
+          <w:szCs w:val="32"/>
+          <w:lang w:val="en-US"/>
+        </w:rPr>
+        <w:t>exist, but</w:t>
+      </w:r>
+      <w:proofErr w:type="gramEnd"/>
+      <w:r>
+        <w:rPr>
+          <w:rFonts w:ascii="Times New Roman" w:hAnsi="Times New Roman" w:cs="Times New Roman"/>
+          <w:sz w:val="32"/>
+          <w:szCs w:val="32"/>
+          <w:lang w:val="en-US"/>
+        </w:rPr>
+        <w:t xml:space="preserve"> are locked behind paywall or paid licenses which is difficult for </w:t>
+      </w:r>
+      <w:proofErr w:type="spellStart"/>
+      <w:r>
+        <w:rPr>
+          <w:rFonts w:ascii="Times New Roman" w:hAnsi="Times New Roman" w:cs="Times New Roman"/>
+          <w:sz w:val="32"/>
+          <w:szCs w:val="32"/>
+          <w:lang w:val="en-US"/>
+        </w:rPr>
+        <w:t>orgainzations</w:t>
+      </w:r>
+      <w:proofErr w:type="spellEnd"/>
+      <w:r>
+        <w:rPr>
+          <w:rFonts w:ascii="Times New Roman" w:hAnsi="Times New Roman" w:cs="Times New Roman"/>
+          <w:sz w:val="32"/>
+          <w:szCs w:val="32"/>
+          <w:lang w:val="en-US"/>
+        </w:rPr>
+        <w:t xml:space="preserve"> will low funding to procure. We hope to identify an effective solution by using LiDAR imagery to help adjust the elevation. </w:t>
+      </w:r>
+    </w:p>
+    <w:p>
+      <w:pPr>
+        <w:ind w:left="720"/>
+        <w:rPr>
+          <w:rFonts w:ascii="Times New Roman" w:hAnsi="Times New Roman" w:cs="Times New Roman"/>
+          <w:b/>
+          <w:bCs/>
+          <w:sz w:val="32"/>
+          <w:szCs w:val="32"/>
+          <w:lang w:val="en-US"/>
+        </w:rPr>
+      </w:pPr>
+    </w:p>
+    <w:p>
+      <w:pPr>
+        <w:ind w:left="720"/>
+        <w:rPr>
+          <w:rFonts w:ascii="Times New Roman" w:hAnsi="Times New Roman" w:cs="Times New Roman"/>
+          <w:b/>
+          <w:bCs/>
+          <w:sz w:val="32"/>
+          <w:szCs w:val="32"/>
+          <w:lang w:val="en-US"/>
+        </w:rPr>
+      </w:pPr>
+    </w:p>
+    <w:p>
+      <w:pPr>
+        <w:ind w:left="720"/>
+        <w:rPr>
+          <w:rFonts w:ascii="Times New Roman" w:hAnsi="Times New Roman" w:cs="Times New Roman"/>
+          <w:b/>
+          <w:bCs/>
+          <w:sz w:val="32"/>
+          <w:szCs w:val="32"/>
+          <w:lang w:val="en-US"/>
+        </w:rPr>
+      </w:pPr>
+    </w:p>
+    <w:p>
+      <w:pPr>
+        <w:ind w:left="720"/>
+        <w:rPr>
+          <w:rFonts w:ascii="Times New Roman" w:hAnsi="Times New Roman" w:cs="Times New Roman"/>
+          <w:b/>
+          <w:bCs/>
+          <w:sz w:val="32"/>
+          <w:szCs w:val="32"/>
+          <w:lang w:val="en-US"/>
+        </w:rPr>
+      </w:pPr>
+    </w:p>
+    <w:p>
+      <w:pPr>
+        <w:ind w:left="720"/>
+        <w:rPr>
+          <w:rFonts w:ascii="Times New Roman" w:hAnsi="Times New Roman" w:cs="Times New Roman"/>
+          <w:b/>
+          <w:bCs/>
+          <w:sz w:val="32"/>
+          <w:szCs w:val="32"/>
+          <w:lang w:val="en-US"/>
+        </w:rPr>
+      </w:pPr>
+    </w:p>
+    <w:p>
+      <w:pPr>
+        <w:ind w:left="720"/>
+        <w:rPr>
+          <w:rFonts w:ascii="Times New Roman" w:hAnsi="Times New Roman" w:cs="Times New Roman"/>
+          <w:b/>
+          <w:bCs/>
+          <w:sz w:val="32"/>
+          <w:szCs w:val="32"/>
+          <w:lang w:val="en-US"/>
+        </w:rPr>
+      </w:pPr>
+    </w:p>
+    <w:p>
+      <w:pPr>
+        <w:ind w:left="720"/>
+        <w:rPr>
+          <w:rFonts w:ascii="Times New Roman" w:hAnsi="Times New Roman" w:cs="Times New Roman"/>
+          <w:b/>
+          <w:bCs/>
+          <w:sz w:val="32"/>
+          <w:szCs w:val="32"/>
+          <w:lang w:val="en-US"/>
+        </w:rPr>
+      </w:pPr>
+    </w:p>
+    <w:p>
+      <w:pPr>
+        <w:ind w:left="720"/>
+        <w:rPr>
+          <w:rFonts w:ascii="Times New Roman" w:hAnsi="Times New Roman" w:cs="Times New Roman"/>
+          <w:b/>
+          <w:bCs/>
+          <w:sz w:val="32"/>
+          <w:szCs w:val="32"/>
+          <w:lang w:val="en-US"/>
+        </w:rPr>
+      </w:pPr>
+    </w:p>
+    <w:p>
+      <w:pPr>
+        <w:ind w:left="720"/>
+        <w:rPr>
+          <w:rFonts w:ascii="Times New Roman" w:hAnsi="Times New Roman" w:cs="Times New Roman"/>
+          <w:b/>
+          <w:bCs/>
+          <w:sz w:val="32"/>
+          <w:szCs w:val="32"/>
+          <w:lang w:val="en-US"/>
+        </w:rPr>
+      </w:pPr>
+    </w:p>
+    <w:p>
+      <w:pPr>
+        <w:ind w:left="720"/>
+        <w:rPr>
+          <w:rFonts w:ascii="Times New Roman" w:hAnsi="Times New Roman" w:cs="Times New Roman"/>
+          <w:b/>
+          <w:bCs/>
+          <w:sz w:val="32"/>
+          <w:szCs w:val="32"/>
+          <w:lang w:val="en-US"/>
+        </w:rPr>
+      </w:pPr>
+    </w:p>
+    <w:p>
+      <w:pPr>
+        <w:ind w:left="720"/>
+        <w:rPr>
+          <w:rFonts w:ascii="Times New Roman" w:hAnsi="Times New Roman" w:cs="Times New Roman"/>
+          <w:b/>
+          <w:bCs/>
+          <w:sz w:val="32"/>
+          <w:szCs w:val="32"/>
+          <w:lang w:val="en-US"/>
+        </w:rPr>
+      </w:pPr>
+    </w:p>
+    <w:p>
+      <w:pPr>
+        <w:ind w:left="720"/>
+        <w:rPr>
+          <w:rFonts w:ascii="Times New Roman" w:hAnsi="Times New Roman" w:cs="Times New Roman"/>
+          <w:b/>
+          <w:bCs/>
+          <w:sz w:val="32"/>
+          <w:szCs w:val="32"/>
+          <w:lang w:val="en-US"/>
+        </w:rPr>
+      </w:pPr>
+    </w:p>
+    <w:p>
+      <w:pPr>
+        <w:ind w:left="720"/>
+        <w:rPr>
+          <w:rFonts w:ascii="Times New Roman" w:hAnsi="Times New Roman" w:cs="Times New Roman"/>
+          <w:b/>
+          <w:bCs/>
+          <w:sz w:val="32"/>
+          <w:szCs w:val="32"/>
+          <w:lang w:val="en-US"/>
+        </w:rPr>
+      </w:pPr>
+    </w:p>
+    <w:p>
+      <w:pPr>
+        <w:ind w:left="720"/>
+        <w:rPr>
+          <w:rFonts w:ascii="Times New Roman" w:hAnsi="Times New Roman" w:cs="Times New Roman"/>
+          <w:b/>
+          <w:bCs/>
+          <w:sz w:val="32"/>
+          <w:szCs w:val="32"/>
+          <w:lang w:val="en-US"/>
+        </w:rPr>
+      </w:pPr>
+    </w:p>
+    <w:p>
+      <w:pPr>
+        <w:rPr>
+          <w:rFonts w:ascii="Times New Roman" w:hAnsi="Times New Roman" w:cs="Times New Roman"/>
+          <w:b/>
+          <w:bCs/>
+          <w:sz w:val="32"/>
+          <w:szCs w:val="32"/>
+          <w:lang w:val="en-US"/>
+        </w:rPr>
+      </w:pPr>
+    </w:p>
+    <w:p>
+      <w:pPr>
+        <w:rPr>
+          <w:rFonts w:ascii="Times New Roman" w:hAnsi="Times New Roman" w:cs="Times New Roman"/>
+          <w:b/>
+          <w:bCs/>
+          <w:sz w:val="32"/>
+          <w:szCs w:val="32"/>
+          <w:lang w:val="en-US"/>
+        </w:rPr>
+      </w:pPr>
+      <w:r>
+        <w:rPr>
+          <w:rFonts w:ascii="Times New Roman" w:hAnsi="Times New Roman" w:cs="Times New Roman"/>
+          <w:b/>
+          <w:bCs/>
+          <w:sz w:val="32"/>
+          <w:szCs w:val="32"/>
+          <w:lang w:val="en-US"/>
+        </w:rPr>
+        <w:lastRenderedPageBreak/>
+        <w:t>Wireframes</w:t>
+      </w:r>
+    </w:p>
+    <w:p>
+      <w:pPr>
+        <w:ind w:left="720"/>
+        <w:rPr>
+          <w:rFonts w:ascii="Times New Roman" w:hAnsi="Times New Roman" w:cs="Times New Roman"/>
+          <w:sz w:val="28"/>
+          <w:szCs w:val="28"/>
+          <w:lang w:val="en-US"/>
+        </w:rPr>
+      </w:pPr>
+      <w:r>
+        <w:rPr>
+          <w:rFonts w:ascii="Times New Roman" w:hAnsi="Times New Roman" w:cs="Times New Roman"/>
+          <w:sz w:val="28"/>
+          <w:szCs w:val="28"/>
+          <w:lang w:val="en-US"/>
+        </w:rPr>
+        <w:t xml:space="preserve">Main Screen: </w:t>
+      </w:r>
+    </w:p>
+    <w:p>
+      <w:pPr>
+        <w:ind w:left="720"/>
+        <w:rPr>
+          <w:rFonts w:ascii="Times New Roman" w:hAnsi="Times New Roman" w:cs="Times New Roman"/>
+          <w:b/>
+          <w:bCs/>
+          <w:sz w:val="32"/>
+          <w:szCs w:val="32"/>
+          <w:lang w:val="en-US"/>
+        </w:rPr>
+      </w:pPr>
+      <w:r>
+        <w:rPr>
+          <w:rFonts w:ascii="Times New Roman" w:hAnsi="Times New Roman" w:cs="Times New Roman"/>
+          <w:b/>
+          <w:bCs/>
+          <w:noProof/>
+          <w:sz w:val="32"/>
+          <w:szCs w:val="32"/>
+          <w:lang w:val="en-US"/>
+        </w:rPr>
+        <w:drawing>
+          <wp:inline distT="0" distB="0" distL="0" distR="0" wp14:anchorId="2DD10365" wp14:editId="3DA6C020">
+            <wp:extent cx="5731510" cy="3716020"/>
+            <wp:effectExtent l="0" t="0" r="0" b="5080"/>
+            <wp:docPr id="741552557" name="Picture 1" descr="A screenshot of a computer screen&#10;&#10;AI-generated content may be incorrect."/>
+            <wp:cNvGraphicFramePr>
+              <a:graphicFrameLocks xmlns:a="http://schemas.openxmlformats.org/drawingml/2006/main" noChangeAspect="1"/>
+            </wp:cNvGraphicFramePr>
+            <a:graphic xmlns:a="http://schemas.openxmlformats.org/drawingml/2006/main">
+              <a:graphicData uri="http://schemas.openxmlformats.org/drawingml/2006/picture">
+                <pic:pic xmlns:pic="http://schemas.openxmlformats.org/drawingml/2006/picture">
+                  <pic:nvPicPr>
+                    <pic:cNvPr id="741552557" name="Picture 1" descr="A screenshot of a computer screen&#10;&#10;AI-generated content may be incorrect."/>
+                    <pic:cNvPicPr/>
+                  </pic:nvPicPr>
+                  <pic:blipFill>
+                    <a:blip r:embed="rId10" cstate="print">
+                      <a:extLst>
+                        <a:ext uri="{28A0092B-C50C-407E-A947-70E740481C1C}">
+                          <a14:useLocalDpi xmlns:a14="http://schemas.microsoft.com/office/drawing/2010/main" val="0"/>
+                        </a:ext>
+                      </a:extLst>
+                    </a:blip>
+                    <a:stretch>
+                      <a:fillRect/>
+                    </a:stretch>
+                  </pic:blipFill>
+                  <pic:spPr>
+                    <a:xfrm>
+                      <a:off x="0" y="0"/>
+                      <a:ext cx="5731510" cy="3716020"/>
+                    </a:xfrm>
+                    <a:prstGeom prst="rect">
+                      <a:avLst/>
+                    </a:prstGeom>
+                  </pic:spPr>
+                </pic:pic>
+              </a:graphicData>
+            </a:graphic>
+          </wp:inline>
+        </w:drawing>
+      </w:r>
+    </w:p>
+    <w:p>
+      <w:pPr>
+        <w:ind w:left="720"/>
+        <w:rPr>
+          <w:rFonts w:ascii="Times New Roman" w:hAnsi="Times New Roman" w:cs="Times New Roman"/>
+          <w:b/>
+          <w:bCs/>
+          <w:sz w:val="32"/>
+          <w:szCs w:val="32"/>
+          <w:lang w:val="en-US"/>
+        </w:rPr>
+      </w:pPr>
+    </w:p>
+    <w:p>
+      <w:pPr>
+        <w:ind w:left="720"/>
+        <w:rPr>
+          <w:rFonts w:ascii="Times New Roman" w:hAnsi="Times New Roman" w:cs="Times New Roman"/>
+          <w:sz w:val="28"/>
+          <w:szCs w:val="28"/>
+          <w:lang w:val="en-US"/>
+        </w:rPr>
+      </w:pPr>
+    </w:p>
+    <w:p>
+      <w:pPr>
+        <w:ind w:left="720"/>
+        <w:rPr>
+          <w:rFonts w:ascii="Times New Roman" w:hAnsi="Times New Roman" w:cs="Times New Roman"/>
+          <w:sz w:val="28"/>
+          <w:szCs w:val="28"/>
+          <w:lang w:val="en-US"/>
+        </w:rPr>
+      </w:pPr>
+    </w:p>
+    <w:p>
+      <w:pPr>
+        <w:ind w:left="720"/>
+        <w:rPr>
+          <w:rFonts w:ascii="Times New Roman" w:hAnsi="Times New Roman" w:cs="Times New Roman"/>
+          <w:sz w:val="28"/>
+          <w:szCs w:val="28"/>
+          <w:lang w:val="en-US"/>
+        </w:rPr>
+      </w:pPr>
+    </w:p>
+    <w:p>
+      <w:pPr>
+        <w:ind w:left="720"/>
+        <w:rPr>
+          <w:rFonts w:ascii="Times New Roman" w:hAnsi="Times New Roman" w:cs="Times New Roman"/>
+          <w:sz w:val="28"/>
+          <w:szCs w:val="28"/>
+          <w:lang w:val="en-US"/>
+        </w:rPr>
+      </w:pPr>
+    </w:p>
+    <w:p>
+      <w:pPr>
+        <w:ind w:left="720"/>
+        <w:rPr>
+          <w:rFonts w:ascii="Times New Roman" w:hAnsi="Times New Roman" w:cs="Times New Roman"/>
+          <w:sz w:val="28"/>
+          <w:szCs w:val="28"/>
+          <w:lang w:val="en-US"/>
+        </w:rPr>
+      </w:pPr>
+    </w:p>
+    <w:p>
+      <w:pPr>
+        <w:ind w:left="720"/>
+        <w:rPr>
+          <w:rFonts w:ascii="Times New Roman" w:hAnsi="Times New Roman" w:cs="Times New Roman"/>
+          <w:sz w:val="28"/>
+          <w:szCs w:val="28"/>
+          <w:lang w:val="en-US"/>
+        </w:rPr>
+      </w:pPr>
+    </w:p>
+    <w:p>
+      <w:pPr>
+        <w:ind w:left="720"/>
+        <w:rPr>
+          <w:rFonts w:ascii="Times New Roman" w:hAnsi="Times New Roman" w:cs="Times New Roman"/>
+          <w:sz w:val="28"/>
+          <w:szCs w:val="28"/>
+          <w:lang w:val="en-US"/>
+        </w:rPr>
+      </w:pPr>
+    </w:p>
+    <w:p>
+      <w:pPr>
+        <w:ind w:left="720"/>
+        <w:rPr>
+          <w:rFonts w:ascii="Times New Roman" w:hAnsi="Times New Roman" w:cs="Times New Roman"/>
+          <w:sz w:val="28"/>
+          <w:szCs w:val="28"/>
+          <w:lang w:val="en-US"/>
+        </w:rPr>
+      </w:pPr>
+    </w:p>
+    <w:p>
+      <w:pPr>
+        <w:ind w:left="720"/>
+        <w:rPr>
+          <w:rFonts w:ascii="Times New Roman" w:hAnsi="Times New Roman" w:cs="Times New Roman"/>
+          <w:sz w:val="28"/>
+          <w:szCs w:val="28"/>
+          <w:lang w:val="en-US"/>
+        </w:rPr>
+      </w:pPr>
+    </w:p>
+    <w:p>
+      <w:pPr>
+        <w:ind w:left="720"/>
+        <w:rPr>
+          <w:rFonts w:ascii="Times New Roman" w:hAnsi="Times New Roman" w:cs="Times New Roman"/>
+          <w:sz w:val="28"/>
+          <w:szCs w:val="28"/>
+          <w:lang w:val="en-US"/>
+        </w:rPr>
+      </w:pPr>
+    </w:p>
+    <w:p>
+      <w:pPr>
+        <w:ind w:left="720"/>
+        <w:rPr>
+          <w:rFonts w:ascii="Times New Roman" w:hAnsi="Times New Roman" w:cs="Times New Roman"/>
+          <w:sz w:val="28"/>
+          <w:szCs w:val="28"/>
+          <w:lang w:val="en-US"/>
+        </w:rPr>
+      </w:pPr>
+    </w:p>
+    <w:p>
+      <w:pPr>
+        <w:ind w:left="720"/>
+        <w:rPr>
+          <w:rFonts w:ascii="Times New Roman" w:hAnsi="Times New Roman" w:cs="Times New Roman"/>
+          <w:sz w:val="28"/>
+          <w:szCs w:val="28"/>
+          <w:lang w:val="en-US"/>
+        </w:rPr>
+      </w:pPr>
+      <w:r>
+        <w:rPr>
+          <w:rFonts w:ascii="Times New Roman" w:hAnsi="Times New Roman" w:cs="Times New Roman"/>
+          <w:sz w:val="28"/>
+          <w:szCs w:val="28"/>
+          <w:lang w:val="en-US"/>
+        </w:rPr>
+        <w:lastRenderedPageBreak/>
+        <w:t>Tab Group Screen:</w:t>
+      </w:r>
+    </w:p>
+    <w:p>
+      <w:pPr>
+        <w:ind w:left="720"/>
+        <w:rPr>
+          <w:rFonts w:ascii="Times New Roman" w:hAnsi="Times New Roman" w:cs="Times New Roman"/>
+          <w:b/>
+          <w:bCs/>
+          <w:sz w:val="32"/>
+          <w:szCs w:val="32"/>
+          <w:lang w:val="en-US"/>
+        </w:rPr>
+      </w:pPr>
+      <w:r>
+        <w:rPr>
+          <w:rFonts w:ascii="Times New Roman" w:hAnsi="Times New Roman" w:cs="Times New Roman"/>
+          <w:b/>
+          <w:bCs/>
+          <w:noProof/>
+          <w:sz w:val="32"/>
+          <w:szCs w:val="32"/>
+          <w:lang w:val="en-US"/>
+        </w:rPr>
+        <w:drawing>
+          <wp:inline distT="0" distB="0" distL="0" distR="0" wp14:anchorId="01CF0CCA" wp14:editId="19CC2F3A">
+            <wp:extent cx="5731510" cy="6117590"/>
+            <wp:effectExtent l="0" t="0" r="0" b="3810"/>
+            <wp:docPr id="1913102501" name="Picture 2" descr="A screenshot of a web page&#10;&#10;AI-generated content may be incorrect."/>
+            <wp:cNvGraphicFramePr>
+              <a:graphicFrameLocks xmlns:a="http://schemas.openxmlformats.org/drawingml/2006/main" noChangeAspect="1"/>
+            </wp:cNvGraphicFramePr>
+            <a:graphic xmlns:a="http://schemas.openxmlformats.org/drawingml/2006/main">
+              <a:graphicData uri="http://schemas.openxmlformats.org/drawingml/2006/picture">
+                <pic:pic xmlns:pic="http://schemas.openxmlformats.org/drawingml/2006/picture">
+                  <pic:nvPicPr>
+                    <pic:cNvPr id="1913102501" name="Picture 2" descr="A screenshot of a web page&#10;&#10;AI-generated content may be incorrect."/>
+                    <pic:cNvPicPr/>
+                  </pic:nvPicPr>
+                  <pic:blipFill>
+                    <a:blip r:embed="rId11" cstate="print">
+                      <a:extLst>
+                        <a:ext uri="{28A0092B-C50C-407E-A947-70E740481C1C}">
+                          <a14:useLocalDpi xmlns:a14="http://schemas.microsoft.com/office/drawing/2010/main" val="0"/>
+                        </a:ext>
+                      </a:extLst>
+                    </a:blip>
+                    <a:stretch>
+                      <a:fillRect/>
+                    </a:stretch>
+                  </pic:blipFill>
+                  <pic:spPr>
+                    <a:xfrm>
+                      <a:off x="0" y="0"/>
+                      <a:ext cx="5731510" cy="6117590"/>
+                    </a:xfrm>
+                    <a:prstGeom prst="rect">
+                      <a:avLst/>
+                    </a:prstGeom>
+                  </pic:spPr>
+                </pic:pic>
+              </a:graphicData>
+            </a:graphic>
+          </wp:inline>
+        </w:drawing>
+      </w:r>
+    </w:p>
+    <w:p>
+      <w:pPr>
+        <w:ind w:left="720"/>
+        <w:rPr>
+          <w:rFonts w:ascii="Times New Roman" w:hAnsi="Times New Roman" w:cs="Times New Roman"/>
+          <w:b/>
+          <w:bCs/>
+          <w:sz w:val="32"/>
+          <w:szCs w:val="32"/>
+          <w:lang w:val="en-US"/>
+        </w:rPr>
+      </w:pPr>
+    </w:p>
+    <w:p>
+      <w:pPr>
+        <w:ind w:left="720"/>
+        <w:rPr>
+          <w:rFonts w:ascii="Times New Roman" w:hAnsi="Times New Roman" w:cs="Times New Roman"/>
+          <w:b/>
+          <w:bCs/>
+          <w:sz w:val="32"/>
+          <w:szCs w:val="32"/>
+          <w:lang w:val="en-US"/>
+        </w:rPr>
+      </w:pPr>
+    </w:p>
+    <w:p>
+      <w:pPr>
+        <w:ind w:left="720"/>
+        <w:rPr>
+          <w:rFonts w:ascii="Times New Roman" w:hAnsi="Times New Roman" w:cs="Times New Roman"/>
+          <w:b/>
+          <w:bCs/>
+          <w:sz w:val="32"/>
+          <w:szCs w:val="32"/>
+          <w:lang w:val="en-US"/>
+        </w:rPr>
+      </w:pPr>
+    </w:p>
+    <w:p>
+      <w:pPr>
+        <w:ind w:left="720"/>
+        <w:rPr>
+          <w:rFonts w:ascii="Times New Roman" w:hAnsi="Times New Roman" w:cs="Times New Roman"/>
+          <w:sz w:val="28"/>
+          <w:szCs w:val="28"/>
+          <w:lang w:val="en-US"/>
+        </w:rPr>
+      </w:pPr>
+    </w:p>
+    <w:p>
+      <w:pPr>
+        <w:ind w:left="720"/>
+        <w:rPr>
+          <w:rFonts w:ascii="Times New Roman" w:hAnsi="Times New Roman" w:cs="Times New Roman"/>
+          <w:sz w:val="28"/>
+          <w:szCs w:val="28"/>
+          <w:lang w:val="en-US"/>
+        </w:rPr>
+      </w:pPr>
+    </w:p>
+    <w:p>
+      <w:pPr>
+        <w:rPr>
+          <w:rFonts w:ascii="Times New Roman" w:hAnsi="Times New Roman" w:cs="Times New Roman"/>
+          <w:sz w:val="28"/>
+          <w:szCs w:val="28"/>
+          <w:lang w:val="en-US"/>
+        </w:rPr>
+      </w:pPr>
+    </w:p>
+    <w:p>
+      <w:pPr>
+        <w:ind w:left="720"/>
+        <w:rPr>
+          <w:rFonts w:ascii="Times New Roman" w:hAnsi="Times New Roman" w:cs="Times New Roman"/>
+          <w:sz w:val="28"/>
+          <w:szCs w:val="28"/>
+          <w:lang w:val="en-US"/>
+        </w:rPr>
+      </w:pPr>
+      <w:r>
+        <w:rPr>
+          <w:rFonts w:ascii="Times New Roman" w:hAnsi="Times New Roman" w:cs="Times New Roman"/>
+          <w:sz w:val="28"/>
+          <w:szCs w:val="28"/>
+          <w:lang w:val="en-US"/>
+        </w:rPr>
+        <w:lastRenderedPageBreak/>
+        <w:t>Batch Processing Screen</w:t>
+      </w:r>
+      <w:r>
+        <w:rPr>
+          <w:rFonts w:ascii="Times New Roman" w:hAnsi="Times New Roman" w:cs="Times New Roman"/>
+          <w:sz w:val="28"/>
+          <w:szCs w:val="28"/>
+          <w:lang w:val="en-US"/>
+        </w:rPr>
+        <w:t>:</w:t>
+      </w:r>
+    </w:p>
+    <w:p>
+      <w:pPr>
+        <w:ind w:left="720"/>
+        <w:rPr>
+          <w:rFonts w:ascii="Times New Roman" w:hAnsi="Times New Roman" w:cs="Times New Roman"/>
+          <w:b/>
+          <w:bCs/>
+          <w:sz w:val="32"/>
+          <w:szCs w:val="32"/>
+          <w:lang w:val="en-US"/>
+        </w:rPr>
+      </w:pPr>
+      <w:r>
+        <w:rPr>
+          <w:rFonts w:ascii="Times New Roman" w:hAnsi="Times New Roman" w:cs="Times New Roman"/>
+          <w:b/>
+          <w:bCs/>
+          <w:noProof/>
+          <w:sz w:val="32"/>
+          <w:szCs w:val="32"/>
+          <w:lang w:val="en-US"/>
+        </w:rPr>
+        <w:drawing>
+          <wp:inline distT="0" distB="0" distL="0" distR="0" wp14:anchorId="6A8C76E4" wp14:editId="2B596F31">
+            <wp:extent cx="5731510" cy="7150100"/>
+            <wp:effectExtent l="0" t="0" r="0" b="0"/>
+            <wp:docPr id="1199272765" name="Picture 3" descr="A diagram of a data processing process&#10;&#10;AI-generated content may be incorrect."/>
+            <wp:cNvGraphicFramePr>
+              <a:graphicFrameLocks xmlns:a="http://schemas.openxmlformats.org/drawingml/2006/main" noChangeAspect="1"/>
+            </wp:cNvGraphicFramePr>
+            <a:graphic xmlns:a="http://schemas.openxmlformats.org/drawingml/2006/main">
+              <a:graphicData uri="http://schemas.openxmlformats.org/drawingml/2006/picture">
+                <pic:pic xmlns:pic="http://schemas.openxmlformats.org/drawingml/2006/picture">
+                  <pic:nvPicPr>
+                    <pic:cNvPr id="1199272765" name="Picture 3" descr="A diagram of a data processing process&#10;&#10;AI-generated content may be incorrect."/>
+                    <pic:cNvPicPr/>
+                  </pic:nvPicPr>
+                  <pic:blipFill>
+                    <a:blip r:embed="rId12">
+                      <a:extLst>
+                        <a:ext uri="{28A0092B-C50C-407E-A947-70E740481C1C}">
+                          <a14:useLocalDpi xmlns:a14="http://schemas.microsoft.com/office/drawing/2010/main" val="0"/>
+                        </a:ext>
+                      </a:extLst>
+                    </a:blip>
+                    <a:stretch>
+                      <a:fillRect/>
+                    </a:stretch>
+                  </pic:blipFill>
+                  <pic:spPr>
+                    <a:xfrm>
+                      <a:off x="0" y="0"/>
+                      <a:ext cx="5731510" cy="7150100"/>
+                    </a:xfrm>
+                    <a:prstGeom prst="rect">
+                      <a:avLst/>
+                    </a:prstGeom>
+                  </pic:spPr>
+                </pic:pic>
+              </a:graphicData>
+            </a:graphic>
+          </wp:inline>
+        </w:drawing>
+      </w:r>
     </w:p>
     <w:sectPr>
       <w:pgSz w:w="11906" w:h="16838"/>
@@ -2023,6 +3083,95 @@
     </w:lvl>
   </w:abstractNum>
   <w:abstractNum w:abstractNumId="1" w15:restartNumberingAfterBreak="0">
+    <w:nsid w:val="10123529"/>
+    <w:multiLevelType w:val="hybridMultilevel"/>
+    <w:tmpl w:val="8F6A7B46"/>
+    <w:lvl w:ilvl="0" w:tplc="03620A3A">
+      <w:start w:val="1"/>
+      <w:numFmt w:val="decimal"/>
+      <w:lvlText w:val="%1)"/>
+      <w:lvlJc w:val="left"/>
+      <w:pPr>
+        <w:ind w:left="1080" w:hanging="360"/>
+      </w:pPr>
+      <w:rPr>
+        <w:rFonts w:hint="default"/>
+      </w:rPr>
+    </w:lvl>
+    <w:lvl w:ilvl="1" w:tplc="08090019" w:tentative="1">
+      <w:start w:val="1"/>
+      <w:numFmt w:val="lowerLetter"/>
+      <w:lvlText w:val="%2."/>
+      <w:lvlJc w:val="left"/>
+      <w:pPr>
+        <w:ind w:left="1800" w:hanging="360"/>
+      </w:pPr>
+    </w:lvl>
+    <w:lvl w:ilvl="2" w:tplc="0809001B" w:tentative="1">
+      <w:start w:val="1"/>
+      <w:numFmt w:val="lowerRoman"/>
+      <w:lvlText w:val="%3."/>
+      <w:lvlJc w:val="right"/>
+      <w:pPr>
+        <w:ind w:left="2520" w:hanging="180"/>
+      </w:pPr>
+    </w:lvl>
+    <w:lvl w:ilvl="3" w:tplc="0809000F" w:tentative="1">
+      <w:start w:val="1"/>
+      <w:numFmt w:val="decimal"/>
+      <w:lvlText w:val="%4."/>
+      <w:lvlJc w:val="left"/>
+      <w:pPr>
+        <w:ind w:left="3240" w:hanging="360"/>
+      </w:pPr>
+    </w:lvl>
+    <w:lvl w:ilvl="4" w:tplc="08090019" w:tentative="1">
+      <w:start w:val="1"/>
+      <w:numFmt w:val="lowerLetter"/>
+      <w:lvlText w:val="%5."/>
+      <w:lvlJc w:val="left"/>
+      <w:pPr>
+        <w:ind w:left="3960" w:hanging="360"/>
+      </w:pPr>
+    </w:lvl>
+    <w:lvl w:ilvl="5" w:tplc="0809001B" w:tentative="1">
+      <w:start w:val="1"/>
+      <w:numFmt w:val="lowerRoman"/>
+      <w:lvlText w:val="%6."/>
+      <w:lvlJc w:val="right"/>
+      <w:pPr>
+        <w:ind w:left="4680" w:hanging="180"/>
+      </w:pPr>
+    </w:lvl>
+    <w:lvl w:ilvl="6" w:tplc="0809000F" w:tentative="1">
+      <w:start w:val="1"/>
+      <w:numFmt w:val="decimal"/>
+      <w:lvlText w:val="%7."/>
+      <w:lvlJc w:val="left"/>
+      <w:pPr>
+        <w:ind w:left="5400" w:hanging="360"/>
+      </w:pPr>
+    </w:lvl>
+    <w:lvl w:ilvl="7" w:tplc="08090019" w:tentative="1">
+      <w:start w:val="1"/>
+      <w:numFmt w:val="lowerLetter"/>
+      <w:lvlText w:val="%8."/>
+      <w:lvlJc w:val="left"/>
+      <w:pPr>
+        <w:ind w:left="6120" w:hanging="360"/>
+      </w:pPr>
+    </w:lvl>
+    <w:lvl w:ilvl="8" w:tplc="0809001B" w:tentative="1">
+      <w:start w:val="1"/>
+      <w:numFmt w:val="lowerRoman"/>
+      <w:lvlText w:val="%9."/>
+      <w:lvlJc w:val="right"/>
+      <w:pPr>
+        <w:ind w:left="6840" w:hanging="180"/>
+      </w:pPr>
+    </w:lvl>
+  </w:abstractNum>
+  <w:abstractNum w:abstractNumId="2" w15:restartNumberingAfterBreak="0">
     <w:nsid w:val="270A7175"/>
     <w:multiLevelType w:val="hybridMultilevel"/>
     <w:tmpl w:val="88E2C358"/>
@@ -2111,7 +3260,7 @@
       </w:pPr>
     </w:lvl>
   </w:abstractNum>
-  <w:abstractNum w:abstractNumId="2" w15:restartNumberingAfterBreak="0">
+  <w:abstractNum w:abstractNumId="3" w15:restartNumberingAfterBreak="0">
     <w:nsid w:val="38AC53B2"/>
     <w:multiLevelType w:val="hybridMultilevel"/>
     <w:tmpl w:val="23245FD8"/>
@@ -2200,7 +3349,7 @@
       </w:pPr>
     </w:lvl>
   </w:abstractNum>
-  <w:abstractNum w:abstractNumId="3" w15:restartNumberingAfterBreak="0">
+  <w:abstractNum w:abstractNumId="4" w15:restartNumberingAfterBreak="0">
     <w:nsid w:val="740E0BE0"/>
     <w:multiLevelType w:val="hybridMultilevel"/>
     <w:tmpl w:val="F104DA8A"/>
@@ -2289,7 +3438,7 @@
       </w:pPr>
     </w:lvl>
   </w:abstractNum>
-  <w:abstractNum w:abstractNumId="4" w15:restartNumberingAfterBreak="0">
+  <w:abstractNum w:abstractNumId="5" w15:restartNumberingAfterBreak="0">
     <w:nsid w:val="76992B80"/>
     <w:multiLevelType w:val="hybridMultilevel"/>
     <w:tmpl w:val="705C05EC"/>
@@ -2379,19 +3528,22 @@
     </w:lvl>
   </w:abstractNum>
   <w:num w:numId="1" w16cid:durableId="1975673213">
+    <w:abstractNumId w:val="5"/>
+  </w:num>
+  <w:num w:numId="2" w16cid:durableId="1319265623">
     <w:abstractNumId w:val="4"/>
   </w:num>
-  <w:num w:numId="2" w16cid:durableId="1319265623">
+  <w:num w:numId="3" w16cid:durableId="1926573245">
     <w:abstractNumId w:val="3"/>
   </w:num>
-  <w:num w:numId="3" w16cid:durableId="1926573245">
+  <w:num w:numId="4" w16cid:durableId="912082426">
     <w:abstractNumId w:val="2"/>
-  </w:num>
-  <w:num w:numId="4" w16cid:durableId="912082426">
-    <w:abstractNumId w:val="1"/>
   </w:num>
   <w:num w:numId="5" w16cid:durableId="1133017783">
     <w:abstractNumId w:val="0"/>
+  </w:num>
+  <w:num w:numId="6" w16cid:durableId="1712193578">
+    <w:abstractNumId w:val="1"/>
   </w:num>
 </w:numbering>
 </file>

</xml_diff>

<commit_message>
Added Libraries section to plan. Included description of PyQT5 and WhiteboxTools
</commit_message>
<xml_diff>
--- a/Project Plan/Project Plan.docx
+++ b/Project Plan/Project Plan.docx
@@ -865,7 +865,7 @@
           <w:lang w:val="en-US"/>
         </w:rPr>
         <w:drawing>
-          <wp:inline distT="0" distB="0" distL="0" distR="0" wp14:anchorId="65FE17F1" wp14:editId="22386370">
+          <wp:inline distT="0" distB="0" distL="0" distR="0" wp14:anchorId="65FE17F1" wp14:editId="426E04AC">
             <wp:extent cx="5731510" cy="3676015"/>
             <wp:effectExtent l="0" t="0" r="0" b="0"/>
             <wp:docPr id="1531882688" name="Picture 2"/>
@@ -2507,7 +2507,35 @@
           <w:lang w:val="en-US"/>
         </w:rPr>
         <w:lastRenderedPageBreak/>
-        <w:t>Wireframes</w:t>
+        <w:t>Design</w:t>
+      </w:r>
+    </w:p>
+    <w:p>
+      <w:pPr>
+        <w:pStyle w:val="ListParagraph"/>
+        <w:numPr>
+          <w:ilvl w:val="0"/>
+          <w:numId w:val="7"/>
+        </w:numPr>
+        <w:rPr>
+          <w:rFonts w:ascii="Times New Roman" w:hAnsi="Times New Roman" w:cs="Times New Roman"/>
+          <w:b/>
+          <w:bCs/>
+          <w:sz w:val="32"/>
+          <w:szCs w:val="32"/>
+          <w:lang w:val="en-US"/>
+        </w:rPr>
+      </w:pPr>
+      <w:r>
+        <w:rPr>
+          <w:rFonts w:ascii="Times New Roman" w:hAnsi="Times New Roman" w:cs="Times New Roman"/>
+          <w:b/>
+          <w:bCs/>
+          <w:sz w:val="32"/>
+          <w:szCs w:val="32"/>
+          <w:lang w:val="en-US"/>
+        </w:rPr>
+        <w:t>UI Wireframes</w:t>
       </w:r>
     </w:p>
     <w:p>
@@ -2746,7 +2774,6 @@
           <w:szCs w:val="28"/>
           <w:lang w:val="en-US"/>
         </w:rPr>
-        <w:lastRenderedPageBreak/>
         <w:t>Tab Group Screen:</w:t>
       </w:r>
     </w:p>
@@ -2903,7 +2930,6 @@
           <w:szCs w:val="28"/>
           <w:lang w:val="en-US"/>
         </w:rPr>
-        <w:lastRenderedPageBreak/>
         <w:t>Batch Processing Screen</w:t>
       </w:r>
       <w:r>
@@ -2981,6 +3007,265 @@
         </w:drawing>
       </w:r>
     </w:p>
+    <w:p>
+      <w:pPr>
+        <w:ind w:left="720"/>
+        <w:rPr>
+          <w:rFonts w:ascii="Times New Roman" w:hAnsi="Times New Roman" w:cs="Times New Roman"/>
+          <w:b/>
+          <w:bCs/>
+          <w:sz w:val="32"/>
+          <w:szCs w:val="32"/>
+          <w:lang w:val="en-US"/>
+        </w:rPr>
+      </w:pPr>
+    </w:p>
+    <w:p>
+      <w:pPr>
+        <w:ind w:left="720"/>
+        <w:rPr>
+          <w:rFonts w:ascii="Times New Roman" w:hAnsi="Times New Roman" w:cs="Times New Roman"/>
+          <w:b/>
+          <w:bCs/>
+          <w:sz w:val="32"/>
+          <w:szCs w:val="32"/>
+          <w:lang w:val="en-US"/>
+        </w:rPr>
+      </w:pPr>
+    </w:p>
+    <w:p>
+      <w:pPr>
+        <w:ind w:left="720"/>
+        <w:rPr>
+          <w:rFonts w:ascii="Times New Roman" w:hAnsi="Times New Roman" w:cs="Times New Roman"/>
+          <w:b/>
+          <w:bCs/>
+          <w:sz w:val="32"/>
+          <w:szCs w:val="32"/>
+          <w:lang w:val="en-US"/>
+        </w:rPr>
+      </w:pPr>
+    </w:p>
+    <w:p>
+      <w:pPr>
+        <w:pStyle w:val="ListParagraph"/>
+        <w:numPr>
+          <w:ilvl w:val="0"/>
+          <w:numId w:val="7"/>
+        </w:numPr>
+        <w:rPr>
+          <w:rFonts w:ascii="Times New Roman" w:hAnsi="Times New Roman" w:cs="Times New Roman"/>
+          <w:b/>
+          <w:bCs/>
+          <w:sz w:val="32"/>
+          <w:szCs w:val="32"/>
+          <w:lang w:val="en-US"/>
+        </w:rPr>
+      </w:pPr>
+      <w:r>
+        <w:rPr>
+          <w:rFonts w:ascii="Times New Roman" w:hAnsi="Times New Roman" w:cs="Times New Roman"/>
+          <w:b/>
+          <w:bCs/>
+          <w:sz w:val="32"/>
+          <w:szCs w:val="32"/>
+          <w:lang w:val="en-US"/>
+        </w:rPr>
+        <w:t>Libraries</w:t>
+      </w:r>
+    </w:p>
+    <w:p>
+      <w:pPr>
+        <w:pStyle w:val="ListParagraph"/>
+        <w:rPr>
+          <w:rFonts w:ascii="Times New Roman" w:hAnsi="Times New Roman" w:cs="Times New Roman"/>
+          <w:b/>
+          <w:bCs/>
+          <w:sz w:val="32"/>
+          <w:szCs w:val="32"/>
+          <w:lang w:val="en-US"/>
+        </w:rPr>
+      </w:pPr>
+    </w:p>
+    <w:p>
+      <w:pPr>
+        <w:pStyle w:val="ListParagraph"/>
+        <w:rPr>
+          <w:rFonts w:ascii="Times New Roman" w:hAnsi="Times New Roman" w:cs="Times New Roman"/>
+          <w:sz w:val="32"/>
+          <w:szCs w:val="32"/>
+          <w:lang w:val="en-US"/>
+        </w:rPr>
+      </w:pPr>
+      <w:hyperlink r:id="rId13" w:history="1">
+        <w:r>
+          <w:rPr>
+            <w:rStyle w:val="Hyperlink"/>
+            <w:rFonts w:ascii="Times New Roman" w:hAnsi="Times New Roman" w:cs="Times New Roman"/>
+            <w:b/>
+            <w:bCs/>
+            <w:sz w:val="32"/>
+            <w:szCs w:val="32"/>
+            <w:lang w:val="en-US"/>
+          </w:rPr>
+          <w:t>PyQT5</w:t>
+        </w:r>
+      </w:hyperlink>
+      <w:r>
+        <w:rPr>
+          <w:rFonts w:ascii="Times New Roman" w:hAnsi="Times New Roman" w:cs="Times New Roman"/>
+          <w:sz w:val="32"/>
+          <w:szCs w:val="32"/>
+          <w:lang w:val="en-US"/>
+        </w:rPr>
+        <w:t xml:space="preserve"> will be the main library used to create the UI. This is a useful library that contains various GUI modules and many other modules such as support for rendering graphics using </w:t>
+      </w:r>
+      <w:proofErr w:type="spellStart"/>
+      <w:r>
+        <w:rPr>
+          <w:rFonts w:ascii="Times New Roman" w:hAnsi="Times New Roman" w:cs="Times New Roman"/>
+          <w:sz w:val="32"/>
+          <w:szCs w:val="32"/>
+          <w:lang w:val="en-US"/>
+        </w:rPr>
+        <w:t>QtOpenGL</w:t>
+      </w:r>
+      <w:proofErr w:type="spellEnd"/>
+      <w:r>
+        <w:rPr>
+          <w:rFonts w:ascii="Times New Roman" w:hAnsi="Times New Roman" w:cs="Times New Roman"/>
+          <w:sz w:val="32"/>
+          <w:szCs w:val="32"/>
+          <w:lang w:val="en-US"/>
+        </w:rPr>
+        <w:t xml:space="preserve">, database management using </w:t>
+      </w:r>
+      <w:proofErr w:type="spellStart"/>
+      <w:r>
+        <w:rPr>
+          <w:rFonts w:ascii="Times New Roman" w:hAnsi="Times New Roman" w:cs="Times New Roman"/>
+          <w:sz w:val="32"/>
+          <w:szCs w:val="32"/>
+          <w:lang w:val="en-US"/>
+        </w:rPr>
+        <w:t>QtSql</w:t>
+      </w:r>
+      <w:proofErr w:type="spellEnd"/>
+      <w:r>
+        <w:rPr>
+          <w:rFonts w:ascii="Times New Roman" w:hAnsi="Times New Roman" w:cs="Times New Roman"/>
+          <w:sz w:val="32"/>
+          <w:szCs w:val="32"/>
+          <w:lang w:val="en-US"/>
+        </w:rPr>
+        <w:t xml:space="preserve"> and working with xml files with </w:t>
+      </w:r>
+      <w:proofErr w:type="spellStart"/>
+      <w:r>
+        <w:rPr>
+          <w:rFonts w:ascii="Times New Roman" w:hAnsi="Times New Roman" w:cs="Times New Roman"/>
+          <w:sz w:val="32"/>
+          <w:szCs w:val="32"/>
+          <w:lang w:val="en-US"/>
+        </w:rPr>
+        <w:t>QtXml</w:t>
+      </w:r>
+      <w:proofErr w:type="spellEnd"/>
+      <w:r>
+        <w:rPr>
+          <w:rFonts w:ascii="Times New Roman" w:hAnsi="Times New Roman" w:cs="Times New Roman"/>
+          <w:sz w:val="32"/>
+          <w:szCs w:val="32"/>
+          <w:lang w:val="en-US"/>
+        </w:rPr>
+        <w:t xml:space="preserve"> just to name a few</w:t>
+      </w:r>
+    </w:p>
+    <w:p>
+      <w:pPr>
+        <w:pStyle w:val="ListParagraph"/>
+        <w:rPr>
+          <w:rFonts w:ascii="Times New Roman" w:hAnsi="Times New Roman" w:cs="Times New Roman"/>
+          <w:sz w:val="32"/>
+          <w:szCs w:val="32"/>
+          <w:lang w:val="en-US"/>
+        </w:rPr>
+      </w:pPr>
+    </w:p>
+    <w:p>
+      <w:pPr>
+        <w:pStyle w:val="ListParagraph"/>
+        <w:rPr>
+          <w:rFonts w:ascii="Times New Roman" w:hAnsi="Times New Roman" w:cs="Times New Roman"/>
+          <w:sz w:val="32"/>
+          <w:szCs w:val="32"/>
+          <w:lang w:val="en-US"/>
+        </w:rPr>
+      </w:pPr>
+      <w:r>
+        <w:rPr>
+          <w:rFonts w:ascii="Times New Roman" w:hAnsi="Times New Roman" w:cs="Times New Roman"/>
+          <w:sz w:val="32"/>
+          <w:szCs w:val="32"/>
+          <w:lang w:val="en-US"/>
+        </w:rPr>
+        <w:t xml:space="preserve">This </w:t>
+      </w:r>
+      <w:r>
+        <w:rPr>
+          <w:rFonts w:ascii="Times New Roman" w:hAnsi="Times New Roman" w:cs="Times New Roman"/>
+          <w:sz w:val="32"/>
+          <w:szCs w:val="32"/>
+          <w:lang w:val="en-US"/>
+        </w:rPr>
+        <w:t xml:space="preserve">program will employ a Model View Controller (MVC) architecture to structure the code. </w:t>
+      </w:r>
+    </w:p>
+    <w:p>
+      <w:pPr>
+        <w:pStyle w:val="ListParagraph"/>
+        <w:rPr>
+          <w:rFonts w:ascii="Times New Roman" w:hAnsi="Times New Roman" w:cs="Times New Roman"/>
+          <w:sz w:val="32"/>
+          <w:szCs w:val="32"/>
+          <w:lang w:val="en-US"/>
+        </w:rPr>
+      </w:pPr>
+    </w:p>
+    <w:p>
+      <w:pPr>
+        <w:pStyle w:val="ListParagraph"/>
+        <w:rPr>
+          <w:rFonts w:ascii="Times New Roman" w:hAnsi="Times New Roman" w:cs="Times New Roman"/>
+          <w:sz w:val="32"/>
+          <w:szCs w:val="32"/>
+          <w:lang w:val="en-US"/>
+        </w:rPr>
+      </w:pPr>
+      <w:hyperlink r:id="rId14" w:history="1">
+        <w:proofErr w:type="spellStart"/>
+        <w:r>
+          <w:rPr>
+            <w:rStyle w:val="Hyperlink"/>
+            <w:rFonts w:ascii="Times New Roman" w:hAnsi="Times New Roman" w:cs="Times New Roman"/>
+            <w:sz w:val="32"/>
+            <w:szCs w:val="32"/>
+            <w:lang w:val="en-US"/>
+          </w:rPr>
+          <w:t>WhiteBoxTools</w:t>
+        </w:r>
+        <w:proofErr w:type="spellEnd"/>
+      </w:hyperlink>
+      <w:r>
+        <w:rPr>
+          <w:rFonts w:ascii="Times New Roman" w:hAnsi="Times New Roman" w:cs="Times New Roman"/>
+          <w:sz w:val="32"/>
+          <w:szCs w:val="32"/>
+          <w:lang w:val="en-US"/>
+        </w:rPr>
+        <w:t xml:space="preserve"> will be the library used to help with LiDAR visualization and manipulation</w:t>
+      </w:r>
+    </w:p>
     <w:sectPr>
       <w:pgSz w:w="11906" w:h="16838"/>
       <w:pgMar w:top="1440" w:right="1440" w:bottom="1440" w:left="1440" w:header="708" w:footer="708" w:gutter="0"/>
@@ -3172,6 +3457,95 @@
     </w:lvl>
   </w:abstractNum>
   <w:abstractNum w:abstractNumId="2" w15:restartNumberingAfterBreak="0">
+    <w:nsid w:val="1847208B"/>
+    <w:multiLevelType w:val="hybridMultilevel"/>
+    <w:tmpl w:val="C4AA41D4"/>
+    <w:lvl w:ilvl="0" w:tplc="08090015">
+      <w:start w:val="1"/>
+      <w:numFmt w:val="upperLetter"/>
+      <w:lvlText w:val="%1."/>
+      <w:lvlJc w:val="left"/>
+      <w:pPr>
+        <w:ind w:left="720" w:hanging="360"/>
+      </w:pPr>
+      <w:rPr>
+        <w:rFonts w:hint="default"/>
+      </w:rPr>
+    </w:lvl>
+    <w:lvl w:ilvl="1" w:tplc="08090019" w:tentative="1">
+      <w:start w:val="1"/>
+      <w:numFmt w:val="lowerLetter"/>
+      <w:lvlText w:val="%2."/>
+      <w:lvlJc w:val="left"/>
+      <w:pPr>
+        <w:ind w:left="1440" w:hanging="360"/>
+      </w:pPr>
+    </w:lvl>
+    <w:lvl w:ilvl="2" w:tplc="0809001B" w:tentative="1">
+      <w:start w:val="1"/>
+      <w:numFmt w:val="lowerRoman"/>
+      <w:lvlText w:val="%3."/>
+      <w:lvlJc w:val="right"/>
+      <w:pPr>
+        <w:ind w:left="2160" w:hanging="180"/>
+      </w:pPr>
+    </w:lvl>
+    <w:lvl w:ilvl="3" w:tplc="0809000F" w:tentative="1">
+      <w:start w:val="1"/>
+      <w:numFmt w:val="decimal"/>
+      <w:lvlText w:val="%4."/>
+      <w:lvlJc w:val="left"/>
+      <w:pPr>
+        <w:ind w:left="2880" w:hanging="360"/>
+      </w:pPr>
+    </w:lvl>
+    <w:lvl w:ilvl="4" w:tplc="08090019" w:tentative="1">
+      <w:start w:val="1"/>
+      <w:numFmt w:val="lowerLetter"/>
+      <w:lvlText w:val="%5."/>
+      <w:lvlJc w:val="left"/>
+      <w:pPr>
+        <w:ind w:left="3600" w:hanging="360"/>
+      </w:pPr>
+    </w:lvl>
+    <w:lvl w:ilvl="5" w:tplc="0809001B" w:tentative="1">
+      <w:start w:val="1"/>
+      <w:numFmt w:val="lowerRoman"/>
+      <w:lvlText w:val="%6."/>
+      <w:lvlJc w:val="right"/>
+      <w:pPr>
+        <w:ind w:left="4320" w:hanging="180"/>
+      </w:pPr>
+    </w:lvl>
+    <w:lvl w:ilvl="6" w:tplc="0809000F" w:tentative="1">
+      <w:start w:val="1"/>
+      <w:numFmt w:val="decimal"/>
+      <w:lvlText w:val="%7."/>
+      <w:lvlJc w:val="left"/>
+      <w:pPr>
+        <w:ind w:left="5040" w:hanging="360"/>
+      </w:pPr>
+    </w:lvl>
+    <w:lvl w:ilvl="7" w:tplc="08090019" w:tentative="1">
+      <w:start w:val="1"/>
+      <w:numFmt w:val="lowerLetter"/>
+      <w:lvlText w:val="%8."/>
+      <w:lvlJc w:val="left"/>
+      <w:pPr>
+        <w:ind w:left="5760" w:hanging="360"/>
+      </w:pPr>
+    </w:lvl>
+    <w:lvl w:ilvl="8" w:tplc="0809001B" w:tentative="1">
+      <w:start w:val="1"/>
+      <w:numFmt w:val="lowerRoman"/>
+      <w:lvlText w:val="%9."/>
+      <w:lvlJc w:val="right"/>
+      <w:pPr>
+        <w:ind w:left="6480" w:hanging="180"/>
+      </w:pPr>
+    </w:lvl>
+  </w:abstractNum>
+  <w:abstractNum w:abstractNumId="3" w15:restartNumberingAfterBreak="0">
     <w:nsid w:val="270A7175"/>
     <w:multiLevelType w:val="hybridMultilevel"/>
     <w:tmpl w:val="88E2C358"/>
@@ -3260,7 +3634,7 @@
       </w:pPr>
     </w:lvl>
   </w:abstractNum>
-  <w:abstractNum w:abstractNumId="3" w15:restartNumberingAfterBreak="0">
+  <w:abstractNum w:abstractNumId="4" w15:restartNumberingAfterBreak="0">
     <w:nsid w:val="38AC53B2"/>
     <w:multiLevelType w:val="hybridMultilevel"/>
     <w:tmpl w:val="23245FD8"/>
@@ -3349,7 +3723,7 @@
       </w:pPr>
     </w:lvl>
   </w:abstractNum>
-  <w:abstractNum w:abstractNumId="4" w15:restartNumberingAfterBreak="0">
+  <w:abstractNum w:abstractNumId="5" w15:restartNumberingAfterBreak="0">
     <w:nsid w:val="740E0BE0"/>
     <w:multiLevelType w:val="hybridMultilevel"/>
     <w:tmpl w:val="F104DA8A"/>
@@ -3438,7 +3812,7 @@
       </w:pPr>
     </w:lvl>
   </w:abstractNum>
-  <w:abstractNum w:abstractNumId="5" w15:restartNumberingAfterBreak="0">
+  <w:abstractNum w:abstractNumId="6" w15:restartNumberingAfterBreak="0">
     <w:nsid w:val="76992B80"/>
     <w:multiLevelType w:val="hybridMultilevel"/>
     <w:tmpl w:val="705C05EC"/>
@@ -3528,22 +3902,25 @@
     </w:lvl>
   </w:abstractNum>
   <w:num w:numId="1" w16cid:durableId="1975673213">
+    <w:abstractNumId w:val="6"/>
+  </w:num>
+  <w:num w:numId="2" w16cid:durableId="1319265623">
     <w:abstractNumId w:val="5"/>
   </w:num>
-  <w:num w:numId="2" w16cid:durableId="1319265623">
+  <w:num w:numId="3" w16cid:durableId="1926573245">
     <w:abstractNumId w:val="4"/>
   </w:num>
-  <w:num w:numId="3" w16cid:durableId="1926573245">
+  <w:num w:numId="4" w16cid:durableId="912082426">
     <w:abstractNumId w:val="3"/>
-  </w:num>
-  <w:num w:numId="4" w16cid:durableId="912082426">
-    <w:abstractNumId w:val="2"/>
   </w:num>
   <w:num w:numId="5" w16cid:durableId="1133017783">
     <w:abstractNumId w:val="0"/>
   </w:num>
   <w:num w:numId="6" w16cid:durableId="1712193578">
     <w:abstractNumId w:val="1"/>
+  </w:num>
+  <w:num w:numId="7" w16cid:durableId="322587771">
+    <w:abstractNumId w:val="2"/>
   </w:num>
 </w:numbering>
 </file>
@@ -4465,6 +4842,29 @@
       <w:spacing w:val="5"/>
     </w:rPr>
   </w:style>
+  <w:style w:type="character" w:styleId="Hyperlink">
+    <w:name w:val="Hyperlink"/>
+    <w:basedOn w:val="DefaultParagraphFont"/>
+    <w:uiPriority w:val="99"/>
+    <w:unhideWhenUsed/>
+    <w:rsid w:val="001B316D"/>
+    <w:rPr>
+      <w:color w:val="467886" w:themeColor="hyperlink"/>
+      <w:u w:val="single"/>
+    </w:rPr>
+  </w:style>
+  <w:style w:type="character" w:styleId="UnresolvedMention">
+    <w:name w:val="Unresolved Mention"/>
+    <w:basedOn w:val="DefaultParagraphFont"/>
+    <w:uiPriority w:val="99"/>
+    <w:semiHidden/>
+    <w:unhideWhenUsed/>
+    <w:rsid w:val="001B316D"/>
+    <w:rPr>
+      <w:color w:val="605E5C"/>
+      <w:shd w:val="clear" w:color="auto" w:fill="E1DFDD"/>
+    </w:rPr>
+  </w:style>
 </w:styles>
 </file>
 

</xml_diff>

<commit_message>
Removed wireframes and moved them to a separate design document
</commit_message>
<xml_diff>
--- a/Project Plan/Project Plan.docx
+++ b/Project Plan/Project Plan.docx
@@ -865,7 +865,7 @@
           <w:lang w:val="en-US"/>
         </w:rPr>
         <w:drawing>
-          <wp:inline distT="0" distB="0" distL="0" distR="0" wp14:anchorId="65FE17F1" wp14:editId="426E04AC">
+          <wp:inline distT="0" distB="0" distL="0" distR="0" wp14:anchorId="65FE17F1" wp14:editId="7EC07708">
             <wp:extent cx="5731510" cy="3676015"/>
             <wp:effectExtent l="0" t="0" r="0" b="0"/>
             <wp:docPr id="1531882688" name="Picture 2"/>
@@ -2488,27 +2488,29 @@
     </w:p>
     <w:p>
       <w:pPr>
-        <w:rPr>
-          <w:rFonts w:ascii="Times New Roman" w:hAnsi="Times New Roman" w:cs="Times New Roman"/>
-          <w:b/>
-          <w:bCs/>
-          <w:sz w:val="32"/>
-          <w:szCs w:val="32"/>
-          <w:lang w:val="en-US"/>
-        </w:rPr>
-      </w:pPr>
-      <w:r>
-        <w:rPr>
-          <w:rFonts w:ascii="Times New Roman" w:hAnsi="Times New Roman" w:cs="Times New Roman"/>
-          <w:b/>
-          <w:bCs/>
-          <w:sz w:val="32"/>
-          <w:szCs w:val="32"/>
-          <w:lang w:val="en-US"/>
-        </w:rPr>
-        <w:lastRenderedPageBreak/>
-        <w:t>Design</w:t>
-      </w:r>
+        <w:ind w:left="720"/>
+        <w:rPr>
+          <w:rFonts w:ascii="Times New Roman" w:hAnsi="Times New Roman" w:cs="Times New Roman"/>
+          <w:b/>
+          <w:bCs/>
+          <w:sz w:val="32"/>
+          <w:szCs w:val="32"/>
+          <w:lang w:val="en-US"/>
+        </w:rPr>
+      </w:pPr>
+    </w:p>
+    <w:p>
+      <w:pPr>
+        <w:ind w:left="720"/>
+        <w:rPr>
+          <w:rFonts w:ascii="Times New Roman" w:hAnsi="Times New Roman" w:cs="Times New Roman"/>
+          <w:b/>
+          <w:bCs/>
+          <w:sz w:val="32"/>
+          <w:szCs w:val="32"/>
+          <w:lang w:val="en-US"/>
+        </w:rPr>
+      </w:pPr>
     </w:p>
     <w:p>
       <w:pPr>
@@ -2535,569 +2537,33 @@
           <w:szCs w:val="32"/>
           <w:lang w:val="en-US"/>
         </w:rPr>
-        <w:t>UI Wireframes</w:t>
-      </w:r>
-    </w:p>
-    <w:p>
-      <w:pPr>
-        <w:ind w:left="720"/>
-        <w:rPr>
-          <w:rFonts w:ascii="Times New Roman" w:hAnsi="Times New Roman" w:cs="Times New Roman"/>
-          <w:sz w:val="28"/>
-          <w:szCs w:val="28"/>
-          <w:lang w:val="en-US"/>
-        </w:rPr>
-      </w:pPr>
-      <w:r>
-        <w:rPr>
-          <w:rFonts w:ascii="Times New Roman" w:hAnsi="Times New Roman" w:cs="Times New Roman"/>
-          <w:sz w:val="28"/>
-          <w:szCs w:val="28"/>
-          <w:lang w:val="en-US"/>
-        </w:rPr>
-        <w:t xml:space="preserve">Main Screen: </w:t>
-      </w:r>
-    </w:p>
-    <w:p>
-      <w:pPr>
-        <w:ind w:left="720"/>
-        <w:rPr>
-          <w:rFonts w:ascii="Times New Roman" w:hAnsi="Times New Roman" w:cs="Times New Roman"/>
-          <w:b/>
-          <w:bCs/>
-          <w:sz w:val="32"/>
-          <w:szCs w:val="32"/>
-          <w:lang w:val="en-US"/>
-        </w:rPr>
-      </w:pPr>
-      <w:r>
-        <w:rPr>
-          <w:rFonts w:ascii="Times New Roman" w:hAnsi="Times New Roman" w:cs="Times New Roman"/>
-          <w:b/>
-          <w:bCs/>
-          <w:noProof/>
-          <w:sz w:val="32"/>
-          <w:szCs w:val="32"/>
-          <w:lang w:val="en-US"/>
-        </w:rPr>
-        <w:drawing>
-          <wp:inline distT="0" distB="0" distL="0" distR="0" wp14:anchorId="2DD10365" wp14:editId="3DA6C020">
-            <wp:extent cx="5731510" cy="3716020"/>
-            <wp:effectExtent l="0" t="0" r="0" b="5080"/>
-            <wp:docPr id="741552557" name="Picture 1" descr="A screenshot of a computer screen&#10;&#10;AI-generated content may be incorrect."/>
-            <wp:cNvGraphicFramePr>
-              <a:graphicFrameLocks xmlns:a="http://schemas.openxmlformats.org/drawingml/2006/main" noChangeAspect="1"/>
-            </wp:cNvGraphicFramePr>
-            <a:graphic xmlns:a="http://schemas.openxmlformats.org/drawingml/2006/main">
-              <a:graphicData uri="http://schemas.openxmlformats.org/drawingml/2006/picture">
-                <pic:pic xmlns:pic="http://schemas.openxmlformats.org/drawingml/2006/picture">
-                  <pic:nvPicPr>
-                    <pic:cNvPr id="741552557" name="Picture 1" descr="A screenshot of a computer screen&#10;&#10;AI-generated content may be incorrect."/>
-                    <pic:cNvPicPr/>
-                  </pic:nvPicPr>
-                  <pic:blipFill>
-                    <a:blip r:embed="rId10" cstate="print">
-                      <a:extLst>
-                        <a:ext uri="{28A0092B-C50C-407E-A947-70E740481C1C}">
-                          <a14:useLocalDpi xmlns:a14="http://schemas.microsoft.com/office/drawing/2010/main" val="0"/>
-                        </a:ext>
-                      </a:extLst>
-                    </a:blip>
-                    <a:stretch>
-                      <a:fillRect/>
-                    </a:stretch>
-                  </pic:blipFill>
-                  <pic:spPr>
-                    <a:xfrm>
-                      <a:off x="0" y="0"/>
-                      <a:ext cx="5731510" cy="3716020"/>
-                    </a:xfrm>
-                    <a:prstGeom prst="rect">
-                      <a:avLst/>
-                    </a:prstGeom>
-                  </pic:spPr>
-                </pic:pic>
-              </a:graphicData>
-            </a:graphic>
-          </wp:inline>
-        </w:drawing>
-      </w:r>
-    </w:p>
-    <w:p>
-      <w:pPr>
-        <w:ind w:left="720"/>
-        <w:rPr>
-          <w:rFonts w:ascii="Times New Roman" w:hAnsi="Times New Roman" w:cs="Times New Roman"/>
-          <w:b/>
-          <w:bCs/>
-          <w:sz w:val="32"/>
-          <w:szCs w:val="32"/>
-          <w:lang w:val="en-US"/>
-        </w:rPr>
-      </w:pPr>
-    </w:p>
-    <w:p>
-      <w:pPr>
-        <w:ind w:left="720"/>
-        <w:rPr>
-          <w:rFonts w:ascii="Times New Roman" w:hAnsi="Times New Roman" w:cs="Times New Roman"/>
-          <w:sz w:val="28"/>
-          <w:szCs w:val="28"/>
-          <w:lang w:val="en-US"/>
-        </w:rPr>
-      </w:pPr>
-    </w:p>
-    <w:p>
-      <w:pPr>
-        <w:ind w:left="720"/>
-        <w:rPr>
-          <w:rFonts w:ascii="Times New Roman" w:hAnsi="Times New Roman" w:cs="Times New Roman"/>
-          <w:sz w:val="28"/>
-          <w:szCs w:val="28"/>
-          <w:lang w:val="en-US"/>
-        </w:rPr>
-      </w:pPr>
-    </w:p>
-    <w:p>
-      <w:pPr>
-        <w:ind w:left="720"/>
-        <w:rPr>
-          <w:rFonts w:ascii="Times New Roman" w:hAnsi="Times New Roman" w:cs="Times New Roman"/>
-          <w:sz w:val="28"/>
-          <w:szCs w:val="28"/>
-          <w:lang w:val="en-US"/>
-        </w:rPr>
-      </w:pPr>
-    </w:p>
-    <w:p>
-      <w:pPr>
-        <w:ind w:left="720"/>
-        <w:rPr>
-          <w:rFonts w:ascii="Times New Roman" w:hAnsi="Times New Roman" w:cs="Times New Roman"/>
-          <w:sz w:val="28"/>
-          <w:szCs w:val="28"/>
-          <w:lang w:val="en-US"/>
-        </w:rPr>
-      </w:pPr>
-    </w:p>
-    <w:p>
-      <w:pPr>
-        <w:ind w:left="720"/>
-        <w:rPr>
-          <w:rFonts w:ascii="Times New Roman" w:hAnsi="Times New Roman" w:cs="Times New Roman"/>
-          <w:sz w:val="28"/>
-          <w:szCs w:val="28"/>
-          <w:lang w:val="en-US"/>
-        </w:rPr>
-      </w:pPr>
-    </w:p>
-    <w:p>
-      <w:pPr>
-        <w:ind w:left="720"/>
-        <w:rPr>
-          <w:rFonts w:ascii="Times New Roman" w:hAnsi="Times New Roman" w:cs="Times New Roman"/>
-          <w:sz w:val="28"/>
-          <w:szCs w:val="28"/>
-          <w:lang w:val="en-US"/>
-        </w:rPr>
-      </w:pPr>
-    </w:p>
-    <w:p>
-      <w:pPr>
-        <w:ind w:left="720"/>
-        <w:rPr>
-          <w:rFonts w:ascii="Times New Roman" w:hAnsi="Times New Roman" w:cs="Times New Roman"/>
-          <w:sz w:val="28"/>
-          <w:szCs w:val="28"/>
-          <w:lang w:val="en-US"/>
-        </w:rPr>
-      </w:pPr>
-    </w:p>
-    <w:p>
-      <w:pPr>
-        <w:ind w:left="720"/>
-        <w:rPr>
-          <w:rFonts w:ascii="Times New Roman" w:hAnsi="Times New Roman" w:cs="Times New Roman"/>
-          <w:sz w:val="28"/>
-          <w:szCs w:val="28"/>
-          <w:lang w:val="en-US"/>
-        </w:rPr>
-      </w:pPr>
-    </w:p>
-    <w:p>
-      <w:pPr>
-        <w:ind w:left="720"/>
-        <w:rPr>
-          <w:rFonts w:ascii="Times New Roman" w:hAnsi="Times New Roman" w:cs="Times New Roman"/>
-          <w:sz w:val="28"/>
-          <w:szCs w:val="28"/>
-          <w:lang w:val="en-US"/>
-        </w:rPr>
-      </w:pPr>
-    </w:p>
-    <w:p>
-      <w:pPr>
-        <w:ind w:left="720"/>
-        <w:rPr>
-          <w:rFonts w:ascii="Times New Roman" w:hAnsi="Times New Roman" w:cs="Times New Roman"/>
-          <w:sz w:val="28"/>
-          <w:szCs w:val="28"/>
-          <w:lang w:val="en-US"/>
-        </w:rPr>
-      </w:pPr>
-    </w:p>
-    <w:p>
-      <w:pPr>
-        <w:ind w:left="720"/>
-        <w:rPr>
-          <w:rFonts w:ascii="Times New Roman" w:hAnsi="Times New Roman" w:cs="Times New Roman"/>
-          <w:sz w:val="28"/>
-          <w:szCs w:val="28"/>
-          <w:lang w:val="en-US"/>
-        </w:rPr>
-      </w:pPr>
-    </w:p>
-    <w:p>
-      <w:pPr>
-        <w:ind w:left="720"/>
-        <w:rPr>
-          <w:rFonts w:ascii="Times New Roman" w:hAnsi="Times New Roman" w:cs="Times New Roman"/>
-          <w:sz w:val="28"/>
-          <w:szCs w:val="28"/>
-          <w:lang w:val="en-US"/>
-        </w:rPr>
-      </w:pPr>
-      <w:r>
-        <w:rPr>
-          <w:rFonts w:ascii="Times New Roman" w:hAnsi="Times New Roman" w:cs="Times New Roman"/>
-          <w:sz w:val="28"/>
-          <w:szCs w:val="28"/>
-          <w:lang w:val="en-US"/>
-        </w:rPr>
-        <w:t>Tab Group Screen:</w:t>
-      </w:r>
-    </w:p>
-    <w:p>
-      <w:pPr>
-        <w:ind w:left="720"/>
-        <w:rPr>
-          <w:rFonts w:ascii="Times New Roman" w:hAnsi="Times New Roman" w:cs="Times New Roman"/>
-          <w:b/>
-          <w:bCs/>
-          <w:sz w:val="32"/>
-          <w:szCs w:val="32"/>
-          <w:lang w:val="en-US"/>
-        </w:rPr>
-      </w:pPr>
-      <w:r>
-        <w:rPr>
-          <w:rFonts w:ascii="Times New Roman" w:hAnsi="Times New Roman" w:cs="Times New Roman"/>
-          <w:b/>
-          <w:bCs/>
-          <w:noProof/>
-          <w:sz w:val="32"/>
-          <w:szCs w:val="32"/>
-          <w:lang w:val="en-US"/>
-        </w:rPr>
-        <w:drawing>
-          <wp:inline distT="0" distB="0" distL="0" distR="0" wp14:anchorId="01CF0CCA" wp14:editId="19CC2F3A">
-            <wp:extent cx="5731510" cy="6117590"/>
-            <wp:effectExtent l="0" t="0" r="0" b="3810"/>
-            <wp:docPr id="1913102501" name="Picture 2" descr="A screenshot of a web page&#10;&#10;AI-generated content may be incorrect."/>
-            <wp:cNvGraphicFramePr>
-              <a:graphicFrameLocks xmlns:a="http://schemas.openxmlformats.org/drawingml/2006/main" noChangeAspect="1"/>
-            </wp:cNvGraphicFramePr>
-            <a:graphic xmlns:a="http://schemas.openxmlformats.org/drawingml/2006/main">
-              <a:graphicData uri="http://schemas.openxmlformats.org/drawingml/2006/picture">
-                <pic:pic xmlns:pic="http://schemas.openxmlformats.org/drawingml/2006/picture">
-                  <pic:nvPicPr>
-                    <pic:cNvPr id="1913102501" name="Picture 2" descr="A screenshot of a web page&#10;&#10;AI-generated content may be incorrect."/>
-                    <pic:cNvPicPr/>
-                  </pic:nvPicPr>
-                  <pic:blipFill>
-                    <a:blip r:embed="rId11" cstate="print">
-                      <a:extLst>
-                        <a:ext uri="{28A0092B-C50C-407E-A947-70E740481C1C}">
-                          <a14:useLocalDpi xmlns:a14="http://schemas.microsoft.com/office/drawing/2010/main" val="0"/>
-                        </a:ext>
-                      </a:extLst>
-                    </a:blip>
-                    <a:stretch>
-                      <a:fillRect/>
-                    </a:stretch>
-                  </pic:blipFill>
-                  <pic:spPr>
-                    <a:xfrm>
-                      <a:off x="0" y="0"/>
-                      <a:ext cx="5731510" cy="6117590"/>
-                    </a:xfrm>
-                    <a:prstGeom prst="rect">
-                      <a:avLst/>
-                    </a:prstGeom>
-                  </pic:spPr>
-                </pic:pic>
-              </a:graphicData>
-            </a:graphic>
-          </wp:inline>
-        </w:drawing>
-      </w:r>
-    </w:p>
-    <w:p>
-      <w:pPr>
-        <w:ind w:left="720"/>
-        <w:rPr>
-          <w:rFonts w:ascii="Times New Roman" w:hAnsi="Times New Roman" w:cs="Times New Roman"/>
-          <w:b/>
-          <w:bCs/>
-          <w:sz w:val="32"/>
-          <w:szCs w:val="32"/>
-          <w:lang w:val="en-US"/>
-        </w:rPr>
-      </w:pPr>
-    </w:p>
-    <w:p>
-      <w:pPr>
-        <w:ind w:left="720"/>
-        <w:rPr>
-          <w:rFonts w:ascii="Times New Roman" w:hAnsi="Times New Roman" w:cs="Times New Roman"/>
-          <w:b/>
-          <w:bCs/>
-          <w:sz w:val="32"/>
-          <w:szCs w:val="32"/>
-          <w:lang w:val="en-US"/>
-        </w:rPr>
-      </w:pPr>
-    </w:p>
-    <w:p>
-      <w:pPr>
-        <w:ind w:left="720"/>
-        <w:rPr>
-          <w:rFonts w:ascii="Times New Roman" w:hAnsi="Times New Roman" w:cs="Times New Roman"/>
-          <w:b/>
-          <w:bCs/>
-          <w:sz w:val="32"/>
-          <w:szCs w:val="32"/>
-          <w:lang w:val="en-US"/>
-        </w:rPr>
-      </w:pPr>
-    </w:p>
-    <w:p>
-      <w:pPr>
-        <w:ind w:left="720"/>
-        <w:rPr>
-          <w:rFonts w:ascii="Times New Roman" w:hAnsi="Times New Roman" w:cs="Times New Roman"/>
-          <w:sz w:val="28"/>
-          <w:szCs w:val="28"/>
-          <w:lang w:val="en-US"/>
-        </w:rPr>
-      </w:pPr>
-    </w:p>
-    <w:p>
-      <w:pPr>
-        <w:ind w:left="720"/>
-        <w:rPr>
-          <w:rFonts w:ascii="Times New Roman" w:hAnsi="Times New Roman" w:cs="Times New Roman"/>
-          <w:sz w:val="28"/>
-          <w:szCs w:val="28"/>
-          <w:lang w:val="en-US"/>
-        </w:rPr>
-      </w:pPr>
-    </w:p>
-    <w:p>
-      <w:pPr>
-        <w:rPr>
-          <w:rFonts w:ascii="Times New Roman" w:hAnsi="Times New Roman" w:cs="Times New Roman"/>
-          <w:sz w:val="28"/>
-          <w:szCs w:val="28"/>
-          <w:lang w:val="en-US"/>
-        </w:rPr>
-      </w:pPr>
-    </w:p>
-    <w:p>
-      <w:pPr>
-        <w:ind w:left="720"/>
-        <w:rPr>
-          <w:rFonts w:ascii="Times New Roman" w:hAnsi="Times New Roman" w:cs="Times New Roman"/>
-          <w:sz w:val="28"/>
-          <w:szCs w:val="28"/>
-          <w:lang w:val="en-US"/>
-        </w:rPr>
-      </w:pPr>
-      <w:r>
-        <w:rPr>
-          <w:rFonts w:ascii="Times New Roman" w:hAnsi="Times New Roman" w:cs="Times New Roman"/>
-          <w:sz w:val="28"/>
-          <w:szCs w:val="28"/>
-          <w:lang w:val="en-US"/>
-        </w:rPr>
-        <w:t>Batch Processing Screen</w:t>
-      </w:r>
-      <w:r>
-        <w:rPr>
-          <w:rFonts w:ascii="Times New Roman" w:hAnsi="Times New Roman" w:cs="Times New Roman"/>
-          <w:sz w:val="28"/>
-          <w:szCs w:val="28"/>
-          <w:lang w:val="en-US"/>
-        </w:rPr>
-        <w:t>:</w:t>
-      </w:r>
-    </w:p>
-    <w:p>
-      <w:pPr>
-        <w:ind w:left="720"/>
-        <w:rPr>
-          <w:rFonts w:ascii="Times New Roman" w:hAnsi="Times New Roman" w:cs="Times New Roman"/>
-          <w:b/>
-          <w:bCs/>
-          <w:sz w:val="32"/>
-          <w:szCs w:val="32"/>
-          <w:lang w:val="en-US"/>
-        </w:rPr>
-      </w:pPr>
-      <w:r>
-        <w:rPr>
-          <w:rFonts w:ascii="Times New Roman" w:hAnsi="Times New Roman" w:cs="Times New Roman"/>
-          <w:b/>
-          <w:bCs/>
-          <w:noProof/>
-          <w:sz w:val="32"/>
-          <w:szCs w:val="32"/>
-          <w:lang w:val="en-US"/>
-        </w:rPr>
-        <w:drawing>
-          <wp:inline distT="0" distB="0" distL="0" distR="0" wp14:anchorId="6A8C76E4" wp14:editId="2B596F31">
-            <wp:extent cx="5731510" cy="7150100"/>
-            <wp:effectExtent l="0" t="0" r="0" b="0"/>
-            <wp:docPr id="1199272765" name="Picture 3" descr="A diagram of a data processing process&#10;&#10;AI-generated content may be incorrect."/>
-            <wp:cNvGraphicFramePr>
-              <a:graphicFrameLocks xmlns:a="http://schemas.openxmlformats.org/drawingml/2006/main" noChangeAspect="1"/>
-            </wp:cNvGraphicFramePr>
-            <a:graphic xmlns:a="http://schemas.openxmlformats.org/drawingml/2006/main">
-              <a:graphicData uri="http://schemas.openxmlformats.org/drawingml/2006/picture">
-                <pic:pic xmlns:pic="http://schemas.openxmlformats.org/drawingml/2006/picture">
-                  <pic:nvPicPr>
-                    <pic:cNvPr id="1199272765" name="Picture 3" descr="A diagram of a data processing process&#10;&#10;AI-generated content may be incorrect."/>
-                    <pic:cNvPicPr/>
-                  </pic:nvPicPr>
-                  <pic:blipFill>
-                    <a:blip r:embed="rId12">
-                      <a:extLst>
-                        <a:ext uri="{28A0092B-C50C-407E-A947-70E740481C1C}">
-                          <a14:useLocalDpi xmlns:a14="http://schemas.microsoft.com/office/drawing/2010/main" val="0"/>
-                        </a:ext>
-                      </a:extLst>
-                    </a:blip>
-                    <a:stretch>
-                      <a:fillRect/>
-                    </a:stretch>
-                  </pic:blipFill>
-                  <pic:spPr>
-                    <a:xfrm>
-                      <a:off x="0" y="0"/>
-                      <a:ext cx="5731510" cy="7150100"/>
-                    </a:xfrm>
-                    <a:prstGeom prst="rect">
-                      <a:avLst/>
-                    </a:prstGeom>
-                  </pic:spPr>
-                </pic:pic>
-              </a:graphicData>
-            </a:graphic>
-          </wp:inline>
-        </w:drawing>
-      </w:r>
-    </w:p>
-    <w:p>
-      <w:pPr>
-        <w:ind w:left="720"/>
-        <w:rPr>
-          <w:rFonts w:ascii="Times New Roman" w:hAnsi="Times New Roman" w:cs="Times New Roman"/>
-          <w:b/>
-          <w:bCs/>
-          <w:sz w:val="32"/>
-          <w:szCs w:val="32"/>
-          <w:lang w:val="en-US"/>
-        </w:rPr>
-      </w:pPr>
-    </w:p>
-    <w:p>
-      <w:pPr>
-        <w:ind w:left="720"/>
-        <w:rPr>
-          <w:rFonts w:ascii="Times New Roman" w:hAnsi="Times New Roman" w:cs="Times New Roman"/>
-          <w:b/>
-          <w:bCs/>
-          <w:sz w:val="32"/>
-          <w:szCs w:val="32"/>
-          <w:lang w:val="en-US"/>
-        </w:rPr>
-      </w:pPr>
-    </w:p>
-    <w:p>
-      <w:pPr>
-        <w:ind w:left="720"/>
-        <w:rPr>
-          <w:rFonts w:ascii="Times New Roman" w:hAnsi="Times New Roman" w:cs="Times New Roman"/>
-          <w:b/>
-          <w:bCs/>
-          <w:sz w:val="32"/>
-          <w:szCs w:val="32"/>
-          <w:lang w:val="en-US"/>
-        </w:rPr>
-      </w:pPr>
+        <w:t>Libraries</w:t>
+      </w:r>
     </w:p>
     <w:p>
       <w:pPr>
         <w:pStyle w:val="ListParagraph"/>
-        <w:numPr>
-          <w:ilvl w:val="0"/>
-          <w:numId w:val="7"/>
-        </w:numPr>
-        <w:rPr>
-          <w:rFonts w:ascii="Times New Roman" w:hAnsi="Times New Roman" w:cs="Times New Roman"/>
-          <w:b/>
-          <w:bCs/>
-          <w:sz w:val="32"/>
-          <w:szCs w:val="32"/>
-          <w:lang w:val="en-US"/>
-        </w:rPr>
-      </w:pPr>
-      <w:r>
-        <w:rPr>
-          <w:rFonts w:ascii="Times New Roman" w:hAnsi="Times New Roman" w:cs="Times New Roman"/>
-          <w:b/>
-          <w:bCs/>
-          <w:sz w:val="32"/>
-          <w:szCs w:val="32"/>
-          <w:lang w:val="en-US"/>
-        </w:rPr>
-        <w:t>Libraries</w:t>
-      </w:r>
+        <w:rPr>
+          <w:rFonts w:ascii="Times New Roman" w:hAnsi="Times New Roman" w:cs="Times New Roman"/>
+          <w:b/>
+          <w:bCs/>
+          <w:sz w:val="32"/>
+          <w:szCs w:val="32"/>
+          <w:lang w:val="en-US"/>
+        </w:rPr>
+      </w:pPr>
     </w:p>
     <w:p>
       <w:pPr>
         <w:pStyle w:val="ListParagraph"/>
         <w:rPr>
           <w:rFonts w:ascii="Times New Roman" w:hAnsi="Times New Roman" w:cs="Times New Roman"/>
-          <w:b/>
-          <w:bCs/>
-          <w:sz w:val="32"/>
-          <w:szCs w:val="32"/>
-          <w:lang w:val="en-US"/>
-        </w:rPr>
-      </w:pPr>
-    </w:p>
-    <w:p>
-      <w:pPr>
-        <w:pStyle w:val="ListParagraph"/>
-        <w:rPr>
-          <w:rFonts w:ascii="Times New Roman" w:hAnsi="Times New Roman" w:cs="Times New Roman"/>
-          <w:sz w:val="32"/>
-          <w:szCs w:val="32"/>
-          <w:lang w:val="en-US"/>
-        </w:rPr>
-      </w:pPr>
-      <w:hyperlink r:id="rId13" w:history="1">
+          <w:sz w:val="32"/>
+          <w:szCs w:val="32"/>
+          <w:lang w:val="en-US"/>
+        </w:rPr>
+      </w:pPr>
+      <w:hyperlink r:id="rId10" w:history="1">
         <w:r>
           <w:rPr>
             <w:rStyle w:val="Hyperlink"/>
@@ -3242,7 +2708,7 @@
           <w:lang w:val="en-US"/>
         </w:rPr>
       </w:pPr>
-      <w:hyperlink r:id="rId14" w:history="1">
+      <w:hyperlink r:id="rId11" w:history="1">
         <w:proofErr w:type="spellStart"/>
         <w:r>
           <w:rPr>

</xml_diff>

<commit_message>
Made intro paragraph concise and narrowed down issues to only relevant ones for the project shareholder and customers
</commit_message>
<xml_diff>
--- a/Project Plan/Project Plan.docx
+++ b/Project Plan/Project Plan.docx
@@ -23,7 +23,7 @@
           <w:szCs w:val="32"/>
           <w:lang w:val="en-US"/>
         </w:rPr>
-        <w:t xml:space="preserve"> </w:t>
+        <w:t>Project Plan</w:t>
       </w:r>
       <w:r>
         <w:rPr>
@@ -34,9 +34,12 @@
           <w:szCs w:val="32"/>
           <w:lang w:val="en-US"/>
         </w:rPr>
-        <w:t>Project Plan</w:t>
-      </w:r>
-      <w:r>
+        <w:t xml:space="preserve"> – GPR.PY 2.0</w:t>
+      </w:r>
+    </w:p>
+    <w:p>
+      <w:pPr>
+        <w:jc w:val="center"/>
         <w:rPr>
           <w:rFonts w:ascii="Times New Roman" w:hAnsi="Times New Roman" w:cs="Times New Roman"/>
           <w:b/>
@@ -45,21 +48,22 @@
           <w:szCs w:val="32"/>
           <w:lang w:val="en-US"/>
         </w:rPr>
-        <w:t xml:space="preserve"> – GPR.PY 2.0</w:t>
-      </w:r>
-    </w:p>
-    <w:p>
-      <w:pPr>
-        <w:jc w:val="center"/>
-        <w:rPr>
-          <w:rFonts w:ascii="Times New Roman" w:hAnsi="Times New Roman" w:cs="Times New Roman"/>
-          <w:b/>
-          <w:bCs/>
-          <w:sz w:val="32"/>
-          <w:szCs w:val="32"/>
-          <w:lang w:val="en-US"/>
-        </w:rPr>
-      </w:pPr>
+      </w:pPr>
+    </w:p>
+    <w:p>
+      <w:pPr>
+        <w:rPr>
+          <w:rFonts w:ascii="Times New Roman" w:hAnsi="Times New Roman" w:cs="Times New Roman"/>
+          <w:lang w:val="en-US"/>
+        </w:rPr>
+      </w:pPr>
+      <w:r>
+        <w:rPr>
+          <w:rFonts w:ascii="Times New Roman" w:hAnsi="Times New Roman" w:cs="Times New Roman"/>
+          <w:lang w:val="en-US"/>
+        </w:rPr>
+        <w:t xml:space="preserve">Ground Penetrating Radar (GPR) is a technology used to get images underground features, some applications include detection of pipelines, geological formations, assessing building integrity and finding artifacts. </w:t>
+      </w:r>
     </w:p>
     <w:p>
       <w:pPr>
@@ -172,7 +176,7 @@
           <w:rFonts w:ascii="Times New Roman" w:hAnsi="Times New Roman" w:cs="Times New Roman"/>
           <w:lang w:val="en-US"/>
         </w:rPr>
-        <w:t>Ground Penetrating Radar (GPR) is a technology used to get images underground features, some applications include detection of pipelines, geological formations, assessing building integrity and finding artifacts. Groups such as The Institute of Prairie and Indigenous Archaeology (IPIA) use GPR to find unmarked graves, however this process is challenging due to the limitation of opensource software</w:t>
+        <w:t>Groups such as The Institute of Prairie and Indigenous Archaeology (IPIA) use GPR to find unmarked graves, however this process is challenging due to the limitation of opensource software</w:t>
       </w:r>
       <w:r>
         <w:rPr>
@@ -272,36 +276,6 @@
           <w:lang w:val="en-US"/>
         </w:rPr>
         <w:t xml:space="preserve"> </w:t>
-      </w:r>
-    </w:p>
-    <w:p>
-      <w:pPr>
-        <w:rPr>
-          <w:rFonts w:ascii="Times New Roman" w:hAnsi="Times New Roman" w:cs="Times New Roman"/>
-          <w:lang w:val="en-US"/>
-        </w:rPr>
-      </w:pPr>
-      <w:r>
-        <w:rPr>
-          <w:rFonts w:ascii="Times New Roman" w:hAnsi="Times New Roman" w:cs="Times New Roman"/>
-          <w:lang w:val="en-US"/>
-        </w:rPr>
-        <w:t xml:space="preserve">The problem was first put forth by William Wadsworth, from the University of Alberta </w:t>
-      </w:r>
-    </w:p>
-    <w:p>
-      <w:pPr>
-        <w:rPr>
-          <w:rFonts w:ascii="Times New Roman" w:hAnsi="Times New Roman" w:cs="Times New Roman"/>
-          <w:lang w:val="en-US"/>
-        </w:rPr>
-      </w:pPr>
-      <w:r>
-        <w:rPr>
-          <w:rFonts w:ascii="Times New Roman" w:hAnsi="Times New Roman" w:cs="Times New Roman"/>
-          <w:lang w:val="en-US"/>
-        </w:rPr>
-        <w:t>During my final year of university, along with a team, I attempted to tackle these issues but was not entirely successful. There were some successes, yet the project was far from perfect and missed some big targets. This time the goal is to approach the problem in a more organized manner, by laying out a clear plan, implementing a proper architecture and using coding principles to ensure all targets are met and the final product is serviceable.</w:t>
       </w:r>
     </w:p>
     <w:p>
@@ -502,7 +476,9 @@
           <w:lang w:val="en-US"/>
         </w:rPr>
       </w:pPr>
-      <w:r>
+    </w:p>
+    <w:p>
+      <w:pPr>
         <w:rPr>
           <w:rFonts w:ascii="Times New Roman" w:hAnsi="Times New Roman" w:cs="Times New Roman"/>
           <w:b/>
@@ -511,8 +487,7 @@
           <w:szCs w:val="32"/>
           <w:lang w:val="en-US"/>
         </w:rPr>
-        <w:t>Issues</w:t>
-      </w:r>
+      </w:pPr>
     </w:p>
     <w:p>
       <w:pPr>
@@ -520,8 +495,8 @@
           <w:rFonts w:ascii="Times New Roman" w:hAnsi="Times New Roman" w:cs="Times New Roman"/>
           <w:b/>
           <w:bCs/>
-          <w:sz w:val="28"/>
-          <w:szCs w:val="28"/>
+          <w:sz w:val="32"/>
+          <w:szCs w:val="32"/>
           <w:lang w:val="en-US"/>
         </w:rPr>
       </w:pPr>
@@ -530,79 +505,13 @@
           <w:rFonts w:ascii="Times New Roman" w:hAnsi="Times New Roman" w:cs="Times New Roman"/>
           <w:b/>
           <w:bCs/>
-          <w:sz w:val="28"/>
-          <w:szCs w:val="28"/>
-          <w:lang w:val="en-US"/>
-        </w:rPr>
-        <w:t xml:space="preserve">A. </w:t>
-      </w:r>
-      <w:r>
-        <w:rPr>
-          <w:rFonts w:ascii="Times New Roman" w:hAnsi="Times New Roman" w:cs="Times New Roman"/>
-          <w:b/>
-          <w:bCs/>
-          <w:sz w:val="28"/>
-          <w:szCs w:val="28"/>
-          <w:lang w:val="en-US"/>
-        </w:rPr>
-        <w:t>Capstone Project</w:t>
-      </w:r>
-    </w:p>
-    <w:p>
-      <w:pPr>
-        <w:ind w:left="360"/>
-        <w:rPr>
-          <w:rFonts w:ascii="Times New Roman" w:hAnsi="Times New Roman" w:cs="Times New Roman"/>
-          <w:lang w:val="en-US"/>
-        </w:rPr>
-      </w:pPr>
-      <w:r>
-        <w:rPr>
-          <w:rFonts w:ascii="Times New Roman" w:hAnsi="Times New Roman" w:cs="Times New Roman"/>
-          <w:lang w:val="en-US"/>
-        </w:rPr>
-        <w:t xml:space="preserve">The first iteration of GPR.PY was developed as a part of my capstone </w:t>
-      </w:r>
-      <w:proofErr w:type="gramStart"/>
-      <w:r>
-        <w:rPr>
-          <w:rFonts w:ascii="Times New Roman" w:hAnsi="Times New Roman" w:cs="Times New Roman"/>
-          <w:lang w:val="en-US"/>
-        </w:rPr>
-        <w:t>project, and</w:t>
-      </w:r>
-      <w:proofErr w:type="gramEnd"/>
-      <w:r>
-        <w:rPr>
-          <w:rFonts w:ascii="Times New Roman" w:hAnsi="Times New Roman" w:cs="Times New Roman"/>
-          <w:lang w:val="en-US"/>
-        </w:rPr>
-        <w:t xml:space="preserve"> aimed at </w:t>
-      </w:r>
-      <w:proofErr w:type="spellStart"/>
-      <w:r>
-        <w:rPr>
-          <w:rFonts w:ascii="Times New Roman" w:hAnsi="Times New Roman" w:cs="Times New Roman"/>
-          <w:lang w:val="en-US"/>
-        </w:rPr>
-        <w:t>acheieving</w:t>
-      </w:r>
-      <w:proofErr w:type="spellEnd"/>
-      <w:r>
-        <w:rPr>
-          <w:rFonts w:ascii="Times New Roman" w:hAnsi="Times New Roman" w:cs="Times New Roman"/>
-          <w:lang w:val="en-US"/>
-        </w:rPr>
-        <w:t xml:space="preserve"> the same goals that are listed above. However, due to several limitations in the libraries used and poor design choices the project failed to meet some targets. Although the final product was working, it was not ready for real-world deployment. The issues with the previous project are as follows:</w:t>
-      </w:r>
-    </w:p>
-    <w:p>
-      <w:pPr>
-        <w:rPr>
-          <w:rFonts w:ascii="Times New Roman" w:hAnsi="Times New Roman" w:cs="Times New Roman"/>
-          <w:lang w:val="en-US"/>
-        </w:rPr>
-      </w:pPr>
+          <w:sz w:val="32"/>
+          <w:szCs w:val="32"/>
+          <w:lang w:val="en-US"/>
+        </w:rPr>
+        <w:lastRenderedPageBreak/>
+        <w:t>Issues</w:t>
+      </w:r>
     </w:p>
     <w:p>
       <w:pPr>
@@ -686,32 +595,7 @@
           <w:rFonts w:ascii="Times New Roman" w:hAnsi="Times New Roman" w:cs="Times New Roman"/>
           <w:lang w:val="en-US"/>
         </w:rPr>
-        <w:t xml:space="preserve"> Despite reinstalling the correct version, the problem continued to persist. </w:t>
-      </w:r>
-      <w:r>
-        <w:rPr>
-          <w:rFonts w:ascii="Times New Roman" w:hAnsi="Times New Roman" w:cs="Times New Roman"/>
-          <w:lang w:val="en-US"/>
-        </w:rPr>
-        <w:t xml:space="preserve">The temporary fix was to </w:t>
-      </w:r>
-      <w:proofErr w:type="spellStart"/>
-      <w:proofErr w:type="gramStart"/>
-      <w:r>
-        <w:rPr>
-          <w:rFonts w:ascii="Times New Roman" w:hAnsi="Times New Roman" w:cs="Times New Roman"/>
-          <w:lang w:val="en-US"/>
-        </w:rPr>
-        <w:t>removed</w:t>
-      </w:r>
-      <w:proofErr w:type="spellEnd"/>
-      <w:proofErr w:type="gramEnd"/>
-      <w:r>
-        <w:rPr>
-          <w:rFonts w:ascii="Times New Roman" w:hAnsi="Times New Roman" w:cs="Times New Roman"/>
-          <w:lang w:val="en-US"/>
-        </w:rPr>
-        <w:t xml:space="preserve"> the import statement entirely. This however, removed the 3D cube visualization capabilities of the program on MacOS.</w:t>
+        <w:t xml:space="preserve"> </w:t>
       </w:r>
     </w:p>
     <w:p>
@@ -722,54 +606,6 @@
           <w:lang w:val="en-US"/>
         </w:rPr>
       </w:pPr>
-      <w:r>
-        <w:rPr>
-          <w:rFonts w:ascii="Times New Roman" w:hAnsi="Times New Roman" w:cs="Times New Roman"/>
-          <w:noProof/>
-          <w:lang w:val="en-US"/>
-        </w:rPr>
-        <w:drawing>
-          <wp:inline distT="0" distB="0" distL="0" distR="0" wp14:anchorId="6D780E43" wp14:editId="0E95FFC1">
-            <wp:extent cx="5731510" cy="3283585"/>
-            <wp:effectExtent l="0" t="0" r="0" b="5715"/>
-            <wp:docPr id="1025035813" name="Picture 1" descr="A screenshot of a computer program&#10;&#10;AI-generated content may be incorrect."/>
-            <wp:cNvGraphicFramePr>
-              <a:graphicFrameLocks xmlns:a="http://schemas.openxmlformats.org/drawingml/2006/main" noChangeAspect="1"/>
-            </wp:cNvGraphicFramePr>
-            <a:graphic xmlns:a="http://schemas.openxmlformats.org/drawingml/2006/main">
-              <a:graphicData uri="http://schemas.openxmlformats.org/drawingml/2006/picture">
-                <pic:pic xmlns:pic="http://schemas.openxmlformats.org/drawingml/2006/picture">
-                  <pic:nvPicPr>
-                    <pic:cNvPr id="1025035813" name="Picture 1" descr="A screenshot of a computer program&#10;&#10;AI-generated content may be incorrect."/>
-                    <pic:cNvPicPr/>
-                  </pic:nvPicPr>
-                  <pic:blipFill>
-                    <a:blip r:embed="rId5">
-                      <a:extLst>
-                        <a:ext uri="{28A0092B-C50C-407E-A947-70E740481C1C}">
-                          <a14:useLocalDpi xmlns:a14="http://schemas.microsoft.com/office/drawing/2010/main" val="0"/>
-                        </a:ext>
-                      </a:extLst>
-                    </a:blip>
-                    <a:stretch>
-                      <a:fillRect/>
-                    </a:stretch>
-                  </pic:blipFill>
-                  <pic:spPr>
-                    <a:xfrm>
-                      <a:off x="0" y="0"/>
-                      <a:ext cx="5731510" cy="3283585"/>
-                    </a:xfrm>
-                    <a:prstGeom prst="rect">
-                      <a:avLst/>
-                    </a:prstGeom>
-                  </pic:spPr>
-                </pic:pic>
-              </a:graphicData>
-            </a:graphic>
-          </wp:inline>
-        </w:drawing>
-      </w:r>
     </w:p>
     <w:p>
       <w:pPr>
@@ -806,106 +642,11 @@
     </w:p>
     <w:p>
       <w:pPr>
-        <w:ind w:left="720"/>
-        <w:rPr>
-          <w:rFonts w:ascii="Times New Roman" w:hAnsi="Times New Roman" w:cs="Times New Roman"/>
-          <w:lang w:val="en-US"/>
-        </w:rPr>
-      </w:pPr>
-      <w:r>
-        <w:rPr>
-          <w:rFonts w:ascii="Times New Roman" w:hAnsi="Times New Roman" w:cs="Times New Roman"/>
-          <w:lang w:val="en-US"/>
-        </w:rPr>
-        <w:t xml:space="preserve">The program also implemented a batch processing feature that enabled users to enter a set of parameters in a series of text fields, and those changes would be applied to the folder containing the GPR data. </w:t>
-      </w:r>
-      <w:r>
-        <w:rPr>
-          <w:rFonts w:ascii="Times New Roman" w:hAnsi="Times New Roman" w:cs="Times New Roman"/>
-          <w:lang w:val="en-US"/>
-        </w:rPr>
-        <w:t xml:space="preserve">The original script was developed by William Wadsworth and Dr Something from the University of Laval. </w:t>
-      </w:r>
-      <w:r>
-        <w:rPr>
-          <w:rFonts w:ascii="Times New Roman" w:hAnsi="Times New Roman" w:cs="Times New Roman"/>
-          <w:lang w:val="en-US"/>
-        </w:rPr>
-        <w:t>To speed up the process, threads were utilized and resulted in 60% faster processing times. However, it would result in memory leaks and</w:t>
-      </w:r>
-      <w:r>
-        <w:rPr>
-          <w:rFonts w:ascii="Times New Roman" w:hAnsi="Times New Roman" w:cs="Times New Roman"/>
-          <w:lang w:val="en-US"/>
-        </w:rPr>
-        <w:t xml:space="preserve"> requires a “force quit” to end the program after one run.</w:t>
-      </w:r>
-    </w:p>
-    <w:p>
-      <w:pPr>
-        <w:ind w:left="720"/>
-        <w:rPr>
-          <w:rFonts w:ascii="Times New Roman" w:hAnsi="Times New Roman" w:cs="Times New Roman"/>
-          <w:lang w:val="en-US"/>
-        </w:rPr>
-      </w:pPr>
-    </w:p>
-    <w:p>
-      <w:pPr>
-        <w:ind w:left="360"/>
-        <w:rPr>
-          <w:rFonts w:ascii="Times New Roman" w:hAnsi="Times New Roman" w:cs="Times New Roman"/>
-          <w:lang w:val="en-US"/>
-        </w:rPr>
-      </w:pPr>
-      <w:r>
-        <w:rPr>
-          <w:rFonts w:ascii="Times New Roman" w:hAnsi="Times New Roman" w:cs="Times New Roman"/>
-          <w:noProof/>
-          <w:lang w:val="en-US"/>
-        </w:rPr>
-        <w:drawing>
-          <wp:inline distT="0" distB="0" distL="0" distR="0" wp14:anchorId="65FE17F1" wp14:editId="7EC07708">
-            <wp:extent cx="5731510" cy="3676015"/>
-            <wp:effectExtent l="0" t="0" r="0" b="0"/>
-            <wp:docPr id="1531882688" name="Picture 2"/>
-            <wp:cNvGraphicFramePr>
-              <a:graphicFrameLocks xmlns:a="http://schemas.openxmlformats.org/drawingml/2006/main" noChangeAspect="1"/>
-            </wp:cNvGraphicFramePr>
-            <a:graphic xmlns:a="http://schemas.openxmlformats.org/drawingml/2006/main">
-              <a:graphicData uri="http://schemas.openxmlformats.org/drawingml/2006/picture">
-                <pic:pic xmlns:pic="http://schemas.openxmlformats.org/drawingml/2006/picture">
-                  <pic:nvPicPr>
-                    <pic:cNvPr id="1531882688" name="Picture 1531882688"/>
-                    <pic:cNvPicPr/>
-                  </pic:nvPicPr>
-                  <pic:blipFill>
-                    <a:blip r:embed="rId6" cstate="print">
-                      <a:extLst>
-                        <a:ext uri="{28A0092B-C50C-407E-A947-70E740481C1C}">
-                          <a14:useLocalDpi xmlns:a14="http://schemas.microsoft.com/office/drawing/2010/main" val="0"/>
-                        </a:ext>
-                      </a:extLst>
-                    </a:blip>
-                    <a:stretch>
-                      <a:fillRect/>
-                    </a:stretch>
-                  </pic:blipFill>
-                  <pic:spPr>
-                    <a:xfrm>
-                      <a:off x="0" y="0"/>
-                      <a:ext cx="5731510" cy="3676015"/>
-                    </a:xfrm>
-                    <a:prstGeom prst="rect">
-                      <a:avLst/>
-                    </a:prstGeom>
-                  </pic:spPr>
-                </pic:pic>
-              </a:graphicData>
-            </a:graphic>
-          </wp:inline>
-        </w:drawing>
-      </w:r>
+        <w:rPr>
+          <w:rFonts w:ascii="Times New Roman" w:hAnsi="Times New Roman" w:cs="Times New Roman"/>
+          <w:lang w:val="en-US"/>
+        </w:rPr>
+      </w:pPr>
     </w:p>
     <w:p>
       <w:pPr>
@@ -928,7 +669,7 @@
           <w:bCs/>
           <w:lang w:val="en-US"/>
         </w:rPr>
-        <w:t>Interpolation</w:t>
+        <w:t>Cube slicing</w:t>
       </w:r>
     </w:p>
     <w:p>
@@ -944,60 +685,14 @@
           <w:rFonts w:ascii="Times New Roman" w:hAnsi="Times New Roman" w:cs="Times New Roman"/>
           <w:lang w:val="en-US"/>
         </w:rPr>
-        <w:t xml:space="preserve">This step utilized the makeDataCube.py file, and </w:t>
-      </w:r>
-      <w:r>
-        <w:rPr>
-          <w:rFonts w:ascii="Times New Roman" w:hAnsi="Times New Roman" w:cs="Times New Roman"/>
-          <w:lang w:val="en-US"/>
-        </w:rPr>
-        <w:t>because of</w:t>
-      </w:r>
-      <w:r>
-        <w:rPr>
-          <w:rFonts w:ascii="Times New Roman" w:hAnsi="Times New Roman" w:cs="Times New Roman"/>
-          <w:lang w:val="en-US"/>
-        </w:rPr>
-        <w:t xml:space="preserve"> the memory leaks created an incorrect matrix. Resulting in the cubing step, which already would take 2-4 hours to finish</w:t>
-      </w:r>
-      <w:r>
-        <w:rPr>
-          <w:rFonts w:ascii="Times New Roman" w:hAnsi="Times New Roman" w:cs="Times New Roman"/>
-          <w:lang w:val="en-US"/>
-        </w:rPr>
-        <w:t xml:space="preserve">, getting stuck in an infinite loop. </w:t>
-      </w:r>
-    </w:p>
-    <w:p>
-      <w:pPr>
-        <w:rPr>
-          <w:rFonts w:ascii="Times New Roman" w:hAnsi="Times New Roman" w:cs="Times New Roman"/>
-          <w:lang w:val="en-US"/>
-        </w:rPr>
-      </w:pPr>
-    </w:p>
-    <w:p>
-      <w:pPr>
-        <w:pStyle w:val="ListParagraph"/>
-        <w:numPr>
-          <w:ilvl w:val="0"/>
-          <w:numId w:val="2"/>
-        </w:numPr>
-        <w:rPr>
-          <w:rFonts w:ascii="Times New Roman" w:hAnsi="Times New Roman" w:cs="Times New Roman"/>
-          <w:b/>
-          <w:bCs/>
-          <w:lang w:val="en-US"/>
-        </w:rPr>
-      </w:pPr>
-      <w:r>
-        <w:rPr>
-          <w:rFonts w:ascii="Times New Roman" w:hAnsi="Times New Roman" w:cs="Times New Roman"/>
-          <w:b/>
-          <w:bCs/>
-          <w:lang w:val="en-US"/>
-        </w:rPr>
-        <w:t>Cube slicing</w:t>
+        <w:t>Results</w:t>
+      </w:r>
+      <w:r>
+        <w:rPr>
+          <w:rFonts w:ascii="Times New Roman" w:hAnsi="Times New Roman" w:cs="Times New Roman"/>
+          <w:lang w:val="en-US"/>
+        </w:rPr>
+        <w:t xml:space="preserve"> in memory overloads and crashing </w:t>
       </w:r>
     </w:p>
     <w:p>
@@ -1008,447 +703,6 @@
           <w:lang w:val="en-US"/>
         </w:rPr>
       </w:pPr>
-      <w:r>
-        <w:rPr>
-          <w:rFonts w:ascii="Times New Roman" w:hAnsi="Times New Roman" w:cs="Times New Roman"/>
-          <w:lang w:val="en-US"/>
-        </w:rPr>
-        <w:t xml:space="preserve">One of the features requested was to be able to slice a 3D cube at set intervals and obtain the coordinates at each slice. This however would go on longer than intended resulting in memory overloads and crashing </w:t>
-      </w:r>
-      <w:proofErr w:type="spellStart"/>
-      <w:r>
-        <w:rPr>
-          <w:rFonts w:ascii="Times New Roman" w:hAnsi="Times New Roman" w:cs="Times New Roman"/>
-          <w:lang w:val="en-US"/>
-        </w:rPr>
-        <w:t>mayavi</w:t>
-      </w:r>
-      <w:proofErr w:type="spellEnd"/>
-      <w:r>
-        <w:rPr>
-          <w:rFonts w:ascii="Times New Roman" w:hAnsi="Times New Roman" w:cs="Times New Roman"/>
-          <w:lang w:val="en-US"/>
-        </w:rPr>
-        <w:t>. A workaround for this was to manually stop the slicing after 50.</w:t>
-      </w:r>
-    </w:p>
-    <w:p>
-      <w:pPr>
-        <w:rPr>
-          <w:rFonts w:ascii="Times New Roman" w:hAnsi="Times New Roman" w:cs="Times New Roman"/>
-          <w:lang w:val="en-US"/>
-        </w:rPr>
-      </w:pPr>
-    </w:p>
-    <w:p>
-      <w:pPr>
-        <w:pStyle w:val="ListParagraph"/>
-        <w:numPr>
-          <w:ilvl w:val="0"/>
-          <w:numId w:val="2"/>
-        </w:numPr>
-        <w:rPr>
-          <w:rFonts w:ascii="Times New Roman" w:hAnsi="Times New Roman" w:cs="Times New Roman"/>
-          <w:b/>
-          <w:bCs/>
-          <w:lang w:val="en-US"/>
-        </w:rPr>
-      </w:pPr>
-      <w:r>
-        <w:rPr>
-          <w:rFonts w:ascii="Times New Roman" w:hAnsi="Times New Roman" w:cs="Times New Roman"/>
-          <w:b/>
-          <w:bCs/>
-          <w:lang w:val="en-US"/>
-        </w:rPr>
-        <w:t>Design</w:t>
-      </w:r>
-    </w:p>
-    <w:p>
-      <w:pPr>
-        <w:ind w:left="720"/>
-        <w:rPr>
-          <w:rFonts w:ascii="Times New Roman" w:hAnsi="Times New Roman" w:cs="Times New Roman"/>
-          <w:lang w:val="en-US"/>
-        </w:rPr>
-      </w:pPr>
-      <w:r>
-        <w:rPr>
-          <w:rFonts w:ascii="Times New Roman" w:hAnsi="Times New Roman" w:cs="Times New Roman"/>
-          <w:lang w:val="en-US"/>
-        </w:rPr>
-        <w:t xml:space="preserve">Poor design decisions are the cause of some of the previous issues mentioned in Cube slicing, Batch processing and MacOS </w:t>
-      </w:r>
-      <w:r>
-        <w:rPr>
-          <w:rFonts w:ascii="Times New Roman" w:hAnsi="Times New Roman" w:cs="Times New Roman"/>
-          <w:lang w:val="en-US"/>
-        </w:rPr>
-        <w:t>incompatibility</w:t>
-      </w:r>
-      <w:r>
-        <w:rPr>
-          <w:rFonts w:ascii="Times New Roman" w:hAnsi="Times New Roman" w:cs="Times New Roman"/>
-          <w:lang w:val="en-US"/>
-        </w:rPr>
-        <w:t xml:space="preserve">. </w:t>
-      </w:r>
-    </w:p>
-    <w:p>
-      <w:pPr>
-        <w:pStyle w:val="ListParagraph"/>
-        <w:numPr>
-          <w:ilvl w:val="1"/>
-          <w:numId w:val="2"/>
-        </w:numPr>
-        <w:rPr>
-          <w:rFonts w:ascii="Times New Roman" w:hAnsi="Times New Roman" w:cs="Times New Roman"/>
-          <w:lang w:val="en-US"/>
-        </w:rPr>
-      </w:pPr>
-      <w:r>
-        <w:rPr>
-          <w:rFonts w:ascii="Times New Roman" w:hAnsi="Times New Roman" w:cs="Times New Roman"/>
-          <w:lang w:val="en-US"/>
-        </w:rPr>
-        <w:t>Placing all functions and classes in one file</w:t>
-      </w:r>
-      <w:r>
-        <w:rPr>
-          <w:rFonts w:ascii="Times New Roman" w:hAnsi="Times New Roman" w:cs="Times New Roman"/>
-          <w:lang w:val="en-US"/>
-        </w:rPr>
-        <w:t xml:space="preserve"> </w:t>
-      </w:r>
-      <w:r>
-        <w:rPr>
-          <w:rFonts w:ascii="Times New Roman" w:hAnsi="Times New Roman" w:cs="Times New Roman"/>
-          <w:lang w:val="en-US"/>
-        </w:rPr>
-        <w:t>did not permit for changes to be made to variables, buttons or the functions without unintended errors.</w:t>
-      </w:r>
-    </w:p>
-    <w:p>
-      <w:pPr>
-        <w:pStyle w:val="ListParagraph"/>
-        <w:numPr>
-          <w:ilvl w:val="1"/>
-          <w:numId w:val="2"/>
-        </w:numPr>
-        <w:rPr>
-          <w:rFonts w:ascii="Times New Roman" w:hAnsi="Times New Roman" w:cs="Times New Roman"/>
-          <w:lang w:val="en-US"/>
-        </w:rPr>
-      </w:pPr>
-      <w:r>
-        <w:rPr>
-          <w:rFonts w:ascii="Times New Roman" w:hAnsi="Times New Roman" w:cs="Times New Roman"/>
-          <w:lang w:val="en-US"/>
-        </w:rPr>
-        <w:t xml:space="preserve">Using </w:t>
-      </w:r>
-      <w:proofErr w:type="spellStart"/>
-      <w:r>
-        <w:rPr>
-          <w:rFonts w:ascii="Times New Roman" w:hAnsi="Times New Roman" w:cs="Times New Roman"/>
-          <w:i/>
-          <w:iCs/>
-          <w:lang w:val="en-US"/>
-        </w:rPr>
-        <w:t>tkinter</w:t>
-      </w:r>
-      <w:proofErr w:type="spellEnd"/>
-      <w:r>
-        <w:rPr>
-          <w:rFonts w:ascii="Times New Roman" w:hAnsi="Times New Roman" w:cs="Times New Roman"/>
-          <w:lang w:val="en-US"/>
-        </w:rPr>
-        <w:t xml:space="preserve"> for the UI constrained development since it is </w:t>
-      </w:r>
-      <w:proofErr w:type="spellStart"/>
-      <w:r>
-        <w:rPr>
-          <w:rFonts w:ascii="Times New Roman" w:hAnsi="Times New Roman" w:cs="Times New Roman"/>
-          <w:lang w:val="en-US"/>
-        </w:rPr>
-        <w:t>uncompatible</w:t>
-      </w:r>
-      <w:proofErr w:type="spellEnd"/>
-      <w:r>
-        <w:rPr>
-          <w:rFonts w:ascii="Times New Roman" w:hAnsi="Times New Roman" w:cs="Times New Roman"/>
-          <w:lang w:val="en-US"/>
-        </w:rPr>
-        <w:t xml:space="preserve"> with certain libraries, especially when it came to the 3D visualization. This also made running </w:t>
-      </w:r>
-      <w:proofErr w:type="spellStart"/>
-      <w:r>
-        <w:rPr>
-          <w:rFonts w:ascii="Times New Roman" w:hAnsi="Times New Roman" w:cs="Times New Roman"/>
-          <w:i/>
-          <w:iCs/>
-          <w:lang w:val="en-US"/>
-        </w:rPr>
-        <w:t>mayavi</w:t>
-      </w:r>
-      <w:proofErr w:type="spellEnd"/>
-      <w:r>
-        <w:rPr>
-          <w:rFonts w:ascii="Times New Roman" w:hAnsi="Times New Roman" w:cs="Times New Roman"/>
-          <w:lang w:val="en-US"/>
-        </w:rPr>
-        <w:t xml:space="preserve"> considerably slow.</w:t>
-      </w:r>
-    </w:p>
-    <w:p>
-      <w:pPr>
-        <w:pStyle w:val="ListParagraph"/>
-        <w:numPr>
-          <w:ilvl w:val="1"/>
-          <w:numId w:val="2"/>
-        </w:numPr>
-        <w:rPr>
-          <w:rFonts w:ascii="Times New Roman" w:hAnsi="Times New Roman" w:cs="Times New Roman"/>
-          <w:lang w:val="en-US"/>
-        </w:rPr>
-      </w:pPr>
-      <w:r>
-        <w:rPr>
-          <w:rFonts w:ascii="Times New Roman" w:hAnsi="Times New Roman" w:cs="Times New Roman"/>
-          <w:lang w:val="en-US"/>
-        </w:rPr>
-        <w:lastRenderedPageBreak/>
-        <w:t xml:space="preserve">Using </w:t>
-      </w:r>
-      <w:proofErr w:type="spellStart"/>
-      <w:r>
-        <w:rPr>
-          <w:rFonts w:ascii="Times New Roman" w:hAnsi="Times New Roman" w:cs="Times New Roman"/>
-          <w:lang w:val="en-US"/>
-        </w:rPr>
-        <w:t>tkinter</w:t>
-      </w:r>
-      <w:proofErr w:type="spellEnd"/>
-      <w:r>
-        <w:rPr>
-          <w:rFonts w:ascii="Times New Roman" w:hAnsi="Times New Roman" w:cs="Times New Roman"/>
-          <w:lang w:val="en-US"/>
-        </w:rPr>
-        <w:t xml:space="preserve"> also resulted in different appearances for Mac and Windows. Required concessions to be made to the design of UI such as, making Collapsible panes instead of Tabs for the different button groups</w:t>
-      </w:r>
-    </w:p>
-    <w:p>
-      <w:pPr>
-        <w:ind w:left="720"/>
-        <w:rPr>
-          <w:rFonts w:ascii="Times New Roman" w:hAnsi="Times New Roman" w:cs="Times New Roman"/>
-          <w:b/>
-          <w:bCs/>
-          <w:lang w:val="en-US"/>
-        </w:rPr>
-      </w:pPr>
-      <w:r>
-        <w:rPr>
-          <w:rFonts w:ascii="Times New Roman" w:hAnsi="Times New Roman" w:cs="Times New Roman"/>
-          <w:b/>
-          <w:bCs/>
-          <w:lang w:val="en-US"/>
-        </w:rPr>
-        <w:t>Mac Version:</w:t>
-      </w:r>
-    </w:p>
-    <w:p>
-      <w:pPr>
-        <w:ind w:left="720"/>
-        <w:rPr>
-          <w:rFonts w:ascii="Times New Roman" w:hAnsi="Times New Roman" w:cs="Times New Roman"/>
-          <w:lang w:val="en-US"/>
-        </w:rPr>
-      </w:pPr>
-      <w:r>
-        <w:rPr>
-          <w:rFonts w:ascii="Times New Roman" w:hAnsi="Times New Roman" w:cs="Times New Roman"/>
-          <w:noProof/>
-          <w:lang w:val="en-US"/>
-        </w:rPr>
-        <w:drawing>
-          <wp:inline distT="0" distB="0" distL="0" distR="0" wp14:anchorId="7C9862AA" wp14:editId="684E1C3B">
-            <wp:extent cx="5731510" cy="3227070"/>
-            <wp:effectExtent l="0" t="0" r="0" b="0"/>
-            <wp:docPr id="2074968455" name="Picture 3" descr="A screenshot of a computer&#10;&#10;AI-generated content may be incorrect."/>
-            <wp:cNvGraphicFramePr>
-              <a:graphicFrameLocks xmlns:a="http://schemas.openxmlformats.org/drawingml/2006/main" noChangeAspect="1"/>
-            </wp:cNvGraphicFramePr>
-            <a:graphic xmlns:a="http://schemas.openxmlformats.org/drawingml/2006/main">
-              <a:graphicData uri="http://schemas.openxmlformats.org/drawingml/2006/picture">
-                <pic:pic xmlns:pic="http://schemas.openxmlformats.org/drawingml/2006/picture">
-                  <pic:nvPicPr>
-                    <pic:cNvPr id="2074968455" name="Picture 3" descr="A screenshot of a computer&#10;&#10;AI-generated content may be incorrect."/>
-                    <pic:cNvPicPr/>
-                  </pic:nvPicPr>
-                  <pic:blipFill>
-                    <a:blip r:embed="rId7" cstate="print">
-                      <a:extLst>
-                        <a:ext uri="{28A0092B-C50C-407E-A947-70E740481C1C}">
-                          <a14:useLocalDpi xmlns:a14="http://schemas.microsoft.com/office/drawing/2010/main" val="0"/>
-                        </a:ext>
-                      </a:extLst>
-                    </a:blip>
-                    <a:stretch>
-                      <a:fillRect/>
-                    </a:stretch>
-                  </pic:blipFill>
-                  <pic:spPr>
-                    <a:xfrm>
-                      <a:off x="0" y="0"/>
-                      <a:ext cx="5731510" cy="3227070"/>
-                    </a:xfrm>
-                    <a:prstGeom prst="rect">
-                      <a:avLst/>
-                    </a:prstGeom>
-                  </pic:spPr>
-                </pic:pic>
-              </a:graphicData>
-            </a:graphic>
-          </wp:inline>
-        </w:drawing>
-      </w:r>
-    </w:p>
-    <w:p>
-      <w:pPr>
-        <w:ind w:left="720"/>
-        <w:rPr>
-          <w:rFonts w:ascii="Times New Roman" w:hAnsi="Times New Roman" w:cs="Times New Roman"/>
-          <w:b/>
-          <w:bCs/>
-          <w:lang w:val="en-US"/>
-        </w:rPr>
-      </w:pPr>
-      <w:r>
-        <w:rPr>
-          <w:rFonts w:ascii="Times New Roman" w:hAnsi="Times New Roman" w:cs="Times New Roman"/>
-          <w:b/>
-          <w:bCs/>
-          <w:lang w:val="en-US"/>
-        </w:rPr>
-        <w:t>Windows Version:</w:t>
-      </w:r>
-    </w:p>
-    <w:p>
-      <w:pPr>
-        <w:ind w:left="720"/>
-        <w:rPr>
-          <w:rFonts w:ascii="Times New Roman" w:hAnsi="Times New Roman" w:cs="Times New Roman"/>
-          <w:lang w:val="en-US"/>
-        </w:rPr>
-      </w:pPr>
-      <w:r>
-        <w:rPr>
-          <w:rFonts w:ascii="Times New Roman" w:hAnsi="Times New Roman" w:cs="Times New Roman"/>
-          <w:noProof/>
-          <w:lang w:val="en-US"/>
-        </w:rPr>
-        <w:drawing>
-          <wp:inline distT="0" distB="0" distL="0" distR="0" wp14:anchorId="78EB1A45" wp14:editId="5914C509">
-            <wp:extent cx="5731510" cy="2863215"/>
-            <wp:effectExtent l="0" t="0" r="0" b="0"/>
-            <wp:docPr id="703638256" name="Picture 4" descr="A screenshot of a computer&#10;&#10;AI-generated content may be incorrect."/>
-            <wp:cNvGraphicFramePr>
-              <a:graphicFrameLocks xmlns:a="http://schemas.openxmlformats.org/drawingml/2006/main" noChangeAspect="1"/>
-            </wp:cNvGraphicFramePr>
-            <a:graphic xmlns:a="http://schemas.openxmlformats.org/drawingml/2006/main">
-              <a:graphicData uri="http://schemas.openxmlformats.org/drawingml/2006/picture">
-                <pic:pic xmlns:pic="http://schemas.openxmlformats.org/drawingml/2006/picture">
-                  <pic:nvPicPr>
-                    <pic:cNvPr id="703638256" name="Picture 4" descr="A screenshot of a computer&#10;&#10;AI-generated content may be incorrect."/>
-                    <pic:cNvPicPr/>
-                  </pic:nvPicPr>
-                  <pic:blipFill>
-                    <a:blip r:embed="rId8">
-                      <a:extLst>
-                        <a:ext uri="{28A0092B-C50C-407E-A947-70E740481C1C}">
-                          <a14:useLocalDpi xmlns:a14="http://schemas.microsoft.com/office/drawing/2010/main" val="0"/>
-                        </a:ext>
-                      </a:extLst>
-                    </a:blip>
-                    <a:stretch>
-                      <a:fillRect/>
-                    </a:stretch>
-                  </pic:blipFill>
-                  <pic:spPr>
-                    <a:xfrm>
-                      <a:off x="0" y="0"/>
-                      <a:ext cx="5731510" cy="2863215"/>
-                    </a:xfrm>
-                    <a:prstGeom prst="rect">
-                      <a:avLst/>
-                    </a:prstGeom>
-                  </pic:spPr>
-                </pic:pic>
-              </a:graphicData>
-            </a:graphic>
-          </wp:inline>
-        </w:drawing>
-      </w:r>
-    </w:p>
-    <w:p>
-      <w:pPr>
-        <w:ind w:left="720"/>
-        <w:rPr>
-          <w:rFonts w:ascii="Times New Roman" w:hAnsi="Times New Roman" w:cs="Times New Roman"/>
-          <w:lang w:val="en-US"/>
-        </w:rPr>
-      </w:pPr>
-    </w:p>
-    <w:p>
-      <w:pPr>
-        <w:ind w:left="720"/>
-        <w:rPr>
-          <w:rFonts w:ascii="Times New Roman" w:hAnsi="Times New Roman" w:cs="Times New Roman"/>
-          <w:lang w:val="en-US"/>
-        </w:rPr>
-      </w:pPr>
-    </w:p>
-    <w:p>
-      <w:pPr>
-        <w:ind w:left="720"/>
-        <w:rPr>
-          <w:rFonts w:ascii="Times New Roman" w:hAnsi="Times New Roman" w:cs="Times New Roman"/>
-          <w:lang w:val="en-US"/>
-        </w:rPr>
-      </w:pPr>
-    </w:p>
-    <w:p>
-      <w:pPr>
-        <w:rPr>
-          <w:rFonts w:ascii="Times New Roman" w:hAnsi="Times New Roman" w:cs="Times New Roman"/>
-          <w:lang w:val="en-US"/>
-        </w:rPr>
-      </w:pPr>
-    </w:p>
-    <w:p>
-      <w:pPr>
-        <w:rPr>
-          <w:rFonts w:ascii="Times New Roman" w:hAnsi="Times New Roman" w:cs="Times New Roman"/>
-          <w:b/>
-          <w:bCs/>
-          <w:sz w:val="28"/>
-          <w:szCs w:val="28"/>
-          <w:lang w:val="en-US"/>
-        </w:rPr>
-      </w:pPr>
-      <w:r>
-        <w:rPr>
-          <w:rFonts w:ascii="Times New Roman" w:hAnsi="Times New Roman" w:cs="Times New Roman"/>
-          <w:b/>
-          <w:bCs/>
-          <w:sz w:val="28"/>
-          <w:szCs w:val="28"/>
-          <w:lang w:val="en-US"/>
-        </w:rPr>
-        <w:lastRenderedPageBreak/>
-        <w:t>B. gpr.py</w:t>
-      </w:r>
     </w:p>
     <w:p>
       <w:pPr>
@@ -1499,96 +753,6 @@
     </w:p>
     <w:p>
       <w:pPr>
-        <w:pStyle w:val="ListParagraph"/>
-        <w:rPr>
-          <w:rFonts w:ascii="Times New Roman" w:hAnsi="Times New Roman" w:cs="Times New Roman"/>
-          <w:lang w:val="en-US"/>
-        </w:rPr>
-      </w:pPr>
-      <w:r>
-        <w:rPr>
-          <w:rFonts w:ascii="Times New Roman" w:hAnsi="Times New Roman" w:cs="Times New Roman"/>
-          <w:lang w:val="en-US"/>
-        </w:rPr>
-        <w:t xml:space="preserve">Since button layout is seemingly random, </w:t>
-      </w:r>
-      <w:proofErr w:type="gramStart"/>
-      <w:r>
-        <w:rPr>
-          <w:rFonts w:ascii="Times New Roman" w:hAnsi="Times New Roman" w:cs="Times New Roman"/>
-          <w:lang w:val="en-US"/>
-        </w:rPr>
-        <w:t>first time</w:t>
-      </w:r>
-      <w:proofErr w:type="gramEnd"/>
-      <w:r>
-        <w:rPr>
-          <w:rFonts w:ascii="Times New Roman" w:hAnsi="Times New Roman" w:cs="Times New Roman"/>
-          <w:lang w:val="en-US"/>
-        </w:rPr>
-        <w:t xml:space="preserve"> users take time to figure out workflow and understand button functionality</w:t>
-      </w:r>
-    </w:p>
-    <w:p>
-      <w:pPr>
-        <w:pStyle w:val="ListParagraph"/>
-        <w:rPr>
-          <w:rFonts w:ascii="Times New Roman" w:hAnsi="Times New Roman" w:cs="Times New Roman"/>
-          <w:lang w:val="en-US"/>
-        </w:rPr>
-      </w:pPr>
-      <w:r>
-        <w:rPr>
-          <w:rFonts w:ascii="Times New Roman" w:hAnsi="Times New Roman" w:cs="Times New Roman"/>
-          <w:noProof/>
-          <w:lang w:val="en-US"/>
-        </w:rPr>
-        <w:drawing>
-          <wp:inline distT="0" distB="0" distL="0" distR="0" wp14:anchorId="58519AE8" wp14:editId="59020039">
-            <wp:extent cx="5731510" cy="2910205"/>
-            <wp:effectExtent l="0" t="0" r="0" b="0"/>
-            <wp:docPr id="1869858423" name="Picture 5" descr="A screenshot of a computer&#10;&#10;AI-generated content may be incorrect."/>
-            <wp:cNvGraphicFramePr>
-              <a:graphicFrameLocks xmlns:a="http://schemas.openxmlformats.org/drawingml/2006/main" noChangeAspect="1"/>
-            </wp:cNvGraphicFramePr>
-            <a:graphic xmlns:a="http://schemas.openxmlformats.org/drawingml/2006/main">
-              <a:graphicData uri="http://schemas.openxmlformats.org/drawingml/2006/picture">
-                <pic:pic xmlns:pic="http://schemas.openxmlformats.org/drawingml/2006/picture">
-                  <pic:nvPicPr>
-                    <pic:cNvPr id="1869858423" name="Picture 5" descr="A screenshot of a computer&#10;&#10;AI-generated content may be incorrect."/>
-                    <pic:cNvPicPr/>
-                  </pic:nvPicPr>
-                  <pic:blipFill>
-                    <a:blip r:embed="rId9">
-                      <a:extLst>
-                        <a:ext uri="{28A0092B-C50C-407E-A947-70E740481C1C}">
-                          <a14:useLocalDpi xmlns:a14="http://schemas.microsoft.com/office/drawing/2010/main" val="0"/>
-                        </a:ext>
-                      </a:extLst>
-                    </a:blip>
-                    <a:stretch>
-                      <a:fillRect/>
-                    </a:stretch>
-                  </pic:blipFill>
-                  <pic:spPr>
-                    <a:xfrm>
-                      <a:off x="0" y="0"/>
-                      <a:ext cx="5731510" cy="2910205"/>
-                    </a:xfrm>
-                    <a:prstGeom prst="rect">
-                      <a:avLst/>
-                    </a:prstGeom>
-                  </pic:spPr>
-                </pic:pic>
-              </a:graphicData>
-            </a:graphic>
-          </wp:inline>
-        </w:drawing>
-      </w:r>
-    </w:p>
-    <w:p>
-      <w:pPr>
-        <w:ind w:left="360"/>
         <w:rPr>
           <w:rFonts w:ascii="Times New Roman" w:hAnsi="Times New Roman" w:cs="Times New Roman"/>
           <w:b/>
@@ -1719,7 +883,7 @@
           <w:rFonts w:ascii="Times New Roman" w:hAnsi="Times New Roman" w:cs="Times New Roman"/>
           <w:lang w:val="en-US"/>
         </w:rPr>
-        <w:t xml:space="preserve"> program and requires additional scripting. On its own the program takes hours to complete, does not have a progress bar and has no way of stopping the process midway.</w:t>
+        <w:t xml:space="preserve"> program and requires additional scripting. </w:t>
       </w:r>
     </w:p>
     <w:p>
@@ -1727,6 +891,16 @@
         <w:pStyle w:val="ListParagraph"/>
         <w:rPr>
           <w:rFonts w:ascii="Times New Roman" w:hAnsi="Times New Roman" w:cs="Times New Roman"/>
+          <w:lang w:val="en-US"/>
+        </w:rPr>
+      </w:pPr>
+    </w:p>
+    <w:p>
+      <w:pPr>
+        <w:rPr>
+          <w:rFonts w:ascii="Times New Roman" w:hAnsi="Times New Roman" w:cs="Times New Roman"/>
+          <w:b/>
+          <w:bCs/>
           <w:lang w:val="en-US"/>
         </w:rPr>
       </w:pPr>
@@ -1881,6 +1055,30 @@
           <w:lang w:val="en-US"/>
         </w:rPr>
       </w:pPr>
+    </w:p>
+    <w:p>
+      <w:pPr>
+        <w:rPr>
+          <w:rFonts w:ascii="Times New Roman" w:hAnsi="Times New Roman" w:cs="Times New Roman"/>
+          <w:b/>
+          <w:bCs/>
+          <w:sz w:val="32"/>
+          <w:szCs w:val="32"/>
+          <w:lang w:val="en-US"/>
+        </w:rPr>
+      </w:pPr>
+    </w:p>
+    <w:p>
+      <w:pPr>
+        <w:rPr>
+          <w:rFonts w:ascii="Times New Roman" w:hAnsi="Times New Roman" w:cs="Times New Roman"/>
+          <w:b/>
+          <w:bCs/>
+          <w:sz w:val="32"/>
+          <w:szCs w:val="32"/>
+          <w:lang w:val="en-US"/>
+        </w:rPr>
+      </w:pPr>
       <w:r>
         <w:rPr>
           <w:rFonts w:ascii="Times New Roman" w:hAnsi="Times New Roman" w:cs="Times New Roman"/>
@@ -1914,16 +1112,12 @@
         </w:numPr>
         <w:rPr>
           <w:rFonts w:ascii="Times New Roman" w:hAnsi="Times New Roman" w:cs="Times New Roman"/>
-          <w:sz w:val="32"/>
-          <w:szCs w:val="32"/>
-          <w:lang w:val="en-US"/>
-        </w:rPr>
-      </w:pPr>
-      <w:r>
-        <w:rPr>
-          <w:rFonts w:ascii="Times New Roman" w:hAnsi="Times New Roman" w:cs="Times New Roman"/>
-          <w:sz w:val="32"/>
-          <w:szCs w:val="32"/>
+          <w:lang w:val="en-US"/>
+        </w:rPr>
+      </w:pPr>
+      <w:r>
+        <w:rPr>
+          <w:rFonts w:ascii="Times New Roman" w:hAnsi="Times New Roman" w:cs="Times New Roman"/>
           <w:lang w:val="en-US"/>
         </w:rPr>
         <w:t>Improve UI</w:t>
@@ -1935,16 +1129,12 @@
         <w:ind w:left="1080"/>
         <w:rPr>
           <w:rFonts w:ascii="Times New Roman" w:hAnsi="Times New Roman" w:cs="Times New Roman"/>
-          <w:sz w:val="32"/>
-          <w:szCs w:val="32"/>
-          <w:lang w:val="en-US"/>
-        </w:rPr>
-      </w:pPr>
-      <w:r>
-        <w:rPr>
-          <w:rFonts w:ascii="Times New Roman" w:hAnsi="Times New Roman" w:cs="Times New Roman"/>
-          <w:sz w:val="32"/>
-          <w:szCs w:val="32"/>
+          <w:lang w:val="en-US"/>
+        </w:rPr>
+      </w:pPr>
+      <w:r>
+        <w:rPr>
+          <w:rFonts w:ascii="Times New Roman" w:hAnsi="Times New Roman" w:cs="Times New Roman"/>
           <w:lang w:val="en-US"/>
         </w:rPr>
         <w:t xml:space="preserve">Utilize modern UI libraries to give a modern and familiar look and feel to the program. Organize functions and elements to reduce clutter </w:t>
@@ -1952,8 +1142,6 @@
       <w:r>
         <w:rPr>
           <w:rFonts w:ascii="Times New Roman" w:hAnsi="Times New Roman" w:cs="Times New Roman"/>
-          <w:sz w:val="32"/>
-          <w:szCs w:val="32"/>
           <w:lang w:val="en-US"/>
         </w:rPr>
         <w:t>and increase the space available to display GPR data. It also</w:t>
@@ -1961,8 +1149,6 @@
       <w:r>
         <w:rPr>
           <w:rFonts w:ascii="Times New Roman" w:hAnsi="Times New Roman" w:cs="Times New Roman"/>
-          <w:sz w:val="32"/>
-          <w:szCs w:val="32"/>
           <w:lang w:val="en-US"/>
         </w:rPr>
         <w:t xml:space="preserve"> allow</w:t>
@@ -1970,8 +1156,6 @@
       <w:r>
         <w:rPr>
           <w:rFonts w:ascii="Times New Roman" w:hAnsi="Times New Roman" w:cs="Times New Roman"/>
-          <w:sz w:val="32"/>
-          <w:szCs w:val="32"/>
           <w:lang w:val="en-US"/>
         </w:rPr>
         <w:t>s</w:t>
@@ -1979,8 +1163,6 @@
       <w:r>
         <w:rPr>
           <w:rFonts w:ascii="Times New Roman" w:hAnsi="Times New Roman" w:cs="Times New Roman"/>
-          <w:sz w:val="32"/>
-          <w:szCs w:val="32"/>
           <w:lang w:val="en-US"/>
         </w:rPr>
         <w:t xml:space="preserve"> user to create their own workflow. We will achieve this by grouping buttons by function type and placing them into separate tab groups. This permits users to pick and choose what changes aspect of the GPR data they will want to work with first. </w:t>
@@ -1990,8 +1172,6 @@
       <w:pPr>
         <w:rPr>
           <w:rFonts w:ascii="Times New Roman" w:hAnsi="Times New Roman" w:cs="Times New Roman"/>
-          <w:sz w:val="32"/>
-          <w:szCs w:val="32"/>
           <w:lang w:val="en-US"/>
         </w:rPr>
       </w:pPr>
@@ -2005,16 +1185,12 @@
         </w:numPr>
         <w:rPr>
           <w:rFonts w:ascii="Times New Roman" w:hAnsi="Times New Roman" w:cs="Times New Roman"/>
-          <w:sz w:val="32"/>
-          <w:szCs w:val="32"/>
-          <w:lang w:val="en-US"/>
-        </w:rPr>
-      </w:pPr>
-      <w:r>
-        <w:rPr>
-          <w:rFonts w:ascii="Times New Roman" w:hAnsi="Times New Roman" w:cs="Times New Roman"/>
-          <w:sz w:val="32"/>
-          <w:szCs w:val="32"/>
+          <w:lang w:val="en-US"/>
+        </w:rPr>
+      </w:pPr>
+      <w:r>
+        <w:rPr>
+          <w:rFonts w:ascii="Times New Roman" w:hAnsi="Times New Roman" w:cs="Times New Roman"/>
           <w:lang w:val="en-US"/>
         </w:rPr>
         <w:t>Faster Performance</w:t>
@@ -2026,16 +1202,12 @@
         <w:ind w:left="1080"/>
         <w:rPr>
           <w:rFonts w:ascii="Times New Roman" w:hAnsi="Times New Roman" w:cs="Times New Roman"/>
-          <w:sz w:val="32"/>
-          <w:szCs w:val="32"/>
-          <w:lang w:val="en-US"/>
-        </w:rPr>
-      </w:pPr>
-      <w:r>
-        <w:rPr>
-          <w:rFonts w:ascii="Times New Roman" w:hAnsi="Times New Roman" w:cs="Times New Roman"/>
-          <w:sz w:val="32"/>
-          <w:szCs w:val="32"/>
+          <w:lang w:val="en-US"/>
+        </w:rPr>
+      </w:pPr>
+      <w:r>
+        <w:rPr>
+          <w:rFonts w:ascii="Times New Roman" w:hAnsi="Times New Roman" w:cs="Times New Roman"/>
           <w:lang w:val="en-US"/>
         </w:rPr>
         <w:t xml:space="preserve">The current processing times for the </w:t>
@@ -2046,8 +1218,6 @@
           <w:rFonts w:ascii="Times New Roman" w:hAnsi="Times New Roman" w:cs="Times New Roman"/>
           <w:i/>
           <w:iCs/>
-          <w:sz w:val="32"/>
-          <w:szCs w:val="32"/>
           <w:lang w:val="en-US"/>
         </w:rPr>
         <w:t>makeDataCube</w:t>
@@ -2056,8 +1226,6 @@
       <w:r>
         <w:rPr>
           <w:rFonts w:ascii="Times New Roman" w:hAnsi="Times New Roman" w:cs="Times New Roman"/>
-          <w:sz w:val="32"/>
-          <w:szCs w:val="32"/>
           <w:lang w:val="en-US"/>
         </w:rPr>
         <w:t xml:space="preserve">, and batch processing functions takes hours or several minutes, respectively. This makes implementing changes in data parameters difficult, since errors are not apparent until the function is done. We hope to accomplish this by reworking the functions themselves either by using alternative methods to create the data cube or to implement threads. This will hopefully speed up the </w:t>
@@ -2066,8 +1234,6 @@
       <w:r>
         <w:rPr>
           <w:rFonts w:ascii="Times New Roman" w:hAnsi="Times New Roman" w:cs="Times New Roman"/>
-          <w:sz w:val="32"/>
-          <w:szCs w:val="32"/>
           <w:lang w:val="en-US"/>
         </w:rPr>
         <w:t>workflow  and</w:t>
@@ -2076,8 +1242,6 @@
       <w:r>
         <w:rPr>
           <w:rFonts w:ascii="Times New Roman" w:hAnsi="Times New Roman" w:cs="Times New Roman"/>
-          <w:sz w:val="32"/>
-          <w:szCs w:val="32"/>
           <w:lang w:val="en-US"/>
         </w:rPr>
         <w:t xml:space="preserve"> permit faster iterations.</w:t>
@@ -2087,8 +1251,6 @@
       <w:pPr>
         <w:rPr>
           <w:rFonts w:ascii="Times New Roman" w:hAnsi="Times New Roman" w:cs="Times New Roman"/>
-          <w:sz w:val="32"/>
-          <w:szCs w:val="32"/>
           <w:lang w:val="en-US"/>
         </w:rPr>
       </w:pPr>
@@ -2102,16 +1264,12 @@
         </w:numPr>
         <w:rPr>
           <w:rFonts w:ascii="Times New Roman" w:hAnsi="Times New Roman" w:cs="Times New Roman"/>
-          <w:sz w:val="32"/>
-          <w:szCs w:val="32"/>
-          <w:lang w:val="en-US"/>
-        </w:rPr>
-      </w:pPr>
-      <w:r>
-        <w:rPr>
-          <w:rFonts w:ascii="Times New Roman" w:hAnsi="Times New Roman" w:cs="Times New Roman"/>
-          <w:sz w:val="32"/>
-          <w:szCs w:val="32"/>
+          <w:lang w:val="en-US"/>
+        </w:rPr>
+      </w:pPr>
+      <w:r>
+        <w:rPr>
+          <w:rFonts w:ascii="Times New Roman" w:hAnsi="Times New Roman" w:cs="Times New Roman"/>
           <w:lang w:val="en-US"/>
         </w:rPr>
         <w:t>3D manipulation</w:t>
@@ -2123,16 +1281,12 @@
         <w:ind w:left="1080"/>
         <w:rPr>
           <w:rFonts w:ascii="Times New Roman" w:hAnsi="Times New Roman" w:cs="Times New Roman"/>
-          <w:sz w:val="32"/>
-          <w:szCs w:val="32"/>
-          <w:lang w:val="en-US"/>
-        </w:rPr>
-      </w:pPr>
-      <w:r>
-        <w:rPr>
-          <w:rFonts w:ascii="Times New Roman" w:hAnsi="Times New Roman" w:cs="Times New Roman"/>
-          <w:sz w:val="32"/>
-          <w:szCs w:val="32"/>
+          <w:lang w:val="en-US"/>
+        </w:rPr>
+      </w:pPr>
+      <w:r>
+        <w:rPr>
+          <w:rFonts w:ascii="Times New Roman" w:hAnsi="Times New Roman" w:cs="Times New Roman"/>
           <w:lang w:val="en-US"/>
         </w:rPr>
         <w:t xml:space="preserve">One of the main uses of the GPR data is to combine the collected data into a cube, via an interpolation function. This cube is then sliced, viewed in </w:t>
@@ -2140,8 +1294,6 @@
       <w:r>
         <w:rPr>
           <w:rFonts w:ascii="Times New Roman" w:hAnsi="Times New Roman" w:cs="Times New Roman"/>
-          <w:sz w:val="32"/>
-          <w:szCs w:val="32"/>
           <w:lang w:val="en-US"/>
         </w:rPr>
         <w:t xml:space="preserve">different modes to identify disturbances in the soil. However, this is only possible by using different software causing a </w:t>
@@ -2150,8 +1302,6 @@
       <w:r>
         <w:rPr>
           <w:rFonts w:ascii="Times New Roman" w:hAnsi="Times New Roman" w:cs="Times New Roman"/>
-          <w:sz w:val="32"/>
-          <w:szCs w:val="32"/>
           <w:lang w:val="en-US"/>
         </w:rPr>
         <w:t>slow down</w:t>
@@ -2160,8 +1310,6 @@
       <w:r>
         <w:rPr>
           <w:rFonts w:ascii="Times New Roman" w:hAnsi="Times New Roman" w:cs="Times New Roman"/>
-          <w:sz w:val="32"/>
-          <w:szCs w:val="32"/>
           <w:lang w:val="en-US"/>
         </w:rPr>
         <w:t xml:space="preserve"> in the data extraction process due to the steep learning curve. By incorporating a </w:t>
@@ -2170,8 +1318,6 @@
       <w:r>
         <w:rPr>
           <w:rFonts w:ascii="Times New Roman" w:hAnsi="Times New Roman" w:cs="Times New Roman"/>
-          <w:sz w:val="32"/>
-          <w:szCs w:val="32"/>
           <w:lang w:val="en-US"/>
         </w:rPr>
         <w:t>stripped down</w:t>
@@ -2180,29 +1326,15 @@
       <w:r>
         <w:rPr>
           <w:rFonts w:ascii="Times New Roman" w:hAnsi="Times New Roman" w:cs="Times New Roman"/>
-          <w:sz w:val="32"/>
-          <w:szCs w:val="32"/>
-          <w:lang w:val="en-US"/>
-        </w:rPr>
-        <w:t xml:space="preserve"> version of a 3D visualization software, that includes only the functions necessary for this </w:t>
-      </w:r>
-      <w:r>
-        <w:rPr>
-          <w:rFonts w:ascii="Times New Roman" w:hAnsi="Times New Roman" w:cs="Times New Roman"/>
-          <w:sz w:val="32"/>
-          <w:szCs w:val="32"/>
-          <w:lang w:val="en-US"/>
-        </w:rPr>
-        <w:lastRenderedPageBreak/>
-        <w:t xml:space="preserve">workflow, we can make the entire process much smoother for non-technical users. </w:t>
-      </w:r>
-    </w:p>
-    <w:p>
-      <w:pPr>
-        <w:rPr>
-          <w:rFonts w:ascii="Times New Roman" w:hAnsi="Times New Roman" w:cs="Times New Roman"/>
-          <w:sz w:val="32"/>
-          <w:szCs w:val="32"/>
+          <w:lang w:val="en-US"/>
+        </w:rPr>
+        <w:t xml:space="preserve"> version of a 3D visualization software, that includes only the functions necessary for this workflow, we can make the entire process much smoother for non-technical users. </w:t>
+      </w:r>
+    </w:p>
+    <w:p>
+      <w:pPr>
+        <w:rPr>
+          <w:rFonts w:ascii="Times New Roman" w:hAnsi="Times New Roman" w:cs="Times New Roman"/>
           <w:lang w:val="en-US"/>
         </w:rPr>
       </w:pPr>
@@ -2216,16 +1348,12 @@
         </w:numPr>
         <w:rPr>
           <w:rFonts w:ascii="Times New Roman" w:hAnsi="Times New Roman" w:cs="Times New Roman"/>
-          <w:sz w:val="32"/>
-          <w:szCs w:val="32"/>
-          <w:lang w:val="en-US"/>
-        </w:rPr>
-      </w:pPr>
-      <w:r>
-        <w:rPr>
-          <w:rFonts w:ascii="Times New Roman" w:hAnsi="Times New Roman" w:cs="Times New Roman"/>
-          <w:sz w:val="32"/>
-          <w:szCs w:val="32"/>
+          <w:lang w:val="en-US"/>
+        </w:rPr>
+      </w:pPr>
+      <w:r>
+        <w:rPr>
+          <w:rFonts w:ascii="Times New Roman" w:hAnsi="Times New Roman" w:cs="Times New Roman"/>
           <w:lang w:val="en-US"/>
         </w:rPr>
         <w:t>Elevation correction</w:t>
@@ -2237,16 +1365,12 @@
         <w:ind w:left="1080"/>
         <w:rPr>
           <w:rFonts w:ascii="Times New Roman" w:hAnsi="Times New Roman" w:cs="Times New Roman"/>
-          <w:sz w:val="32"/>
-          <w:szCs w:val="32"/>
-          <w:lang w:val="en-US"/>
-        </w:rPr>
-      </w:pPr>
-      <w:r>
-        <w:rPr>
-          <w:rFonts w:ascii="Times New Roman" w:hAnsi="Times New Roman" w:cs="Times New Roman"/>
-          <w:sz w:val="32"/>
-          <w:szCs w:val="32"/>
+          <w:lang w:val="en-US"/>
+        </w:rPr>
+      </w:pPr>
+      <w:r>
+        <w:rPr>
+          <w:rFonts w:ascii="Times New Roman" w:hAnsi="Times New Roman" w:cs="Times New Roman"/>
           <w:lang w:val="en-US"/>
         </w:rPr>
         <w:t xml:space="preserve">One of the main challenges with GPR data is that elevation of the terrain is not measured. This makes accurately locating structures underground difficult. Elevation correction solutions do </w:t>
@@ -2255,8 +1379,6 @@
       <w:r>
         <w:rPr>
           <w:rFonts w:ascii="Times New Roman" w:hAnsi="Times New Roman" w:cs="Times New Roman"/>
-          <w:sz w:val="32"/>
-          <w:szCs w:val="32"/>
           <w:lang w:val="en-US"/>
         </w:rPr>
         <w:t>exist, but</w:t>
@@ -2265,8 +1387,6 @@
       <w:r>
         <w:rPr>
           <w:rFonts w:ascii="Times New Roman" w:hAnsi="Times New Roman" w:cs="Times New Roman"/>
-          <w:sz w:val="32"/>
-          <w:szCs w:val="32"/>
           <w:lang w:val="en-US"/>
         </w:rPr>
         <w:t xml:space="preserve"> are locked behind paywall or paid licenses which is difficult for </w:t>
@@ -2275,8 +1395,6 @@
       <w:r>
         <w:rPr>
           <w:rFonts w:ascii="Times New Roman" w:hAnsi="Times New Roman" w:cs="Times New Roman"/>
-          <w:sz w:val="32"/>
-          <w:szCs w:val="32"/>
           <w:lang w:val="en-US"/>
         </w:rPr>
         <w:t>orgainzations</w:t>
@@ -2285,8 +1403,6 @@
       <w:r>
         <w:rPr>
           <w:rFonts w:ascii="Times New Roman" w:hAnsi="Times New Roman" w:cs="Times New Roman"/>
-          <w:sz w:val="32"/>
-          <w:szCs w:val="32"/>
           <w:lang w:val="en-US"/>
         </w:rPr>
         <w:t xml:space="preserve"> will low funding to procure. We hope to identify an effective solution by using LiDAR imagery to help adjust the elevation. </w:t>
@@ -2299,8 +1415,6 @@
           <w:rFonts w:ascii="Times New Roman" w:hAnsi="Times New Roman" w:cs="Times New Roman"/>
           <w:b/>
           <w:bCs/>
-          <w:sz w:val="32"/>
-          <w:szCs w:val="32"/>
           <w:lang w:val="en-US"/>
         </w:rPr>
       </w:pPr>
@@ -2312,202 +1426,16 @@
           <w:rFonts w:ascii="Times New Roman" w:hAnsi="Times New Roman" w:cs="Times New Roman"/>
           <w:b/>
           <w:bCs/>
-          <w:sz w:val="32"/>
-          <w:szCs w:val="32"/>
-          <w:lang w:val="en-US"/>
-        </w:rPr>
-      </w:pPr>
-    </w:p>
-    <w:p>
-      <w:pPr>
-        <w:ind w:left="720"/>
+          <w:lang w:val="en-US"/>
+        </w:rPr>
+      </w:pPr>
+    </w:p>
+    <w:p>
+      <w:pPr>
         <w:rPr>
           <w:rFonts w:ascii="Times New Roman" w:hAnsi="Times New Roman" w:cs="Times New Roman"/>
           <w:b/>
           <w:bCs/>
-          <w:sz w:val="32"/>
-          <w:szCs w:val="32"/>
-          <w:lang w:val="en-US"/>
-        </w:rPr>
-      </w:pPr>
-    </w:p>
-    <w:p>
-      <w:pPr>
-        <w:ind w:left="720"/>
-        <w:rPr>
-          <w:rFonts w:ascii="Times New Roman" w:hAnsi="Times New Roman" w:cs="Times New Roman"/>
-          <w:b/>
-          <w:bCs/>
-          <w:sz w:val="32"/>
-          <w:szCs w:val="32"/>
-          <w:lang w:val="en-US"/>
-        </w:rPr>
-      </w:pPr>
-    </w:p>
-    <w:p>
-      <w:pPr>
-        <w:ind w:left="720"/>
-        <w:rPr>
-          <w:rFonts w:ascii="Times New Roman" w:hAnsi="Times New Roman" w:cs="Times New Roman"/>
-          <w:b/>
-          <w:bCs/>
-          <w:sz w:val="32"/>
-          <w:szCs w:val="32"/>
-          <w:lang w:val="en-US"/>
-        </w:rPr>
-      </w:pPr>
-    </w:p>
-    <w:p>
-      <w:pPr>
-        <w:ind w:left="720"/>
-        <w:rPr>
-          <w:rFonts w:ascii="Times New Roman" w:hAnsi="Times New Roman" w:cs="Times New Roman"/>
-          <w:b/>
-          <w:bCs/>
-          <w:sz w:val="32"/>
-          <w:szCs w:val="32"/>
-          <w:lang w:val="en-US"/>
-        </w:rPr>
-      </w:pPr>
-    </w:p>
-    <w:p>
-      <w:pPr>
-        <w:ind w:left="720"/>
-        <w:rPr>
-          <w:rFonts w:ascii="Times New Roman" w:hAnsi="Times New Roman" w:cs="Times New Roman"/>
-          <w:b/>
-          <w:bCs/>
-          <w:sz w:val="32"/>
-          <w:szCs w:val="32"/>
-          <w:lang w:val="en-US"/>
-        </w:rPr>
-      </w:pPr>
-    </w:p>
-    <w:p>
-      <w:pPr>
-        <w:ind w:left="720"/>
-        <w:rPr>
-          <w:rFonts w:ascii="Times New Roman" w:hAnsi="Times New Roman" w:cs="Times New Roman"/>
-          <w:b/>
-          <w:bCs/>
-          <w:sz w:val="32"/>
-          <w:szCs w:val="32"/>
-          <w:lang w:val="en-US"/>
-        </w:rPr>
-      </w:pPr>
-    </w:p>
-    <w:p>
-      <w:pPr>
-        <w:ind w:left="720"/>
-        <w:rPr>
-          <w:rFonts w:ascii="Times New Roman" w:hAnsi="Times New Roman" w:cs="Times New Roman"/>
-          <w:b/>
-          <w:bCs/>
-          <w:sz w:val="32"/>
-          <w:szCs w:val="32"/>
-          <w:lang w:val="en-US"/>
-        </w:rPr>
-      </w:pPr>
-    </w:p>
-    <w:p>
-      <w:pPr>
-        <w:ind w:left="720"/>
-        <w:rPr>
-          <w:rFonts w:ascii="Times New Roman" w:hAnsi="Times New Roman" w:cs="Times New Roman"/>
-          <w:b/>
-          <w:bCs/>
-          <w:sz w:val="32"/>
-          <w:szCs w:val="32"/>
-          <w:lang w:val="en-US"/>
-        </w:rPr>
-      </w:pPr>
-    </w:p>
-    <w:p>
-      <w:pPr>
-        <w:ind w:left="720"/>
-        <w:rPr>
-          <w:rFonts w:ascii="Times New Roman" w:hAnsi="Times New Roman" w:cs="Times New Roman"/>
-          <w:b/>
-          <w:bCs/>
-          <w:sz w:val="32"/>
-          <w:szCs w:val="32"/>
-          <w:lang w:val="en-US"/>
-        </w:rPr>
-      </w:pPr>
-    </w:p>
-    <w:p>
-      <w:pPr>
-        <w:ind w:left="720"/>
-        <w:rPr>
-          <w:rFonts w:ascii="Times New Roman" w:hAnsi="Times New Roman" w:cs="Times New Roman"/>
-          <w:b/>
-          <w:bCs/>
-          <w:sz w:val="32"/>
-          <w:szCs w:val="32"/>
-          <w:lang w:val="en-US"/>
-        </w:rPr>
-      </w:pPr>
-    </w:p>
-    <w:p>
-      <w:pPr>
-        <w:ind w:left="720"/>
-        <w:rPr>
-          <w:rFonts w:ascii="Times New Roman" w:hAnsi="Times New Roman" w:cs="Times New Roman"/>
-          <w:b/>
-          <w:bCs/>
-          <w:sz w:val="32"/>
-          <w:szCs w:val="32"/>
-          <w:lang w:val="en-US"/>
-        </w:rPr>
-      </w:pPr>
-    </w:p>
-    <w:p>
-      <w:pPr>
-        <w:ind w:left="720"/>
-        <w:rPr>
-          <w:rFonts w:ascii="Times New Roman" w:hAnsi="Times New Roman" w:cs="Times New Roman"/>
-          <w:b/>
-          <w:bCs/>
-          <w:sz w:val="32"/>
-          <w:szCs w:val="32"/>
-          <w:lang w:val="en-US"/>
-        </w:rPr>
-      </w:pPr>
-    </w:p>
-    <w:p>
-      <w:pPr>
-        <w:rPr>
-          <w:rFonts w:ascii="Times New Roman" w:hAnsi="Times New Roman" w:cs="Times New Roman"/>
-          <w:b/>
-          <w:bCs/>
-          <w:sz w:val="32"/>
-          <w:szCs w:val="32"/>
-          <w:lang w:val="en-US"/>
-        </w:rPr>
-      </w:pPr>
-    </w:p>
-    <w:p>
-      <w:pPr>
-        <w:ind w:left="720"/>
-        <w:rPr>
-          <w:rFonts w:ascii="Times New Roman" w:hAnsi="Times New Roman" w:cs="Times New Roman"/>
-          <w:b/>
-          <w:bCs/>
-          <w:sz w:val="32"/>
-          <w:szCs w:val="32"/>
-          <w:lang w:val="en-US"/>
-        </w:rPr>
-      </w:pPr>
-    </w:p>
-    <w:p>
-      <w:pPr>
-        <w:ind w:left="720"/>
-        <w:rPr>
-          <w:rFonts w:ascii="Times New Roman" w:hAnsi="Times New Roman" w:cs="Times New Roman"/>
-          <w:b/>
-          <w:bCs/>
-          <w:sz w:val="32"/>
-          <w:szCs w:val="32"/>
           <w:lang w:val="en-US"/>
         </w:rPr>
       </w:pPr>
@@ -2515,222 +1443,11 @@
     <w:p>
       <w:pPr>
         <w:pStyle w:val="ListParagraph"/>
-        <w:numPr>
-          <w:ilvl w:val="0"/>
-          <w:numId w:val="7"/>
-        </w:numPr>
-        <w:rPr>
-          <w:rFonts w:ascii="Times New Roman" w:hAnsi="Times New Roman" w:cs="Times New Roman"/>
-          <w:b/>
-          <w:bCs/>
-          <w:sz w:val="32"/>
-          <w:szCs w:val="32"/>
-          <w:lang w:val="en-US"/>
-        </w:rPr>
-      </w:pPr>
-      <w:r>
-        <w:rPr>
-          <w:rFonts w:ascii="Times New Roman" w:hAnsi="Times New Roman" w:cs="Times New Roman"/>
-          <w:b/>
-          <w:bCs/>
-          <w:sz w:val="32"/>
-          <w:szCs w:val="32"/>
-          <w:lang w:val="en-US"/>
-        </w:rPr>
-        <w:t>Libraries</w:t>
-      </w:r>
-    </w:p>
-    <w:p>
-      <w:pPr>
-        <w:pStyle w:val="ListParagraph"/>
-        <w:rPr>
-          <w:rFonts w:ascii="Times New Roman" w:hAnsi="Times New Roman" w:cs="Times New Roman"/>
-          <w:b/>
-          <w:bCs/>
-          <w:sz w:val="32"/>
-          <w:szCs w:val="32"/>
-          <w:lang w:val="en-US"/>
-        </w:rPr>
-      </w:pPr>
-    </w:p>
-    <w:p>
-      <w:pPr>
-        <w:pStyle w:val="ListParagraph"/>
-        <w:rPr>
-          <w:rFonts w:ascii="Times New Roman" w:hAnsi="Times New Roman" w:cs="Times New Roman"/>
-          <w:sz w:val="32"/>
-          <w:szCs w:val="32"/>
-          <w:lang w:val="en-US"/>
-        </w:rPr>
-      </w:pPr>
-      <w:hyperlink r:id="rId10" w:history="1">
-        <w:r>
-          <w:rPr>
-            <w:rStyle w:val="Hyperlink"/>
-            <w:rFonts w:ascii="Times New Roman" w:hAnsi="Times New Roman" w:cs="Times New Roman"/>
-            <w:b/>
-            <w:bCs/>
-            <w:sz w:val="32"/>
-            <w:szCs w:val="32"/>
-            <w:lang w:val="en-US"/>
-          </w:rPr>
-          <w:t>PyQT5</w:t>
-        </w:r>
-      </w:hyperlink>
-      <w:r>
-        <w:rPr>
-          <w:rFonts w:ascii="Times New Roman" w:hAnsi="Times New Roman" w:cs="Times New Roman"/>
-          <w:sz w:val="32"/>
-          <w:szCs w:val="32"/>
-          <w:lang w:val="en-US"/>
-        </w:rPr>
-        <w:t xml:space="preserve"> will be the main library used to create the UI. This is a useful library that contains various GUI modules and many other modules such as support for rendering graphics using </w:t>
-      </w:r>
-      <w:proofErr w:type="spellStart"/>
-      <w:r>
-        <w:rPr>
-          <w:rFonts w:ascii="Times New Roman" w:hAnsi="Times New Roman" w:cs="Times New Roman"/>
-          <w:sz w:val="32"/>
-          <w:szCs w:val="32"/>
-          <w:lang w:val="en-US"/>
-        </w:rPr>
-        <w:t>QtOpenGL</w:t>
-      </w:r>
-      <w:proofErr w:type="spellEnd"/>
-      <w:r>
-        <w:rPr>
-          <w:rFonts w:ascii="Times New Roman" w:hAnsi="Times New Roman" w:cs="Times New Roman"/>
-          <w:sz w:val="32"/>
-          <w:szCs w:val="32"/>
-          <w:lang w:val="en-US"/>
-        </w:rPr>
-        <w:t xml:space="preserve">, database management using </w:t>
-      </w:r>
-      <w:proofErr w:type="spellStart"/>
-      <w:r>
-        <w:rPr>
-          <w:rFonts w:ascii="Times New Roman" w:hAnsi="Times New Roman" w:cs="Times New Roman"/>
-          <w:sz w:val="32"/>
-          <w:szCs w:val="32"/>
-          <w:lang w:val="en-US"/>
-        </w:rPr>
-        <w:t>QtSql</w:t>
-      </w:r>
-      <w:proofErr w:type="spellEnd"/>
-      <w:r>
-        <w:rPr>
-          <w:rFonts w:ascii="Times New Roman" w:hAnsi="Times New Roman" w:cs="Times New Roman"/>
-          <w:sz w:val="32"/>
-          <w:szCs w:val="32"/>
-          <w:lang w:val="en-US"/>
-        </w:rPr>
-        <w:t xml:space="preserve"> and working with xml files with </w:t>
-      </w:r>
-      <w:proofErr w:type="spellStart"/>
-      <w:r>
-        <w:rPr>
-          <w:rFonts w:ascii="Times New Roman" w:hAnsi="Times New Roman" w:cs="Times New Roman"/>
-          <w:sz w:val="32"/>
-          <w:szCs w:val="32"/>
-          <w:lang w:val="en-US"/>
-        </w:rPr>
-        <w:t>QtXml</w:t>
-      </w:r>
-      <w:proofErr w:type="spellEnd"/>
-      <w:r>
-        <w:rPr>
-          <w:rFonts w:ascii="Times New Roman" w:hAnsi="Times New Roman" w:cs="Times New Roman"/>
-          <w:sz w:val="32"/>
-          <w:szCs w:val="32"/>
-          <w:lang w:val="en-US"/>
-        </w:rPr>
-        <w:t xml:space="preserve"> just to name a few</w:t>
-      </w:r>
-    </w:p>
-    <w:p>
-      <w:pPr>
-        <w:pStyle w:val="ListParagraph"/>
-        <w:rPr>
-          <w:rFonts w:ascii="Times New Roman" w:hAnsi="Times New Roman" w:cs="Times New Roman"/>
-          <w:sz w:val="32"/>
-          <w:szCs w:val="32"/>
-          <w:lang w:val="en-US"/>
-        </w:rPr>
-      </w:pPr>
-    </w:p>
-    <w:p>
-      <w:pPr>
-        <w:pStyle w:val="ListParagraph"/>
-        <w:rPr>
-          <w:rFonts w:ascii="Times New Roman" w:hAnsi="Times New Roman" w:cs="Times New Roman"/>
-          <w:sz w:val="32"/>
-          <w:szCs w:val="32"/>
-          <w:lang w:val="en-US"/>
-        </w:rPr>
-      </w:pPr>
-      <w:r>
-        <w:rPr>
-          <w:rFonts w:ascii="Times New Roman" w:hAnsi="Times New Roman" w:cs="Times New Roman"/>
-          <w:sz w:val="32"/>
-          <w:szCs w:val="32"/>
-          <w:lang w:val="en-US"/>
-        </w:rPr>
-        <w:t xml:space="preserve">This </w:t>
-      </w:r>
-      <w:r>
-        <w:rPr>
-          <w:rFonts w:ascii="Times New Roman" w:hAnsi="Times New Roman" w:cs="Times New Roman"/>
-          <w:sz w:val="32"/>
-          <w:szCs w:val="32"/>
-          <w:lang w:val="en-US"/>
-        </w:rPr>
-        <w:t xml:space="preserve">program will employ a Model View Controller (MVC) architecture to structure the code. </w:t>
-      </w:r>
-    </w:p>
-    <w:p>
-      <w:pPr>
-        <w:pStyle w:val="ListParagraph"/>
-        <w:rPr>
-          <w:rFonts w:ascii="Times New Roman" w:hAnsi="Times New Roman" w:cs="Times New Roman"/>
-          <w:sz w:val="32"/>
-          <w:szCs w:val="32"/>
-          <w:lang w:val="en-US"/>
-        </w:rPr>
-      </w:pPr>
-    </w:p>
-    <w:p>
-      <w:pPr>
-        <w:pStyle w:val="ListParagraph"/>
-        <w:rPr>
-          <w:rFonts w:ascii="Times New Roman" w:hAnsi="Times New Roman" w:cs="Times New Roman"/>
-          <w:sz w:val="32"/>
-          <w:szCs w:val="32"/>
-          <w:lang w:val="en-US"/>
-        </w:rPr>
-      </w:pPr>
-      <w:hyperlink r:id="rId11" w:history="1">
-        <w:proofErr w:type="spellStart"/>
-        <w:r>
-          <w:rPr>
-            <w:rStyle w:val="Hyperlink"/>
-            <w:rFonts w:ascii="Times New Roman" w:hAnsi="Times New Roman" w:cs="Times New Roman"/>
-            <w:sz w:val="32"/>
-            <w:szCs w:val="32"/>
-            <w:lang w:val="en-US"/>
-          </w:rPr>
-          <w:t>WhiteBoxTools</w:t>
-        </w:r>
-        <w:proofErr w:type="spellEnd"/>
-      </w:hyperlink>
-      <w:r>
-        <w:rPr>
-          <w:rFonts w:ascii="Times New Roman" w:hAnsi="Times New Roman" w:cs="Times New Roman"/>
-          <w:sz w:val="32"/>
-          <w:szCs w:val="32"/>
-          <w:lang w:val="en-US"/>
-        </w:rPr>
-        <w:t xml:space="preserve"> will be the library used to help with LiDAR visualization and manipulation</w:t>
-      </w:r>
+        <w:rPr>
+          <w:rFonts w:ascii="Times New Roman" w:hAnsi="Times New Roman" w:cs="Times New Roman"/>
+          <w:lang w:val="en-US"/>
+        </w:rPr>
+      </w:pPr>
     </w:p>
     <w:sectPr>
       <w:pgSz w:w="11906" w:h="16838"/>

</xml_diff>

<commit_message>
Added Conclusion section, removed unnecessary descriptions. Overall, made the document more relevant to a shareholder/customer audience by removing technial details.
</commit_message>
<xml_diff>
--- a/Project Plan/Project Plan.docx
+++ b/Project Plan/Project Plan.docx
@@ -183,7 +183,36 @@
           <w:rFonts w:ascii="Times New Roman" w:hAnsi="Times New Roman" w:cs="Times New Roman"/>
           <w:lang w:val="en-US"/>
         </w:rPr>
-        <w:t xml:space="preserve">. GPR’s do not account for the terrain of the land when recording measurements. Therefore, when graves or artifacts are </w:t>
+        <w:t xml:space="preserve">. GPR’s do not account for the terrain of the land when recording measurements. </w:t>
+      </w:r>
+      <w:r>
+        <w:rPr>
+          <w:rFonts w:ascii="Times New Roman" w:hAnsi="Times New Roman" w:cs="Times New Roman"/>
+          <w:lang w:val="en-US"/>
+        </w:rPr>
+        <w:t>This results in extra being spent to locate them via excavations, which is not feasible for small scale non-profit organizations</w:t>
+      </w:r>
+      <w:r>
+        <w:rPr>
+          <w:rFonts w:ascii="Times New Roman" w:hAnsi="Times New Roman" w:cs="Times New Roman"/>
+          <w:lang w:val="en-US"/>
+        </w:rPr>
+        <w:t>.</w:t>
+      </w:r>
+    </w:p>
+    <w:p>
+      <w:pPr>
+        <w:rPr>
+          <w:rFonts w:ascii="Times New Roman" w:hAnsi="Times New Roman" w:cs="Times New Roman"/>
+          <w:lang w:val="en-US"/>
+        </w:rPr>
+      </w:pPr>
+      <w:r>
+        <w:rPr>
+          <w:rFonts w:ascii="Times New Roman" w:hAnsi="Times New Roman" w:cs="Times New Roman"/>
+          <w:lang w:val="en-US"/>
+        </w:rPr>
+        <w:t xml:space="preserve">Therefore, when graves or artifacts are </w:t>
       </w:r>
       <w:r>
         <w:rPr>
@@ -293,13 +322,1345 @@
           <w:lang w:val="en-US"/>
         </w:rPr>
       </w:pPr>
-      <w:r>
-        <w:rPr>
-          <w:rFonts w:ascii="Times New Roman" w:hAnsi="Times New Roman" w:cs="Times New Roman"/>
-          <w:lang w:val="en-US"/>
-        </w:rPr>
-        <w:t>The final is product will have the following changes implemented:</w:t>
-      </w:r>
+    </w:p>
+    <w:p>
+      <w:pPr>
+        <w:rPr>
+          <w:rFonts w:ascii="Times New Roman" w:hAnsi="Times New Roman" w:cs="Times New Roman"/>
+          <w:lang w:val="en-US"/>
+        </w:rPr>
+      </w:pPr>
+    </w:p>
+    <w:p>
+      <w:pPr>
+        <w:rPr>
+          <w:rFonts w:ascii="Times New Roman" w:hAnsi="Times New Roman" w:cs="Times New Roman"/>
+          <w:lang w:val="en-US"/>
+        </w:rPr>
+      </w:pPr>
+    </w:p>
+    <w:p>
+      <w:pPr>
+        <w:rPr>
+          <w:rFonts w:ascii="Times New Roman" w:hAnsi="Times New Roman" w:cs="Times New Roman"/>
+          <w:lang w:val="en-US"/>
+        </w:rPr>
+      </w:pPr>
+    </w:p>
+    <w:p>
+      <w:pPr>
+        <w:rPr>
+          <w:rFonts w:ascii="Times New Roman" w:hAnsi="Times New Roman" w:cs="Times New Roman"/>
+          <w:lang w:val="en-US"/>
+        </w:rPr>
+      </w:pPr>
+    </w:p>
+    <w:p>
+      <w:pPr>
+        <w:rPr>
+          <w:rFonts w:ascii="Times New Roman" w:hAnsi="Times New Roman" w:cs="Times New Roman"/>
+          <w:lang w:val="en-US"/>
+        </w:rPr>
+      </w:pPr>
+    </w:p>
+    <w:p>
+      <w:pPr>
+        <w:rPr>
+          <w:rFonts w:ascii="Times New Roman" w:hAnsi="Times New Roman" w:cs="Times New Roman"/>
+          <w:lang w:val="en-US"/>
+        </w:rPr>
+      </w:pPr>
+    </w:p>
+    <w:p>
+      <w:pPr>
+        <w:rPr>
+          <w:rFonts w:ascii="Times New Roman" w:hAnsi="Times New Roman" w:cs="Times New Roman"/>
+          <w:lang w:val="en-US"/>
+        </w:rPr>
+      </w:pPr>
+    </w:p>
+    <w:p>
+      <w:pPr>
+        <w:rPr>
+          <w:rFonts w:ascii="Times New Roman" w:hAnsi="Times New Roman" w:cs="Times New Roman"/>
+          <w:lang w:val="en-US"/>
+        </w:rPr>
+      </w:pPr>
+    </w:p>
+    <w:p>
+      <w:pPr>
+        <w:rPr>
+          <w:rFonts w:ascii="Times New Roman" w:hAnsi="Times New Roman" w:cs="Times New Roman"/>
+          <w:b/>
+          <w:bCs/>
+          <w:sz w:val="32"/>
+          <w:szCs w:val="32"/>
+          <w:lang w:val="en-US"/>
+        </w:rPr>
+      </w:pPr>
+    </w:p>
+    <w:p>
+      <w:pPr>
+        <w:rPr>
+          <w:rFonts w:ascii="Times New Roman" w:hAnsi="Times New Roman" w:cs="Times New Roman"/>
+          <w:b/>
+          <w:bCs/>
+          <w:sz w:val="32"/>
+          <w:szCs w:val="32"/>
+          <w:lang w:val="en-US"/>
+        </w:rPr>
+      </w:pPr>
+    </w:p>
+    <w:p>
+      <w:pPr>
+        <w:rPr>
+          <w:rFonts w:ascii="Times New Roman" w:hAnsi="Times New Roman" w:cs="Times New Roman"/>
+          <w:b/>
+          <w:bCs/>
+          <w:sz w:val="32"/>
+          <w:szCs w:val="32"/>
+          <w:lang w:val="en-US"/>
+        </w:rPr>
+      </w:pPr>
+      <w:r>
+        <w:rPr>
+          <w:rFonts w:ascii="Times New Roman" w:hAnsi="Times New Roman" w:cs="Times New Roman"/>
+          <w:b/>
+          <w:bCs/>
+          <w:sz w:val="32"/>
+          <w:szCs w:val="32"/>
+          <w:lang w:val="en-US"/>
+        </w:rPr>
+        <w:lastRenderedPageBreak/>
+        <w:t>Issues</w:t>
+      </w:r>
+    </w:p>
+    <w:p>
+      <w:pPr>
+        <w:pStyle w:val="ListParagraph"/>
+        <w:numPr>
+          <w:ilvl w:val="0"/>
+          <w:numId w:val="2"/>
+        </w:numPr>
+        <w:rPr>
+          <w:rFonts w:ascii="Times New Roman" w:hAnsi="Times New Roman" w:cs="Times New Roman"/>
+          <w:b/>
+          <w:bCs/>
+          <w:lang w:val="en-US"/>
+        </w:rPr>
+      </w:pPr>
+      <w:r>
+        <w:rPr>
+          <w:rFonts w:ascii="Times New Roman" w:hAnsi="Times New Roman" w:cs="Times New Roman"/>
+          <w:b/>
+          <w:bCs/>
+          <w:lang w:val="en-US"/>
+        </w:rPr>
+        <w:t>Incomp</w:t>
+      </w:r>
+      <w:r>
+        <w:rPr>
+          <w:rFonts w:ascii="Times New Roman" w:hAnsi="Times New Roman" w:cs="Times New Roman"/>
+          <w:b/>
+          <w:bCs/>
+          <w:lang w:val="en-US"/>
+        </w:rPr>
+        <w:t>a</w:t>
+      </w:r>
+      <w:r>
+        <w:rPr>
+          <w:rFonts w:ascii="Times New Roman" w:hAnsi="Times New Roman" w:cs="Times New Roman"/>
+          <w:b/>
+          <w:bCs/>
+          <w:lang w:val="en-US"/>
+        </w:rPr>
+        <w:t>t</w:t>
+      </w:r>
+      <w:r>
+        <w:rPr>
+          <w:rFonts w:ascii="Times New Roman" w:hAnsi="Times New Roman" w:cs="Times New Roman"/>
+          <w:b/>
+          <w:bCs/>
+          <w:lang w:val="en-US"/>
+        </w:rPr>
+        <w:t>i</w:t>
+      </w:r>
+      <w:r>
+        <w:rPr>
+          <w:rFonts w:ascii="Times New Roman" w:hAnsi="Times New Roman" w:cs="Times New Roman"/>
+          <w:b/>
+          <w:bCs/>
+          <w:lang w:val="en-US"/>
+        </w:rPr>
+        <w:t>bility</w:t>
+      </w:r>
+      <w:r>
+        <w:rPr>
+          <w:rFonts w:ascii="Times New Roman" w:hAnsi="Times New Roman" w:cs="Times New Roman"/>
+          <w:b/>
+          <w:bCs/>
+          <w:lang w:val="en-US"/>
+        </w:rPr>
+        <w:t xml:space="preserve"> with MacOS</w:t>
+      </w:r>
+      <w:r>
+        <w:rPr>
+          <w:rFonts w:ascii="Times New Roman" w:hAnsi="Times New Roman" w:cs="Times New Roman"/>
+          <w:b/>
+          <w:bCs/>
+          <w:lang w:val="en-US"/>
+        </w:rPr>
+        <w:t xml:space="preserve">: </w:t>
+      </w:r>
+      <w:r>
+        <w:rPr>
+          <w:rFonts w:ascii="Times New Roman" w:hAnsi="Times New Roman" w:cs="Times New Roman"/>
+          <w:lang w:val="en-US"/>
+        </w:rPr>
+        <w:t xml:space="preserve">Conflicts with VTK versions causes program to crash on launch. </w:t>
+      </w:r>
+      <w:r>
+        <w:rPr>
+          <w:rFonts w:ascii="Times New Roman" w:hAnsi="Times New Roman" w:cs="Times New Roman"/>
+          <w:lang w:val="en-US"/>
+        </w:rPr>
+        <w:t xml:space="preserve"> </w:t>
+      </w:r>
+    </w:p>
+    <w:p>
+      <w:pPr>
+        <w:pStyle w:val="ListParagraph"/>
+        <w:rPr>
+          <w:rFonts w:ascii="Times New Roman" w:hAnsi="Times New Roman" w:cs="Times New Roman"/>
+          <w:b/>
+          <w:bCs/>
+          <w:lang w:val="en-US"/>
+        </w:rPr>
+      </w:pPr>
+    </w:p>
+    <w:p>
+      <w:pPr>
+        <w:pStyle w:val="ListParagraph"/>
+        <w:numPr>
+          <w:ilvl w:val="0"/>
+          <w:numId w:val="2"/>
+        </w:numPr>
+        <w:rPr>
+          <w:rFonts w:ascii="Times New Roman" w:hAnsi="Times New Roman" w:cs="Times New Roman"/>
+          <w:b/>
+          <w:bCs/>
+          <w:lang w:val="en-US"/>
+        </w:rPr>
+      </w:pPr>
+      <w:r>
+        <w:rPr>
+          <w:rFonts w:ascii="Times New Roman" w:hAnsi="Times New Roman" w:cs="Times New Roman"/>
+          <w:b/>
+          <w:bCs/>
+          <w:lang w:val="en-US"/>
+        </w:rPr>
+        <w:t>Memory Leaks</w:t>
+      </w:r>
+      <w:r>
+        <w:rPr>
+          <w:rFonts w:ascii="Times New Roman" w:hAnsi="Times New Roman" w:cs="Times New Roman"/>
+          <w:b/>
+          <w:bCs/>
+          <w:lang w:val="en-US"/>
+        </w:rPr>
+        <w:t xml:space="preserve">: </w:t>
+      </w:r>
+      <w:r>
+        <w:rPr>
+          <w:rFonts w:ascii="Times New Roman" w:hAnsi="Times New Roman" w:cs="Times New Roman"/>
+          <w:lang w:val="en-US"/>
+        </w:rPr>
+        <w:t>Causes program to get stuck after one run.</w:t>
+      </w:r>
+    </w:p>
+    <w:p>
+      <w:pPr>
+        <w:rPr>
+          <w:rFonts w:ascii="Times New Roman" w:hAnsi="Times New Roman" w:cs="Times New Roman"/>
+          <w:lang w:val="en-US"/>
+        </w:rPr>
+      </w:pPr>
+    </w:p>
+    <w:p>
+      <w:pPr>
+        <w:pStyle w:val="ListParagraph"/>
+        <w:numPr>
+          <w:ilvl w:val="0"/>
+          <w:numId w:val="2"/>
+        </w:numPr>
+        <w:rPr>
+          <w:rFonts w:ascii="Times New Roman" w:hAnsi="Times New Roman" w:cs="Times New Roman"/>
+          <w:b/>
+          <w:bCs/>
+          <w:lang w:val="en-US"/>
+        </w:rPr>
+      </w:pPr>
+      <w:r>
+        <w:rPr>
+          <w:rFonts w:ascii="Times New Roman" w:hAnsi="Times New Roman" w:cs="Times New Roman"/>
+          <w:b/>
+          <w:bCs/>
+          <w:lang w:val="en-US"/>
+        </w:rPr>
+        <w:t>Cube slicing</w:t>
+      </w:r>
+      <w:r>
+        <w:rPr>
+          <w:rFonts w:ascii="Times New Roman" w:hAnsi="Times New Roman" w:cs="Times New Roman"/>
+          <w:b/>
+          <w:bCs/>
+          <w:lang w:val="en-US"/>
+        </w:rPr>
+        <w:t xml:space="preserve">: </w:t>
+      </w:r>
+      <w:r>
+        <w:rPr>
+          <w:rFonts w:ascii="Times New Roman" w:hAnsi="Times New Roman" w:cs="Times New Roman"/>
+          <w:lang w:val="en-US"/>
+        </w:rPr>
+        <w:t>Results</w:t>
+      </w:r>
+      <w:r>
+        <w:rPr>
+          <w:rFonts w:ascii="Times New Roman" w:hAnsi="Times New Roman" w:cs="Times New Roman"/>
+          <w:lang w:val="en-US"/>
+        </w:rPr>
+        <w:t xml:space="preserve"> in memory overloads and crashing </w:t>
+      </w:r>
+    </w:p>
+    <w:p>
+      <w:pPr>
+        <w:ind w:left="720"/>
+        <w:rPr>
+          <w:rFonts w:ascii="Times New Roman" w:hAnsi="Times New Roman" w:cs="Times New Roman"/>
+          <w:lang w:val="en-US"/>
+        </w:rPr>
+      </w:pPr>
+    </w:p>
+    <w:p>
+      <w:pPr>
+        <w:pStyle w:val="ListParagraph"/>
+        <w:numPr>
+          <w:ilvl w:val="0"/>
+          <w:numId w:val="2"/>
+        </w:numPr>
+        <w:rPr>
+          <w:rFonts w:ascii="Times New Roman" w:hAnsi="Times New Roman" w:cs="Times New Roman"/>
+          <w:b/>
+          <w:bCs/>
+          <w:lang w:val="en-US"/>
+        </w:rPr>
+      </w:pPr>
+      <w:r>
+        <w:rPr>
+          <w:rFonts w:ascii="Times New Roman" w:hAnsi="Times New Roman" w:cs="Times New Roman"/>
+          <w:b/>
+          <w:bCs/>
+          <w:lang w:val="en-US"/>
+        </w:rPr>
+        <w:t>UI</w:t>
+      </w:r>
+      <w:r>
+        <w:rPr>
+          <w:rFonts w:ascii="Times New Roman" w:hAnsi="Times New Roman" w:cs="Times New Roman"/>
+          <w:b/>
+          <w:bCs/>
+          <w:lang w:val="en-US"/>
+        </w:rPr>
+        <w:t xml:space="preserve">: </w:t>
+      </w:r>
+      <w:r>
+        <w:rPr>
+          <w:rFonts w:ascii="Times New Roman" w:hAnsi="Times New Roman" w:cs="Times New Roman"/>
+          <w:lang w:val="en-US"/>
+        </w:rPr>
+        <w:t xml:space="preserve">The current UI is outdated and disorganized. </w:t>
+      </w:r>
+      <w:r>
+        <w:rPr>
+          <w:rFonts w:ascii="Times New Roman" w:hAnsi="Times New Roman" w:cs="Times New Roman"/>
+          <w:lang w:val="en-US"/>
+        </w:rPr>
+        <w:t>Acts as a high barrier to entry for non-technical users, or users with little to none programming experience.</w:t>
+      </w:r>
+    </w:p>
+    <w:p>
+      <w:pPr>
+        <w:rPr>
+          <w:rFonts w:ascii="Times New Roman" w:hAnsi="Times New Roman" w:cs="Times New Roman"/>
+          <w:b/>
+          <w:bCs/>
+          <w:lang w:val="en-US"/>
+        </w:rPr>
+      </w:pPr>
+    </w:p>
+    <w:p>
+      <w:pPr>
+        <w:pStyle w:val="ListParagraph"/>
+        <w:numPr>
+          <w:ilvl w:val="0"/>
+          <w:numId w:val="2"/>
+        </w:numPr>
+        <w:rPr>
+          <w:rFonts w:ascii="Times New Roman" w:hAnsi="Times New Roman" w:cs="Times New Roman"/>
+          <w:b/>
+          <w:bCs/>
+          <w:lang w:val="en-US"/>
+        </w:rPr>
+      </w:pPr>
+      <w:r>
+        <w:rPr>
+          <w:rFonts w:ascii="Times New Roman" w:hAnsi="Times New Roman" w:cs="Times New Roman"/>
+          <w:b/>
+          <w:bCs/>
+          <w:lang w:val="en-US"/>
+        </w:rPr>
+        <w:t>Interpolation</w:t>
+      </w:r>
+      <w:r>
+        <w:rPr>
+          <w:rFonts w:ascii="Times New Roman" w:hAnsi="Times New Roman" w:cs="Times New Roman"/>
+          <w:b/>
+          <w:bCs/>
+          <w:lang w:val="en-US"/>
+        </w:rPr>
+        <w:t>:</w:t>
+      </w:r>
+      <w:r>
+        <w:rPr>
+          <w:rFonts w:ascii="Times New Roman" w:hAnsi="Times New Roman" w:cs="Times New Roman"/>
+          <w:lang w:val="en-US"/>
+        </w:rPr>
+        <w:t xml:space="preserve"> The process of converting </w:t>
+      </w:r>
+      <w:proofErr w:type="spellStart"/>
+      <w:r>
+        <w:rPr>
+          <w:rFonts w:ascii="Times New Roman" w:hAnsi="Times New Roman" w:cs="Times New Roman"/>
+          <w:lang w:val="en-US"/>
+        </w:rPr>
+        <w:t>gpr</w:t>
+      </w:r>
+      <w:proofErr w:type="spellEnd"/>
+      <w:r>
+        <w:rPr>
+          <w:rFonts w:ascii="Times New Roman" w:hAnsi="Times New Roman" w:cs="Times New Roman"/>
+          <w:lang w:val="en-US"/>
+        </w:rPr>
+        <w:t xml:space="preserve"> data in a cube</w:t>
+      </w:r>
+      <w:r>
+        <w:rPr>
+          <w:rFonts w:ascii="Times New Roman" w:hAnsi="Times New Roman" w:cs="Times New Roman"/>
+          <w:lang w:val="en-US"/>
+        </w:rPr>
+        <w:t xml:space="preserve">. </w:t>
+      </w:r>
+      <w:proofErr w:type="gramStart"/>
+      <w:r>
+        <w:rPr>
+          <w:rFonts w:ascii="Times New Roman" w:hAnsi="Times New Roman" w:cs="Times New Roman"/>
+          <w:lang w:val="en-US"/>
+        </w:rPr>
+        <w:t>However</w:t>
+      </w:r>
+      <w:proofErr w:type="gramEnd"/>
+      <w:r>
+        <w:rPr>
+          <w:rFonts w:ascii="Times New Roman" w:hAnsi="Times New Roman" w:cs="Times New Roman"/>
+          <w:lang w:val="en-US"/>
+        </w:rPr>
+        <w:t xml:space="preserve"> this functionality is not integrated </w:t>
+      </w:r>
+      <w:r>
+        <w:rPr>
+          <w:rFonts w:ascii="Times New Roman" w:hAnsi="Times New Roman" w:cs="Times New Roman"/>
+          <w:lang w:val="en-US"/>
+        </w:rPr>
+        <w:t xml:space="preserve">into the </w:t>
+      </w:r>
+      <w:proofErr w:type="spellStart"/>
+      <w:r>
+        <w:rPr>
+          <w:rFonts w:ascii="Times New Roman" w:hAnsi="Times New Roman" w:cs="Times New Roman"/>
+          <w:lang w:val="en-US"/>
+        </w:rPr>
+        <w:t>GPRpy</w:t>
+      </w:r>
+      <w:proofErr w:type="spellEnd"/>
+      <w:r>
+        <w:rPr>
+          <w:rFonts w:ascii="Times New Roman" w:hAnsi="Times New Roman" w:cs="Times New Roman"/>
+          <w:lang w:val="en-US"/>
+        </w:rPr>
+        <w:t xml:space="preserve"> program and requires additional scripting. </w:t>
+      </w:r>
+    </w:p>
+    <w:p>
+      <w:pPr>
+        <w:rPr>
+          <w:rFonts w:ascii="Times New Roman" w:hAnsi="Times New Roman" w:cs="Times New Roman"/>
+          <w:b/>
+          <w:bCs/>
+          <w:lang w:val="en-US"/>
+        </w:rPr>
+      </w:pPr>
+    </w:p>
+    <w:p>
+      <w:pPr>
+        <w:pStyle w:val="ListParagraph"/>
+        <w:numPr>
+          <w:ilvl w:val="0"/>
+          <w:numId w:val="2"/>
+        </w:numPr>
+        <w:rPr>
+          <w:rFonts w:ascii="Times New Roman" w:hAnsi="Times New Roman" w:cs="Times New Roman"/>
+          <w:b/>
+          <w:bCs/>
+          <w:lang w:val="en-US"/>
+        </w:rPr>
+      </w:pPr>
+      <w:r>
+        <w:rPr>
+          <w:rFonts w:ascii="Times New Roman" w:hAnsi="Times New Roman" w:cs="Times New Roman"/>
+          <w:b/>
+          <w:bCs/>
+          <w:lang w:val="en-US"/>
+        </w:rPr>
+        <w:t>LiDAR correctio</w:t>
+      </w:r>
+      <w:r>
+        <w:rPr>
+          <w:rFonts w:ascii="Times New Roman" w:hAnsi="Times New Roman" w:cs="Times New Roman"/>
+          <w:b/>
+          <w:bCs/>
+          <w:lang w:val="en-US"/>
+        </w:rPr>
+        <w:t>n</w:t>
+      </w:r>
+      <w:r>
+        <w:rPr>
+          <w:rFonts w:ascii="Times New Roman" w:hAnsi="Times New Roman" w:cs="Times New Roman"/>
+          <w:b/>
+          <w:bCs/>
+          <w:lang w:val="en-US"/>
+        </w:rPr>
+        <w:t xml:space="preserve">: </w:t>
+      </w:r>
+      <w:r>
+        <w:rPr>
+          <w:rFonts w:ascii="Times New Roman" w:hAnsi="Times New Roman" w:cs="Times New Roman"/>
+          <w:lang w:val="en-US"/>
+        </w:rPr>
+        <w:t xml:space="preserve">Since GPR data does not account </w:t>
+      </w:r>
+      <w:r>
+        <w:rPr>
+          <w:rFonts w:ascii="Times New Roman" w:hAnsi="Times New Roman" w:cs="Times New Roman"/>
+          <w:lang w:val="en-US"/>
+        </w:rPr>
+        <w:t xml:space="preserve">for </w:t>
+      </w:r>
+      <w:r>
+        <w:rPr>
+          <w:rFonts w:ascii="Times New Roman" w:hAnsi="Times New Roman" w:cs="Times New Roman"/>
+          <w:lang w:val="en-US"/>
+        </w:rPr>
+        <w:t>elevation of terrain</w:t>
+      </w:r>
+      <w:r>
+        <w:rPr>
+          <w:rFonts w:ascii="Times New Roman" w:hAnsi="Times New Roman" w:cs="Times New Roman"/>
+          <w:lang w:val="en-US"/>
+        </w:rPr>
+        <w:t xml:space="preserve">, finding accurate positions of </w:t>
+      </w:r>
+      <w:r>
+        <w:rPr>
+          <w:rFonts w:ascii="Times New Roman" w:hAnsi="Times New Roman" w:cs="Times New Roman"/>
+          <w:lang w:val="en-US"/>
+        </w:rPr>
+        <w:t>unmarked</w:t>
+      </w:r>
+      <w:r>
+        <w:rPr>
+          <w:rFonts w:ascii="Times New Roman" w:hAnsi="Times New Roman" w:cs="Times New Roman"/>
+          <w:lang w:val="en-US"/>
+        </w:rPr>
+        <w:t xml:space="preserve"> graves becomes difficult. </w:t>
+      </w:r>
+    </w:p>
+    <w:p>
+      <w:pPr>
+        <w:ind w:left="720"/>
+        <w:rPr>
+          <w:rFonts w:ascii="Times New Roman" w:hAnsi="Times New Roman" w:cs="Times New Roman"/>
+          <w:lang w:val="en-US"/>
+        </w:rPr>
+      </w:pPr>
+    </w:p>
+    <w:p>
+      <w:pPr>
+        <w:rPr>
+          <w:rFonts w:ascii="Times New Roman" w:hAnsi="Times New Roman" w:cs="Times New Roman"/>
+          <w:b/>
+          <w:bCs/>
+          <w:sz w:val="32"/>
+          <w:szCs w:val="32"/>
+          <w:lang w:val="en-US"/>
+        </w:rPr>
+      </w:pPr>
+    </w:p>
+    <w:p>
+      <w:pPr>
+        <w:rPr>
+          <w:rFonts w:ascii="Times New Roman" w:hAnsi="Times New Roman" w:cs="Times New Roman"/>
+          <w:b/>
+          <w:bCs/>
+          <w:sz w:val="32"/>
+          <w:szCs w:val="32"/>
+          <w:lang w:val="en-US"/>
+        </w:rPr>
+      </w:pPr>
+    </w:p>
+    <w:p>
+      <w:pPr>
+        <w:rPr>
+          <w:rFonts w:ascii="Times New Roman" w:hAnsi="Times New Roman" w:cs="Times New Roman"/>
+          <w:b/>
+          <w:bCs/>
+          <w:sz w:val="32"/>
+          <w:szCs w:val="32"/>
+          <w:lang w:val="en-US"/>
+        </w:rPr>
+      </w:pPr>
+    </w:p>
+    <w:p>
+      <w:pPr>
+        <w:rPr>
+          <w:rFonts w:ascii="Times New Roman" w:hAnsi="Times New Roman" w:cs="Times New Roman"/>
+          <w:b/>
+          <w:bCs/>
+          <w:sz w:val="32"/>
+          <w:szCs w:val="32"/>
+          <w:lang w:val="en-US"/>
+        </w:rPr>
+      </w:pPr>
+    </w:p>
+    <w:p>
+      <w:pPr>
+        <w:rPr>
+          <w:rFonts w:ascii="Times New Roman" w:hAnsi="Times New Roman" w:cs="Times New Roman"/>
+          <w:b/>
+          <w:bCs/>
+          <w:sz w:val="32"/>
+          <w:szCs w:val="32"/>
+          <w:lang w:val="en-US"/>
+        </w:rPr>
+      </w:pPr>
+    </w:p>
+    <w:p>
+      <w:pPr>
+        <w:rPr>
+          <w:rFonts w:ascii="Times New Roman" w:hAnsi="Times New Roman" w:cs="Times New Roman"/>
+          <w:b/>
+          <w:bCs/>
+          <w:sz w:val="32"/>
+          <w:szCs w:val="32"/>
+          <w:lang w:val="en-US"/>
+        </w:rPr>
+      </w:pPr>
+    </w:p>
+    <w:p>
+      <w:pPr>
+        <w:rPr>
+          <w:rFonts w:ascii="Times New Roman" w:hAnsi="Times New Roman" w:cs="Times New Roman"/>
+          <w:b/>
+          <w:bCs/>
+          <w:sz w:val="32"/>
+          <w:szCs w:val="32"/>
+          <w:lang w:val="en-US"/>
+        </w:rPr>
+      </w:pPr>
+    </w:p>
+    <w:p>
+      <w:pPr>
+        <w:rPr>
+          <w:rFonts w:ascii="Times New Roman" w:hAnsi="Times New Roman" w:cs="Times New Roman"/>
+          <w:b/>
+          <w:bCs/>
+          <w:sz w:val="32"/>
+          <w:szCs w:val="32"/>
+          <w:lang w:val="en-US"/>
+        </w:rPr>
+      </w:pPr>
+    </w:p>
+    <w:p>
+      <w:pPr>
+        <w:rPr>
+          <w:rFonts w:ascii="Times New Roman" w:hAnsi="Times New Roman" w:cs="Times New Roman"/>
+          <w:b/>
+          <w:bCs/>
+          <w:sz w:val="32"/>
+          <w:szCs w:val="32"/>
+          <w:lang w:val="en-US"/>
+        </w:rPr>
+      </w:pPr>
+    </w:p>
+    <w:p>
+      <w:pPr>
+        <w:rPr>
+          <w:rFonts w:ascii="Times New Roman" w:hAnsi="Times New Roman" w:cs="Times New Roman"/>
+          <w:b/>
+          <w:bCs/>
+          <w:sz w:val="32"/>
+          <w:szCs w:val="32"/>
+          <w:lang w:val="en-US"/>
+        </w:rPr>
+      </w:pPr>
+    </w:p>
+    <w:p>
+      <w:pPr>
+        <w:rPr>
+          <w:rFonts w:ascii="Times New Roman" w:hAnsi="Times New Roman" w:cs="Times New Roman"/>
+          <w:b/>
+          <w:bCs/>
+          <w:sz w:val="32"/>
+          <w:szCs w:val="32"/>
+          <w:lang w:val="en-US"/>
+        </w:rPr>
+      </w:pPr>
+    </w:p>
+    <w:p>
+      <w:pPr>
+        <w:rPr>
+          <w:rFonts w:ascii="Times New Roman" w:hAnsi="Times New Roman" w:cs="Times New Roman"/>
+          <w:b/>
+          <w:bCs/>
+          <w:sz w:val="32"/>
+          <w:szCs w:val="32"/>
+          <w:lang w:val="en-US"/>
+        </w:rPr>
+      </w:pPr>
+      <w:r>
+        <w:rPr>
+          <w:rFonts w:ascii="Times New Roman" w:hAnsi="Times New Roman" w:cs="Times New Roman"/>
+          <w:b/>
+          <w:bCs/>
+          <w:sz w:val="32"/>
+          <w:szCs w:val="32"/>
+          <w:lang w:val="en-US"/>
+        </w:rPr>
+        <w:lastRenderedPageBreak/>
+        <w:t>Goals</w:t>
+      </w:r>
+      <w:r>
+        <w:rPr>
+          <w:rFonts w:ascii="Times New Roman" w:hAnsi="Times New Roman" w:cs="Times New Roman"/>
+          <w:b/>
+          <w:bCs/>
+          <w:sz w:val="32"/>
+          <w:szCs w:val="32"/>
+          <w:lang w:val="en-US"/>
+        </w:rPr>
+        <w:t xml:space="preserve"> </w:t>
+      </w:r>
+    </w:p>
+    <w:p>
+      <w:pPr>
+        <w:pStyle w:val="ListParagraph"/>
+        <w:numPr>
+          <w:ilvl w:val="0"/>
+          <w:numId w:val="6"/>
+        </w:numPr>
+        <w:rPr>
+          <w:rFonts w:ascii="Times New Roman" w:hAnsi="Times New Roman" w:cs="Times New Roman"/>
+          <w:b/>
+          <w:bCs/>
+          <w:lang w:val="en-US"/>
+        </w:rPr>
+      </w:pPr>
+      <w:r>
+        <w:rPr>
+          <w:rFonts w:ascii="Times New Roman" w:hAnsi="Times New Roman" w:cs="Times New Roman"/>
+          <w:b/>
+          <w:bCs/>
+          <w:lang w:val="en-US"/>
+        </w:rPr>
+        <w:t>Improve UI</w:t>
+      </w:r>
+    </w:p>
+    <w:p>
+      <w:pPr>
+        <w:pStyle w:val="ListParagraph"/>
+        <w:ind w:left="1080"/>
+        <w:rPr>
+          <w:rFonts w:ascii="Times New Roman" w:hAnsi="Times New Roman" w:cs="Times New Roman"/>
+          <w:lang w:val="en-US"/>
+        </w:rPr>
+      </w:pPr>
+      <w:r>
+        <w:rPr>
+          <w:rFonts w:ascii="Times New Roman" w:hAnsi="Times New Roman" w:cs="Times New Roman"/>
+          <w:lang w:val="en-US"/>
+        </w:rPr>
+        <w:t xml:space="preserve">Utilize modern UI libraries to give a modern and familiar look and feel to the program. Organize functions and elements to reduce clutter </w:t>
+      </w:r>
+      <w:r>
+        <w:rPr>
+          <w:rFonts w:ascii="Times New Roman" w:hAnsi="Times New Roman" w:cs="Times New Roman"/>
+          <w:lang w:val="en-US"/>
+        </w:rPr>
+        <w:t>and increase the space available to display GPR data. It also</w:t>
+      </w:r>
+      <w:r>
+        <w:rPr>
+          <w:rFonts w:ascii="Times New Roman" w:hAnsi="Times New Roman" w:cs="Times New Roman"/>
+          <w:lang w:val="en-US"/>
+        </w:rPr>
+        <w:t xml:space="preserve"> allow</w:t>
+      </w:r>
+      <w:r>
+        <w:rPr>
+          <w:rFonts w:ascii="Times New Roman" w:hAnsi="Times New Roman" w:cs="Times New Roman"/>
+          <w:lang w:val="en-US"/>
+        </w:rPr>
+        <w:t>s</w:t>
+      </w:r>
+      <w:r>
+        <w:rPr>
+          <w:rFonts w:ascii="Times New Roman" w:hAnsi="Times New Roman" w:cs="Times New Roman"/>
+          <w:lang w:val="en-US"/>
+        </w:rPr>
+        <w:t xml:space="preserve"> user to create their own workflow. </w:t>
+      </w:r>
+    </w:p>
+    <w:p>
+      <w:pPr>
+        <w:rPr>
+          <w:rFonts w:ascii="Times New Roman" w:hAnsi="Times New Roman" w:cs="Times New Roman"/>
+          <w:lang w:val="en-US"/>
+        </w:rPr>
+      </w:pPr>
+    </w:p>
+    <w:p>
+      <w:pPr>
+        <w:pStyle w:val="ListParagraph"/>
+        <w:numPr>
+          <w:ilvl w:val="0"/>
+          <w:numId w:val="6"/>
+        </w:numPr>
+        <w:rPr>
+          <w:rFonts w:ascii="Times New Roman" w:hAnsi="Times New Roman" w:cs="Times New Roman"/>
+          <w:b/>
+          <w:bCs/>
+          <w:lang w:val="en-US"/>
+        </w:rPr>
+      </w:pPr>
+      <w:r>
+        <w:rPr>
+          <w:rFonts w:ascii="Times New Roman" w:hAnsi="Times New Roman" w:cs="Times New Roman"/>
+          <w:b/>
+          <w:bCs/>
+          <w:lang w:val="en-US"/>
+        </w:rPr>
+        <w:t>Faster Performance</w:t>
+      </w:r>
+    </w:p>
+    <w:p>
+      <w:pPr>
+        <w:pStyle w:val="ListParagraph"/>
+        <w:ind w:left="1080"/>
+        <w:rPr>
+          <w:rFonts w:ascii="Times New Roman" w:hAnsi="Times New Roman" w:cs="Times New Roman"/>
+          <w:lang w:val="en-US"/>
+        </w:rPr>
+      </w:pPr>
+      <w:r>
+        <w:rPr>
+          <w:rFonts w:ascii="Times New Roman" w:hAnsi="Times New Roman" w:cs="Times New Roman"/>
+          <w:lang w:val="en-US"/>
+        </w:rPr>
+        <w:t xml:space="preserve">Improve the processing times for the </w:t>
+      </w:r>
+      <w:proofErr w:type="spellStart"/>
+      <w:r>
+        <w:rPr>
+          <w:rFonts w:ascii="Times New Roman" w:hAnsi="Times New Roman" w:cs="Times New Roman"/>
+          <w:lang w:val="en-US"/>
+        </w:rPr>
+        <w:t>makeDataCube</w:t>
+      </w:r>
+      <w:proofErr w:type="spellEnd"/>
+      <w:r>
+        <w:rPr>
+          <w:rFonts w:ascii="Times New Roman" w:hAnsi="Times New Roman" w:cs="Times New Roman"/>
+          <w:lang w:val="en-US"/>
+        </w:rPr>
+        <w:t xml:space="preserve"> and batch processing functions by reworking the functions, leveraging alternative methods and implementing threads. Permitting users to speed up data analysis and report generation times.</w:t>
+      </w:r>
+    </w:p>
+    <w:p>
+      <w:pPr>
+        <w:rPr>
+          <w:rFonts w:ascii="Times New Roman" w:hAnsi="Times New Roman" w:cs="Times New Roman"/>
+          <w:lang w:val="en-US"/>
+        </w:rPr>
+      </w:pPr>
+    </w:p>
+    <w:p>
+      <w:pPr>
+        <w:pStyle w:val="ListParagraph"/>
+        <w:numPr>
+          <w:ilvl w:val="0"/>
+          <w:numId w:val="6"/>
+        </w:numPr>
+        <w:rPr>
+          <w:rFonts w:ascii="Times New Roman" w:hAnsi="Times New Roman" w:cs="Times New Roman"/>
+          <w:b/>
+          <w:bCs/>
+          <w:lang w:val="en-US"/>
+        </w:rPr>
+      </w:pPr>
+      <w:r>
+        <w:rPr>
+          <w:rFonts w:ascii="Times New Roman" w:hAnsi="Times New Roman" w:cs="Times New Roman"/>
+          <w:b/>
+          <w:bCs/>
+          <w:lang w:val="en-US"/>
+        </w:rPr>
+        <w:t>3D manipulation</w:t>
+      </w:r>
+    </w:p>
+    <w:p>
+      <w:pPr>
+        <w:pStyle w:val="ListParagraph"/>
+        <w:ind w:left="1080"/>
+        <w:rPr>
+          <w:rFonts w:ascii="Times New Roman" w:hAnsi="Times New Roman" w:cs="Times New Roman"/>
+          <w:lang w:val="en-US"/>
+        </w:rPr>
+      </w:pPr>
+      <w:r>
+        <w:rPr>
+          <w:rFonts w:ascii="Times New Roman" w:hAnsi="Times New Roman" w:cs="Times New Roman"/>
+          <w:lang w:val="en-US"/>
+        </w:rPr>
+        <w:t>I</w:t>
+      </w:r>
+      <w:r>
+        <w:rPr>
+          <w:rFonts w:ascii="Times New Roman" w:hAnsi="Times New Roman" w:cs="Times New Roman"/>
+          <w:lang w:val="en-US"/>
+        </w:rPr>
+        <w:t xml:space="preserve">ncorporating a </w:t>
+      </w:r>
+      <w:r>
+        <w:rPr>
+          <w:rFonts w:ascii="Times New Roman" w:hAnsi="Times New Roman" w:cs="Times New Roman"/>
+          <w:lang w:val="en-US"/>
+        </w:rPr>
+        <w:t>stripped-down</w:t>
+      </w:r>
+      <w:r>
+        <w:rPr>
+          <w:rFonts w:ascii="Times New Roman" w:hAnsi="Times New Roman" w:cs="Times New Roman"/>
+          <w:lang w:val="en-US"/>
+        </w:rPr>
+        <w:t xml:space="preserve"> version of a 3D visualization software, that includes only the functions necessary for this workflow, </w:t>
+      </w:r>
+      <w:r>
+        <w:rPr>
+          <w:rFonts w:ascii="Times New Roman" w:hAnsi="Times New Roman" w:cs="Times New Roman"/>
+          <w:lang w:val="en-US"/>
+        </w:rPr>
+        <w:t>into the program itself. Reducing the need for users to use other software to achieve 3D manipulation</w:t>
+      </w:r>
+    </w:p>
+    <w:p>
+      <w:pPr>
+        <w:rPr>
+          <w:rFonts w:ascii="Times New Roman" w:hAnsi="Times New Roman" w:cs="Times New Roman"/>
+          <w:lang w:val="en-US"/>
+        </w:rPr>
+      </w:pPr>
+    </w:p>
+    <w:p>
+      <w:pPr>
+        <w:pStyle w:val="ListParagraph"/>
+        <w:numPr>
+          <w:ilvl w:val="0"/>
+          <w:numId w:val="6"/>
+        </w:numPr>
+        <w:rPr>
+          <w:rFonts w:ascii="Times New Roman" w:hAnsi="Times New Roman" w:cs="Times New Roman"/>
+          <w:b/>
+          <w:bCs/>
+          <w:lang w:val="en-US"/>
+        </w:rPr>
+      </w:pPr>
+      <w:r>
+        <w:rPr>
+          <w:rFonts w:ascii="Times New Roman" w:hAnsi="Times New Roman" w:cs="Times New Roman"/>
+          <w:b/>
+          <w:bCs/>
+          <w:lang w:val="en-US"/>
+        </w:rPr>
+        <w:t>Elevation correction</w:t>
+      </w:r>
+    </w:p>
+    <w:p>
+      <w:pPr>
+        <w:pStyle w:val="ListParagraph"/>
+        <w:ind w:left="1080"/>
+        <w:rPr>
+          <w:rFonts w:ascii="Times New Roman" w:hAnsi="Times New Roman" w:cs="Times New Roman"/>
+          <w:lang w:val="en-US"/>
+        </w:rPr>
+      </w:pPr>
+      <w:r>
+        <w:rPr>
+          <w:rFonts w:ascii="Times New Roman" w:hAnsi="Times New Roman" w:cs="Times New Roman"/>
+          <w:lang w:val="en-US"/>
+        </w:rPr>
+        <w:t>I</w:t>
+      </w:r>
+      <w:r>
+        <w:rPr>
+          <w:rFonts w:ascii="Times New Roman" w:hAnsi="Times New Roman" w:cs="Times New Roman"/>
+          <w:lang w:val="en-US"/>
+        </w:rPr>
+        <w:t>dentify an effective solution by using LiDAR imagery to help adjust the elevation</w:t>
+      </w:r>
+      <w:r>
+        <w:rPr>
+          <w:rFonts w:ascii="Times New Roman" w:hAnsi="Times New Roman" w:cs="Times New Roman"/>
+          <w:lang w:val="en-US"/>
+        </w:rPr>
+        <w:t xml:space="preserve"> of </w:t>
+      </w:r>
+      <w:proofErr w:type="spellStart"/>
+      <w:r>
+        <w:rPr>
+          <w:rFonts w:ascii="Times New Roman" w:hAnsi="Times New Roman" w:cs="Times New Roman"/>
+          <w:lang w:val="en-US"/>
+        </w:rPr>
+        <w:t>gpr</w:t>
+      </w:r>
+      <w:proofErr w:type="spellEnd"/>
+      <w:r>
+        <w:rPr>
+          <w:rFonts w:ascii="Times New Roman" w:hAnsi="Times New Roman" w:cs="Times New Roman"/>
+          <w:lang w:val="en-US"/>
+        </w:rPr>
+        <w:t xml:space="preserve"> data cubes. This will help archaeologists accurately locate </w:t>
+      </w:r>
+      <w:r>
+        <w:rPr>
+          <w:rFonts w:ascii="Times New Roman" w:hAnsi="Times New Roman" w:cs="Times New Roman"/>
+          <w:lang w:val="en-US"/>
+        </w:rPr>
+        <w:t>points of interest, minimize wastage of resources and manpower, and remove the need for paid solutions</w:t>
+      </w:r>
+    </w:p>
+    <w:p>
+      <w:pPr>
+        <w:pStyle w:val="ListParagraph"/>
+        <w:ind w:left="1080"/>
+        <w:rPr>
+          <w:rFonts w:ascii="Times New Roman" w:hAnsi="Times New Roman" w:cs="Times New Roman"/>
+          <w:lang w:val="en-US"/>
+        </w:rPr>
+      </w:pPr>
+    </w:p>
+    <w:p>
+      <w:pPr>
+        <w:pStyle w:val="ListParagraph"/>
+        <w:ind w:left="1080"/>
+        <w:rPr>
+          <w:rFonts w:ascii="Times New Roman" w:hAnsi="Times New Roman" w:cs="Times New Roman"/>
+          <w:lang w:val="en-US"/>
+        </w:rPr>
+      </w:pPr>
+    </w:p>
+    <w:p>
+      <w:pPr>
+        <w:pStyle w:val="ListParagraph"/>
+        <w:ind w:left="1080"/>
+        <w:rPr>
+          <w:rFonts w:ascii="Times New Roman" w:hAnsi="Times New Roman" w:cs="Times New Roman"/>
+          <w:lang w:val="en-US"/>
+        </w:rPr>
+      </w:pPr>
+    </w:p>
+    <w:p>
+      <w:pPr>
+        <w:pStyle w:val="ListParagraph"/>
+        <w:ind w:left="1080"/>
+        <w:rPr>
+          <w:rFonts w:ascii="Times New Roman" w:hAnsi="Times New Roman" w:cs="Times New Roman"/>
+          <w:lang w:val="en-US"/>
+        </w:rPr>
+      </w:pPr>
+    </w:p>
+    <w:p>
+      <w:pPr>
+        <w:pStyle w:val="ListParagraph"/>
+        <w:ind w:left="1080"/>
+        <w:rPr>
+          <w:rFonts w:ascii="Times New Roman" w:hAnsi="Times New Roman" w:cs="Times New Roman"/>
+          <w:lang w:val="en-US"/>
+        </w:rPr>
+      </w:pPr>
+    </w:p>
+    <w:p>
+      <w:pPr>
+        <w:pStyle w:val="ListParagraph"/>
+        <w:ind w:left="1080"/>
+        <w:rPr>
+          <w:rFonts w:ascii="Times New Roman" w:hAnsi="Times New Roman" w:cs="Times New Roman"/>
+          <w:lang w:val="en-US"/>
+        </w:rPr>
+      </w:pPr>
+    </w:p>
+    <w:p>
+      <w:pPr>
+        <w:pStyle w:val="ListParagraph"/>
+        <w:ind w:left="1080"/>
+        <w:rPr>
+          <w:rFonts w:ascii="Times New Roman" w:hAnsi="Times New Roman" w:cs="Times New Roman"/>
+          <w:lang w:val="en-US"/>
+        </w:rPr>
+      </w:pPr>
+    </w:p>
+    <w:p>
+      <w:pPr>
+        <w:pStyle w:val="ListParagraph"/>
+        <w:ind w:left="1080"/>
+        <w:rPr>
+          <w:rFonts w:ascii="Times New Roman" w:hAnsi="Times New Roman" w:cs="Times New Roman"/>
+          <w:lang w:val="en-US"/>
+        </w:rPr>
+      </w:pPr>
+    </w:p>
+    <w:p>
+      <w:pPr>
+        <w:pStyle w:val="ListParagraph"/>
+        <w:ind w:left="1080"/>
+        <w:rPr>
+          <w:rFonts w:ascii="Times New Roman" w:hAnsi="Times New Roman" w:cs="Times New Roman"/>
+          <w:lang w:val="en-US"/>
+        </w:rPr>
+      </w:pPr>
+    </w:p>
+    <w:p>
+      <w:pPr>
+        <w:pStyle w:val="ListParagraph"/>
+        <w:ind w:left="1080"/>
+        <w:rPr>
+          <w:rFonts w:ascii="Times New Roman" w:hAnsi="Times New Roman" w:cs="Times New Roman"/>
+          <w:lang w:val="en-US"/>
+        </w:rPr>
+      </w:pPr>
+    </w:p>
+    <w:p>
+      <w:pPr>
+        <w:pStyle w:val="ListParagraph"/>
+        <w:ind w:left="1080"/>
+        <w:rPr>
+          <w:rFonts w:ascii="Times New Roman" w:hAnsi="Times New Roman" w:cs="Times New Roman"/>
+          <w:lang w:val="en-US"/>
+        </w:rPr>
+      </w:pPr>
+    </w:p>
+    <w:p>
+      <w:pPr>
+        <w:pStyle w:val="ListParagraph"/>
+        <w:ind w:left="1080"/>
+        <w:rPr>
+          <w:rFonts w:ascii="Times New Roman" w:hAnsi="Times New Roman" w:cs="Times New Roman"/>
+          <w:lang w:val="en-US"/>
+        </w:rPr>
+      </w:pPr>
+    </w:p>
+    <w:p>
+      <w:pPr>
+        <w:pStyle w:val="ListParagraph"/>
+        <w:ind w:left="1080"/>
+        <w:rPr>
+          <w:rFonts w:ascii="Times New Roman" w:hAnsi="Times New Roman" w:cs="Times New Roman"/>
+          <w:lang w:val="en-US"/>
+        </w:rPr>
+      </w:pPr>
+    </w:p>
+    <w:p>
+      <w:pPr>
+        <w:pStyle w:val="ListParagraph"/>
+        <w:ind w:left="1080"/>
+        <w:rPr>
+          <w:rFonts w:ascii="Times New Roman" w:hAnsi="Times New Roman" w:cs="Times New Roman"/>
+          <w:lang w:val="en-US"/>
+        </w:rPr>
+      </w:pPr>
+    </w:p>
+    <w:p>
+      <w:pPr>
+        <w:pStyle w:val="ListParagraph"/>
+        <w:ind w:left="1080"/>
+        <w:rPr>
+          <w:rFonts w:ascii="Times New Roman" w:hAnsi="Times New Roman" w:cs="Times New Roman"/>
+          <w:lang w:val="en-US"/>
+        </w:rPr>
+      </w:pPr>
+    </w:p>
+    <w:p>
+      <w:pPr>
+        <w:pStyle w:val="ListParagraph"/>
+        <w:ind w:left="1080"/>
+        <w:rPr>
+          <w:rFonts w:ascii="Times New Roman" w:hAnsi="Times New Roman" w:cs="Times New Roman"/>
+          <w:lang w:val="en-US"/>
+        </w:rPr>
+      </w:pPr>
+    </w:p>
+    <w:p>
+      <w:pPr>
+        <w:pStyle w:val="ListParagraph"/>
+        <w:ind w:left="1080"/>
+        <w:rPr>
+          <w:rFonts w:ascii="Times New Roman" w:hAnsi="Times New Roman" w:cs="Times New Roman"/>
+          <w:lang w:val="en-US"/>
+        </w:rPr>
+      </w:pPr>
+    </w:p>
+    <w:p>
+      <w:pPr>
+        <w:pStyle w:val="ListParagraph"/>
+        <w:ind w:left="1080"/>
+        <w:rPr>
+          <w:rFonts w:ascii="Times New Roman" w:hAnsi="Times New Roman" w:cs="Times New Roman"/>
+          <w:b/>
+          <w:bCs/>
+          <w:sz w:val="32"/>
+          <w:szCs w:val="32"/>
+          <w:lang w:val="en-US"/>
+        </w:rPr>
+      </w:pPr>
+      <w:r>
+        <w:rPr>
+          <w:rFonts w:ascii="Times New Roman" w:hAnsi="Times New Roman" w:cs="Times New Roman"/>
+          <w:b/>
+          <w:bCs/>
+          <w:sz w:val="32"/>
+          <w:szCs w:val="32"/>
+          <w:lang w:val="en-US"/>
+        </w:rPr>
+        <w:lastRenderedPageBreak/>
+        <w:t>Conclusion</w:t>
+      </w:r>
+    </w:p>
+    <w:p>
+      <w:pPr>
+        <w:pStyle w:val="ListParagraph"/>
+        <w:ind w:left="1080"/>
+        <w:rPr>
+          <w:rFonts w:ascii="Times New Roman" w:hAnsi="Times New Roman" w:cs="Times New Roman"/>
+          <w:lang w:val="en-US"/>
+        </w:rPr>
+      </w:pPr>
+    </w:p>
+    <w:p>
+      <w:pPr>
+        <w:pStyle w:val="ListParagraph"/>
+        <w:ind w:left="1080"/>
+        <w:rPr>
+          <w:rFonts w:ascii="Times New Roman" w:hAnsi="Times New Roman" w:cs="Times New Roman"/>
+          <w:lang w:val="en-US"/>
+        </w:rPr>
+      </w:pPr>
+      <w:r>
+        <w:rPr>
+          <w:rFonts w:ascii="Times New Roman" w:hAnsi="Times New Roman" w:cs="Times New Roman"/>
+          <w:lang w:val="en-US"/>
+        </w:rPr>
+        <w:t>The aim of this pro</w:t>
+      </w:r>
+      <w:r>
+        <w:rPr>
+          <w:rFonts w:ascii="Times New Roman" w:hAnsi="Times New Roman" w:cs="Times New Roman"/>
+          <w:lang w:val="en-US"/>
+        </w:rPr>
+        <w:t xml:space="preserve">ject is to modernize and improve the gpr.py library and introduce necessary features that will make it a viable product for archaeologists to use. Slow processing times, need for third party software and hold it back from being a staple in current workflows. </w:t>
+      </w:r>
+    </w:p>
+    <w:p>
+      <w:pPr>
+        <w:pStyle w:val="ListParagraph"/>
+        <w:ind w:left="1080"/>
+        <w:rPr>
+          <w:rFonts w:ascii="Times New Roman" w:hAnsi="Times New Roman" w:cs="Times New Roman"/>
+          <w:lang w:val="en-US"/>
+        </w:rPr>
+      </w:pPr>
+    </w:p>
+    <w:p>
+      <w:pPr>
+        <w:pStyle w:val="ListParagraph"/>
+        <w:ind w:left="1080"/>
+        <w:rPr>
+          <w:rFonts w:ascii="Times New Roman" w:hAnsi="Times New Roman" w:cs="Times New Roman"/>
+          <w:lang w:val="en-US"/>
+        </w:rPr>
+      </w:pPr>
+      <w:r>
+        <w:rPr>
+          <w:rFonts w:ascii="Times New Roman" w:hAnsi="Times New Roman" w:cs="Times New Roman"/>
+          <w:lang w:val="en-US"/>
+        </w:rPr>
+        <w:t xml:space="preserve">By updating the UI to make it user-friendly, reworking the functions to make them faster we can reduce the barrier to entry for this product. And by adding the LiDAR correction feature we will be able to make this an enticing product for small scale Geoscience and Archaeology operations. </w:t>
+      </w:r>
+    </w:p>
+    <w:p>
+      <w:pPr>
+        <w:pStyle w:val="ListParagraph"/>
+        <w:ind w:left="1080"/>
+        <w:rPr>
+          <w:rFonts w:ascii="Times New Roman" w:hAnsi="Times New Roman" w:cs="Times New Roman"/>
+          <w:lang w:val="en-US"/>
+        </w:rPr>
+      </w:pPr>
+    </w:p>
+    <w:p>
+      <w:pPr>
+        <w:pStyle w:val="ListParagraph"/>
+        <w:ind w:left="1080"/>
+        <w:rPr>
+          <w:rFonts w:ascii="Times New Roman" w:hAnsi="Times New Roman" w:cs="Times New Roman"/>
+          <w:lang w:val="en-US"/>
+        </w:rPr>
+      </w:pPr>
+      <w:r>
+        <w:rPr>
+          <w:rFonts w:ascii="Times New Roman" w:hAnsi="Times New Roman" w:cs="Times New Roman"/>
+          <w:lang w:val="en-US"/>
+        </w:rPr>
+        <w:t>This product will be an opensource program that will be packaged into and install file and will be deployable on any machine. And the features included in the final product will be:</w:t>
+      </w:r>
+    </w:p>
+    <w:p>
+      <w:pPr>
+        <w:pStyle w:val="ListParagraph"/>
+        <w:ind w:left="1080"/>
+        <w:rPr>
+          <w:rFonts w:ascii="Times New Roman" w:hAnsi="Times New Roman" w:cs="Times New Roman"/>
+          <w:lang w:val="en-US"/>
+        </w:rPr>
+      </w:pPr>
     </w:p>
     <w:p>
       <w:pPr>
@@ -419,712 +1780,6 @@
     </w:p>
     <w:p>
       <w:pPr>
-        <w:rPr>
-          <w:rFonts w:ascii="Times New Roman" w:hAnsi="Times New Roman" w:cs="Times New Roman"/>
-          <w:lang w:val="en-US"/>
-        </w:rPr>
-      </w:pPr>
-    </w:p>
-    <w:p>
-      <w:pPr>
-        <w:rPr>
-          <w:rFonts w:ascii="Times New Roman" w:hAnsi="Times New Roman" w:cs="Times New Roman"/>
-          <w:lang w:val="en-US"/>
-        </w:rPr>
-      </w:pPr>
-    </w:p>
-    <w:p>
-      <w:pPr>
-        <w:rPr>
-          <w:rFonts w:ascii="Times New Roman" w:hAnsi="Times New Roman" w:cs="Times New Roman"/>
-          <w:lang w:val="en-US"/>
-        </w:rPr>
-      </w:pPr>
-    </w:p>
-    <w:p>
-      <w:pPr>
-        <w:rPr>
-          <w:rFonts w:ascii="Times New Roman" w:hAnsi="Times New Roman" w:cs="Times New Roman"/>
-          <w:lang w:val="en-US"/>
-        </w:rPr>
-      </w:pPr>
-    </w:p>
-    <w:p>
-      <w:pPr>
-        <w:rPr>
-          <w:rFonts w:ascii="Times New Roman" w:hAnsi="Times New Roman" w:cs="Times New Roman"/>
-          <w:lang w:val="en-US"/>
-        </w:rPr>
-      </w:pPr>
-    </w:p>
-    <w:p>
-      <w:pPr>
-        <w:rPr>
-          <w:rFonts w:ascii="Times New Roman" w:hAnsi="Times New Roman" w:cs="Times New Roman"/>
-          <w:lang w:val="en-US"/>
-        </w:rPr>
-      </w:pPr>
-    </w:p>
-    <w:p>
-      <w:pPr>
-        <w:rPr>
-          <w:rFonts w:ascii="Times New Roman" w:hAnsi="Times New Roman" w:cs="Times New Roman"/>
-          <w:b/>
-          <w:bCs/>
-          <w:sz w:val="32"/>
-          <w:szCs w:val="32"/>
-          <w:lang w:val="en-US"/>
-        </w:rPr>
-      </w:pPr>
-    </w:p>
-    <w:p>
-      <w:pPr>
-        <w:rPr>
-          <w:rFonts w:ascii="Times New Roman" w:hAnsi="Times New Roman" w:cs="Times New Roman"/>
-          <w:b/>
-          <w:bCs/>
-          <w:sz w:val="32"/>
-          <w:szCs w:val="32"/>
-          <w:lang w:val="en-US"/>
-        </w:rPr>
-      </w:pPr>
-    </w:p>
-    <w:p>
-      <w:pPr>
-        <w:rPr>
-          <w:rFonts w:ascii="Times New Roman" w:hAnsi="Times New Roman" w:cs="Times New Roman"/>
-          <w:b/>
-          <w:bCs/>
-          <w:sz w:val="32"/>
-          <w:szCs w:val="32"/>
-          <w:lang w:val="en-US"/>
-        </w:rPr>
-      </w:pPr>
-      <w:r>
-        <w:rPr>
-          <w:rFonts w:ascii="Times New Roman" w:hAnsi="Times New Roman" w:cs="Times New Roman"/>
-          <w:b/>
-          <w:bCs/>
-          <w:sz w:val="32"/>
-          <w:szCs w:val="32"/>
-          <w:lang w:val="en-US"/>
-        </w:rPr>
-        <w:lastRenderedPageBreak/>
-        <w:t>Issues</w:t>
-      </w:r>
-    </w:p>
-    <w:p>
-      <w:pPr>
-        <w:pStyle w:val="ListParagraph"/>
-        <w:numPr>
-          <w:ilvl w:val="0"/>
-          <w:numId w:val="2"/>
-        </w:numPr>
-        <w:rPr>
-          <w:rFonts w:ascii="Times New Roman" w:hAnsi="Times New Roman" w:cs="Times New Roman"/>
-          <w:b/>
-          <w:bCs/>
-          <w:lang w:val="en-US"/>
-        </w:rPr>
-      </w:pPr>
-      <w:proofErr w:type="spellStart"/>
-      <w:r>
-        <w:rPr>
-          <w:rFonts w:ascii="Times New Roman" w:hAnsi="Times New Roman" w:cs="Times New Roman"/>
-          <w:b/>
-          <w:bCs/>
-          <w:lang w:val="en-US"/>
-        </w:rPr>
-        <w:t>Incompatibilty</w:t>
-      </w:r>
-      <w:proofErr w:type="spellEnd"/>
-      <w:r>
-        <w:rPr>
-          <w:rFonts w:ascii="Times New Roman" w:hAnsi="Times New Roman" w:cs="Times New Roman"/>
-          <w:b/>
-          <w:bCs/>
-          <w:lang w:val="en-US"/>
-        </w:rPr>
-        <w:t xml:space="preserve"> with MacOS</w:t>
-      </w:r>
-    </w:p>
-    <w:p>
-      <w:pPr>
-        <w:ind w:left="720"/>
-        <w:rPr>
-          <w:rFonts w:ascii="Times New Roman" w:hAnsi="Times New Roman" w:cs="Times New Roman"/>
-          <w:lang w:val="en-US"/>
-        </w:rPr>
-      </w:pPr>
-      <w:r>
-        <w:rPr>
-          <w:rFonts w:ascii="Times New Roman" w:hAnsi="Times New Roman" w:cs="Times New Roman"/>
-          <w:lang w:val="en-US"/>
-        </w:rPr>
-        <w:t xml:space="preserve">This was due to conflicts with </w:t>
-      </w:r>
-      <w:proofErr w:type="spellStart"/>
-      <w:r>
-        <w:rPr>
-          <w:rFonts w:ascii="Times New Roman" w:hAnsi="Times New Roman" w:cs="Times New Roman"/>
-          <w:i/>
-          <w:iCs/>
-          <w:lang w:val="en-US"/>
-        </w:rPr>
-        <w:t>mayavi</w:t>
-      </w:r>
-      <w:proofErr w:type="spellEnd"/>
-      <w:r>
-        <w:rPr>
-          <w:rFonts w:ascii="Times New Roman" w:hAnsi="Times New Roman" w:cs="Times New Roman"/>
-          <w:lang w:val="en-US"/>
-        </w:rPr>
-        <w:t xml:space="preserve"> libraries which resulted in the program crashing on </w:t>
-      </w:r>
-      <w:proofErr w:type="gramStart"/>
-      <w:r>
-        <w:rPr>
-          <w:rFonts w:ascii="Times New Roman" w:hAnsi="Times New Roman" w:cs="Times New Roman"/>
-          <w:lang w:val="en-US"/>
-        </w:rPr>
-        <w:t>launch .</w:t>
-      </w:r>
-      <w:proofErr w:type="gramEnd"/>
-      <w:r>
-        <w:rPr>
-          <w:rFonts w:ascii="Times New Roman" w:hAnsi="Times New Roman" w:cs="Times New Roman"/>
-          <w:lang w:val="en-US"/>
-        </w:rPr>
-        <w:t xml:space="preserve"> </w:t>
-      </w:r>
-    </w:p>
-    <w:p>
-      <w:pPr>
-        <w:ind w:left="720"/>
-        <w:rPr>
-          <w:rFonts w:ascii="Times New Roman" w:hAnsi="Times New Roman" w:cs="Times New Roman"/>
-          <w:lang w:val="en-US"/>
-        </w:rPr>
-      </w:pPr>
-    </w:p>
-    <w:p>
-      <w:pPr>
-        <w:pStyle w:val="ListParagraph"/>
-        <w:numPr>
-          <w:ilvl w:val="0"/>
-          <w:numId w:val="2"/>
-        </w:numPr>
-        <w:rPr>
-          <w:rFonts w:ascii="Times New Roman" w:hAnsi="Times New Roman" w:cs="Times New Roman"/>
-          <w:b/>
-          <w:bCs/>
-          <w:lang w:val="en-US"/>
-        </w:rPr>
-      </w:pPr>
-      <w:r>
-        <w:rPr>
-          <w:rFonts w:ascii="Times New Roman" w:hAnsi="Times New Roman" w:cs="Times New Roman"/>
-          <w:b/>
-          <w:bCs/>
-          <w:lang w:val="en-US"/>
-        </w:rPr>
-        <w:t xml:space="preserve">Batch Processing - </w:t>
-      </w:r>
-      <w:r>
-        <w:rPr>
-          <w:rFonts w:ascii="Times New Roman" w:hAnsi="Times New Roman" w:cs="Times New Roman"/>
-          <w:b/>
-          <w:bCs/>
-          <w:lang w:val="en-US"/>
-        </w:rPr>
-        <w:t>Memory Leaks</w:t>
-      </w:r>
-    </w:p>
-    <w:p>
-      <w:pPr>
-        <w:rPr>
-          <w:rFonts w:ascii="Times New Roman" w:hAnsi="Times New Roman" w:cs="Times New Roman"/>
-          <w:lang w:val="en-US"/>
-        </w:rPr>
-      </w:pPr>
-    </w:p>
-    <w:p>
-      <w:pPr>
-        <w:pStyle w:val="ListParagraph"/>
-        <w:numPr>
-          <w:ilvl w:val="0"/>
-          <w:numId w:val="2"/>
-        </w:numPr>
-        <w:rPr>
-          <w:rFonts w:ascii="Times New Roman" w:hAnsi="Times New Roman" w:cs="Times New Roman"/>
-          <w:b/>
-          <w:bCs/>
-          <w:lang w:val="en-US"/>
-        </w:rPr>
-      </w:pPr>
-      <w:r>
-        <w:rPr>
-          <w:rFonts w:ascii="Times New Roman" w:hAnsi="Times New Roman" w:cs="Times New Roman"/>
-          <w:b/>
-          <w:bCs/>
-          <w:lang w:val="en-US"/>
-        </w:rPr>
-        <w:t>Cube slicing</w:t>
-      </w:r>
-    </w:p>
-    <w:p>
-      <w:pPr>
-        <w:ind w:left="720"/>
-        <w:rPr>
-          <w:rFonts w:ascii="Times New Roman" w:hAnsi="Times New Roman" w:cs="Times New Roman"/>
-          <w:lang w:val="en-US"/>
-        </w:rPr>
-      </w:pPr>
-      <w:r>
-        <w:rPr>
-          <w:rFonts w:ascii="Times New Roman" w:hAnsi="Times New Roman" w:cs="Times New Roman"/>
-          <w:lang w:val="en-US"/>
-        </w:rPr>
-        <w:t>Results</w:t>
-      </w:r>
-      <w:r>
-        <w:rPr>
-          <w:rFonts w:ascii="Times New Roman" w:hAnsi="Times New Roman" w:cs="Times New Roman"/>
-          <w:lang w:val="en-US"/>
-        </w:rPr>
-        <w:t xml:space="preserve"> in memory overloads and crashing </w:t>
-      </w:r>
-    </w:p>
-    <w:p>
-      <w:pPr>
-        <w:ind w:left="720"/>
-        <w:rPr>
-          <w:rFonts w:ascii="Times New Roman" w:hAnsi="Times New Roman" w:cs="Times New Roman"/>
-          <w:lang w:val="en-US"/>
-        </w:rPr>
-      </w:pPr>
-    </w:p>
-    <w:p>
-      <w:pPr>
-        <w:pStyle w:val="ListParagraph"/>
-        <w:numPr>
-          <w:ilvl w:val="0"/>
-          <w:numId w:val="5"/>
-        </w:numPr>
-        <w:rPr>
-          <w:rFonts w:ascii="Times New Roman" w:hAnsi="Times New Roman" w:cs="Times New Roman"/>
-          <w:b/>
-          <w:bCs/>
-          <w:lang w:val="en-US"/>
-        </w:rPr>
-      </w:pPr>
-      <w:r>
-        <w:rPr>
-          <w:rFonts w:ascii="Times New Roman" w:hAnsi="Times New Roman" w:cs="Times New Roman"/>
-          <w:b/>
-          <w:bCs/>
-          <w:lang w:val="en-US"/>
-        </w:rPr>
-        <w:t>UI</w:t>
-      </w:r>
-    </w:p>
-    <w:p>
-      <w:pPr>
-        <w:pStyle w:val="ListParagraph"/>
-        <w:rPr>
-          <w:rFonts w:ascii="Times New Roman" w:hAnsi="Times New Roman" w:cs="Times New Roman"/>
-          <w:lang w:val="en-US"/>
-        </w:rPr>
-      </w:pPr>
-      <w:r>
-        <w:rPr>
-          <w:rFonts w:ascii="Times New Roman" w:hAnsi="Times New Roman" w:cs="Times New Roman"/>
-          <w:lang w:val="en-US"/>
-        </w:rPr>
-        <w:t xml:space="preserve">The current UI is outdated and disorganized. </w:t>
-      </w:r>
-      <w:r>
-        <w:rPr>
-          <w:rFonts w:ascii="Times New Roman" w:hAnsi="Times New Roman" w:cs="Times New Roman"/>
-          <w:lang w:val="en-US"/>
-        </w:rPr>
-        <w:t>Acts as a high barrier to entry for non-technical users, or users with little to none programming experience.</w:t>
-      </w:r>
-    </w:p>
-    <w:p>
-      <w:pPr>
-        <w:rPr>
-          <w:rFonts w:ascii="Times New Roman" w:hAnsi="Times New Roman" w:cs="Times New Roman"/>
-          <w:b/>
-          <w:bCs/>
-          <w:lang w:val="en-US"/>
-        </w:rPr>
-      </w:pPr>
-    </w:p>
-    <w:p>
-      <w:pPr>
-        <w:pStyle w:val="ListParagraph"/>
-        <w:numPr>
-          <w:ilvl w:val="0"/>
-          <w:numId w:val="5"/>
-        </w:numPr>
-        <w:rPr>
-          <w:rFonts w:ascii="Times New Roman" w:hAnsi="Times New Roman" w:cs="Times New Roman"/>
-          <w:b/>
-          <w:bCs/>
-          <w:lang w:val="en-US"/>
-        </w:rPr>
-      </w:pPr>
-      <w:r>
-        <w:rPr>
-          <w:rFonts w:ascii="Times New Roman" w:hAnsi="Times New Roman" w:cs="Times New Roman"/>
-          <w:b/>
-          <w:bCs/>
-          <w:lang w:val="en-US"/>
-        </w:rPr>
-        <w:t>Interpolation</w:t>
-      </w:r>
-    </w:p>
-    <w:p>
-      <w:pPr>
-        <w:pStyle w:val="ListParagraph"/>
-        <w:rPr>
-          <w:rFonts w:ascii="Times New Roman" w:hAnsi="Times New Roman" w:cs="Times New Roman"/>
-          <w:lang w:val="en-US"/>
-        </w:rPr>
-      </w:pPr>
-      <w:r>
-        <w:rPr>
-          <w:rFonts w:ascii="Times New Roman" w:hAnsi="Times New Roman" w:cs="Times New Roman"/>
-          <w:lang w:val="en-US"/>
-        </w:rPr>
-        <w:t xml:space="preserve">This is the function of combining a series of </w:t>
-      </w:r>
-      <w:proofErr w:type="spellStart"/>
-      <w:r>
-        <w:rPr>
-          <w:rFonts w:ascii="Times New Roman" w:hAnsi="Times New Roman" w:cs="Times New Roman"/>
-          <w:lang w:val="en-US"/>
-        </w:rPr>
-        <w:t>gpr</w:t>
-      </w:r>
-      <w:proofErr w:type="spellEnd"/>
-      <w:r>
-        <w:rPr>
-          <w:rFonts w:ascii="Times New Roman" w:hAnsi="Times New Roman" w:cs="Times New Roman"/>
-          <w:lang w:val="en-US"/>
-        </w:rPr>
-        <w:t xml:space="preserve"> files and creating a 3D cube of the </w:t>
-      </w:r>
-      <w:proofErr w:type="gramStart"/>
-      <w:r>
-        <w:rPr>
-          <w:rFonts w:ascii="Times New Roman" w:hAnsi="Times New Roman" w:cs="Times New Roman"/>
-          <w:lang w:val="en-US"/>
-        </w:rPr>
-        <w:t>area</w:t>
-      </w:r>
-      <w:r>
-        <w:rPr>
-          <w:rFonts w:ascii="Times New Roman" w:hAnsi="Times New Roman" w:cs="Times New Roman"/>
-          <w:lang w:val="en-US"/>
-        </w:rPr>
-        <w:t>, and</w:t>
-      </w:r>
-      <w:proofErr w:type="gramEnd"/>
-      <w:r>
-        <w:rPr>
-          <w:rFonts w:ascii="Times New Roman" w:hAnsi="Times New Roman" w:cs="Times New Roman"/>
-          <w:lang w:val="en-US"/>
-        </w:rPr>
-        <w:t xml:space="preserve"> is stored in the makeDataCube.py file</w:t>
-      </w:r>
-      <w:r>
-        <w:rPr>
-          <w:rFonts w:ascii="Times New Roman" w:hAnsi="Times New Roman" w:cs="Times New Roman"/>
-          <w:lang w:val="en-US"/>
-        </w:rPr>
-        <w:t xml:space="preserve">. </w:t>
-      </w:r>
-      <w:proofErr w:type="gramStart"/>
-      <w:r>
-        <w:rPr>
-          <w:rFonts w:ascii="Times New Roman" w:hAnsi="Times New Roman" w:cs="Times New Roman"/>
-          <w:lang w:val="en-US"/>
-        </w:rPr>
-        <w:t>However</w:t>
-      </w:r>
-      <w:proofErr w:type="gramEnd"/>
-      <w:r>
-        <w:rPr>
-          <w:rFonts w:ascii="Times New Roman" w:hAnsi="Times New Roman" w:cs="Times New Roman"/>
-          <w:lang w:val="en-US"/>
-        </w:rPr>
-        <w:t xml:space="preserve"> this functionality is not integrated </w:t>
-      </w:r>
-      <w:r>
-        <w:rPr>
-          <w:rFonts w:ascii="Times New Roman" w:hAnsi="Times New Roman" w:cs="Times New Roman"/>
-          <w:lang w:val="en-US"/>
-        </w:rPr>
-        <w:t xml:space="preserve">into the </w:t>
-      </w:r>
-      <w:proofErr w:type="spellStart"/>
-      <w:r>
-        <w:rPr>
-          <w:rFonts w:ascii="Times New Roman" w:hAnsi="Times New Roman" w:cs="Times New Roman"/>
-          <w:lang w:val="en-US"/>
-        </w:rPr>
-        <w:t>GPRpy</w:t>
-      </w:r>
-      <w:proofErr w:type="spellEnd"/>
-      <w:r>
-        <w:rPr>
-          <w:rFonts w:ascii="Times New Roman" w:hAnsi="Times New Roman" w:cs="Times New Roman"/>
-          <w:lang w:val="en-US"/>
-        </w:rPr>
-        <w:t xml:space="preserve"> program and requires additional scripting. </w:t>
-      </w:r>
-    </w:p>
-    <w:p>
-      <w:pPr>
-        <w:pStyle w:val="ListParagraph"/>
-        <w:rPr>
-          <w:rFonts w:ascii="Times New Roman" w:hAnsi="Times New Roman" w:cs="Times New Roman"/>
-          <w:lang w:val="en-US"/>
-        </w:rPr>
-      </w:pPr>
-    </w:p>
-    <w:p>
-      <w:pPr>
-        <w:rPr>
-          <w:rFonts w:ascii="Times New Roman" w:hAnsi="Times New Roman" w:cs="Times New Roman"/>
-          <w:b/>
-          <w:bCs/>
-          <w:lang w:val="en-US"/>
-        </w:rPr>
-      </w:pPr>
-    </w:p>
-    <w:p>
-      <w:pPr>
-        <w:pStyle w:val="ListParagraph"/>
-        <w:numPr>
-          <w:ilvl w:val="0"/>
-          <w:numId w:val="5"/>
-        </w:numPr>
-        <w:rPr>
-          <w:rFonts w:ascii="Times New Roman" w:hAnsi="Times New Roman" w:cs="Times New Roman"/>
-          <w:b/>
-          <w:bCs/>
-          <w:lang w:val="en-US"/>
-        </w:rPr>
-      </w:pPr>
-      <w:r>
-        <w:rPr>
-          <w:rFonts w:ascii="Times New Roman" w:hAnsi="Times New Roman" w:cs="Times New Roman"/>
-          <w:b/>
-          <w:bCs/>
-          <w:lang w:val="en-US"/>
-        </w:rPr>
-        <w:t>LiDAR correctio</w:t>
-      </w:r>
-      <w:r>
-        <w:rPr>
-          <w:rFonts w:ascii="Times New Roman" w:hAnsi="Times New Roman" w:cs="Times New Roman"/>
-          <w:b/>
-          <w:bCs/>
-          <w:lang w:val="en-US"/>
-        </w:rPr>
-        <w:t>n</w:t>
-      </w:r>
-    </w:p>
-    <w:p>
-      <w:pPr>
-        <w:ind w:left="720"/>
-        <w:rPr>
-          <w:rFonts w:ascii="Times New Roman" w:hAnsi="Times New Roman" w:cs="Times New Roman"/>
-          <w:lang w:val="en-US"/>
-        </w:rPr>
-      </w:pPr>
-      <w:r>
-        <w:rPr>
-          <w:rFonts w:ascii="Times New Roman" w:hAnsi="Times New Roman" w:cs="Times New Roman"/>
-          <w:lang w:val="en-US"/>
-        </w:rPr>
-        <w:t xml:space="preserve">Since GPR data does not account </w:t>
-      </w:r>
-      <w:r>
-        <w:rPr>
-          <w:rFonts w:ascii="Times New Roman" w:hAnsi="Times New Roman" w:cs="Times New Roman"/>
-          <w:lang w:val="en-US"/>
-        </w:rPr>
-        <w:t xml:space="preserve">for </w:t>
-      </w:r>
-      <w:r>
-        <w:rPr>
-          <w:rFonts w:ascii="Times New Roman" w:hAnsi="Times New Roman" w:cs="Times New Roman"/>
-          <w:lang w:val="en-US"/>
-        </w:rPr>
-        <w:t>elevation of terrain</w:t>
-      </w:r>
-      <w:r>
-        <w:rPr>
-          <w:rFonts w:ascii="Times New Roman" w:hAnsi="Times New Roman" w:cs="Times New Roman"/>
-          <w:lang w:val="en-US"/>
-        </w:rPr>
-        <w:t xml:space="preserve">, finding accurate positions of </w:t>
-      </w:r>
-      <w:r>
-        <w:rPr>
-          <w:rFonts w:ascii="Times New Roman" w:hAnsi="Times New Roman" w:cs="Times New Roman"/>
-          <w:lang w:val="en-US"/>
-        </w:rPr>
-        <w:t>unmarked</w:t>
-      </w:r>
-      <w:r>
-        <w:rPr>
-          <w:rFonts w:ascii="Times New Roman" w:hAnsi="Times New Roman" w:cs="Times New Roman"/>
-          <w:lang w:val="en-US"/>
-        </w:rPr>
-        <w:t xml:space="preserve"> graves becomes difficult. This results in extra being spent to locate them via excavations, which is not feasible for small scale non-profit organizations</w:t>
-      </w:r>
-      <w:r>
-        <w:rPr>
-          <w:rFonts w:ascii="Times New Roman" w:hAnsi="Times New Roman" w:cs="Times New Roman"/>
-          <w:lang w:val="en-US"/>
-        </w:rPr>
-        <w:t xml:space="preserve"> that are known to do work related to this area. By incorporating LiDAR images of the landform and adjusting the </w:t>
-      </w:r>
-      <w:proofErr w:type="spellStart"/>
-      <w:r>
-        <w:rPr>
-          <w:rFonts w:ascii="Times New Roman" w:hAnsi="Times New Roman" w:cs="Times New Roman"/>
-          <w:lang w:val="en-US"/>
-        </w:rPr>
-        <w:t>gpr</w:t>
-      </w:r>
-      <w:proofErr w:type="spellEnd"/>
-      <w:r>
-        <w:rPr>
-          <w:rFonts w:ascii="Times New Roman" w:hAnsi="Times New Roman" w:cs="Times New Roman"/>
-          <w:lang w:val="en-US"/>
-        </w:rPr>
-        <w:t xml:space="preserve"> data for elevation, the positions of these graves are more precise. There are paid software alternatives, but licenses for them cost large sums of money and is not within the purchasing power of organizations with poor funding. William proposed this project with the goal of creating an </w:t>
-      </w:r>
-      <w:proofErr w:type="gramStart"/>
-      <w:r>
-        <w:rPr>
-          <w:rFonts w:ascii="Times New Roman" w:hAnsi="Times New Roman" w:cs="Times New Roman"/>
-          <w:lang w:val="en-US"/>
-        </w:rPr>
-        <w:t>open source</w:t>
-      </w:r>
-      <w:proofErr w:type="gramEnd"/>
-      <w:r>
-        <w:rPr>
-          <w:rFonts w:ascii="Times New Roman" w:hAnsi="Times New Roman" w:cs="Times New Roman"/>
-          <w:lang w:val="en-US"/>
-        </w:rPr>
-        <w:t xml:space="preserve"> version that can be distributed for free amongst such organizations like the IPIA</w:t>
-      </w:r>
-      <w:r>
-        <w:rPr>
-          <w:rFonts w:ascii="Times New Roman" w:hAnsi="Times New Roman" w:cs="Times New Roman"/>
-          <w:lang w:val="en-US"/>
-        </w:rPr>
-        <w:t xml:space="preserve"> and help in the discovery of unmarked graves</w:t>
-      </w:r>
-    </w:p>
-    <w:p>
-      <w:pPr>
-        <w:ind w:left="720"/>
-        <w:rPr>
-          <w:rFonts w:ascii="Times New Roman" w:hAnsi="Times New Roman" w:cs="Times New Roman"/>
-          <w:lang w:val="en-US"/>
-        </w:rPr>
-      </w:pPr>
-    </w:p>
-    <w:p>
-      <w:pPr>
-        <w:rPr>
-          <w:rFonts w:ascii="Times New Roman" w:hAnsi="Times New Roman" w:cs="Times New Roman"/>
-          <w:b/>
-          <w:bCs/>
-          <w:sz w:val="32"/>
-          <w:szCs w:val="32"/>
-          <w:lang w:val="en-US"/>
-        </w:rPr>
-      </w:pPr>
-    </w:p>
-    <w:p>
-      <w:pPr>
-        <w:rPr>
-          <w:rFonts w:ascii="Times New Roman" w:hAnsi="Times New Roman" w:cs="Times New Roman"/>
-          <w:b/>
-          <w:bCs/>
-          <w:sz w:val="32"/>
-          <w:szCs w:val="32"/>
-          <w:lang w:val="en-US"/>
-        </w:rPr>
-      </w:pPr>
-    </w:p>
-    <w:p>
-      <w:pPr>
-        <w:rPr>
-          <w:rFonts w:ascii="Times New Roman" w:hAnsi="Times New Roman" w:cs="Times New Roman"/>
-          <w:b/>
-          <w:bCs/>
-          <w:sz w:val="32"/>
-          <w:szCs w:val="32"/>
-          <w:lang w:val="en-US"/>
-        </w:rPr>
-      </w:pPr>
-      <w:r>
-        <w:rPr>
-          <w:rFonts w:ascii="Times New Roman" w:hAnsi="Times New Roman" w:cs="Times New Roman"/>
-          <w:b/>
-          <w:bCs/>
-          <w:sz w:val="32"/>
-          <w:szCs w:val="32"/>
-          <w:lang w:val="en-US"/>
-        </w:rPr>
-        <w:lastRenderedPageBreak/>
-        <w:t>Goals</w:t>
-      </w:r>
-      <w:r>
-        <w:rPr>
-          <w:rFonts w:ascii="Times New Roman" w:hAnsi="Times New Roman" w:cs="Times New Roman"/>
-          <w:b/>
-          <w:bCs/>
-          <w:sz w:val="32"/>
-          <w:szCs w:val="32"/>
-          <w:lang w:val="en-US"/>
-        </w:rPr>
-        <w:t xml:space="preserve"> </w:t>
-      </w:r>
-    </w:p>
-    <w:p>
-      <w:pPr>
-        <w:pStyle w:val="ListParagraph"/>
-        <w:numPr>
-          <w:ilvl w:val="0"/>
-          <w:numId w:val="6"/>
-        </w:numPr>
-        <w:rPr>
-          <w:rFonts w:ascii="Times New Roman" w:hAnsi="Times New Roman" w:cs="Times New Roman"/>
-          <w:lang w:val="en-US"/>
-        </w:rPr>
-      </w:pPr>
-      <w:r>
-        <w:rPr>
-          <w:rFonts w:ascii="Times New Roman" w:hAnsi="Times New Roman" w:cs="Times New Roman"/>
-          <w:lang w:val="en-US"/>
-        </w:rPr>
-        <w:t>Improve UI</w:t>
-      </w:r>
-    </w:p>
-    <w:p>
-      <w:pPr>
         <w:pStyle w:val="ListParagraph"/>
         <w:ind w:left="1080"/>
         <w:rPr>
@@ -1132,69 +1787,6 @@
           <w:lang w:val="en-US"/>
         </w:rPr>
       </w:pPr>
-      <w:r>
-        <w:rPr>
-          <w:rFonts w:ascii="Times New Roman" w:hAnsi="Times New Roman" w:cs="Times New Roman"/>
-          <w:lang w:val="en-US"/>
-        </w:rPr>
-        <w:t xml:space="preserve">Utilize modern UI libraries to give a modern and familiar look and feel to the program. Organize functions and elements to reduce clutter </w:t>
-      </w:r>
-      <w:r>
-        <w:rPr>
-          <w:rFonts w:ascii="Times New Roman" w:hAnsi="Times New Roman" w:cs="Times New Roman"/>
-          <w:lang w:val="en-US"/>
-        </w:rPr>
-        <w:t>and increase the space available to display GPR data. It also</w:t>
-      </w:r>
-      <w:r>
-        <w:rPr>
-          <w:rFonts w:ascii="Times New Roman" w:hAnsi="Times New Roman" w:cs="Times New Roman"/>
-          <w:lang w:val="en-US"/>
-        </w:rPr>
-        <w:t xml:space="preserve"> allow</w:t>
-      </w:r>
-      <w:r>
-        <w:rPr>
-          <w:rFonts w:ascii="Times New Roman" w:hAnsi="Times New Roman" w:cs="Times New Roman"/>
-          <w:lang w:val="en-US"/>
-        </w:rPr>
-        <w:t>s</w:t>
-      </w:r>
-      <w:r>
-        <w:rPr>
-          <w:rFonts w:ascii="Times New Roman" w:hAnsi="Times New Roman" w:cs="Times New Roman"/>
-          <w:lang w:val="en-US"/>
-        </w:rPr>
-        <w:t xml:space="preserve"> user to create their own workflow. We will achieve this by grouping buttons by function type and placing them into separate tab groups. This permits users to pick and choose what changes aspect of the GPR data they will want to work with first. </w:t>
-      </w:r>
-    </w:p>
-    <w:p>
-      <w:pPr>
-        <w:rPr>
-          <w:rFonts w:ascii="Times New Roman" w:hAnsi="Times New Roman" w:cs="Times New Roman"/>
-          <w:lang w:val="en-US"/>
-        </w:rPr>
-      </w:pPr>
-    </w:p>
-    <w:p>
-      <w:pPr>
-        <w:pStyle w:val="ListParagraph"/>
-        <w:numPr>
-          <w:ilvl w:val="0"/>
-          <w:numId w:val="6"/>
-        </w:numPr>
-        <w:rPr>
-          <w:rFonts w:ascii="Times New Roman" w:hAnsi="Times New Roman" w:cs="Times New Roman"/>
-          <w:lang w:val="en-US"/>
-        </w:rPr>
-      </w:pPr>
-      <w:r>
-        <w:rPr>
-          <w:rFonts w:ascii="Times New Roman" w:hAnsi="Times New Roman" w:cs="Times New Roman"/>
-          <w:lang w:val="en-US"/>
-        </w:rPr>
-        <w:t>Faster Performance</w:t>
-      </w:r>
     </w:p>
     <w:p>
       <w:pPr>
@@ -1205,208 +1797,6 @@
           <w:lang w:val="en-US"/>
         </w:rPr>
       </w:pPr>
-      <w:r>
-        <w:rPr>
-          <w:rFonts w:ascii="Times New Roman" w:hAnsi="Times New Roman" w:cs="Times New Roman"/>
-          <w:lang w:val="en-US"/>
-        </w:rPr>
-        <w:t xml:space="preserve">The current processing times for the </w:t>
-      </w:r>
-      <w:proofErr w:type="spellStart"/>
-      <w:r>
-        <w:rPr>
-          <w:rFonts w:ascii="Times New Roman" w:hAnsi="Times New Roman" w:cs="Times New Roman"/>
-          <w:i/>
-          <w:iCs/>
-          <w:lang w:val="en-US"/>
-        </w:rPr>
-        <w:t>makeDataCube</w:t>
-      </w:r>
-      <w:proofErr w:type="spellEnd"/>
-      <w:r>
-        <w:rPr>
-          <w:rFonts w:ascii="Times New Roman" w:hAnsi="Times New Roman" w:cs="Times New Roman"/>
-          <w:lang w:val="en-US"/>
-        </w:rPr>
-        <w:t xml:space="preserve">, and batch processing functions takes hours or several minutes, respectively. This makes implementing changes in data parameters difficult, since errors are not apparent until the function is done. We hope to accomplish this by reworking the functions themselves either by using alternative methods to create the data cube or to implement threads. This will hopefully speed up the </w:t>
-      </w:r>
-      <w:proofErr w:type="gramStart"/>
-      <w:r>
-        <w:rPr>
-          <w:rFonts w:ascii="Times New Roman" w:hAnsi="Times New Roman" w:cs="Times New Roman"/>
-          <w:lang w:val="en-US"/>
-        </w:rPr>
-        <w:t>workflow  and</w:t>
-      </w:r>
-      <w:proofErr w:type="gramEnd"/>
-      <w:r>
-        <w:rPr>
-          <w:rFonts w:ascii="Times New Roman" w:hAnsi="Times New Roman" w:cs="Times New Roman"/>
-          <w:lang w:val="en-US"/>
-        </w:rPr>
-        <w:t xml:space="preserve"> permit faster iterations.</w:t>
-      </w:r>
-    </w:p>
-    <w:p>
-      <w:pPr>
-        <w:rPr>
-          <w:rFonts w:ascii="Times New Roman" w:hAnsi="Times New Roman" w:cs="Times New Roman"/>
-          <w:lang w:val="en-US"/>
-        </w:rPr>
-      </w:pPr>
-    </w:p>
-    <w:p>
-      <w:pPr>
-        <w:pStyle w:val="ListParagraph"/>
-        <w:numPr>
-          <w:ilvl w:val="0"/>
-          <w:numId w:val="6"/>
-        </w:numPr>
-        <w:rPr>
-          <w:rFonts w:ascii="Times New Roman" w:hAnsi="Times New Roman" w:cs="Times New Roman"/>
-          <w:lang w:val="en-US"/>
-        </w:rPr>
-      </w:pPr>
-      <w:r>
-        <w:rPr>
-          <w:rFonts w:ascii="Times New Roman" w:hAnsi="Times New Roman" w:cs="Times New Roman"/>
-          <w:lang w:val="en-US"/>
-        </w:rPr>
-        <w:t>3D manipulation</w:t>
-      </w:r>
-    </w:p>
-    <w:p>
-      <w:pPr>
-        <w:pStyle w:val="ListParagraph"/>
-        <w:ind w:left="1080"/>
-        <w:rPr>
-          <w:rFonts w:ascii="Times New Roman" w:hAnsi="Times New Roman" w:cs="Times New Roman"/>
-          <w:lang w:val="en-US"/>
-        </w:rPr>
-      </w:pPr>
-      <w:r>
-        <w:rPr>
-          <w:rFonts w:ascii="Times New Roman" w:hAnsi="Times New Roman" w:cs="Times New Roman"/>
-          <w:lang w:val="en-US"/>
-        </w:rPr>
-        <w:t xml:space="preserve">One of the main uses of the GPR data is to combine the collected data into a cube, via an interpolation function. This cube is then sliced, viewed in </w:t>
-      </w:r>
-      <w:r>
-        <w:rPr>
-          <w:rFonts w:ascii="Times New Roman" w:hAnsi="Times New Roman" w:cs="Times New Roman"/>
-          <w:lang w:val="en-US"/>
-        </w:rPr>
-        <w:t xml:space="preserve">different modes to identify disturbances in the soil. However, this is only possible by using different software causing a </w:t>
-      </w:r>
-      <w:proofErr w:type="spellStart"/>
-      <w:r>
-        <w:rPr>
-          <w:rFonts w:ascii="Times New Roman" w:hAnsi="Times New Roman" w:cs="Times New Roman"/>
-          <w:lang w:val="en-US"/>
-        </w:rPr>
-        <w:t>slow down</w:t>
-      </w:r>
-      <w:proofErr w:type="spellEnd"/>
-      <w:r>
-        <w:rPr>
-          <w:rFonts w:ascii="Times New Roman" w:hAnsi="Times New Roman" w:cs="Times New Roman"/>
-          <w:lang w:val="en-US"/>
-        </w:rPr>
-        <w:t xml:space="preserve"> in the data extraction process due to the steep learning curve. By incorporating a </w:t>
-      </w:r>
-      <w:proofErr w:type="gramStart"/>
-      <w:r>
-        <w:rPr>
-          <w:rFonts w:ascii="Times New Roman" w:hAnsi="Times New Roman" w:cs="Times New Roman"/>
-          <w:lang w:val="en-US"/>
-        </w:rPr>
-        <w:t>stripped down</w:t>
-      </w:r>
-      <w:proofErr w:type="gramEnd"/>
-      <w:r>
-        <w:rPr>
-          <w:rFonts w:ascii="Times New Roman" w:hAnsi="Times New Roman" w:cs="Times New Roman"/>
-          <w:lang w:val="en-US"/>
-        </w:rPr>
-        <w:t xml:space="preserve"> version of a 3D visualization software, that includes only the functions necessary for this workflow, we can make the entire process much smoother for non-technical users. </w:t>
-      </w:r>
-    </w:p>
-    <w:p>
-      <w:pPr>
-        <w:rPr>
-          <w:rFonts w:ascii="Times New Roman" w:hAnsi="Times New Roman" w:cs="Times New Roman"/>
-          <w:lang w:val="en-US"/>
-        </w:rPr>
-      </w:pPr>
-    </w:p>
-    <w:p>
-      <w:pPr>
-        <w:pStyle w:val="ListParagraph"/>
-        <w:numPr>
-          <w:ilvl w:val="0"/>
-          <w:numId w:val="6"/>
-        </w:numPr>
-        <w:rPr>
-          <w:rFonts w:ascii="Times New Roman" w:hAnsi="Times New Roman" w:cs="Times New Roman"/>
-          <w:lang w:val="en-US"/>
-        </w:rPr>
-      </w:pPr>
-      <w:r>
-        <w:rPr>
-          <w:rFonts w:ascii="Times New Roman" w:hAnsi="Times New Roman" w:cs="Times New Roman"/>
-          <w:lang w:val="en-US"/>
-        </w:rPr>
-        <w:t>Elevation correction</w:t>
-      </w:r>
-    </w:p>
-    <w:p>
-      <w:pPr>
-        <w:pStyle w:val="ListParagraph"/>
-        <w:ind w:left="1080"/>
-        <w:rPr>
-          <w:rFonts w:ascii="Times New Roman" w:hAnsi="Times New Roman" w:cs="Times New Roman"/>
-          <w:lang w:val="en-US"/>
-        </w:rPr>
-      </w:pPr>
-      <w:r>
-        <w:rPr>
-          <w:rFonts w:ascii="Times New Roman" w:hAnsi="Times New Roman" w:cs="Times New Roman"/>
-          <w:lang w:val="en-US"/>
-        </w:rPr>
-        <w:t xml:space="preserve">One of the main challenges with GPR data is that elevation of the terrain is not measured. This makes accurately locating structures underground difficult. Elevation correction solutions do </w:t>
-      </w:r>
-      <w:proofErr w:type="gramStart"/>
-      <w:r>
-        <w:rPr>
-          <w:rFonts w:ascii="Times New Roman" w:hAnsi="Times New Roman" w:cs="Times New Roman"/>
-          <w:lang w:val="en-US"/>
-        </w:rPr>
-        <w:t>exist, but</w:t>
-      </w:r>
-      <w:proofErr w:type="gramEnd"/>
-      <w:r>
-        <w:rPr>
-          <w:rFonts w:ascii="Times New Roman" w:hAnsi="Times New Roman" w:cs="Times New Roman"/>
-          <w:lang w:val="en-US"/>
-        </w:rPr>
-        <w:t xml:space="preserve"> are locked behind paywall or paid licenses which is difficult for </w:t>
-      </w:r>
-      <w:proofErr w:type="spellStart"/>
-      <w:r>
-        <w:rPr>
-          <w:rFonts w:ascii="Times New Roman" w:hAnsi="Times New Roman" w:cs="Times New Roman"/>
-          <w:lang w:val="en-US"/>
-        </w:rPr>
-        <w:t>orgainzations</w:t>
-      </w:r>
-      <w:proofErr w:type="spellEnd"/>
-      <w:r>
-        <w:rPr>
-          <w:rFonts w:ascii="Times New Roman" w:hAnsi="Times New Roman" w:cs="Times New Roman"/>
-          <w:lang w:val="en-US"/>
-        </w:rPr>
-        <w:t xml:space="preserve"> will low funding to procure. We hope to identify an effective solution by using LiDAR imagery to help adjust the elevation. </w:t>
-      </w:r>
     </w:p>
     <w:p>
       <w:pPr>
@@ -2005,7 +2395,7 @@
       <w:lvlText w:val="%1)"/>
       <w:lvlJc w:val="left"/>
       <w:pPr>
-        <w:ind w:left="720" w:hanging="360"/>
+        <w:ind w:left="1800" w:hanging="360"/>
       </w:pPr>
       <w:rPr>
         <w:rFonts w:hint="default"/>
@@ -2017,7 +2407,7 @@
       <w:lvlText w:val="%2."/>
       <w:lvlJc w:val="left"/>
       <w:pPr>
-        <w:ind w:left="1440" w:hanging="360"/>
+        <w:ind w:left="2520" w:hanging="360"/>
       </w:pPr>
     </w:lvl>
     <w:lvl w:ilvl="2" w:tplc="0809001B" w:tentative="1">
@@ -2026,7 +2416,7 @@
       <w:lvlText w:val="%3."/>
       <w:lvlJc w:val="right"/>
       <w:pPr>
-        <w:ind w:left="2160" w:hanging="180"/>
+        <w:ind w:left="3240" w:hanging="180"/>
       </w:pPr>
     </w:lvl>
     <w:lvl w:ilvl="3" w:tplc="0809000F" w:tentative="1">
@@ -2035,7 +2425,7 @@
       <w:lvlText w:val="%4."/>
       <w:lvlJc w:val="left"/>
       <w:pPr>
-        <w:ind w:left="2880" w:hanging="360"/>
+        <w:ind w:left="3960" w:hanging="360"/>
       </w:pPr>
     </w:lvl>
     <w:lvl w:ilvl="4" w:tplc="08090019" w:tentative="1">
@@ -2044,7 +2434,7 @@
       <w:lvlText w:val="%5."/>
       <w:lvlJc w:val="left"/>
       <w:pPr>
-        <w:ind w:left="3600" w:hanging="360"/>
+        <w:ind w:left="4680" w:hanging="360"/>
       </w:pPr>
     </w:lvl>
     <w:lvl w:ilvl="5" w:tplc="0809001B" w:tentative="1">
@@ -2053,7 +2443,7 @@
       <w:lvlText w:val="%6."/>
       <w:lvlJc w:val="right"/>
       <w:pPr>
-        <w:ind w:left="4320" w:hanging="180"/>
+        <w:ind w:left="5400" w:hanging="180"/>
       </w:pPr>
     </w:lvl>
     <w:lvl w:ilvl="6" w:tplc="0809000F" w:tentative="1">
@@ -2062,7 +2452,7 @@
       <w:lvlText w:val="%7."/>
       <w:lvlJc w:val="left"/>
       <w:pPr>
-        <w:ind w:left="5040" w:hanging="360"/>
+        <w:ind w:left="6120" w:hanging="360"/>
       </w:pPr>
     </w:lvl>
     <w:lvl w:ilvl="7" w:tplc="08090019" w:tentative="1">
@@ -2071,7 +2461,7 @@
       <w:lvlText w:val="%8."/>
       <w:lvlJc w:val="left"/>
       <w:pPr>
-        <w:ind w:left="5760" w:hanging="360"/>
+        <w:ind w:left="6840" w:hanging="360"/>
       </w:pPr>
     </w:lvl>
     <w:lvl w:ilvl="8" w:tplc="0809001B" w:tentative="1">
@@ -2080,7 +2470,7 @@
       <w:lvlText w:val="%9."/>
       <w:lvlJc w:val="right"/>
       <w:pPr>
-        <w:ind w:left="6480" w:hanging="180"/>
+        <w:ind w:left="7560" w:hanging="180"/>
       </w:pPr>
     </w:lvl>
   </w:abstractNum>

</xml_diff>